<commit_message>
Update CV and experience section
</commit_message>
<xml_diff>
--- a/public/CV.docx
+++ b/public/CV.docx
@@ -32,7 +32,8 @@
               <w:rPr>
                 <w:rFonts w:ascii="Tw Cen MT" w:hAnsi="Tw Cen MT"/>
                 <w:b/>
-                <w:sz w:val="24"/>
+                <w:sz w:val="6"/>
+                <w:szCs w:val="4"/>
               </w:rPr>
             </w:pPr>
           </w:p>
@@ -76,30 +77,10 @@
               <w:spacing w:after="0"/>
               <w:rPr>
                 <w:rFonts w:ascii="Tw Cen MT" w:hAnsi="Tw Cen MT"/>
-                <w:sz w:val="24"/>
+                <w:sz w:val="6"/>
+                <w:szCs w:val="4"/>
               </w:rPr>
             </w:pPr>
-            <w:r>
-              <w:rPr>
-                <w:rFonts w:ascii="Tw Cen MT" w:hAnsi="Tw Cen MT"/>
-                <w:sz w:val="24"/>
-              </w:rPr>
-              <w:t>Address</w:t>
-            </w:r>
-            <w:r>
-              <w:rPr>
-                <w:rFonts w:ascii="Tw Cen MT" w:hAnsi="Tw Cen MT"/>
-                <w:sz w:val="24"/>
-              </w:rPr>
-              <w:tab/>
-            </w:r>
-            <w:r>
-              <w:rPr>
-                <w:rFonts w:ascii="Tw Cen MT" w:hAnsi="Tw Cen MT"/>
-                <w:sz w:val="24"/>
-              </w:rPr>
-              <w:t xml:space="preserve">37 Twyford House, London, </w:t>
-            </w:r>
           </w:p>
           <w:p>
             <w:pPr>
@@ -114,7 +95,21 @@
                 <w:rFonts w:ascii="Tw Cen MT" w:hAnsi="Tw Cen MT"/>
                 <w:sz w:val="24"/>
               </w:rPr>
-              <w:t xml:space="preserve">                      N5 1</w:t>
+              <w:t>Location</w:t>
+            </w:r>
+            <w:r>
+              <w:rPr>
+                <w:rFonts w:ascii="Tw Cen MT" w:hAnsi="Tw Cen MT"/>
+                <w:sz w:val="24"/>
+              </w:rPr>
+              <w:tab/>
+            </w:r>
+            <w:r>
+              <w:rPr>
+                <w:rFonts w:ascii="Tw Cen MT" w:hAnsi="Tw Cen MT"/>
+                <w:sz w:val="24"/>
+              </w:rPr>
+              <w:t>London, N5 1</w:t>
             </w:r>
             <w:r>
               <w:rPr>
@@ -336,14 +331,12 @@
           <w:rFonts w:ascii="Tw Cen MT" w:hAnsi="Tw Cen MT"/>
         </w:rPr>
       </w:pPr>
-      <w:proofErr w:type="spellStart"/>
       <w:r>
         <w:rPr>
           <w:rFonts w:ascii="Tw Cen MT" w:hAnsi="Tw Cen MT"/>
         </w:rPr>
         <w:t>MMath</w:t>
       </w:r>
-      <w:proofErr w:type="spellEnd"/>
       <w:r>
         <w:rPr>
           <w:rFonts w:ascii="Tw Cen MT" w:hAnsi="Tw Cen MT"/>
@@ -452,7 +445,7 @@
         <w:rPr>
           <w:rFonts w:ascii="Tw Cen MT" w:hAnsi="Tw Cen MT"/>
         </w:rPr>
-        <w:t>Modules: General Relativity, Black Holes, Quantum Field Theory, Cosmology, String Theory and The Standard Model</w:t>
+        <w:t>Modules: General Relativity, Black Holes, Quantum Field Theory, Cosmology, String Theory</w:t>
       </w:r>
     </w:p>
     <w:p>
@@ -624,7 +617,13 @@
         <w:rPr>
           <w:rFonts w:ascii="Tw Cen MT" w:hAnsi="Tw Cen MT"/>
         </w:rPr>
-        <w:t xml:space="preserve">as </w:t>
+        <w:t>for</w:t>
+      </w:r>
+      <w:r>
+        <w:rPr>
+          <w:rFonts w:ascii="Tw Cen MT" w:hAnsi="Tw Cen MT"/>
+        </w:rPr>
+        <w:t xml:space="preserve"> </w:t>
       </w:r>
       <w:r>
         <w:rPr>
@@ -723,7 +722,19 @@
         <w:rPr>
           <w:rFonts w:ascii="Tw Cen MT" w:hAnsi="Tw Cen MT"/>
         </w:rPr>
-        <w:t>AS- Level: 1x A- Economics</w:t>
+        <w:t xml:space="preserve">AS- Level: </w:t>
+      </w:r>
+      <w:r>
+        <w:rPr>
+          <w:rFonts w:ascii="Tw Cen MT" w:hAnsi="Tw Cen MT"/>
+        </w:rPr>
+        <w:t>1</w:t>
+      </w:r>
+      <w:r>
+        <w:rPr>
+          <w:rFonts w:ascii="Tw Cen MT" w:hAnsi="Tw Cen MT"/>
+        </w:rPr>
+        <w:t>x A- Economics</w:t>
       </w:r>
     </w:p>
     <w:p>
@@ -834,10 +845,20 @@
         <w:rPr>
           <w:rFonts w:ascii="Tw Cen MT" w:hAnsi="Tw Cen MT"/>
           <w:b/>
+          <w:noProof/>
           <w:sz w:val="24"/>
           <w:szCs w:val="24"/>
         </w:rPr>
-        <w:t>Employment and Experience:</w:t>
+        <w:t>Software</w:t>
+      </w:r>
+      <w:r>
+        <w:rPr>
+          <w:rFonts w:ascii="Tw Cen MT" w:hAnsi="Tw Cen MT"/>
+          <w:b/>
+          <w:sz w:val="24"/>
+          <w:szCs w:val="24"/>
+        </w:rPr>
+        <w:t xml:space="preserve"> Experience:</w:t>
       </w:r>
     </w:p>
     <w:p>
@@ -887,85 +908,7 @@
         <w:rPr>
           <w:rFonts w:ascii="Tw Cen MT" w:hAnsi="Tw Cen MT"/>
         </w:rPr>
-        <w:t>W</w:t>
-      </w:r>
-      <w:r>
-        <w:rPr>
-          <w:rFonts w:ascii="Tw Cen MT" w:hAnsi="Tw Cen MT"/>
-        </w:rPr>
-        <w:t xml:space="preserve">orking on Azure to deploy </w:t>
-      </w:r>
-      <w:r>
-        <w:rPr>
-          <w:rFonts w:ascii="Tw Cen MT" w:hAnsi="Tw Cen MT"/>
-        </w:rPr>
-        <w:t>a voicemail solution</w:t>
-      </w:r>
-      <w:r>
-        <w:rPr>
-          <w:rFonts w:ascii="Tw Cen MT" w:hAnsi="Tw Cen MT"/>
-        </w:rPr>
-        <w:t xml:space="preserve"> for</w:t>
-      </w:r>
-      <w:r>
-        <w:rPr>
-          <w:rFonts w:ascii="Tw Cen MT" w:hAnsi="Tw Cen MT"/>
-        </w:rPr>
-        <w:t xml:space="preserve"> a</w:t>
-      </w:r>
-      <w:r>
-        <w:rPr>
-          <w:rFonts w:ascii="Tw Cen MT" w:hAnsi="Tw Cen MT"/>
-        </w:rPr>
-        <w:t xml:space="preserve"> large </w:t>
-      </w:r>
-      <w:r>
-        <w:rPr>
-          <w:rFonts w:ascii="Tw Cen MT" w:hAnsi="Tw Cen MT"/>
-        </w:rPr>
-        <w:t>tel</w:t>
-      </w:r>
-      <w:r>
-        <w:rPr>
-          <w:rFonts w:ascii="Tw Cen MT" w:hAnsi="Tw Cen MT"/>
-        </w:rPr>
-        <w:t>co</w:t>
-      </w:r>
-      <w:r>
-        <w:rPr>
-          <w:rFonts w:ascii="Tw Cen MT" w:hAnsi="Tw Cen MT"/>
-        </w:rPr>
-        <w:t xml:space="preserve">. Using </w:t>
-      </w:r>
-      <w:r>
-        <w:rPr>
-          <w:rFonts w:ascii="Tw Cen MT" w:hAnsi="Tw Cen MT"/>
-        </w:rPr>
-        <w:t>Kubernetes infrastructure</w:t>
-      </w:r>
-      <w:r>
-        <w:rPr>
-          <w:rFonts w:ascii="Tw Cen MT" w:hAnsi="Tw Cen MT"/>
-        </w:rPr>
-        <w:t xml:space="preserve"> for</w:t>
-      </w:r>
-      <w:r>
-        <w:rPr>
-          <w:rFonts w:ascii="Tw Cen MT" w:hAnsi="Tw Cen MT"/>
-        </w:rPr>
-        <w:t xml:space="preserve"> maintenance and debugging, writing</w:t>
-      </w:r>
-      <w:r>
-        <w:rPr>
-          <w:rFonts w:ascii="Tw Cen MT" w:hAnsi="Tw Cen MT"/>
-        </w:rPr>
-        <w:t xml:space="preserve"> Python</w:t>
-      </w:r>
-      <w:r>
-        <w:rPr>
-          <w:rFonts w:ascii="Tw Cen MT" w:hAnsi="Tw Cen MT"/>
-        </w:rPr>
-        <w:t xml:space="preserve"> automation scripts to manage and fix CVEs, and working with Rust to improve the solution functionality.</w:t>
+        <w:t>Developed a Rust based solution to configuration translation with an extensive testing framework.</w:t>
       </w:r>
     </w:p>
     <w:p>
@@ -984,25 +927,19 @@
         <w:rPr>
           <w:rFonts w:ascii="Tw Cen MT" w:hAnsi="Tw Cen MT"/>
         </w:rPr>
-        <w:t>Scrum master for a team of 10, implementing</w:t>
-      </w:r>
-      <w:r>
-        <w:rPr>
-          <w:rFonts w:ascii="Tw Cen MT" w:hAnsi="Tw Cen MT"/>
-        </w:rPr>
-        <w:t xml:space="preserve"> and running</w:t>
-      </w:r>
-      <w:r>
-        <w:rPr>
-          <w:rFonts w:ascii="Tw Cen MT" w:hAnsi="Tw Cen MT"/>
-        </w:rPr>
-        <w:t xml:space="preserve"> sprint ceremon</w:t>
-      </w:r>
-      <w:r>
-        <w:rPr>
-          <w:rFonts w:ascii="Tw Cen MT" w:hAnsi="Tw Cen MT"/>
-        </w:rPr>
-        <w:t>ies</w:t>
+        <w:t>D</w:t>
+      </w:r>
+      <w:r>
+        <w:rPr>
+          <w:rFonts w:ascii="Tw Cen MT" w:hAnsi="Tw Cen MT"/>
+        </w:rPr>
+        <w:t>eploy</w:t>
+      </w:r>
+      <w:r>
+        <w:rPr>
+          <w:rFonts w:ascii="Tw Cen MT" w:hAnsi="Tw Cen MT"/>
+        </w:rPr>
+        <w:t>ed</w:t>
       </w:r>
       <w:r>
         <w:rPr>
@@ -1014,31 +951,73 @@
         <w:rPr>
           <w:rFonts w:ascii="Tw Cen MT" w:hAnsi="Tw Cen MT"/>
         </w:rPr>
-        <w:t>as well as</w:t>
-      </w:r>
-      <w:r>
-        <w:rPr>
-          <w:rFonts w:ascii="Tw Cen MT" w:hAnsi="Tw Cen MT"/>
-        </w:rPr>
-        <w:t xml:space="preserve"> </w:t>
-      </w:r>
-      <w:r>
-        <w:rPr>
-          <w:rFonts w:ascii="Tw Cen MT" w:hAnsi="Tw Cen MT"/>
-        </w:rPr>
-        <w:t xml:space="preserve">continually </w:t>
-      </w:r>
-      <w:r>
-        <w:rPr>
-          <w:rFonts w:ascii="Tw Cen MT" w:hAnsi="Tw Cen MT"/>
-        </w:rPr>
-        <w:t xml:space="preserve">improving the </w:t>
-      </w:r>
-      <w:r>
-        <w:rPr>
-          <w:rFonts w:ascii="Tw Cen MT" w:hAnsi="Tw Cen MT"/>
-        </w:rPr>
-        <w:t>efficiency of daily meetings.</w:t>
+        <w:t>a voicemail solution</w:t>
+      </w:r>
+      <w:r>
+        <w:rPr>
+          <w:rFonts w:ascii="Tw Cen MT" w:hAnsi="Tw Cen MT"/>
+        </w:rPr>
+        <w:t xml:space="preserve"> on Azure</w:t>
+      </w:r>
+      <w:r>
+        <w:rPr>
+          <w:rFonts w:ascii="Tw Cen MT" w:hAnsi="Tw Cen MT"/>
+        </w:rPr>
+        <w:t xml:space="preserve"> for</w:t>
+      </w:r>
+      <w:r>
+        <w:rPr>
+          <w:rFonts w:ascii="Tw Cen MT" w:hAnsi="Tw Cen MT"/>
+        </w:rPr>
+        <w:t xml:space="preserve"> a</w:t>
+      </w:r>
+      <w:r>
+        <w:rPr>
+          <w:rFonts w:ascii="Tw Cen MT" w:hAnsi="Tw Cen MT"/>
+        </w:rPr>
+        <w:t xml:space="preserve"> large </w:t>
+      </w:r>
+      <w:r>
+        <w:rPr>
+          <w:rFonts w:ascii="Tw Cen MT" w:hAnsi="Tw Cen MT"/>
+        </w:rPr>
+        <w:t>tel</w:t>
+      </w:r>
+      <w:r>
+        <w:rPr>
+          <w:rFonts w:ascii="Tw Cen MT" w:hAnsi="Tw Cen MT"/>
+        </w:rPr>
+        <w:t>co</w:t>
+      </w:r>
+      <w:r>
+        <w:rPr>
+          <w:rFonts w:ascii="Tw Cen MT" w:hAnsi="Tw Cen MT"/>
+        </w:rPr>
+        <w:t xml:space="preserve"> u</w:t>
+      </w:r>
+      <w:r>
+        <w:rPr>
+          <w:rFonts w:ascii="Tw Cen MT" w:hAnsi="Tw Cen MT"/>
+        </w:rPr>
+        <w:t>s</w:t>
+      </w:r>
+      <w:r>
+        <w:rPr>
+          <w:rFonts w:ascii="Tw Cen MT" w:hAnsi="Tw Cen MT"/>
+        </w:rPr>
+        <w:t xml:space="preserve">ing </w:t>
+      </w:r>
+      <w:r>
+        <w:rPr>
+          <w:rFonts w:ascii="Tw Cen MT" w:hAnsi="Tw Cen MT"/>
+        </w:rPr>
+        <w:t xml:space="preserve">Kubernetes </w:t>
+      </w:r>
+      <w:r>
+        <w:rPr>
+          <w:rFonts w:ascii="Tw Cen MT" w:hAnsi="Tw Cen MT"/>
+        </w:rPr>
+        <w:t>clusters.</w:t>
       </w:r>
     </w:p>
     <w:p>
@@ -1057,6 +1036,104 @@
         <w:rPr>
           <w:rFonts w:ascii="Tw Cen MT" w:hAnsi="Tw Cen MT"/>
         </w:rPr>
+        <w:t>Wrote and owned</w:t>
+      </w:r>
+      <w:r>
+        <w:rPr>
+          <w:rFonts w:ascii="Tw Cen MT" w:hAnsi="Tw Cen MT"/>
+        </w:rPr>
+        <w:t xml:space="preserve"> </w:t>
+      </w:r>
+      <w:r>
+        <w:rPr>
+          <w:rFonts w:ascii="Tw Cen MT" w:hAnsi="Tw Cen MT"/>
+        </w:rPr>
+        <w:t xml:space="preserve">an </w:t>
+      </w:r>
+      <w:r>
+        <w:rPr>
+          <w:rFonts w:ascii="Tw Cen MT" w:hAnsi="Tw Cen MT"/>
+        </w:rPr>
+        <w:t xml:space="preserve">automation </w:t>
+      </w:r>
+      <w:r>
+        <w:rPr>
+          <w:rFonts w:ascii="Tw Cen MT" w:hAnsi="Tw Cen MT"/>
+        </w:rPr>
+        <w:t>bot</w:t>
+      </w:r>
+      <w:r>
+        <w:rPr>
+          <w:rFonts w:ascii="Tw Cen MT" w:hAnsi="Tw Cen MT"/>
+        </w:rPr>
+        <w:t xml:space="preserve"> </w:t>
+      </w:r>
+      <w:r>
+        <w:rPr>
+          <w:rFonts w:ascii="Tw Cen MT" w:hAnsi="Tw Cen MT"/>
+        </w:rPr>
+        <w:t>to manage and fix CVEs</w:t>
+      </w:r>
+      <w:r>
+        <w:rPr>
+          <w:rFonts w:ascii="Tw Cen MT" w:hAnsi="Tw Cen MT"/>
+        </w:rPr>
+        <w:t xml:space="preserve"> </w:t>
+      </w:r>
+      <w:r>
+        <w:rPr>
+          <w:rFonts w:ascii="Tw Cen MT" w:hAnsi="Tw Cen MT"/>
+        </w:rPr>
+        <w:t>using Python</w:t>
+      </w:r>
+      <w:r>
+        <w:rPr>
+          <w:rFonts w:ascii="Tw Cen MT" w:hAnsi="Tw Cen MT"/>
+        </w:rPr>
+        <w:t>.</w:t>
+      </w:r>
+    </w:p>
+    <w:p>
+      <w:pPr>
+        <w:pStyle w:val="ListParagraph"/>
+        <w:numPr>
+          <w:ilvl w:val="1"/>
+          <w:numId w:val="5"/>
+        </w:numPr>
+        <w:rPr>
+          <w:rFonts w:ascii="Tw Cen MT" w:hAnsi="Tw Cen MT"/>
+          <w:u w:val="single"/>
+        </w:rPr>
+      </w:pPr>
+      <w:r>
+        <w:rPr>
+          <w:rFonts w:ascii="Tw Cen MT" w:hAnsi="Tw Cen MT"/>
+        </w:rPr>
+        <w:t>Scrum master for a team of 10</w:t>
+      </w:r>
+      <w:r>
+        <w:rPr>
+          <w:rFonts w:ascii="Tw Cen MT" w:hAnsi="Tw Cen MT"/>
+        </w:rPr>
+        <w:t>.</w:t>
+      </w:r>
+    </w:p>
+    <w:p>
+      <w:pPr>
+        <w:pStyle w:val="ListParagraph"/>
+        <w:numPr>
+          <w:ilvl w:val="1"/>
+          <w:numId w:val="5"/>
+        </w:numPr>
+        <w:rPr>
+          <w:rFonts w:ascii="Tw Cen MT" w:hAnsi="Tw Cen MT"/>
+          <w:u w:val="single"/>
+        </w:rPr>
+      </w:pPr>
+      <w:r>
+        <w:rPr>
+          <w:rFonts w:ascii="Tw Cen MT" w:hAnsi="Tw Cen MT"/>
+        </w:rPr>
         <w:t>Worked with</w:t>
       </w:r>
       <w:r>
@@ -1105,43 +1182,87 @@
         <w:rPr>
           <w:rFonts w:ascii="Tw Cen MT" w:hAnsi="Tw Cen MT"/>
         </w:rPr>
-        <w:t xml:space="preserve">app </w:t>
-      </w:r>
-      <w:r>
-        <w:rPr>
-          <w:rFonts w:ascii="Tw Cen MT" w:hAnsi="Tw Cen MT"/>
-        </w:rPr>
-        <w:t>sold to</w:t>
-      </w:r>
-      <w:r>
-        <w:rPr>
-          <w:rFonts w:ascii="Tw Cen MT" w:hAnsi="Tw Cen MT"/>
-        </w:rPr>
-        <w:t xml:space="preserve"> small businesses that </w:t>
-      </w:r>
-      <w:r>
-        <w:rPr>
-          <w:rFonts w:ascii="Tw Cen MT" w:hAnsi="Tw Cen MT"/>
-        </w:rPr>
-        <w:t>integrates</w:t>
-      </w:r>
-      <w:r>
-        <w:rPr>
-          <w:rFonts w:ascii="Tw Cen MT" w:hAnsi="Tw Cen MT"/>
-        </w:rPr>
-        <w:t xml:space="preserve"> with users </w:t>
-      </w:r>
-      <w:r>
-        <w:rPr>
-          <w:rFonts w:ascii="Tw Cen MT" w:hAnsi="Tw Cen MT"/>
-        </w:rPr>
-        <w:t>mobile numbers</w:t>
+        <w:t>app.</w:t>
+      </w:r>
+    </w:p>
+    <w:p>
+      <w:pPr>
+        <w:pStyle w:val="ListParagraph"/>
+        <w:numPr>
+          <w:ilvl w:val="1"/>
+          <w:numId w:val="5"/>
+        </w:numPr>
+        <w:rPr>
+          <w:rFonts w:ascii="Tw Cen MT" w:hAnsi="Tw Cen MT"/>
+          <w:u w:val="single"/>
+        </w:rPr>
+      </w:pPr>
+      <w:r>
+        <w:rPr>
+          <w:rFonts w:ascii="Tw Cen MT" w:hAnsi="Tw Cen MT"/>
+        </w:rPr>
+        <w:t>Gave</w:t>
+      </w:r>
+      <w:r>
+        <w:rPr>
+          <w:rFonts w:ascii="Tw Cen MT" w:hAnsi="Tw Cen MT"/>
+        </w:rPr>
+        <w:t xml:space="preserve"> demos to 100+ people</w:t>
+      </w:r>
+      <w:r>
+        <w:rPr>
+          <w:rFonts w:ascii="Tw Cen MT" w:hAnsi="Tw Cen MT"/>
+        </w:rPr>
+        <w:t xml:space="preserve"> on the uses and capabilities of GitHub Copilot</w:t>
       </w:r>
       <w:r>
         <w:rPr>
           <w:rFonts w:ascii="Tw Cen MT" w:hAnsi="Tw Cen MT"/>
         </w:rPr>
         <w:t>.</w:t>
+      </w:r>
+    </w:p>
+    <w:p>
+      <w:pPr>
+        <w:pStyle w:val="ListParagraph"/>
+        <w:numPr>
+          <w:ilvl w:val="1"/>
+          <w:numId w:val="5"/>
+        </w:numPr>
+        <w:rPr>
+          <w:rFonts w:ascii="Tw Cen MT" w:hAnsi="Tw Cen MT"/>
+          <w:u w:val="single"/>
+        </w:rPr>
+      </w:pPr>
+      <w:r>
+        <w:rPr>
+          <w:rFonts w:ascii="Tw Cen MT" w:hAnsi="Tw Cen MT"/>
+        </w:rPr>
+        <w:t>R</w:t>
+      </w:r>
+      <w:r>
+        <w:rPr>
+          <w:rFonts w:ascii="Tw Cen MT" w:hAnsi="Tw Cen MT"/>
+        </w:rPr>
+        <w:t>u</w:t>
+      </w:r>
+      <w:r>
+        <w:rPr>
+          <w:rFonts w:ascii="Tw Cen MT" w:hAnsi="Tw Cen MT"/>
+        </w:rPr>
+        <w:t>n</w:t>
+      </w:r>
+      <w:r>
+        <w:rPr>
+          <w:rFonts w:ascii="Tw Cen MT" w:hAnsi="Tw Cen MT"/>
+        </w:rPr>
+        <w:t>ning</w:t>
+      </w:r>
+      <w:r>
+        <w:rPr>
+          <w:rFonts w:ascii="Tw Cen MT" w:hAnsi="Tw Cen MT"/>
+        </w:rPr>
+        <w:t xml:space="preserve"> a sustainability series, personally giving talks on fishing and carbon removal companies.</w:t>
       </w:r>
     </w:p>
     <w:p>
@@ -1211,62 +1332,58 @@
         </w:numPr>
         <w:rPr>
           <w:rFonts w:ascii="Tw Cen MT" w:hAnsi="Tw Cen MT"/>
-          <w:u w:val="single"/>
-        </w:rPr>
-      </w:pPr>
-      <w:r>
-        <w:rPr>
-          <w:rFonts w:ascii="Tw Cen MT" w:hAnsi="Tw Cen MT"/>
-        </w:rPr>
-        <w:t>Software Engineer at Microsoft, 8-week virtual internship</w:t>
-      </w:r>
-      <w:r>
-        <w:rPr>
-          <w:rFonts w:ascii="Tw Cen MT" w:hAnsi="Tw Cen MT"/>
-        </w:rPr>
-        <w:t xml:space="preserve"> (2021)</w:t>
-      </w:r>
-      <w:r>
-        <w:rPr>
-          <w:rFonts w:ascii="Tw Cen MT" w:hAnsi="Tw Cen MT"/>
-        </w:rPr>
-        <w:t xml:space="preserve"> writing </w:t>
-      </w:r>
-      <w:r>
-        <w:rPr>
-          <w:rFonts w:ascii="Tw Cen MT" w:hAnsi="Tw Cen MT"/>
-        </w:rPr>
-        <w:t>P</w:t>
-      </w:r>
-      <w:r>
-        <w:rPr>
-          <w:rFonts w:ascii="Tw Cen MT" w:hAnsi="Tw Cen MT"/>
-        </w:rPr>
-        <w:t xml:space="preserve">ython scripts to improve the automation of </w:t>
-      </w:r>
-      <w:r>
-        <w:rPr>
-          <w:rFonts w:ascii="Tw Cen MT" w:hAnsi="Tw Cen MT"/>
-        </w:rPr>
-        <w:t>VM deployment and</w:t>
-      </w:r>
-      <w:r>
-        <w:rPr>
-          <w:rFonts w:ascii="Tw Cen MT" w:hAnsi="Tw Cen MT"/>
-        </w:rPr>
-        <w:t xml:space="preserve"> management f</w:t>
-      </w:r>
-      <w:r>
-        <w:rPr>
-          <w:rFonts w:ascii="Tw Cen MT" w:hAnsi="Tw Cen MT"/>
-        </w:rPr>
-        <w:t>or</w:t>
-      </w:r>
-      <w:r>
-        <w:rPr>
-          <w:rFonts w:ascii="Tw Cen MT" w:hAnsi="Tw Cen MT"/>
-        </w:rPr>
-        <w:t xml:space="preserve"> products in the telecoms sector.</w:t>
+        </w:rPr>
+      </w:pPr>
+      <w:r>
+        <w:rPr>
+          <w:rFonts w:ascii="Tw Cen MT" w:hAnsi="Tw Cen MT"/>
+        </w:rPr>
+        <w:t xml:space="preserve">Volunteer </w:t>
+      </w:r>
+      <w:r>
+        <w:rPr>
+          <w:rFonts w:ascii="Tw Cen MT" w:hAnsi="Tw Cen MT"/>
+        </w:rPr>
+        <w:t xml:space="preserve">Machine Learning Engineer, </w:t>
+      </w:r>
+      <w:hyperlink r:id="rId7" w:history="1">
+        <w:r>
+          <w:rPr>
+            <w:rStyle w:val="Hyperlink"/>
+            <w:rFonts w:ascii="Tw Cen MT" w:hAnsi="Tw Cen MT"/>
+          </w:rPr>
+          <w:t>Shark Trust</w:t>
+        </w:r>
+      </w:hyperlink>
+      <w:r>
+        <w:rPr>
+          <w:rFonts w:ascii="Tw Cen MT" w:hAnsi="Tw Cen MT"/>
+        </w:rPr>
+        <w:t xml:space="preserve"> </w:t>
+      </w:r>
+      <w:r>
+        <w:rPr>
+          <w:rFonts w:ascii="Tw Cen MT" w:hAnsi="Tw Cen MT"/>
+        </w:rPr>
+        <w:t xml:space="preserve">(2023-Present) </w:t>
+      </w:r>
+      <w:r>
+        <w:rPr>
+          <w:rFonts w:ascii="Tw Cen MT" w:hAnsi="Tw Cen MT"/>
+        </w:rPr>
+        <w:t>classi</w:t>
+      </w:r>
+      <w:r>
+        <w:rPr>
+          <w:rFonts w:ascii="Tw Cen MT" w:hAnsi="Tw Cen MT"/>
+        </w:rPr>
+        <w:t xml:space="preserve">fying </w:t>
+      </w:r>
+      <w:r>
+        <w:rPr>
+          <w:rFonts w:ascii="Tw Cen MT" w:hAnsi="Tw Cen MT"/>
+        </w:rPr>
+        <w:t>shark and ray eggs by species to substitute for manual classification.</w:t>
       </w:r>
     </w:p>
     <w:p>
@@ -1285,9 +1402,385 @@
         <w:rPr>
           <w:rFonts w:ascii="Tw Cen MT" w:hAnsi="Tw Cen MT"/>
         </w:rPr>
-        <w:t xml:space="preserve">Led a team to win </w:t>
-      </w:r>
-      <w:hyperlink r:id="rId7" w:history="1">
+        <w:t>Machine Learning Engineer, Cambridge (2022), w</w:t>
+      </w:r>
+      <w:r>
+        <w:rPr>
+          <w:rFonts w:ascii="Tw Cen MT" w:hAnsi="Tw Cen MT"/>
+        </w:rPr>
+        <w:t xml:space="preserve">orked on a </w:t>
+      </w:r>
+      <w:r>
+        <w:rPr>
+          <w:rFonts w:ascii="Tw Cen MT" w:hAnsi="Tw Cen MT"/>
+        </w:rPr>
+        <w:t>m</w:t>
+      </w:r>
+      <w:r>
+        <w:rPr>
+          <w:rFonts w:ascii="Tw Cen MT" w:hAnsi="Tw Cen MT"/>
+        </w:rPr>
+        <w:t xml:space="preserve">achine </w:t>
+      </w:r>
+      <w:r>
+        <w:rPr>
+          <w:rFonts w:ascii="Tw Cen MT" w:hAnsi="Tw Cen MT"/>
+        </w:rPr>
+        <w:t>l</w:t>
+      </w:r>
+      <w:r>
+        <w:rPr>
+          <w:rFonts w:ascii="Tw Cen MT" w:hAnsi="Tw Cen MT"/>
+        </w:rPr>
+        <w:t xml:space="preserve">earning </w:t>
+      </w:r>
+      <w:r>
+        <w:rPr>
+          <w:rFonts w:ascii="Tw Cen MT" w:hAnsi="Tw Cen MT"/>
+        </w:rPr>
+        <w:t>e</w:t>
+      </w:r>
+      <w:r>
+        <w:rPr>
+          <w:rFonts w:ascii="Tw Cen MT" w:hAnsi="Tw Cen MT"/>
+        </w:rPr>
+        <w:t>cology project using Detectron2 to predict the location of tree crowns to improve estimates of carbon store in forests and other locations. Resulted in a scientific paper published in a variety of journals.</w:t>
+      </w:r>
+    </w:p>
+    <w:p>
+      <w:pPr>
+        <w:pStyle w:val="ListParagraph"/>
+        <w:numPr>
+          <w:ilvl w:val="0"/>
+          <w:numId w:val="5"/>
+        </w:numPr>
+        <w:rPr>
+          <w:rFonts w:ascii="Tw Cen MT" w:hAnsi="Tw Cen MT"/>
+          <w:u w:val="single"/>
+        </w:rPr>
+      </w:pPr>
+      <w:r>
+        <w:rPr>
+          <w:rFonts w:ascii="Tw Cen MT" w:hAnsi="Tw Cen MT"/>
+        </w:rPr>
+        <w:t>Software Engineer at Microsoft, 8-week virtual internship</w:t>
+      </w:r>
+      <w:r>
+        <w:rPr>
+          <w:rFonts w:ascii="Tw Cen MT" w:hAnsi="Tw Cen MT"/>
+        </w:rPr>
+        <w:t xml:space="preserve"> (2021)</w:t>
+      </w:r>
+      <w:r>
+        <w:rPr>
+          <w:rFonts w:ascii="Tw Cen MT" w:hAnsi="Tw Cen MT"/>
+        </w:rPr>
+        <w:t>, wrote</w:t>
+      </w:r>
+      <w:r>
+        <w:rPr>
+          <w:rFonts w:ascii="Tw Cen MT" w:hAnsi="Tw Cen MT"/>
+        </w:rPr>
+        <w:t xml:space="preserve"> </w:t>
+      </w:r>
+      <w:r>
+        <w:rPr>
+          <w:rFonts w:ascii="Tw Cen MT" w:hAnsi="Tw Cen MT"/>
+        </w:rPr>
+        <w:t>P</w:t>
+      </w:r>
+      <w:r>
+        <w:rPr>
+          <w:rFonts w:ascii="Tw Cen MT" w:hAnsi="Tw Cen MT"/>
+        </w:rPr>
+        <w:t xml:space="preserve">ython to improve the automation of </w:t>
+      </w:r>
+      <w:r>
+        <w:rPr>
+          <w:rFonts w:ascii="Tw Cen MT" w:hAnsi="Tw Cen MT"/>
+        </w:rPr>
+        <w:t>VM deployment and</w:t>
+      </w:r>
+      <w:r>
+        <w:rPr>
+          <w:rFonts w:ascii="Tw Cen MT" w:hAnsi="Tw Cen MT"/>
+        </w:rPr>
+        <w:t xml:space="preserve"> management f</w:t>
+      </w:r>
+      <w:r>
+        <w:rPr>
+          <w:rFonts w:ascii="Tw Cen MT" w:hAnsi="Tw Cen MT"/>
+        </w:rPr>
+        <w:t>or</w:t>
+      </w:r>
+      <w:r>
+        <w:rPr>
+          <w:rFonts w:ascii="Tw Cen MT" w:hAnsi="Tw Cen MT"/>
+        </w:rPr>
+        <w:t xml:space="preserve"> products in the telecoms sector.</w:t>
+      </w:r>
+    </w:p>
+    <w:p>
+      <w:pPr>
+        <w:rPr>
+          <w:rFonts w:ascii="Tw Cen MT" w:hAnsi="Tw Cen MT"/>
+          <w:b/>
+          <w:bCs/>
+          <w:sz w:val="24"/>
+          <w:szCs w:val="24"/>
+        </w:rPr>
+      </w:pPr>
+      <w:r>
+        <w:rPr>
+          <w:rFonts w:ascii="Tw Cen MT" w:hAnsi="Tw Cen MT"/>
+          <w:b/>
+          <w:noProof/>
+          <w:sz w:val="24"/>
+          <w:szCs w:val="24"/>
+        </w:rPr>
+        <mc:AlternateContent>
+          <mc:Choice Requires="wps">
+            <w:drawing>
+              <wp:anchor distT="0" distB="0" distL="114300" distR="114300" simplePos="0" relativeHeight="251672576" behindDoc="0" locked="0" layoutInCell="1" allowOverlap="1" wp14:anchorId="433A1D9C" wp14:editId="0B06B2D2">
+                <wp:simplePos x="0" y="0"/>
+                <wp:positionH relativeFrom="margin">
+                  <wp:align>left</wp:align>
+                </wp:positionH>
+                <wp:positionV relativeFrom="paragraph">
+                  <wp:posOffset>186690</wp:posOffset>
+                </wp:positionV>
+                <wp:extent cx="6007100" cy="0"/>
+                <wp:effectExtent l="0" t="0" r="0" b="0"/>
+                <wp:wrapNone/>
+                <wp:docPr id="610557234" name="Straight Connector 610557234"/>
+                <wp:cNvGraphicFramePr/>
+                <a:graphic xmlns:a="http://schemas.openxmlformats.org/drawingml/2006/main">
+                  <a:graphicData uri="http://schemas.microsoft.com/office/word/2010/wordprocessingShape">
+                    <wps:wsp>
+                      <wps:cNvCnPr/>
+                      <wps:spPr>
+                        <a:xfrm flipV="1">
+                          <a:off x="0" y="0"/>
+                          <a:ext cx="6007100" cy="0"/>
+                        </a:xfrm>
+                        <a:prstGeom prst="line">
+                          <a:avLst/>
+                        </a:prstGeom>
+                        <a:ln w="15875">
+                          <a:solidFill>
+                            <a:schemeClr val="tx1"/>
+                          </a:solidFill>
+                        </a:ln>
+                      </wps:spPr>
+                      <wps:style>
+                        <a:lnRef idx="1">
+                          <a:schemeClr val="accent1"/>
+                        </a:lnRef>
+                        <a:fillRef idx="0">
+                          <a:schemeClr val="accent1"/>
+                        </a:fillRef>
+                        <a:effectRef idx="0">
+                          <a:schemeClr val="accent1"/>
+                        </a:effectRef>
+                        <a:fontRef idx="minor">
+                          <a:schemeClr val="tx1"/>
+                        </a:fontRef>
+                      </wps:style>
+                      <wps:bodyPr/>
+                    </wps:wsp>
+                  </a:graphicData>
+                </a:graphic>
+                <wp14:sizeRelV relativeFrom="margin">
+                  <wp14:pctHeight>0</wp14:pctHeight>
+                </wp14:sizeRelV>
+              </wp:anchor>
+            </w:drawing>
+          </mc:Choice>
+          <mc:Fallback>
+            <w:pict>
+              <v:line w14:anchorId="09ADAC01" id="Straight Connector 610557234" o:spid="_x0000_s1026" style="position:absolute;flip:y;z-index:251672576;visibility:visible;mso-wrap-style:square;mso-height-percent:0;mso-wrap-distance-left:9pt;mso-wrap-distance-top:0;mso-wrap-distance-right:9pt;mso-wrap-distance-bottom:0;mso-position-horizontal:left;mso-position-horizontal-relative:margin;mso-position-vertical:absolute;mso-position-vertical-relative:text;mso-height-percent:0;mso-height-relative:margin" from="0,14.7pt" to="473pt,14.7pt" o:gfxdata="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" strokecolor="black [3213]" strokeweight="1.25pt">
+                <v:stroke joinstyle="miter"/>
+                <w10:wrap anchorx="margin"/>
+              </v:line>
+            </w:pict>
+          </mc:Fallback>
+        </mc:AlternateContent>
+      </w:r>
+      <w:r>
+        <w:rPr>
+          <w:rFonts w:ascii="Tw Cen MT" w:hAnsi="Tw Cen MT"/>
+          <w:b/>
+          <w:bCs/>
+          <w:sz w:val="24"/>
+          <w:szCs w:val="24"/>
+        </w:rPr>
+        <w:t>Other Experience</w:t>
+      </w:r>
+    </w:p>
+    <w:p>
+      <w:pPr>
+        <w:pStyle w:val="ListParagraph"/>
+        <w:numPr>
+          <w:ilvl w:val="0"/>
+          <w:numId w:val="5"/>
+        </w:numPr>
+        <w:rPr>
+          <w:rFonts w:ascii="Tw Cen MT" w:hAnsi="Tw Cen MT"/>
+          <w:u w:val="single"/>
+        </w:rPr>
+      </w:pPr>
+      <w:r>
+        <w:rPr>
+          <w:rFonts w:ascii="Tw Cen MT" w:hAnsi="Tw Cen MT"/>
+        </w:rPr>
+        <w:t xml:space="preserve">Restaurant manager </w:t>
+      </w:r>
+      <w:r>
+        <w:rPr>
+          <w:rFonts w:ascii="Tw Cen MT" w:hAnsi="Tw Cen MT"/>
+        </w:rPr>
+        <w:t xml:space="preserve">with Hotelplan </w:t>
+      </w:r>
+      <w:r>
+        <w:rPr>
+          <w:rFonts w:ascii="Tw Cen MT" w:hAnsi="Tw Cen MT"/>
+        </w:rPr>
+        <w:t xml:space="preserve">(2017-18) </w:t>
+      </w:r>
+      <w:r>
+        <w:rPr>
+          <w:rFonts w:ascii="Tw Cen MT" w:hAnsi="Tw Cen MT"/>
+        </w:rPr>
+        <w:t>during a</w:t>
+      </w:r>
+      <w:r>
+        <w:rPr>
+          <w:rFonts w:ascii="Tw Cen MT" w:hAnsi="Tw Cen MT"/>
+        </w:rPr>
+        <w:t xml:space="preserve"> winter</w:t>
+      </w:r>
+      <w:r>
+        <w:rPr>
+          <w:rFonts w:ascii="Tw Cen MT" w:hAnsi="Tw Cen MT"/>
+        </w:rPr>
+        <w:t xml:space="preserve"> ski</w:t>
+      </w:r>
+      <w:r>
+        <w:rPr>
+          <w:rFonts w:ascii="Tw Cen MT" w:hAnsi="Tw Cen MT"/>
+        </w:rPr>
+        <w:t xml:space="preserve"> season, managing 20 staff of varying ages.</w:t>
+      </w:r>
+      <w:r>
+        <w:rPr>
+          <w:rFonts w:ascii="Tw Cen MT" w:hAnsi="Tw Cen MT"/>
+        </w:rPr>
+        <w:t xml:space="preserve"> Achieved ‘Mountain Spirit Award’</w:t>
+      </w:r>
+      <w:r>
+        <w:rPr>
+          <w:rFonts w:ascii="Tw Cen MT" w:hAnsi="Tw Cen MT"/>
+        </w:rPr>
+        <w:t xml:space="preserve"> </w:t>
+      </w:r>
+      <w:r>
+        <w:rPr>
+          <w:rFonts w:ascii="Tw Cen MT" w:hAnsi="Tw Cen MT"/>
+        </w:rPr>
+        <w:t xml:space="preserve">out of </w:t>
+      </w:r>
+      <w:r>
+        <w:rPr>
+          <w:rFonts w:ascii="Tw Cen MT" w:hAnsi="Tw Cen MT"/>
+        </w:rPr>
+        <w:t>500 employees</w:t>
+      </w:r>
+      <w:r>
+        <w:rPr>
+          <w:rFonts w:ascii="Tw Cen MT" w:hAnsi="Tw Cen MT"/>
+        </w:rPr>
+        <w:t xml:space="preserve"> for performance</w:t>
+      </w:r>
+      <w:r>
+        <w:rPr>
+          <w:rFonts w:ascii="Tw Cen MT" w:hAnsi="Tw Cen MT"/>
+        </w:rPr>
+        <w:t xml:space="preserve">. </w:t>
+      </w:r>
+    </w:p>
+    <w:p>
+      <w:pPr>
+        <w:pStyle w:val="ListParagraph"/>
+        <w:numPr>
+          <w:ilvl w:val="0"/>
+          <w:numId w:val="5"/>
+        </w:numPr>
+        <w:rPr>
+          <w:rFonts w:ascii="Tw Cen MT" w:hAnsi="Tw Cen MT"/>
+        </w:rPr>
+      </w:pPr>
+      <w:r>
+        <w:rPr>
+          <w:rFonts w:ascii="Tw Cen MT" w:hAnsi="Tw Cen MT"/>
+        </w:rPr>
+        <w:t xml:space="preserve">Private tutor </w:t>
+      </w:r>
+      <w:r>
+        <w:rPr>
+          <w:rFonts w:ascii="Tw Cen MT" w:hAnsi="Tw Cen MT"/>
+        </w:rPr>
+        <w:t xml:space="preserve">and </w:t>
+      </w:r>
+      <w:r>
+        <w:rPr>
+          <w:rFonts w:ascii="Tw Cen MT" w:hAnsi="Tw Cen MT"/>
+        </w:rPr>
+        <w:t>Explore Learning Colchester Tutor</w:t>
+      </w:r>
+      <w:r>
+        <w:rPr>
+          <w:rFonts w:ascii="Tw Cen MT" w:hAnsi="Tw Cen MT"/>
+        </w:rPr>
+        <w:t xml:space="preserve"> (2017)</w:t>
+      </w:r>
+      <w:r>
+        <w:rPr>
+          <w:rFonts w:ascii="Tw Cen MT" w:hAnsi="Tw Cen MT"/>
+        </w:rPr>
+        <w:t xml:space="preserve"> in Maths</w:t>
+      </w:r>
+      <w:r>
+        <w:rPr>
+          <w:rFonts w:ascii="Tw Cen MT" w:hAnsi="Tw Cen MT"/>
+        </w:rPr>
+        <w:t>.</w:t>
+      </w:r>
+    </w:p>
+    <w:p>
+      <w:pPr>
+        <w:pStyle w:val="ListParagraph"/>
+        <w:numPr>
+          <w:ilvl w:val="0"/>
+          <w:numId w:val="5"/>
+        </w:numPr>
+        <w:rPr>
+          <w:rFonts w:ascii="Tw Cen MT" w:hAnsi="Tw Cen MT"/>
+          <w:u w:val="single"/>
+        </w:rPr>
+      </w:pPr>
+      <w:r>
+        <w:rPr>
+          <w:rFonts w:ascii="Tw Cen MT" w:hAnsi="Tw Cen MT"/>
+        </w:rPr>
+        <w:t>Team Leader for</w:t>
+      </w:r>
+      <w:r>
+        <w:rPr>
+          <w:rFonts w:ascii="Tw Cen MT" w:hAnsi="Tw Cen MT"/>
+        </w:rPr>
+        <w:t xml:space="preserve"> </w:t>
+      </w:r>
+      <w:hyperlink r:id="rId8" w:history="1">
         <w:r>
           <w:rPr>
             <w:rStyle w:val="Hyperlink"/>
@@ -1309,305 +1802,67 @@
         <w:rPr>
           <w:rFonts w:ascii="Tw Cen MT" w:hAnsi="Tw Cen MT"/>
         </w:rPr>
-        <w:t>2016), an i</w:t>
-      </w:r>
-      <w:r>
-        <w:rPr>
-          <w:rFonts w:ascii="Tw Cen MT" w:hAnsi="Tw Cen MT"/>
-        </w:rPr>
-        <w:t>nternational competition</w:t>
-      </w:r>
-      <w:r>
-        <w:rPr>
-          <w:rFonts w:ascii="Tw Cen MT" w:hAnsi="Tw Cen MT"/>
-        </w:rPr>
-        <w:t xml:space="preserve"> held by CERN. Our</w:t>
-      </w:r>
-      <w:r>
-        <w:rPr>
-          <w:rFonts w:ascii="Tw Cen MT" w:hAnsi="Tw Cen MT"/>
-        </w:rPr>
-        <w:t xml:space="preserve"> </w:t>
-      </w:r>
-      <w:r>
-        <w:rPr>
-          <w:rFonts w:ascii="Tw Cen MT" w:hAnsi="Tw Cen MT"/>
-        </w:rPr>
-        <w:t xml:space="preserve">winning proposal was an </w:t>
-      </w:r>
-      <w:r>
-        <w:rPr>
-          <w:rFonts w:ascii="Tw Cen MT" w:hAnsi="Tw Cen MT"/>
-        </w:rPr>
-        <w:t>experiment to</w:t>
-      </w:r>
-      <w:r>
-        <w:rPr>
-          <w:rFonts w:ascii="Tw Cen MT" w:hAnsi="Tw Cen MT"/>
-        </w:rPr>
-        <w:t xml:space="preserve"> investigate Einstein’s Special Theory of Relativity. </w:t>
-      </w:r>
-      <w:r>
-        <w:rPr>
-          <w:rFonts w:ascii="Tw Cen MT" w:hAnsi="Tw Cen MT"/>
-        </w:rPr>
-        <w:t>Subsequently c</w:t>
-      </w:r>
-      <w:r>
-        <w:rPr>
-          <w:rFonts w:ascii="Tw Cen MT" w:hAnsi="Tw Cen MT"/>
-        </w:rPr>
-        <w:t xml:space="preserve">ompleted data collection using a particle accelerator at CERN and </w:t>
-      </w:r>
-      <w:r>
-        <w:rPr>
-          <w:rFonts w:ascii="Tw Cen MT" w:hAnsi="Tw Cen MT"/>
-        </w:rPr>
-        <w:t>p</w:t>
-      </w:r>
-      <w:r>
-        <w:rPr>
-          <w:rFonts w:ascii="Tw Cen MT" w:hAnsi="Tw Cen MT"/>
-        </w:rPr>
-        <w:t xml:space="preserve">ublished </w:t>
-      </w:r>
-      <w:r>
-        <w:rPr>
-          <w:rFonts w:ascii="Tw Cen MT" w:hAnsi="Tw Cen MT"/>
-        </w:rPr>
-        <w:t xml:space="preserve">a </w:t>
-      </w:r>
-      <w:r>
-        <w:rPr>
-          <w:rFonts w:ascii="Tw Cen MT" w:hAnsi="Tw Cen MT"/>
-        </w:rPr>
-        <w:t>scientific paper in IOP Journal a</w:t>
-      </w:r>
-      <w:r>
-        <w:rPr>
-          <w:rFonts w:ascii="Tw Cen MT" w:hAnsi="Tw Cen MT"/>
-        </w:rPr>
-        <w:t xml:space="preserve">nd </w:t>
-      </w:r>
-      <w:r>
-        <w:rPr>
-          <w:rFonts w:ascii="Tw Cen MT" w:hAnsi="Tw Cen MT"/>
-        </w:rPr>
-        <w:t>on</w:t>
-      </w:r>
-      <w:r>
-        <w:rPr>
-          <w:rFonts w:ascii="Tw Cen MT" w:hAnsi="Tw Cen MT"/>
-        </w:rPr>
-        <w:t xml:space="preserve"> the</w:t>
-      </w:r>
-      <w:r>
-        <w:rPr>
-          <w:rFonts w:ascii="Tw Cen MT" w:hAnsi="Tw Cen MT"/>
-        </w:rPr>
-        <w:t xml:space="preserve"> CERN website</w:t>
-      </w:r>
-      <w:r>
-        <w:rPr>
-          <w:rFonts w:ascii="Tw Cen MT" w:hAnsi="Tw Cen MT"/>
-        </w:rPr>
-        <w:t>.</w:t>
-      </w:r>
-    </w:p>
-    <w:p>
-      <w:pPr>
-        <w:pStyle w:val="ListParagraph"/>
-        <w:numPr>
-          <w:ilvl w:val="0"/>
-          <w:numId w:val="5"/>
-        </w:numPr>
-        <w:rPr>
-          <w:rFonts w:ascii="Tw Cen MT" w:hAnsi="Tw Cen MT"/>
-          <w:u w:val="single"/>
-        </w:rPr>
-      </w:pPr>
-      <w:r>
-        <w:rPr>
-          <w:rFonts w:ascii="Tw Cen MT" w:hAnsi="Tw Cen MT"/>
-        </w:rPr>
-        <w:t xml:space="preserve">Worked on a </w:t>
-      </w:r>
-      <w:r>
-        <w:rPr>
-          <w:rFonts w:ascii="Tw Cen MT" w:hAnsi="Tw Cen MT"/>
-        </w:rPr>
-        <w:t>m</w:t>
-      </w:r>
-      <w:r>
-        <w:rPr>
-          <w:rFonts w:ascii="Tw Cen MT" w:hAnsi="Tw Cen MT"/>
-        </w:rPr>
-        <w:t xml:space="preserve">achine </w:t>
-      </w:r>
-      <w:r>
-        <w:rPr>
-          <w:rFonts w:ascii="Tw Cen MT" w:hAnsi="Tw Cen MT"/>
-        </w:rPr>
-        <w:t>l</w:t>
-      </w:r>
-      <w:r>
-        <w:rPr>
-          <w:rFonts w:ascii="Tw Cen MT" w:hAnsi="Tw Cen MT"/>
-        </w:rPr>
-        <w:t xml:space="preserve">earning </w:t>
-      </w:r>
-      <w:r>
-        <w:rPr>
-          <w:rFonts w:ascii="Tw Cen MT" w:hAnsi="Tw Cen MT"/>
-        </w:rPr>
-        <w:t>e</w:t>
-      </w:r>
-      <w:r>
-        <w:rPr>
-          <w:rFonts w:ascii="Tw Cen MT" w:hAnsi="Tw Cen MT"/>
-        </w:rPr>
-        <w:t>cology project</w:t>
-      </w:r>
-      <w:r>
-        <w:rPr>
-          <w:rFonts w:ascii="Tw Cen MT" w:hAnsi="Tw Cen MT"/>
-        </w:rPr>
-        <w:t xml:space="preserve"> (2022)</w:t>
-      </w:r>
-      <w:r>
-        <w:rPr>
-          <w:rFonts w:ascii="Tw Cen MT" w:hAnsi="Tw Cen MT"/>
-        </w:rPr>
-        <w:t xml:space="preserve"> using Detectron2 to predict the location of tree crowns to improve estimates of carbon store in forests and other locations</w:t>
-      </w:r>
-      <w:r>
-        <w:rPr>
-          <w:rFonts w:ascii="Tw Cen MT" w:hAnsi="Tw Cen MT"/>
-        </w:rPr>
-        <w:t>. Resulted in a scientific paper published in a variety of journals</w:t>
-      </w:r>
-      <w:r>
-        <w:rPr>
-          <w:rFonts w:ascii="Tw Cen MT" w:hAnsi="Tw Cen MT"/>
-        </w:rPr>
-        <w:t>.</w:t>
-      </w:r>
-    </w:p>
-    <w:p>
-      <w:pPr>
-        <w:pStyle w:val="ListParagraph"/>
-        <w:numPr>
-          <w:ilvl w:val="0"/>
-          <w:numId w:val="5"/>
-        </w:numPr>
-        <w:rPr>
-          <w:rFonts w:ascii="Tw Cen MT" w:hAnsi="Tw Cen MT"/>
-          <w:u w:val="single"/>
-        </w:rPr>
-      </w:pPr>
-      <w:r>
-        <w:rPr>
-          <w:rFonts w:ascii="Tw Cen MT" w:hAnsi="Tw Cen MT"/>
-        </w:rPr>
-        <w:t xml:space="preserve">Restaurant manager </w:t>
-      </w:r>
-      <w:r>
-        <w:rPr>
-          <w:rFonts w:ascii="Tw Cen MT" w:hAnsi="Tw Cen MT"/>
-        </w:rPr>
-        <w:t xml:space="preserve">with </w:t>
-      </w:r>
-      <w:proofErr w:type="spellStart"/>
-      <w:r>
-        <w:rPr>
-          <w:rFonts w:ascii="Tw Cen MT" w:hAnsi="Tw Cen MT"/>
-        </w:rPr>
-        <w:t>Hotelplan</w:t>
-      </w:r>
-      <w:proofErr w:type="spellEnd"/>
-      <w:r>
-        <w:rPr>
-          <w:rFonts w:ascii="Tw Cen MT" w:hAnsi="Tw Cen MT"/>
-        </w:rPr>
-        <w:t xml:space="preserve"> </w:t>
-      </w:r>
-      <w:r>
-        <w:rPr>
-          <w:rFonts w:ascii="Tw Cen MT" w:hAnsi="Tw Cen MT"/>
-        </w:rPr>
-        <w:t xml:space="preserve">(2017-18) </w:t>
-      </w:r>
-      <w:r>
-        <w:rPr>
-          <w:rFonts w:ascii="Tw Cen MT" w:hAnsi="Tw Cen MT"/>
-        </w:rPr>
-        <w:t>during a</w:t>
-      </w:r>
-      <w:r>
-        <w:rPr>
-          <w:rFonts w:ascii="Tw Cen MT" w:hAnsi="Tw Cen MT"/>
-        </w:rPr>
-        <w:t xml:space="preserve"> winter season, managing 20 staff of varying ages.</w:t>
-      </w:r>
-      <w:r>
-        <w:rPr>
-          <w:rFonts w:ascii="Tw Cen MT" w:hAnsi="Tw Cen MT"/>
-        </w:rPr>
-        <w:t xml:space="preserve"> Achieved ‘Mountain Spirit Award’</w:t>
-      </w:r>
-      <w:r>
-        <w:rPr>
-          <w:rFonts w:ascii="Tw Cen MT" w:hAnsi="Tw Cen MT"/>
-        </w:rPr>
-        <w:t xml:space="preserve"> </w:t>
-      </w:r>
-      <w:r>
-        <w:rPr>
-          <w:rFonts w:ascii="Tw Cen MT" w:hAnsi="Tw Cen MT"/>
-        </w:rPr>
-        <w:t xml:space="preserve">out of </w:t>
-      </w:r>
-      <w:r>
-        <w:rPr>
-          <w:rFonts w:ascii="Tw Cen MT" w:hAnsi="Tw Cen MT"/>
-        </w:rPr>
-        <w:t>500 employees</w:t>
-      </w:r>
-      <w:r>
-        <w:rPr>
-          <w:rFonts w:ascii="Tw Cen MT" w:hAnsi="Tw Cen MT"/>
-        </w:rPr>
-        <w:t xml:space="preserve"> for performance</w:t>
-      </w:r>
-      <w:r>
-        <w:rPr>
-          <w:rFonts w:ascii="Tw Cen MT" w:hAnsi="Tw Cen MT"/>
-        </w:rPr>
-        <w:t xml:space="preserve">. </w:t>
-      </w:r>
-    </w:p>
-    <w:p>
-      <w:pPr>
-        <w:pStyle w:val="ListParagraph"/>
-        <w:numPr>
-          <w:ilvl w:val="0"/>
-          <w:numId w:val="5"/>
-        </w:numPr>
-        <w:rPr>
-          <w:rFonts w:ascii="Tw Cen MT" w:hAnsi="Tw Cen MT"/>
-        </w:rPr>
-      </w:pPr>
-      <w:r>
-        <w:rPr>
-          <w:rFonts w:ascii="Tw Cen MT" w:hAnsi="Tw Cen MT"/>
-        </w:rPr>
-        <w:t>Private tutoring for Maths as well as Explore Learning Colchester Tutor</w:t>
-      </w:r>
-      <w:r>
-        <w:rPr>
-          <w:rFonts w:ascii="Tw Cen MT" w:hAnsi="Tw Cen MT"/>
-        </w:rPr>
-        <w:t xml:space="preserve"> (2017).</w:t>
+        <w:t xml:space="preserve">2016), </w:t>
+      </w:r>
+      <w:r>
+        <w:rPr>
+          <w:rFonts w:ascii="Tw Cen MT" w:hAnsi="Tw Cen MT"/>
+        </w:rPr>
+        <w:t xml:space="preserve">led the winning team for </w:t>
+      </w:r>
+      <w:r>
+        <w:rPr>
+          <w:rFonts w:ascii="Tw Cen MT" w:hAnsi="Tw Cen MT"/>
+        </w:rPr>
+        <w:t xml:space="preserve">an international competition held by CERN. </w:t>
+      </w:r>
+      <w:r>
+        <w:rPr>
+          <w:rFonts w:ascii="Tw Cen MT" w:hAnsi="Tw Cen MT"/>
+        </w:rPr>
+        <w:t xml:space="preserve">We </w:t>
+      </w:r>
+      <w:r>
+        <w:rPr>
+          <w:rFonts w:ascii="Tw Cen MT" w:hAnsi="Tw Cen MT"/>
+        </w:rPr>
+        <w:t>propos</w:t>
+      </w:r>
+      <w:r>
+        <w:rPr>
+          <w:rFonts w:ascii="Tw Cen MT" w:hAnsi="Tw Cen MT"/>
+        </w:rPr>
+        <w:t>ed</w:t>
+      </w:r>
+      <w:r>
+        <w:rPr>
+          <w:rFonts w:ascii="Tw Cen MT" w:hAnsi="Tw Cen MT"/>
+        </w:rPr>
+        <w:t xml:space="preserve"> an experiment to investigate Einstein’s Special Theory of Relativity</w:t>
+      </w:r>
+      <w:r>
+        <w:rPr>
+          <w:rFonts w:ascii="Tw Cen MT" w:hAnsi="Tw Cen MT"/>
+        </w:rPr>
+        <w:t xml:space="preserve"> and then </w:t>
+      </w:r>
+      <w:r>
+        <w:rPr>
+          <w:rFonts w:ascii="Tw Cen MT" w:hAnsi="Tw Cen MT"/>
+        </w:rPr>
+        <w:t xml:space="preserve">completed </w:t>
+      </w:r>
+      <w:r>
+        <w:rPr>
+          <w:rFonts w:ascii="Tw Cen MT" w:hAnsi="Tw Cen MT"/>
+        </w:rPr>
+        <w:t xml:space="preserve">the </w:t>
+      </w:r>
+      <w:r>
+        <w:rPr>
+          <w:rFonts w:ascii="Tw Cen MT" w:hAnsi="Tw Cen MT"/>
+        </w:rPr>
+        <w:t>data collection using a particle accelerator at CERN and published a scientific paper in IOP Journal.</w:t>
       </w:r>
     </w:p>
     <w:p>
@@ -1702,26 +1957,6 @@
           <w:szCs w:val="24"/>
         </w:rPr>
         <w:t>Volunteer Work:</w:t>
-      </w:r>
-    </w:p>
-    <w:p>
-      <w:pPr>
-        <w:pStyle w:val="ListParagraph"/>
-        <w:numPr>
-          <w:ilvl w:val="0"/>
-          <w:numId w:val="6"/>
-        </w:numPr>
-        <w:rPr>
-          <w:rFonts w:ascii="Tw Cen MT" w:hAnsi="Tw Cen MT"/>
-          <w:szCs w:val="20"/>
-        </w:rPr>
-      </w:pPr>
-      <w:r>
-        <w:rPr>
-          <w:rFonts w:ascii="Tw Cen MT" w:hAnsi="Tw Cen MT"/>
-          <w:szCs w:val="20"/>
-        </w:rPr>
-        <w:t>Shark Trust- machine learning and data management for an outreach project.</w:t>
       </w:r>
     </w:p>
     <w:p>
@@ -3173,6 +3408,119 @@
     </w:lvl>
   </w:abstractNum>
   <w:abstractNum w:abstractNumId="7" w15:restartNumberingAfterBreak="0">
+    <w:nsid w:val="5B8678B7"/>
+    <w:multiLevelType w:val="hybridMultilevel"/>
+    <w:tmpl w:val="CCB0387A"/>
+    <w:lvl w:ilvl="0" w:tplc="08090001">
+      <w:start w:val="1"/>
+      <w:numFmt w:val="bullet"/>
+      <w:lvlText w:val=""/>
+      <w:lvlJc w:val="left"/>
+      <w:pPr>
+        <w:ind w:left="720" w:hanging="360"/>
+      </w:pPr>
+      <w:rPr>
+        <w:rFonts w:ascii="Symbol" w:hAnsi="Symbol" w:hint="default"/>
+      </w:rPr>
+    </w:lvl>
+    <w:lvl w:ilvl="1" w:tplc="08090003" w:tentative="1">
+      <w:start w:val="1"/>
+      <w:numFmt w:val="bullet"/>
+      <w:lvlText w:val="o"/>
+      <w:lvlJc w:val="left"/>
+      <w:pPr>
+        <w:ind w:left="1440" w:hanging="360"/>
+      </w:pPr>
+      <w:rPr>
+        <w:rFonts w:ascii="Courier New" w:hAnsi="Courier New" w:cs="Courier New" w:hint="default"/>
+      </w:rPr>
+    </w:lvl>
+    <w:lvl w:ilvl="2" w:tplc="08090005" w:tentative="1">
+      <w:start w:val="1"/>
+      <w:numFmt w:val="bullet"/>
+      <w:lvlText w:val=""/>
+      <w:lvlJc w:val="left"/>
+      <w:pPr>
+        <w:ind w:left="2160" w:hanging="360"/>
+      </w:pPr>
+      <w:rPr>
+        <w:rFonts w:ascii="Wingdings" w:hAnsi="Wingdings" w:hint="default"/>
+      </w:rPr>
+    </w:lvl>
+    <w:lvl w:ilvl="3" w:tplc="08090001" w:tentative="1">
+      <w:start w:val="1"/>
+      <w:numFmt w:val="bullet"/>
+      <w:lvlText w:val=""/>
+      <w:lvlJc w:val="left"/>
+      <w:pPr>
+        <w:ind w:left="2880" w:hanging="360"/>
+      </w:pPr>
+      <w:rPr>
+        <w:rFonts w:ascii="Symbol" w:hAnsi="Symbol" w:hint="default"/>
+      </w:rPr>
+    </w:lvl>
+    <w:lvl w:ilvl="4" w:tplc="08090003" w:tentative="1">
+      <w:start w:val="1"/>
+      <w:numFmt w:val="bullet"/>
+      <w:lvlText w:val="o"/>
+      <w:lvlJc w:val="left"/>
+      <w:pPr>
+        <w:ind w:left="3600" w:hanging="360"/>
+      </w:pPr>
+      <w:rPr>
+        <w:rFonts w:ascii="Courier New" w:hAnsi="Courier New" w:cs="Courier New" w:hint="default"/>
+      </w:rPr>
+    </w:lvl>
+    <w:lvl w:ilvl="5" w:tplc="08090005" w:tentative="1">
+      <w:start w:val="1"/>
+      <w:numFmt w:val="bullet"/>
+      <w:lvlText w:val=""/>
+      <w:lvlJc w:val="left"/>
+      <w:pPr>
+        <w:ind w:left="4320" w:hanging="360"/>
+      </w:pPr>
+      <w:rPr>
+        <w:rFonts w:ascii="Wingdings" w:hAnsi="Wingdings" w:hint="default"/>
+      </w:rPr>
+    </w:lvl>
+    <w:lvl w:ilvl="6" w:tplc="08090001" w:tentative="1">
+      <w:start w:val="1"/>
+      <w:numFmt w:val="bullet"/>
+      <w:lvlText w:val=""/>
+      <w:lvlJc w:val="left"/>
+      <w:pPr>
+        <w:ind w:left="5040" w:hanging="360"/>
+      </w:pPr>
+      <w:rPr>
+        <w:rFonts w:ascii="Symbol" w:hAnsi="Symbol" w:hint="default"/>
+      </w:rPr>
+    </w:lvl>
+    <w:lvl w:ilvl="7" w:tplc="08090003" w:tentative="1">
+      <w:start w:val="1"/>
+      <w:numFmt w:val="bullet"/>
+      <w:lvlText w:val="o"/>
+      <w:lvlJc w:val="left"/>
+      <w:pPr>
+        <w:ind w:left="5760" w:hanging="360"/>
+      </w:pPr>
+      <w:rPr>
+        <w:rFonts w:ascii="Courier New" w:hAnsi="Courier New" w:cs="Courier New" w:hint="default"/>
+      </w:rPr>
+    </w:lvl>
+    <w:lvl w:ilvl="8" w:tplc="08090005" w:tentative="1">
+      <w:start w:val="1"/>
+      <w:numFmt w:val="bullet"/>
+      <w:lvlText w:val=""/>
+      <w:lvlJc w:val="left"/>
+      <w:pPr>
+        <w:ind w:left="6480" w:hanging="360"/>
+      </w:pPr>
+      <w:rPr>
+        <w:rFonts w:ascii="Wingdings" w:hAnsi="Wingdings" w:hint="default"/>
+      </w:rPr>
+    </w:lvl>
+  </w:abstractNum>
+  <w:abstractNum w:abstractNumId="8" w15:restartNumberingAfterBreak="0">
     <w:nsid w:val="6A852F6E"/>
     <w:multiLevelType w:val="hybridMultilevel"/>
     <w:tmpl w:val="D3BA0334"/>
@@ -3298,7 +3646,7 @@
     <w:abstractNumId w:val="6"/>
   </w:num>
   <w:num w:numId="5" w16cid:durableId="908687168">
-    <w:abstractNumId w:val="7"/>
+    <w:abstractNumId w:val="8"/>
   </w:num>
   <w:num w:numId="6" w16cid:durableId="1594586417">
     <w:abstractNumId w:val="0"/>
@@ -3308,6 +3656,9 @@
   </w:num>
   <w:num w:numId="8" w16cid:durableId="789591293">
     <w:abstractNumId w:val="2"/>
+  </w:num>
+  <w:num w:numId="9" w16cid:durableId="969895271">
+    <w:abstractNumId w:val="7"/>
   </w:num>
 </w:numbering>
 </file>

</xml_diff>

<commit_message>
Include profile in CV
</commit_message>
<xml_diff>
--- a/public/CV.docx
+++ b/public/CV.docx
@@ -72,16 +72,6 @@
           <w:tcPr>
             <w:tcW w:w="4757" w:type="dxa"/>
           </w:tcPr>
-          <w:p>
-            <w:pPr>
-              <w:spacing w:after="0"/>
-              <w:rPr>
-                <w:rFonts w:ascii="Tw Cen MT" w:hAnsi="Tw Cen MT"/>
-                <w:sz w:val="6"/>
-                <w:szCs w:val="4"/>
-              </w:rPr>
-            </w:pPr>
-          </w:p>
           <w:p>
             <w:pPr>
               <w:spacing w:after="0"/>
@@ -203,6 +193,32 @@
               <w:t>7504 456577</w:t>
             </w:r>
           </w:p>
+          <w:p>
+            <w:pPr>
+              <w:spacing w:after="0"/>
+              <w:rPr>
+                <w:rFonts w:ascii="Tw Cen MT" w:hAnsi="Tw Cen MT"/>
+                <w:sz w:val="24"/>
+              </w:rPr>
+            </w:pPr>
+            <w:r>
+              <w:rPr>
+                <w:rFonts w:ascii="Tw Cen MT" w:hAnsi="Tw Cen MT"/>
+                <w:sz w:val="24"/>
+              </w:rPr>
+              <w:t xml:space="preserve">LinkedIn          </w:t>
+            </w:r>
+            <w:hyperlink r:id="rId6" w:history="1">
+              <w:r>
+                <w:rPr>
+                  <w:rStyle w:val="Hyperlink"/>
+                  <w:rFonts w:ascii="Tw Cen MT" w:hAnsi="Tw Cen MT"/>
+                  <w:sz w:val="24"/>
+                </w:rPr>
+                <w:t>James Hirst</w:t>
+              </w:r>
+            </w:hyperlink>
+          </w:p>
         </w:tc>
       </w:tr>
     </w:tbl>
@@ -236,7 +252,657 @@
         <mc:AlternateContent>
           <mc:Choice Requires="wps">
             <w:drawing>
-              <wp:anchor distT="0" distB="0" distL="114300" distR="114300" simplePos="0" relativeHeight="251668480" behindDoc="0" locked="0" layoutInCell="1" allowOverlap="1" wp14:anchorId="79F2B61C" wp14:editId="6F4146C8">
+              <wp:anchor distT="0" distB="0" distL="114300" distR="114300" simplePos="0" relativeHeight="251676672" behindDoc="0" locked="0" layoutInCell="1" allowOverlap="1" wp14:anchorId="59052C27" wp14:editId="2516EE9A">
+                <wp:simplePos x="0" y="0"/>
+                <wp:positionH relativeFrom="column">
+                  <wp:posOffset>5715</wp:posOffset>
+                </wp:positionH>
+                <wp:positionV relativeFrom="paragraph">
+                  <wp:posOffset>188112</wp:posOffset>
+                </wp:positionV>
+                <wp:extent cx="6007100" cy="0"/>
+                <wp:effectExtent l="0" t="0" r="0" b="0"/>
+                <wp:wrapNone/>
+                <wp:docPr id="4" name="Straight Connector 4"/>
+                <wp:cNvGraphicFramePr/>
+                <a:graphic xmlns:a="http://schemas.openxmlformats.org/drawingml/2006/main">
+                  <a:graphicData uri="http://schemas.microsoft.com/office/word/2010/wordprocessingShape">
+                    <wps:wsp>
+                      <wps:cNvCnPr/>
+                      <wps:spPr>
+                        <a:xfrm flipV="1">
+                          <a:off x="0" y="0"/>
+                          <a:ext cx="6007100" cy="0"/>
+                        </a:xfrm>
+                        <a:prstGeom prst="line">
+                          <a:avLst/>
+                        </a:prstGeom>
+                        <a:ln w="15875">
+                          <a:solidFill>
+                            <a:schemeClr val="tx1"/>
+                          </a:solidFill>
+                        </a:ln>
+                      </wps:spPr>
+                      <wps:style>
+                        <a:lnRef idx="1">
+                          <a:schemeClr val="accent1"/>
+                        </a:lnRef>
+                        <a:fillRef idx="0">
+                          <a:schemeClr val="accent1"/>
+                        </a:fillRef>
+                        <a:effectRef idx="0">
+                          <a:schemeClr val="accent1"/>
+                        </a:effectRef>
+                        <a:fontRef idx="minor">
+                          <a:schemeClr val="tx1"/>
+                        </a:fontRef>
+                      </wps:style>
+                      <wps:bodyPr/>
+                    </wps:wsp>
+                  </a:graphicData>
+                </a:graphic>
+                <wp14:sizeRelV relativeFrom="margin">
+                  <wp14:pctHeight>0</wp14:pctHeight>
+                </wp14:sizeRelV>
+              </wp:anchor>
+            </w:drawing>
+          </mc:Choice>
+          <mc:Fallback>
+            <w:pict>
+              <v:line w14:anchorId="4EC38FA6" id="Straight Connector 4" o:spid="_x0000_s1026" style="position:absolute;flip:y;z-index:251676672;visibility:visible;mso-wrap-style:square;mso-height-percent:0;mso-wrap-distance-left:9pt;mso-wrap-distance-top:0;mso-wrap-distance-right:9pt;mso-wrap-distance-bottom:0;mso-position-horizontal:absolute;mso-position-horizontal-relative:text;mso-position-vertical:absolute;mso-position-vertical-relative:text;mso-height-percent:0;mso-height-relative:margin" from=".45pt,14.8pt" to="473.45pt,14.8pt" o:gfxdata="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" strokecolor="black [3213]" strokeweight="1.25pt">
+                <v:stroke joinstyle="miter"/>
+              </v:line>
+            </w:pict>
+          </mc:Fallback>
+        </mc:AlternateContent>
+      </w:r>
+      <w:r>
+        <w:rPr>
+          <w:rFonts w:ascii="Tw Cen MT" w:hAnsi="Tw Cen MT"/>
+          <w:b/>
+          <w:sz w:val="24"/>
+          <w:szCs w:val="24"/>
+        </w:rPr>
+        <w:t>Profile</w:t>
+      </w:r>
+      <w:r>
+        <w:rPr>
+          <w:rFonts w:ascii="Tw Cen MT" w:hAnsi="Tw Cen MT"/>
+          <w:b/>
+          <w:sz w:val="24"/>
+          <w:szCs w:val="24"/>
+        </w:rPr>
+        <w:t>:</w:t>
+      </w:r>
+    </w:p>
+    <w:p>
+      <w:pPr>
+        <w:rPr>
+          <w:rFonts w:ascii="Tw Cen MT" w:hAnsi="Tw Cen MT"/>
+        </w:rPr>
+      </w:pPr>
+      <w:r>
+        <w:rPr>
+          <w:rFonts w:ascii="Tw Cen MT" w:hAnsi="Tw Cen MT"/>
+        </w:rPr>
+        <w:t>Software Engineer with Python and Rust expertise, and experience in developing robust applications on Azure using Kubernetes. Skilled in communication and presentation, and passionate about climate tech solutions.</w:t>
+      </w:r>
+    </w:p>
+    <w:p>
+      <w:pPr>
+        <w:rPr>
+          <w:rFonts w:ascii="Tw Cen MT" w:hAnsi="Tw Cen MT"/>
+          <w:b/>
+          <w:sz w:val="26"/>
+          <w:szCs w:val="26"/>
+        </w:rPr>
+      </w:pPr>
+      <w:r>
+        <w:rPr>
+          <w:rFonts w:ascii="Tw Cen MT" w:hAnsi="Tw Cen MT"/>
+          <w:b/>
+          <w:noProof/>
+          <w:sz w:val="24"/>
+          <w:szCs w:val="24"/>
+        </w:rPr>
+        <mc:AlternateContent>
+          <mc:Choice Requires="wps">
+            <w:drawing>
+              <wp:anchor distT="0" distB="0" distL="114300" distR="114300" simplePos="0" relativeHeight="251674624" behindDoc="0" locked="0" layoutInCell="1" allowOverlap="1" wp14:anchorId="06D268AE" wp14:editId="7561000C">
+                <wp:simplePos x="0" y="0"/>
+                <wp:positionH relativeFrom="column">
+                  <wp:posOffset>979</wp:posOffset>
+                </wp:positionH>
+                <wp:positionV relativeFrom="paragraph">
+                  <wp:posOffset>189865</wp:posOffset>
+                </wp:positionV>
+                <wp:extent cx="6007100" cy="0"/>
+                <wp:effectExtent l="0" t="0" r="0" b="0"/>
+                <wp:wrapNone/>
+                <wp:docPr id="3" name="Straight Connector 3"/>
+                <wp:cNvGraphicFramePr/>
+                <a:graphic xmlns:a="http://schemas.openxmlformats.org/drawingml/2006/main">
+                  <a:graphicData uri="http://schemas.microsoft.com/office/word/2010/wordprocessingShape">
+                    <wps:wsp>
+                      <wps:cNvCnPr/>
+                      <wps:spPr>
+                        <a:xfrm flipV="1">
+                          <a:off x="0" y="0"/>
+                          <a:ext cx="6007100" cy="0"/>
+                        </a:xfrm>
+                        <a:prstGeom prst="line">
+                          <a:avLst/>
+                        </a:prstGeom>
+                        <a:ln w="15875">
+                          <a:solidFill>
+                            <a:schemeClr val="tx1"/>
+                          </a:solidFill>
+                        </a:ln>
+                      </wps:spPr>
+                      <wps:style>
+                        <a:lnRef idx="1">
+                          <a:schemeClr val="accent1"/>
+                        </a:lnRef>
+                        <a:fillRef idx="0">
+                          <a:schemeClr val="accent1"/>
+                        </a:fillRef>
+                        <a:effectRef idx="0">
+                          <a:schemeClr val="accent1"/>
+                        </a:effectRef>
+                        <a:fontRef idx="minor">
+                          <a:schemeClr val="tx1"/>
+                        </a:fontRef>
+                      </wps:style>
+                      <wps:bodyPr/>
+                    </wps:wsp>
+                  </a:graphicData>
+                </a:graphic>
+                <wp14:sizeRelV relativeFrom="margin">
+                  <wp14:pctHeight>0</wp14:pctHeight>
+                </wp14:sizeRelV>
+              </wp:anchor>
+            </w:drawing>
+          </mc:Choice>
+          <mc:Fallback>
+            <w:pict>
+              <v:line w14:anchorId="18941E32" id="Straight Connector 3" o:spid="_x0000_s1026" style="position:absolute;flip:y;z-index:251674624;visibility:visible;mso-wrap-style:square;mso-height-percent:0;mso-wrap-distance-left:9pt;mso-wrap-distance-top:0;mso-wrap-distance-right:9pt;mso-wrap-distance-bottom:0;mso-position-horizontal:absolute;mso-position-horizontal-relative:text;mso-position-vertical:absolute;mso-position-vertical-relative:text;mso-height-percent:0;mso-height-relative:margin" from=".1pt,14.95pt" to="473.1pt,14.95pt" o:gfxdata="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" strokecolor="black [3213]" strokeweight="1.25pt">
+                <v:stroke joinstyle="miter"/>
+              </v:line>
+            </w:pict>
+          </mc:Fallback>
+        </mc:AlternateContent>
+      </w:r>
+      <w:r>
+        <w:rPr>
+          <w:rFonts w:ascii="Tw Cen MT" w:hAnsi="Tw Cen MT"/>
+          <w:b/>
+          <w:noProof/>
+          <w:sz w:val="24"/>
+          <w:szCs w:val="24"/>
+        </w:rPr>
+        <w:t>Software</w:t>
+      </w:r>
+      <w:r>
+        <w:rPr>
+          <w:rFonts w:ascii="Tw Cen MT" w:hAnsi="Tw Cen MT"/>
+          <w:b/>
+          <w:sz w:val="24"/>
+          <w:szCs w:val="24"/>
+        </w:rPr>
+        <w:t xml:space="preserve"> Experience:</w:t>
+      </w:r>
+    </w:p>
+    <w:p>
+      <w:pPr>
+        <w:pStyle w:val="ListParagraph"/>
+        <w:numPr>
+          <w:ilvl w:val="0"/>
+          <w:numId w:val="5"/>
+        </w:numPr>
+        <w:rPr>
+          <w:rFonts w:ascii="Tw Cen MT" w:hAnsi="Tw Cen MT"/>
+          <w:u w:val="single"/>
+        </w:rPr>
+      </w:pPr>
+      <w:r>
+        <w:rPr>
+          <w:rFonts w:ascii="Tw Cen MT" w:hAnsi="Tw Cen MT"/>
+        </w:rPr>
+        <w:t xml:space="preserve">Software Engineer, Microsoft (Sep 2022-Present) </w:t>
+      </w:r>
+    </w:p>
+    <w:p>
+      <w:pPr>
+        <w:pStyle w:val="ListParagraph"/>
+        <w:numPr>
+          <w:ilvl w:val="1"/>
+          <w:numId w:val="5"/>
+        </w:numPr>
+        <w:rPr>
+          <w:rFonts w:ascii="Tw Cen MT" w:hAnsi="Tw Cen MT"/>
+          <w:u w:val="single"/>
+        </w:rPr>
+      </w:pPr>
+      <w:r>
+        <w:rPr>
+          <w:rFonts w:ascii="Tw Cen MT" w:hAnsi="Tw Cen MT"/>
+        </w:rPr>
+        <w:t>Developed a Rust based solution to configuration translation with an extensive testing framework.</w:t>
+      </w:r>
+    </w:p>
+    <w:p>
+      <w:pPr>
+        <w:pStyle w:val="ListParagraph"/>
+        <w:numPr>
+          <w:ilvl w:val="1"/>
+          <w:numId w:val="5"/>
+        </w:numPr>
+        <w:rPr>
+          <w:rFonts w:ascii="Tw Cen MT" w:hAnsi="Tw Cen MT"/>
+          <w:u w:val="single"/>
+        </w:rPr>
+      </w:pPr>
+      <w:r>
+        <w:rPr>
+          <w:rFonts w:ascii="Tw Cen MT" w:hAnsi="Tw Cen MT"/>
+        </w:rPr>
+        <w:t>D</w:t>
+      </w:r>
+      <w:r>
+        <w:rPr>
+          <w:rFonts w:ascii="Tw Cen MT" w:hAnsi="Tw Cen MT"/>
+        </w:rPr>
+        <w:t>eploy</w:t>
+      </w:r>
+      <w:r>
+        <w:rPr>
+          <w:rFonts w:ascii="Tw Cen MT" w:hAnsi="Tw Cen MT"/>
+        </w:rPr>
+        <w:t>ed</w:t>
+      </w:r>
+      <w:r>
+        <w:rPr>
+          <w:rFonts w:ascii="Tw Cen MT" w:hAnsi="Tw Cen MT"/>
+        </w:rPr>
+        <w:t xml:space="preserve"> a voicemail solution</w:t>
+      </w:r>
+      <w:r>
+        <w:rPr>
+          <w:rFonts w:ascii="Tw Cen MT" w:hAnsi="Tw Cen MT"/>
+        </w:rPr>
+        <w:t xml:space="preserve"> on Azure</w:t>
+      </w:r>
+      <w:r>
+        <w:rPr>
+          <w:rFonts w:ascii="Tw Cen MT" w:hAnsi="Tw Cen MT"/>
+        </w:rPr>
+        <w:t xml:space="preserve"> for a large telco</w:t>
+      </w:r>
+      <w:r>
+        <w:rPr>
+          <w:rFonts w:ascii="Tw Cen MT" w:hAnsi="Tw Cen MT"/>
+        </w:rPr>
+        <w:t xml:space="preserve"> u</w:t>
+      </w:r>
+      <w:r>
+        <w:rPr>
+          <w:rFonts w:ascii="Tw Cen MT" w:hAnsi="Tw Cen MT"/>
+        </w:rPr>
+        <w:t>s</w:t>
+      </w:r>
+      <w:r>
+        <w:rPr>
+          <w:rFonts w:ascii="Tw Cen MT" w:hAnsi="Tw Cen MT"/>
+        </w:rPr>
+        <w:t xml:space="preserve">ing </w:t>
+      </w:r>
+      <w:r>
+        <w:rPr>
+          <w:rFonts w:ascii="Tw Cen MT" w:hAnsi="Tw Cen MT"/>
+        </w:rPr>
+        <w:t xml:space="preserve">Kubernetes </w:t>
+      </w:r>
+      <w:r>
+        <w:rPr>
+          <w:rFonts w:ascii="Tw Cen MT" w:hAnsi="Tw Cen MT"/>
+        </w:rPr>
+        <w:t>clusters.</w:t>
+      </w:r>
+    </w:p>
+    <w:p>
+      <w:pPr>
+        <w:pStyle w:val="ListParagraph"/>
+        <w:numPr>
+          <w:ilvl w:val="1"/>
+          <w:numId w:val="5"/>
+        </w:numPr>
+        <w:rPr>
+          <w:rFonts w:ascii="Tw Cen MT" w:hAnsi="Tw Cen MT"/>
+        </w:rPr>
+      </w:pPr>
+      <w:r>
+        <w:rPr>
+          <w:rFonts w:ascii="Tw Cen MT" w:hAnsi="Tw Cen MT"/>
+        </w:rPr>
+        <w:t xml:space="preserve">Wrote and owned an </w:t>
+      </w:r>
+      <w:r>
+        <w:rPr>
+          <w:rFonts w:ascii="Tw Cen MT" w:hAnsi="Tw Cen MT"/>
+        </w:rPr>
+        <w:t xml:space="preserve">automation </w:t>
+      </w:r>
+      <w:r>
+        <w:rPr>
+          <w:rFonts w:ascii="Tw Cen MT" w:hAnsi="Tw Cen MT"/>
+        </w:rPr>
+        <w:t xml:space="preserve">bot </w:t>
+      </w:r>
+      <w:r>
+        <w:rPr>
+          <w:rFonts w:ascii="Tw Cen MT" w:hAnsi="Tw Cen MT"/>
+        </w:rPr>
+        <w:t>to manage and fix CVEs</w:t>
+      </w:r>
+      <w:r>
+        <w:rPr>
+          <w:rFonts w:ascii="Tw Cen MT" w:hAnsi="Tw Cen MT"/>
+        </w:rPr>
+        <w:t xml:space="preserve"> using Python.</w:t>
+      </w:r>
+    </w:p>
+    <w:p>
+      <w:pPr>
+        <w:pStyle w:val="ListParagraph"/>
+        <w:numPr>
+          <w:ilvl w:val="1"/>
+          <w:numId w:val="5"/>
+        </w:numPr>
+        <w:rPr>
+          <w:rFonts w:ascii="Tw Cen MT" w:hAnsi="Tw Cen MT"/>
+          <w:u w:val="single"/>
+        </w:rPr>
+      </w:pPr>
+      <w:r>
+        <w:rPr>
+          <w:rFonts w:ascii="Tw Cen MT" w:hAnsi="Tw Cen MT"/>
+        </w:rPr>
+        <w:t>Scrum master for a team of 10</w:t>
+      </w:r>
+      <w:r>
+        <w:rPr>
+          <w:rFonts w:ascii="Tw Cen MT" w:hAnsi="Tw Cen MT"/>
+        </w:rPr>
+        <w:t>, achieving more efficient impact driven meetings.</w:t>
+      </w:r>
+    </w:p>
+    <w:p>
+      <w:pPr>
+        <w:pStyle w:val="ListParagraph"/>
+        <w:numPr>
+          <w:ilvl w:val="1"/>
+          <w:numId w:val="5"/>
+        </w:numPr>
+        <w:rPr>
+          <w:rFonts w:ascii="Tw Cen MT" w:hAnsi="Tw Cen MT"/>
+          <w:u w:val="single"/>
+        </w:rPr>
+      </w:pPr>
+      <w:r>
+        <w:rPr>
+          <w:rFonts w:ascii="Tw Cen MT" w:hAnsi="Tw Cen MT"/>
+        </w:rPr>
+        <w:t>Worked with Java and JavaScript to maintain a workplace messaging app.</w:t>
+      </w:r>
+    </w:p>
+    <w:p>
+      <w:pPr>
+        <w:pStyle w:val="ListParagraph"/>
+        <w:numPr>
+          <w:ilvl w:val="1"/>
+          <w:numId w:val="5"/>
+        </w:numPr>
+        <w:rPr>
+          <w:rFonts w:ascii="Tw Cen MT" w:hAnsi="Tw Cen MT"/>
+          <w:u w:val="single"/>
+        </w:rPr>
+      </w:pPr>
+      <w:r>
+        <w:rPr>
+          <w:rFonts w:ascii="Tw Cen MT" w:hAnsi="Tw Cen MT"/>
+        </w:rPr>
+        <w:t>Gave</w:t>
+      </w:r>
+      <w:r>
+        <w:rPr>
+          <w:rFonts w:ascii="Tw Cen MT" w:hAnsi="Tw Cen MT"/>
+        </w:rPr>
+        <w:t xml:space="preserve"> demos to 100+ people</w:t>
+      </w:r>
+      <w:r>
+        <w:rPr>
+          <w:rFonts w:ascii="Tw Cen MT" w:hAnsi="Tw Cen MT"/>
+        </w:rPr>
+        <w:t xml:space="preserve"> on the uses and capabilities of GitHub Copilot</w:t>
+      </w:r>
+      <w:r>
+        <w:rPr>
+          <w:rFonts w:ascii="Tw Cen MT" w:hAnsi="Tw Cen MT"/>
+        </w:rPr>
+        <w:t>.</w:t>
+      </w:r>
+    </w:p>
+    <w:p>
+      <w:pPr>
+        <w:pStyle w:val="ListParagraph"/>
+        <w:numPr>
+          <w:ilvl w:val="1"/>
+          <w:numId w:val="5"/>
+        </w:numPr>
+        <w:rPr>
+          <w:rFonts w:ascii="Tw Cen MT" w:hAnsi="Tw Cen MT"/>
+          <w:u w:val="single"/>
+        </w:rPr>
+      </w:pPr>
+      <w:r>
+        <w:rPr>
+          <w:rFonts w:ascii="Tw Cen MT" w:hAnsi="Tw Cen MT"/>
+        </w:rPr>
+        <w:t>Running a sustainability series, personally giving talks on fishing and carbon removal companies.</w:t>
+      </w:r>
+    </w:p>
+    <w:p>
+      <w:pPr>
+        <w:pStyle w:val="ListParagraph"/>
+        <w:numPr>
+          <w:ilvl w:val="0"/>
+          <w:numId w:val="5"/>
+        </w:numPr>
+        <w:rPr>
+          <w:rFonts w:ascii="Tw Cen MT" w:hAnsi="Tw Cen MT"/>
+          <w:u w:val="single"/>
+        </w:rPr>
+      </w:pPr>
+      <w:r>
+        <w:rPr>
+          <w:rFonts w:ascii="Tw Cen MT" w:hAnsi="Tw Cen MT"/>
+        </w:rPr>
+        <w:t xml:space="preserve">Built a personal website using React - </w:t>
+      </w:r>
+      <w:hyperlink r:id="rId7" w:history="1">
+        <w:r>
+          <w:rPr>
+            <w:rStyle w:val="Hyperlink"/>
+            <w:rFonts w:ascii="Tw Cen MT" w:hAnsi="Tw Cen MT"/>
+          </w:rPr>
+          <w:t>https://www.jamesjhirst.com/</w:t>
+        </w:r>
+      </w:hyperlink>
+      <w:r>
+        <w:rPr>
+          <w:rFonts w:ascii="Tw Cen MT" w:hAnsi="Tw Cen MT"/>
+        </w:rPr>
+        <w:t>.</w:t>
+      </w:r>
+    </w:p>
+    <w:p>
+      <w:pPr>
+        <w:pStyle w:val="ListParagraph"/>
+        <w:numPr>
+          <w:ilvl w:val="0"/>
+          <w:numId w:val="5"/>
+        </w:numPr>
+        <w:rPr>
+          <w:rFonts w:ascii="Tw Cen MT" w:hAnsi="Tw Cen MT"/>
+        </w:rPr>
+      </w:pPr>
+      <w:r>
+        <w:rPr>
+          <w:rFonts w:ascii="Tw Cen MT" w:hAnsi="Tw Cen MT"/>
+        </w:rPr>
+        <w:t xml:space="preserve">Volunteer Machine Learning Engineer, </w:t>
+      </w:r>
+      <w:hyperlink r:id="rId8" w:history="1">
+        <w:r>
+          <w:rPr>
+            <w:rStyle w:val="Hyperlink"/>
+            <w:rFonts w:ascii="Tw Cen MT" w:hAnsi="Tw Cen MT"/>
+          </w:rPr>
+          <w:t>Shark Trust</w:t>
+        </w:r>
+      </w:hyperlink>
+      <w:r>
+        <w:rPr>
+          <w:rFonts w:ascii="Tw Cen MT" w:hAnsi="Tw Cen MT"/>
+        </w:rPr>
+        <w:t xml:space="preserve"> (2023-Present) classifying shark and ray eggs by species to substitute for manual classification.</w:t>
+      </w:r>
+    </w:p>
+    <w:p>
+      <w:pPr>
+        <w:pStyle w:val="ListParagraph"/>
+        <w:numPr>
+          <w:ilvl w:val="0"/>
+          <w:numId w:val="5"/>
+        </w:numPr>
+        <w:rPr>
+          <w:rFonts w:ascii="Tw Cen MT" w:hAnsi="Tw Cen MT"/>
+          <w:u w:val="single"/>
+        </w:rPr>
+      </w:pPr>
+      <w:r>
+        <w:rPr>
+          <w:rFonts w:ascii="Tw Cen MT" w:hAnsi="Tw Cen MT"/>
+        </w:rPr>
+        <w:t>Machine Learning Engineer, Cambridge (2022), w</w:t>
+      </w:r>
+      <w:r>
+        <w:rPr>
+          <w:rFonts w:ascii="Tw Cen MT" w:hAnsi="Tw Cen MT"/>
+        </w:rPr>
+        <w:t xml:space="preserve">orked on a </w:t>
+      </w:r>
+      <w:r>
+        <w:rPr>
+          <w:rFonts w:ascii="Tw Cen MT" w:hAnsi="Tw Cen MT"/>
+        </w:rPr>
+        <w:t>m</w:t>
+      </w:r>
+      <w:r>
+        <w:rPr>
+          <w:rFonts w:ascii="Tw Cen MT" w:hAnsi="Tw Cen MT"/>
+        </w:rPr>
+        <w:t xml:space="preserve">achine </w:t>
+      </w:r>
+      <w:r>
+        <w:rPr>
+          <w:rFonts w:ascii="Tw Cen MT" w:hAnsi="Tw Cen MT"/>
+        </w:rPr>
+        <w:t>l</w:t>
+      </w:r>
+      <w:r>
+        <w:rPr>
+          <w:rFonts w:ascii="Tw Cen MT" w:hAnsi="Tw Cen MT"/>
+        </w:rPr>
+        <w:t xml:space="preserve">earning </w:t>
+      </w:r>
+      <w:r>
+        <w:rPr>
+          <w:rFonts w:ascii="Tw Cen MT" w:hAnsi="Tw Cen MT"/>
+        </w:rPr>
+        <w:t>e</w:t>
+      </w:r>
+      <w:r>
+        <w:rPr>
+          <w:rFonts w:ascii="Tw Cen MT" w:hAnsi="Tw Cen MT"/>
+        </w:rPr>
+        <w:t>cology project using Detectron2 to predict the location of tree crowns to improve estimates of carbon store in forests and other locations. Resulted in a scientific paper published in a variety of journals.</w:t>
+      </w:r>
+    </w:p>
+    <w:p>
+      <w:pPr>
+        <w:pStyle w:val="ListParagraph"/>
+        <w:numPr>
+          <w:ilvl w:val="0"/>
+          <w:numId w:val="5"/>
+        </w:numPr>
+        <w:rPr>
+          <w:rFonts w:ascii="Tw Cen MT" w:hAnsi="Tw Cen MT"/>
+          <w:u w:val="single"/>
+        </w:rPr>
+      </w:pPr>
+      <w:r>
+        <w:rPr>
+          <w:rFonts w:ascii="Tw Cen MT" w:hAnsi="Tw Cen MT"/>
+        </w:rPr>
+        <w:t>Software Engineer</w:t>
+      </w:r>
+      <w:r>
+        <w:rPr>
+          <w:rFonts w:ascii="Tw Cen MT" w:hAnsi="Tw Cen MT"/>
+        </w:rPr>
+        <w:t>,</w:t>
+      </w:r>
+      <w:r>
+        <w:rPr>
+          <w:rFonts w:ascii="Tw Cen MT" w:hAnsi="Tw Cen MT"/>
+        </w:rPr>
+        <w:t xml:space="preserve"> Microsoft, 8-week virtual internship (2021)</w:t>
+      </w:r>
+      <w:r>
+        <w:rPr>
+          <w:rFonts w:ascii="Tw Cen MT" w:hAnsi="Tw Cen MT"/>
+        </w:rPr>
+        <w:t>, wrote</w:t>
+      </w:r>
+      <w:r>
+        <w:rPr>
+          <w:rFonts w:ascii="Tw Cen MT" w:hAnsi="Tw Cen MT"/>
+        </w:rPr>
+        <w:t xml:space="preserve"> Python to improve the automation of VM deployment and management for products in the telecoms sector.</w:t>
+      </w:r>
+    </w:p>
+    <w:p>
+      <w:pPr>
+        <w:rPr>
+          <w:rFonts w:ascii="Tw Cen MT" w:hAnsi="Tw Cen MT"/>
+          <w:b/>
+          <w:sz w:val="26"/>
+          <w:szCs w:val="26"/>
+        </w:rPr>
+      </w:pPr>
+      <w:r>
+        <w:rPr>
+          <w:rFonts w:ascii="Tw Cen MT" w:hAnsi="Tw Cen MT"/>
+          <w:b/>
+          <w:noProof/>
+          <w:sz w:val="24"/>
+          <w:szCs w:val="24"/>
+        </w:rPr>
+        <mc:AlternateContent>
+          <mc:Choice Requires="wps">
+            <w:drawing>
+              <wp:anchor distT="0" distB="0" distL="114300" distR="114300" simplePos="0" relativeHeight="251668480" behindDoc="0" locked="0" layoutInCell="1" allowOverlap="1" wp14:anchorId="79F2B61C" wp14:editId="1ED60913">
                 <wp:simplePos x="0" y="0"/>
                 <wp:positionH relativeFrom="column">
                   <wp:posOffset>979</wp:posOffset>
@@ -293,7 +959,7 @@
           </mc:Choice>
           <mc:Fallback>
             <w:pict>
-              <v:line w14:anchorId="5868D9B3" id="Straight Connector 6" o:spid="_x0000_s1026" style="position:absolute;flip:y;z-index:251668480;visibility:visible;mso-wrap-style:square;mso-height-percent:0;mso-wrap-distance-left:9pt;mso-wrap-distance-top:0;mso-wrap-distance-right:9pt;mso-wrap-distance-bottom:0;mso-position-horizontal:absolute;mso-position-horizontal-relative:text;mso-position-vertical:absolute;mso-position-vertical-relative:text;mso-height-percent:0;mso-height-relative:margin" from=".1pt,14.1pt" to="473.1pt,14.1pt" o:gfxdata="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" strokecolor="black [3213]" strokeweight="1.25pt">
+              <v:line w14:anchorId="1493C408" id="Straight Connector 6" o:spid="_x0000_s1026" style="position:absolute;flip:y;z-index:251668480;visibility:visible;mso-wrap-style:square;mso-height-percent:0;mso-wrap-distance-left:9pt;mso-wrap-distance-top:0;mso-wrap-distance-right:9pt;mso-wrap-distance-bottom:0;mso-position-horizontal:absolute;mso-position-horizontal-relative:text;mso-position-vertical:absolute;mso-position-vertical-relative:text;mso-height-percent:0;mso-height-relative:margin" from=".1pt,14.1pt" to="473.1pt,14.1pt" o:gfxdata="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" strokecolor="black [3213]" strokeweight="1.25pt">
                 <v:stroke joinstyle="miter"/>
               </v:line>
             </w:pict>
@@ -716,54 +1382,25 @@
         </w:numPr>
         <w:rPr>
           <w:rFonts w:ascii="Tw Cen MT" w:hAnsi="Tw Cen MT"/>
-        </w:rPr>
-      </w:pPr>
-      <w:r>
-        <w:rPr>
-          <w:rFonts w:ascii="Tw Cen MT" w:hAnsi="Tw Cen MT"/>
-        </w:rPr>
-        <w:t xml:space="preserve">AS- Level: </w:t>
-      </w:r>
-      <w:r>
-        <w:rPr>
-          <w:rFonts w:ascii="Tw Cen MT" w:hAnsi="Tw Cen MT"/>
-        </w:rPr>
-        <w:t>1</w:t>
-      </w:r>
-      <w:r>
-        <w:rPr>
-          <w:rFonts w:ascii="Tw Cen MT" w:hAnsi="Tw Cen MT"/>
-        </w:rPr>
-        <w:t>x A- Economics</w:t>
+          <w:b/>
+        </w:rPr>
+      </w:pPr>
+      <w:r>
+        <w:rPr>
+          <w:rFonts w:ascii="Tw Cen MT" w:hAnsi="Tw Cen MT"/>
+          <w:bCs/>
+        </w:rPr>
+        <w:t>IGCSE/ GCSE: 14x A*’s and an A</w:t>
       </w:r>
     </w:p>
     <w:p>
       <w:pPr>
-        <w:pStyle w:val="ListParagraph"/>
-        <w:numPr>
-          <w:ilvl w:val="0"/>
-          <w:numId w:val="8"/>
-        </w:numPr>
         <w:rPr>
           <w:rFonts w:ascii="Tw Cen MT" w:hAnsi="Tw Cen MT"/>
           <w:b/>
-        </w:rPr>
-      </w:pPr>
-      <w:r>
-        <w:rPr>
-          <w:rFonts w:ascii="Tw Cen MT" w:hAnsi="Tw Cen MT"/>
           <w:bCs/>
-        </w:rPr>
-        <w:t>IGCSE/ GCSE: 14x A*’s and an A</w:t>
-      </w:r>
-    </w:p>
-    <w:p>
-      <w:pPr>
-        <w:rPr>
-          <w:rFonts w:ascii="Tw Cen MT" w:hAnsi="Tw Cen MT"/>
-          <w:b/>
-          <w:sz w:val="26"/>
-          <w:szCs w:val="26"/>
+          <w:sz w:val="24"/>
+          <w:szCs w:val="24"/>
         </w:rPr>
       </w:pPr>
       <w:r>
@@ -777,783 +1414,7 @@
         <mc:AlternateContent>
           <mc:Choice Requires="wps">
             <w:drawing>
-              <wp:anchor distT="0" distB="0" distL="114300" distR="114300" simplePos="0" relativeHeight="251662336" behindDoc="0" locked="0" layoutInCell="1" allowOverlap="1" wp14:anchorId="3A991878" wp14:editId="12EB5E3E">
-                <wp:simplePos x="0" y="0"/>
-                <wp:positionH relativeFrom="column">
-                  <wp:posOffset>979</wp:posOffset>
-                </wp:positionH>
-                <wp:positionV relativeFrom="paragraph">
-                  <wp:posOffset>189865</wp:posOffset>
-                </wp:positionV>
-                <wp:extent cx="6007100" cy="0"/>
-                <wp:effectExtent l="0" t="0" r="0" b="0"/>
-                <wp:wrapNone/>
-                <wp:docPr id="3" name="Straight Connector 3"/>
-                <wp:cNvGraphicFramePr/>
-                <a:graphic xmlns:a="http://schemas.openxmlformats.org/drawingml/2006/main">
-                  <a:graphicData uri="http://schemas.microsoft.com/office/word/2010/wordprocessingShape">
-                    <wps:wsp>
-                      <wps:cNvCnPr/>
-                      <wps:spPr>
-                        <a:xfrm flipV="1">
-                          <a:off x="0" y="0"/>
-                          <a:ext cx="6007100" cy="0"/>
-                        </a:xfrm>
-                        <a:prstGeom prst="line">
-                          <a:avLst/>
-                        </a:prstGeom>
-                        <a:ln w="15875">
-                          <a:solidFill>
-                            <a:schemeClr val="tx1"/>
-                          </a:solidFill>
-                        </a:ln>
-                      </wps:spPr>
-                      <wps:style>
-                        <a:lnRef idx="1">
-                          <a:schemeClr val="accent1"/>
-                        </a:lnRef>
-                        <a:fillRef idx="0">
-                          <a:schemeClr val="accent1"/>
-                        </a:fillRef>
-                        <a:effectRef idx="0">
-                          <a:schemeClr val="accent1"/>
-                        </a:effectRef>
-                        <a:fontRef idx="minor">
-                          <a:schemeClr val="tx1"/>
-                        </a:fontRef>
-                      </wps:style>
-                      <wps:bodyPr/>
-                    </wps:wsp>
-                  </a:graphicData>
-                </a:graphic>
-                <wp14:sizeRelV relativeFrom="margin">
-                  <wp14:pctHeight>0</wp14:pctHeight>
-                </wp14:sizeRelV>
-              </wp:anchor>
-            </w:drawing>
-          </mc:Choice>
-          <mc:Fallback>
-            <w:pict>
-              <v:line w14:anchorId="52B57508" id="Straight Connector 3" o:spid="_x0000_s1026" style="position:absolute;flip:y;z-index:251662336;visibility:visible;mso-wrap-style:square;mso-height-percent:0;mso-wrap-distance-left:9pt;mso-wrap-distance-top:0;mso-wrap-distance-right:9pt;mso-wrap-distance-bottom:0;mso-position-horizontal:absolute;mso-position-horizontal-relative:text;mso-position-vertical:absolute;mso-position-vertical-relative:text;mso-height-percent:0;mso-height-relative:margin" from=".1pt,14.95pt" to="473.1pt,14.95pt" o:gfxdata="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" strokecolor="black [3213]" strokeweight="1.25pt">
-                <v:stroke joinstyle="miter"/>
-              </v:line>
-            </w:pict>
-          </mc:Fallback>
-        </mc:AlternateContent>
-      </w:r>
-      <w:r>
-        <w:rPr>
-          <w:rFonts w:ascii="Tw Cen MT" w:hAnsi="Tw Cen MT"/>
-          <w:b/>
-          <w:noProof/>
-          <w:sz w:val="24"/>
-          <w:szCs w:val="24"/>
-        </w:rPr>
-        <w:t>Software</w:t>
-      </w:r>
-      <w:r>
-        <w:rPr>
-          <w:rFonts w:ascii="Tw Cen MT" w:hAnsi="Tw Cen MT"/>
-          <w:b/>
-          <w:sz w:val="24"/>
-          <w:szCs w:val="24"/>
-        </w:rPr>
-        <w:t xml:space="preserve"> Experience:</w:t>
-      </w:r>
-    </w:p>
-    <w:p>
-      <w:pPr>
-        <w:pStyle w:val="ListParagraph"/>
-        <w:numPr>
-          <w:ilvl w:val="0"/>
-          <w:numId w:val="5"/>
-        </w:numPr>
-        <w:rPr>
-          <w:rFonts w:ascii="Tw Cen MT" w:hAnsi="Tw Cen MT"/>
-          <w:u w:val="single"/>
-        </w:rPr>
-      </w:pPr>
-      <w:r>
-        <w:rPr>
-          <w:rFonts w:ascii="Tw Cen MT" w:hAnsi="Tw Cen MT"/>
-        </w:rPr>
-        <w:t>Software Engineer</w:t>
-      </w:r>
-      <w:r>
-        <w:rPr>
-          <w:rFonts w:ascii="Tw Cen MT" w:hAnsi="Tw Cen MT"/>
-        </w:rPr>
-        <w:t xml:space="preserve">, </w:t>
-      </w:r>
-      <w:r>
-        <w:rPr>
-          <w:rFonts w:ascii="Tw Cen MT" w:hAnsi="Tw Cen MT"/>
-        </w:rPr>
-        <w:t xml:space="preserve">Microsoft (Sep 2022-Present) </w:t>
-      </w:r>
-    </w:p>
-    <w:p>
-      <w:pPr>
-        <w:pStyle w:val="ListParagraph"/>
-        <w:numPr>
-          <w:ilvl w:val="1"/>
-          <w:numId w:val="5"/>
-        </w:numPr>
-        <w:rPr>
-          <w:rFonts w:ascii="Tw Cen MT" w:hAnsi="Tw Cen MT"/>
-          <w:u w:val="single"/>
-        </w:rPr>
-      </w:pPr>
-      <w:r>
-        <w:rPr>
-          <w:rFonts w:ascii="Tw Cen MT" w:hAnsi="Tw Cen MT"/>
-        </w:rPr>
-        <w:t>Developed a Rust based solution to configuration translation with an extensive testing framework.</w:t>
-      </w:r>
-    </w:p>
-    <w:p>
-      <w:pPr>
-        <w:pStyle w:val="ListParagraph"/>
-        <w:numPr>
-          <w:ilvl w:val="1"/>
-          <w:numId w:val="5"/>
-        </w:numPr>
-        <w:rPr>
-          <w:rFonts w:ascii="Tw Cen MT" w:hAnsi="Tw Cen MT"/>
-          <w:u w:val="single"/>
-        </w:rPr>
-      </w:pPr>
-      <w:r>
-        <w:rPr>
-          <w:rFonts w:ascii="Tw Cen MT" w:hAnsi="Tw Cen MT"/>
-        </w:rPr>
-        <w:t>D</w:t>
-      </w:r>
-      <w:r>
-        <w:rPr>
-          <w:rFonts w:ascii="Tw Cen MT" w:hAnsi="Tw Cen MT"/>
-        </w:rPr>
-        <w:t>eploy</w:t>
-      </w:r>
-      <w:r>
-        <w:rPr>
-          <w:rFonts w:ascii="Tw Cen MT" w:hAnsi="Tw Cen MT"/>
-        </w:rPr>
-        <w:t>ed</w:t>
-      </w:r>
-      <w:r>
-        <w:rPr>
-          <w:rFonts w:ascii="Tw Cen MT" w:hAnsi="Tw Cen MT"/>
-        </w:rPr>
-        <w:t xml:space="preserve"> </w:t>
-      </w:r>
-      <w:r>
-        <w:rPr>
-          <w:rFonts w:ascii="Tw Cen MT" w:hAnsi="Tw Cen MT"/>
-        </w:rPr>
-        <w:t>a voicemail solution</w:t>
-      </w:r>
-      <w:r>
-        <w:rPr>
-          <w:rFonts w:ascii="Tw Cen MT" w:hAnsi="Tw Cen MT"/>
-        </w:rPr>
-        <w:t xml:space="preserve"> on Azure</w:t>
-      </w:r>
-      <w:r>
-        <w:rPr>
-          <w:rFonts w:ascii="Tw Cen MT" w:hAnsi="Tw Cen MT"/>
-        </w:rPr>
-        <w:t xml:space="preserve"> for</w:t>
-      </w:r>
-      <w:r>
-        <w:rPr>
-          <w:rFonts w:ascii="Tw Cen MT" w:hAnsi="Tw Cen MT"/>
-        </w:rPr>
-        <w:t xml:space="preserve"> a</w:t>
-      </w:r>
-      <w:r>
-        <w:rPr>
-          <w:rFonts w:ascii="Tw Cen MT" w:hAnsi="Tw Cen MT"/>
-        </w:rPr>
-        <w:t xml:space="preserve"> large </w:t>
-      </w:r>
-      <w:r>
-        <w:rPr>
-          <w:rFonts w:ascii="Tw Cen MT" w:hAnsi="Tw Cen MT"/>
-        </w:rPr>
-        <w:t>tel</w:t>
-      </w:r>
-      <w:r>
-        <w:rPr>
-          <w:rFonts w:ascii="Tw Cen MT" w:hAnsi="Tw Cen MT"/>
-        </w:rPr>
-        <w:t>co</w:t>
-      </w:r>
-      <w:r>
-        <w:rPr>
-          <w:rFonts w:ascii="Tw Cen MT" w:hAnsi="Tw Cen MT"/>
-        </w:rPr>
-        <w:t xml:space="preserve"> u</w:t>
-      </w:r>
-      <w:r>
-        <w:rPr>
-          <w:rFonts w:ascii="Tw Cen MT" w:hAnsi="Tw Cen MT"/>
-        </w:rPr>
-        <w:t>s</w:t>
-      </w:r>
-      <w:r>
-        <w:rPr>
-          <w:rFonts w:ascii="Tw Cen MT" w:hAnsi="Tw Cen MT"/>
-        </w:rPr>
-        <w:t xml:space="preserve">ing </w:t>
-      </w:r>
-      <w:r>
-        <w:rPr>
-          <w:rFonts w:ascii="Tw Cen MT" w:hAnsi="Tw Cen MT"/>
-        </w:rPr>
-        <w:t xml:space="preserve">Kubernetes </w:t>
-      </w:r>
-      <w:r>
-        <w:rPr>
-          <w:rFonts w:ascii="Tw Cen MT" w:hAnsi="Tw Cen MT"/>
-        </w:rPr>
-        <w:t>clusters.</w:t>
-      </w:r>
-    </w:p>
-    <w:p>
-      <w:pPr>
-        <w:pStyle w:val="ListParagraph"/>
-        <w:numPr>
-          <w:ilvl w:val="1"/>
-          <w:numId w:val="5"/>
-        </w:numPr>
-        <w:rPr>
-          <w:rFonts w:ascii="Tw Cen MT" w:hAnsi="Tw Cen MT"/>
-          <w:u w:val="single"/>
-        </w:rPr>
-      </w:pPr>
-      <w:r>
-        <w:rPr>
-          <w:rFonts w:ascii="Tw Cen MT" w:hAnsi="Tw Cen MT"/>
-        </w:rPr>
-        <w:t>Wrote and owned</w:t>
-      </w:r>
-      <w:r>
-        <w:rPr>
-          <w:rFonts w:ascii="Tw Cen MT" w:hAnsi="Tw Cen MT"/>
-        </w:rPr>
-        <w:t xml:space="preserve"> </w:t>
-      </w:r>
-      <w:r>
-        <w:rPr>
-          <w:rFonts w:ascii="Tw Cen MT" w:hAnsi="Tw Cen MT"/>
-        </w:rPr>
-        <w:t xml:space="preserve">an </w:t>
-      </w:r>
-      <w:r>
-        <w:rPr>
-          <w:rFonts w:ascii="Tw Cen MT" w:hAnsi="Tw Cen MT"/>
-        </w:rPr>
-        <w:t xml:space="preserve">automation </w:t>
-      </w:r>
-      <w:r>
-        <w:rPr>
-          <w:rFonts w:ascii="Tw Cen MT" w:hAnsi="Tw Cen MT"/>
-        </w:rPr>
-        <w:t>bot</w:t>
-      </w:r>
-      <w:r>
-        <w:rPr>
-          <w:rFonts w:ascii="Tw Cen MT" w:hAnsi="Tw Cen MT"/>
-        </w:rPr>
-        <w:t xml:space="preserve"> </w:t>
-      </w:r>
-      <w:r>
-        <w:rPr>
-          <w:rFonts w:ascii="Tw Cen MT" w:hAnsi="Tw Cen MT"/>
-        </w:rPr>
-        <w:t>to manage and fix CVEs</w:t>
-      </w:r>
-      <w:r>
-        <w:rPr>
-          <w:rFonts w:ascii="Tw Cen MT" w:hAnsi="Tw Cen MT"/>
-        </w:rPr>
-        <w:t xml:space="preserve"> </w:t>
-      </w:r>
-      <w:r>
-        <w:rPr>
-          <w:rFonts w:ascii="Tw Cen MT" w:hAnsi="Tw Cen MT"/>
-        </w:rPr>
-        <w:t>using Python</w:t>
-      </w:r>
-      <w:r>
-        <w:rPr>
-          <w:rFonts w:ascii="Tw Cen MT" w:hAnsi="Tw Cen MT"/>
-        </w:rPr>
-        <w:t>.</w:t>
-      </w:r>
-    </w:p>
-    <w:p>
-      <w:pPr>
-        <w:pStyle w:val="ListParagraph"/>
-        <w:numPr>
-          <w:ilvl w:val="1"/>
-          <w:numId w:val="5"/>
-        </w:numPr>
-        <w:rPr>
-          <w:rFonts w:ascii="Tw Cen MT" w:hAnsi="Tw Cen MT"/>
-          <w:u w:val="single"/>
-        </w:rPr>
-      </w:pPr>
-      <w:r>
-        <w:rPr>
-          <w:rFonts w:ascii="Tw Cen MT" w:hAnsi="Tw Cen MT"/>
-        </w:rPr>
-        <w:t>Scrum master for a team of 10</w:t>
-      </w:r>
-      <w:r>
-        <w:rPr>
-          <w:rFonts w:ascii="Tw Cen MT" w:hAnsi="Tw Cen MT"/>
-        </w:rPr>
-        <w:t>.</w:t>
-      </w:r>
-    </w:p>
-    <w:p>
-      <w:pPr>
-        <w:pStyle w:val="ListParagraph"/>
-        <w:numPr>
-          <w:ilvl w:val="1"/>
-          <w:numId w:val="5"/>
-        </w:numPr>
-        <w:rPr>
-          <w:rFonts w:ascii="Tw Cen MT" w:hAnsi="Tw Cen MT"/>
-          <w:u w:val="single"/>
-        </w:rPr>
-      </w:pPr>
-      <w:r>
-        <w:rPr>
-          <w:rFonts w:ascii="Tw Cen MT" w:hAnsi="Tw Cen MT"/>
-        </w:rPr>
-        <w:t>Worked with</w:t>
-      </w:r>
-      <w:r>
-        <w:rPr>
-          <w:rFonts w:ascii="Tw Cen MT" w:hAnsi="Tw Cen MT"/>
-        </w:rPr>
-        <w:t xml:space="preserve"> Java and </w:t>
-      </w:r>
-      <w:r>
-        <w:rPr>
-          <w:rFonts w:ascii="Tw Cen MT" w:hAnsi="Tw Cen MT"/>
-        </w:rPr>
-        <w:t>JavaScript</w:t>
-      </w:r>
-      <w:r>
-        <w:rPr>
-          <w:rFonts w:ascii="Tw Cen MT" w:hAnsi="Tw Cen MT"/>
-        </w:rPr>
-        <w:t xml:space="preserve"> to maintain a</w:t>
-      </w:r>
-      <w:r>
-        <w:rPr>
-          <w:rFonts w:ascii="Tw Cen MT" w:hAnsi="Tw Cen MT"/>
-        </w:rPr>
-        <w:t xml:space="preserve"> </w:t>
-      </w:r>
-      <w:r>
-        <w:rPr>
-          <w:rFonts w:ascii="Tw Cen MT" w:hAnsi="Tw Cen MT"/>
-        </w:rPr>
-        <w:t>workplace</w:t>
-      </w:r>
-      <w:r>
-        <w:rPr>
-          <w:rFonts w:ascii="Tw Cen MT" w:hAnsi="Tw Cen MT"/>
-        </w:rPr>
-        <w:t xml:space="preserve"> messagi</w:t>
-      </w:r>
-      <w:r>
-        <w:rPr>
-          <w:rFonts w:ascii="Tw Cen MT" w:hAnsi="Tw Cen MT"/>
-        </w:rPr>
-        <w:t xml:space="preserve">ng </w:t>
-      </w:r>
-      <w:r>
-        <w:rPr>
-          <w:rFonts w:ascii="Tw Cen MT" w:hAnsi="Tw Cen MT"/>
-        </w:rPr>
-        <w:t>app.</w:t>
-      </w:r>
-    </w:p>
-    <w:p>
-      <w:pPr>
-        <w:pStyle w:val="ListParagraph"/>
-        <w:numPr>
-          <w:ilvl w:val="1"/>
-          <w:numId w:val="5"/>
-        </w:numPr>
-        <w:rPr>
-          <w:rFonts w:ascii="Tw Cen MT" w:hAnsi="Tw Cen MT"/>
-          <w:u w:val="single"/>
-        </w:rPr>
-      </w:pPr>
-      <w:r>
-        <w:rPr>
-          <w:rFonts w:ascii="Tw Cen MT" w:hAnsi="Tw Cen MT"/>
-        </w:rPr>
-        <w:t>Gave</w:t>
-      </w:r>
-      <w:r>
-        <w:rPr>
-          <w:rFonts w:ascii="Tw Cen MT" w:hAnsi="Tw Cen MT"/>
-        </w:rPr>
-        <w:t xml:space="preserve"> demos to 100+ people</w:t>
-      </w:r>
-      <w:r>
-        <w:rPr>
-          <w:rFonts w:ascii="Tw Cen MT" w:hAnsi="Tw Cen MT"/>
-        </w:rPr>
-        <w:t xml:space="preserve"> on the uses and capabilities of GitHub Copilot</w:t>
-      </w:r>
-      <w:r>
-        <w:rPr>
-          <w:rFonts w:ascii="Tw Cen MT" w:hAnsi="Tw Cen MT"/>
-        </w:rPr>
-        <w:t>.</w:t>
-      </w:r>
-    </w:p>
-    <w:p>
-      <w:pPr>
-        <w:pStyle w:val="ListParagraph"/>
-        <w:numPr>
-          <w:ilvl w:val="1"/>
-          <w:numId w:val="5"/>
-        </w:numPr>
-        <w:rPr>
-          <w:rFonts w:ascii="Tw Cen MT" w:hAnsi="Tw Cen MT"/>
-          <w:u w:val="single"/>
-        </w:rPr>
-      </w:pPr>
-      <w:r>
-        <w:rPr>
-          <w:rFonts w:ascii="Tw Cen MT" w:hAnsi="Tw Cen MT"/>
-        </w:rPr>
-        <w:t>R</w:t>
-      </w:r>
-      <w:r>
-        <w:rPr>
-          <w:rFonts w:ascii="Tw Cen MT" w:hAnsi="Tw Cen MT"/>
-        </w:rPr>
-        <w:t>u</w:t>
-      </w:r>
-      <w:r>
-        <w:rPr>
-          <w:rFonts w:ascii="Tw Cen MT" w:hAnsi="Tw Cen MT"/>
-        </w:rPr>
-        <w:t>n</w:t>
-      </w:r>
-      <w:r>
-        <w:rPr>
-          <w:rFonts w:ascii="Tw Cen MT" w:hAnsi="Tw Cen MT"/>
-        </w:rPr>
-        <w:t>ning</w:t>
-      </w:r>
-      <w:r>
-        <w:rPr>
-          <w:rFonts w:ascii="Tw Cen MT" w:hAnsi="Tw Cen MT"/>
-        </w:rPr>
-        <w:t xml:space="preserve"> a sustainability series, personally giving talks on fishing and carbon removal companies.</w:t>
-      </w:r>
-    </w:p>
-    <w:p>
-      <w:pPr>
-        <w:pStyle w:val="ListParagraph"/>
-        <w:numPr>
-          <w:ilvl w:val="0"/>
-          <w:numId w:val="5"/>
-        </w:numPr>
-        <w:rPr>
-          <w:rFonts w:ascii="Tw Cen MT" w:hAnsi="Tw Cen MT"/>
-          <w:u w:val="single"/>
-        </w:rPr>
-      </w:pPr>
-      <w:r>
-        <w:rPr>
-          <w:rFonts w:ascii="Tw Cen MT" w:hAnsi="Tw Cen MT"/>
-        </w:rPr>
-        <w:t>Built a</w:t>
-      </w:r>
-      <w:r>
-        <w:rPr>
-          <w:rFonts w:ascii="Tw Cen MT" w:hAnsi="Tw Cen MT"/>
-        </w:rPr>
-        <w:t xml:space="preserve"> personal</w:t>
-      </w:r>
-      <w:r>
-        <w:rPr>
-          <w:rFonts w:ascii="Tw Cen MT" w:hAnsi="Tw Cen MT"/>
-        </w:rPr>
-        <w:t xml:space="preserve"> website using React</w:t>
-      </w:r>
-      <w:r>
-        <w:rPr>
-          <w:rFonts w:ascii="Tw Cen MT" w:hAnsi="Tw Cen MT"/>
-        </w:rPr>
-        <w:t xml:space="preserve"> -</w:t>
-      </w:r>
-      <w:r>
-        <w:rPr>
-          <w:rFonts w:ascii="Tw Cen MT" w:hAnsi="Tw Cen MT"/>
-        </w:rPr>
-        <w:t xml:space="preserve"> </w:t>
-      </w:r>
-      <w:hyperlink r:id="rId6" w:history="1">
-        <w:r>
-          <w:rPr>
-            <w:rStyle w:val="Hyperlink"/>
-            <w:rFonts w:ascii="Tw Cen MT" w:hAnsi="Tw Cen MT"/>
-          </w:rPr>
-          <w:t>https://www.jamesjhirst.com/</w:t>
-        </w:r>
-      </w:hyperlink>
-      <w:r>
-        <w:rPr>
-          <w:rFonts w:ascii="Tw Cen MT" w:hAnsi="Tw Cen MT"/>
-        </w:rPr>
-        <w:t>.</w:t>
-      </w:r>
-    </w:p>
-    <w:p>
-      <w:pPr>
-        <w:pStyle w:val="ListParagraph"/>
-        <w:numPr>
-          <w:ilvl w:val="0"/>
-          <w:numId w:val="5"/>
-        </w:numPr>
-        <w:rPr>
-          <w:rFonts w:ascii="Tw Cen MT" w:hAnsi="Tw Cen MT"/>
-        </w:rPr>
-      </w:pPr>
-      <w:r>
-        <w:rPr>
-          <w:rFonts w:ascii="Tw Cen MT" w:hAnsi="Tw Cen MT"/>
-        </w:rPr>
-        <w:t xml:space="preserve">Volunteer </w:t>
-      </w:r>
-      <w:r>
-        <w:rPr>
-          <w:rFonts w:ascii="Tw Cen MT" w:hAnsi="Tw Cen MT"/>
-        </w:rPr>
-        <w:t xml:space="preserve">Machine Learning Engineer, </w:t>
-      </w:r>
-      <w:hyperlink r:id="rId7" w:history="1">
-        <w:r>
-          <w:rPr>
-            <w:rStyle w:val="Hyperlink"/>
-            <w:rFonts w:ascii="Tw Cen MT" w:hAnsi="Tw Cen MT"/>
-          </w:rPr>
-          <w:t>Shark Trust</w:t>
-        </w:r>
-      </w:hyperlink>
-      <w:r>
-        <w:rPr>
-          <w:rFonts w:ascii="Tw Cen MT" w:hAnsi="Tw Cen MT"/>
-        </w:rPr>
-        <w:t xml:space="preserve"> </w:t>
-      </w:r>
-      <w:r>
-        <w:rPr>
-          <w:rFonts w:ascii="Tw Cen MT" w:hAnsi="Tw Cen MT"/>
-        </w:rPr>
-        <w:t xml:space="preserve">(2023-Present) </w:t>
-      </w:r>
-      <w:r>
-        <w:rPr>
-          <w:rFonts w:ascii="Tw Cen MT" w:hAnsi="Tw Cen MT"/>
-        </w:rPr>
-        <w:t>classi</w:t>
-      </w:r>
-      <w:r>
-        <w:rPr>
-          <w:rFonts w:ascii="Tw Cen MT" w:hAnsi="Tw Cen MT"/>
-        </w:rPr>
-        <w:t xml:space="preserve">fying </w:t>
-      </w:r>
-      <w:r>
-        <w:rPr>
-          <w:rFonts w:ascii="Tw Cen MT" w:hAnsi="Tw Cen MT"/>
-        </w:rPr>
-        <w:t>shark and ray eggs by species to substitute for manual classification.</w:t>
-      </w:r>
-    </w:p>
-    <w:p>
-      <w:pPr>
-        <w:pStyle w:val="ListParagraph"/>
-        <w:numPr>
-          <w:ilvl w:val="0"/>
-          <w:numId w:val="5"/>
-        </w:numPr>
-        <w:rPr>
-          <w:rFonts w:ascii="Tw Cen MT" w:hAnsi="Tw Cen MT"/>
-          <w:u w:val="single"/>
-        </w:rPr>
-      </w:pPr>
-      <w:r>
-        <w:rPr>
-          <w:rFonts w:ascii="Tw Cen MT" w:hAnsi="Tw Cen MT"/>
-        </w:rPr>
-        <w:t>Machine Learning Engineer, Cambridge (2022), w</w:t>
-      </w:r>
-      <w:r>
-        <w:rPr>
-          <w:rFonts w:ascii="Tw Cen MT" w:hAnsi="Tw Cen MT"/>
-        </w:rPr>
-        <w:t xml:space="preserve">orked on a </w:t>
-      </w:r>
-      <w:r>
-        <w:rPr>
-          <w:rFonts w:ascii="Tw Cen MT" w:hAnsi="Tw Cen MT"/>
-        </w:rPr>
-        <w:t>m</w:t>
-      </w:r>
-      <w:r>
-        <w:rPr>
-          <w:rFonts w:ascii="Tw Cen MT" w:hAnsi="Tw Cen MT"/>
-        </w:rPr>
-        <w:t xml:space="preserve">achine </w:t>
-      </w:r>
-      <w:r>
-        <w:rPr>
-          <w:rFonts w:ascii="Tw Cen MT" w:hAnsi="Tw Cen MT"/>
-        </w:rPr>
-        <w:t>l</w:t>
-      </w:r>
-      <w:r>
-        <w:rPr>
-          <w:rFonts w:ascii="Tw Cen MT" w:hAnsi="Tw Cen MT"/>
-        </w:rPr>
-        <w:t xml:space="preserve">earning </w:t>
-      </w:r>
-      <w:r>
-        <w:rPr>
-          <w:rFonts w:ascii="Tw Cen MT" w:hAnsi="Tw Cen MT"/>
-        </w:rPr>
-        <w:t>e</w:t>
-      </w:r>
-      <w:r>
-        <w:rPr>
-          <w:rFonts w:ascii="Tw Cen MT" w:hAnsi="Tw Cen MT"/>
-        </w:rPr>
-        <w:t>cology project using Detectron2 to predict the location of tree crowns to improve estimates of carbon store in forests and other locations. Resulted in a scientific paper published in a variety of journals.</w:t>
-      </w:r>
-    </w:p>
-    <w:p>
-      <w:pPr>
-        <w:pStyle w:val="ListParagraph"/>
-        <w:numPr>
-          <w:ilvl w:val="0"/>
-          <w:numId w:val="5"/>
-        </w:numPr>
-        <w:rPr>
-          <w:rFonts w:ascii="Tw Cen MT" w:hAnsi="Tw Cen MT"/>
-          <w:u w:val="single"/>
-        </w:rPr>
-      </w:pPr>
-      <w:r>
-        <w:rPr>
-          <w:rFonts w:ascii="Tw Cen MT" w:hAnsi="Tw Cen MT"/>
-        </w:rPr>
-        <w:t>Software Engineer</w:t>
-      </w:r>
-      <w:r>
-        <w:rPr>
-          <w:rFonts w:ascii="Tw Cen MT" w:hAnsi="Tw Cen MT"/>
-        </w:rPr>
-        <w:t>,</w:t>
-      </w:r>
-      <w:r>
-        <w:rPr>
-          <w:rFonts w:ascii="Tw Cen MT" w:hAnsi="Tw Cen MT"/>
-        </w:rPr>
-        <w:t xml:space="preserve"> Microsoft, 8-week virtual internship</w:t>
-      </w:r>
-      <w:r>
-        <w:rPr>
-          <w:rFonts w:ascii="Tw Cen MT" w:hAnsi="Tw Cen MT"/>
-        </w:rPr>
-        <w:t xml:space="preserve"> (2021)</w:t>
-      </w:r>
-      <w:r>
-        <w:rPr>
-          <w:rFonts w:ascii="Tw Cen MT" w:hAnsi="Tw Cen MT"/>
-        </w:rPr>
-        <w:t>, wrote</w:t>
-      </w:r>
-      <w:r>
-        <w:rPr>
-          <w:rFonts w:ascii="Tw Cen MT" w:hAnsi="Tw Cen MT"/>
-        </w:rPr>
-        <w:t xml:space="preserve"> </w:t>
-      </w:r>
-      <w:r>
-        <w:rPr>
-          <w:rFonts w:ascii="Tw Cen MT" w:hAnsi="Tw Cen MT"/>
-        </w:rPr>
-        <w:t>P</w:t>
-      </w:r>
-      <w:r>
-        <w:rPr>
-          <w:rFonts w:ascii="Tw Cen MT" w:hAnsi="Tw Cen MT"/>
-        </w:rPr>
-        <w:t xml:space="preserve">ython to improve the automation of </w:t>
-      </w:r>
-      <w:r>
-        <w:rPr>
-          <w:rFonts w:ascii="Tw Cen MT" w:hAnsi="Tw Cen MT"/>
-        </w:rPr>
-        <w:t>VM deployment and</w:t>
-      </w:r>
-      <w:r>
-        <w:rPr>
-          <w:rFonts w:ascii="Tw Cen MT" w:hAnsi="Tw Cen MT"/>
-        </w:rPr>
-        <w:t xml:space="preserve"> management f</w:t>
-      </w:r>
-      <w:r>
-        <w:rPr>
-          <w:rFonts w:ascii="Tw Cen MT" w:hAnsi="Tw Cen MT"/>
-        </w:rPr>
-        <w:t>or</w:t>
-      </w:r>
-      <w:r>
-        <w:rPr>
-          <w:rFonts w:ascii="Tw Cen MT" w:hAnsi="Tw Cen MT"/>
-        </w:rPr>
-        <w:t xml:space="preserve"> products in the telecoms sector.</w:t>
-      </w:r>
-    </w:p>
-    <w:p>
-      <w:pPr>
-        <w:rPr>
-          <w:rFonts w:ascii="Tw Cen MT" w:hAnsi="Tw Cen MT"/>
-          <w:b/>
-          <w:bCs/>
-          <w:sz w:val="24"/>
-          <w:szCs w:val="24"/>
-        </w:rPr>
-      </w:pPr>
-      <w:r>
-        <w:rPr>
-          <w:rFonts w:ascii="Tw Cen MT" w:hAnsi="Tw Cen MT"/>
-          <w:b/>
-          <w:noProof/>
-          <w:sz w:val="24"/>
-          <w:szCs w:val="24"/>
-        </w:rPr>
-        <mc:AlternateContent>
-          <mc:Choice Requires="wps">
-            <w:drawing>
-              <wp:anchor distT="0" distB="0" distL="114300" distR="114300" simplePos="0" relativeHeight="251672576" behindDoc="0" locked="0" layoutInCell="1" allowOverlap="1" wp14:anchorId="433A1D9C" wp14:editId="0B06B2D2">
+              <wp:anchor distT="0" distB="0" distL="114300" distR="114300" simplePos="0" relativeHeight="251672576" behindDoc="0" locked="0" layoutInCell="1" allowOverlap="1" wp14:anchorId="433A1D9C" wp14:editId="1E231289">
                 <wp:simplePos x="0" y="0"/>
                 <wp:positionH relativeFrom="margin">
                   <wp:align>left</wp:align>
@@ -1610,7 +1471,7 @@
           </mc:Choice>
           <mc:Fallback>
             <w:pict>
-              <v:line w14:anchorId="0BF7348D" id="Straight Connector 610557234" o:spid="_x0000_s1026" style="position:absolute;flip:y;z-index:251672576;visibility:visible;mso-wrap-style:square;mso-height-percent:0;mso-wrap-distance-left:9pt;mso-wrap-distance-top:0;mso-wrap-distance-right:9pt;mso-wrap-distance-bottom:0;mso-position-horizontal:left;mso-position-horizontal-relative:margin;mso-position-vertical:absolute;mso-position-vertical-relative:text;mso-height-percent:0;mso-height-relative:margin" from="0,14.7pt" to="473pt,14.7pt" o:gfxdata="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" strokecolor="black [3213]" strokeweight="1.25pt">
+              <v:line w14:anchorId="20418848" id="Straight Connector 610557234" o:spid="_x0000_s1026" style="position:absolute;flip:y;z-index:251672576;visibility:visible;mso-wrap-style:square;mso-height-percent:0;mso-wrap-distance-left:9pt;mso-wrap-distance-top:0;mso-wrap-distance-right:9pt;mso-wrap-distance-bottom:0;mso-position-horizontal:left;mso-position-horizontal-relative:margin;mso-position-vertical:absolute;mso-position-vertical-relative:text;mso-height-percent:0;mso-height-relative:margin" from="0,14.7pt" to="473pt,14.7pt" o:gfxdata="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" strokecolor="black [3213]" strokeweight="1.25pt">
                 <v:stroke joinstyle="miter"/>
                 <w10:wrap anchorx="margin"/>
               </v:line>
@@ -1828,7 +1689,7 @@
         </w:rPr>
         <w:t xml:space="preserve"> </w:t>
       </w:r>
-      <w:hyperlink r:id="rId8" w:history="1">
+      <w:hyperlink r:id="rId9" w:history="1">
         <w:r>
           <w:rPr>
             <w:rStyle w:val="Hyperlink"/>
@@ -1918,160 +1779,6 @@
         <w:rPr>
           <w:rFonts w:ascii="Tw Cen MT" w:hAnsi="Tw Cen MT"/>
           <w:b/>
-          <w:sz w:val="26"/>
-          <w:szCs w:val="26"/>
-        </w:rPr>
-      </w:pPr>
-      <w:r>
-        <w:rPr>
-          <w:rFonts w:ascii="Tw Cen MT" w:hAnsi="Tw Cen MT"/>
-          <w:b/>
-          <w:noProof/>
-          <w:sz w:val="24"/>
-          <w:szCs w:val="24"/>
-        </w:rPr>
-        <mc:AlternateContent>
-          <mc:Choice Requires="wps">
-            <w:drawing>
-              <wp:anchor distT="0" distB="0" distL="114300" distR="114300" simplePos="0" relativeHeight="251664384" behindDoc="0" locked="0" layoutInCell="1" allowOverlap="1" wp14:anchorId="59DD76E2" wp14:editId="1E626466">
-                <wp:simplePos x="0" y="0"/>
-                <wp:positionH relativeFrom="column">
-                  <wp:posOffset>5715</wp:posOffset>
-                </wp:positionH>
-                <wp:positionV relativeFrom="paragraph">
-                  <wp:posOffset>188112</wp:posOffset>
-                </wp:positionV>
-                <wp:extent cx="6007100" cy="0"/>
-                <wp:effectExtent l="0" t="0" r="0" b="0"/>
-                <wp:wrapNone/>
-                <wp:docPr id="4" name="Straight Connector 4"/>
-                <wp:cNvGraphicFramePr/>
-                <a:graphic xmlns:a="http://schemas.openxmlformats.org/drawingml/2006/main">
-                  <a:graphicData uri="http://schemas.microsoft.com/office/word/2010/wordprocessingShape">
-                    <wps:wsp>
-                      <wps:cNvCnPr/>
-                      <wps:spPr>
-                        <a:xfrm flipV="1">
-                          <a:off x="0" y="0"/>
-                          <a:ext cx="6007100" cy="0"/>
-                        </a:xfrm>
-                        <a:prstGeom prst="line">
-                          <a:avLst/>
-                        </a:prstGeom>
-                        <a:ln w="15875">
-                          <a:solidFill>
-                            <a:schemeClr val="tx1"/>
-                          </a:solidFill>
-                        </a:ln>
-                      </wps:spPr>
-                      <wps:style>
-                        <a:lnRef idx="1">
-                          <a:schemeClr val="accent1"/>
-                        </a:lnRef>
-                        <a:fillRef idx="0">
-                          <a:schemeClr val="accent1"/>
-                        </a:fillRef>
-                        <a:effectRef idx="0">
-                          <a:schemeClr val="accent1"/>
-                        </a:effectRef>
-                        <a:fontRef idx="minor">
-                          <a:schemeClr val="tx1"/>
-                        </a:fontRef>
-                      </wps:style>
-                      <wps:bodyPr/>
-                    </wps:wsp>
-                  </a:graphicData>
-                </a:graphic>
-                <wp14:sizeRelV relativeFrom="margin">
-                  <wp14:pctHeight>0</wp14:pctHeight>
-                </wp14:sizeRelV>
-              </wp:anchor>
-            </w:drawing>
-          </mc:Choice>
-          <mc:Fallback>
-            <w:pict>
-              <v:line w14:anchorId="54329AE1" id="Straight Connector 4" o:spid="_x0000_s1026" style="position:absolute;flip:y;z-index:251664384;visibility:visible;mso-wrap-style:square;mso-height-percent:0;mso-wrap-distance-left:9pt;mso-wrap-distance-top:0;mso-wrap-distance-right:9pt;mso-wrap-distance-bottom:0;mso-position-horizontal:absolute;mso-position-horizontal-relative:text;mso-position-vertical:absolute;mso-position-vertical-relative:text;mso-height-percent:0;mso-height-relative:margin" from=".45pt,14.8pt" to="473.45pt,14.8pt" o:gfxdata="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" strokecolor="black [3213]" strokeweight="1.25pt">
-                <v:stroke joinstyle="miter"/>
-              </v:line>
-            </w:pict>
-          </mc:Fallback>
-        </mc:AlternateContent>
-      </w:r>
-      <w:r>
-        <w:rPr>
-          <w:rFonts w:ascii="Tw Cen MT" w:hAnsi="Tw Cen MT"/>
-          <w:b/>
-          <w:sz w:val="24"/>
-          <w:szCs w:val="24"/>
-        </w:rPr>
-        <w:t>Volunteer Work:</w:t>
-      </w:r>
-    </w:p>
-    <w:p>
-      <w:pPr>
-        <w:pStyle w:val="ListParagraph"/>
-        <w:numPr>
-          <w:ilvl w:val="0"/>
-          <w:numId w:val="6"/>
-        </w:numPr>
-        <w:rPr>
-          <w:rFonts w:ascii="Tw Cen MT" w:hAnsi="Tw Cen MT"/>
-          <w:szCs w:val="20"/>
-        </w:rPr>
-      </w:pPr>
-      <w:r>
-        <w:rPr>
-          <w:rFonts w:ascii="Tw Cen MT" w:hAnsi="Tw Cen MT"/>
-          <w:szCs w:val="20"/>
-        </w:rPr>
-        <w:t>Kids Inspire- raising awareness for mental instabilities and disabilities in children.</w:t>
-      </w:r>
-    </w:p>
-    <w:p>
-      <w:pPr>
-        <w:pStyle w:val="ListParagraph"/>
-        <w:numPr>
-          <w:ilvl w:val="0"/>
-          <w:numId w:val="6"/>
-        </w:numPr>
-        <w:rPr>
-          <w:rFonts w:ascii="Tw Cen MT" w:hAnsi="Tw Cen MT"/>
-          <w:szCs w:val="20"/>
-        </w:rPr>
-      </w:pPr>
-      <w:r>
-        <w:rPr>
-          <w:rFonts w:ascii="Tw Cen MT" w:hAnsi="Tw Cen MT"/>
-          <w:szCs w:val="20"/>
-        </w:rPr>
-        <w:t>Chelmsford Boys Club- painting and renovating youth rooms.</w:t>
-      </w:r>
-    </w:p>
-    <w:p>
-      <w:pPr>
-        <w:pStyle w:val="ListParagraph"/>
-        <w:numPr>
-          <w:ilvl w:val="0"/>
-          <w:numId w:val="6"/>
-        </w:numPr>
-        <w:rPr>
-          <w:rFonts w:ascii="Tw Cen MT" w:hAnsi="Tw Cen MT"/>
-          <w:szCs w:val="20"/>
-        </w:rPr>
-      </w:pPr>
-      <w:r>
-        <w:rPr>
-          <w:rFonts w:ascii="Tw Cen MT" w:hAnsi="Tw Cen MT"/>
-          <w:szCs w:val="20"/>
-        </w:rPr>
-        <w:t>Youth Enquiry Centre Colchester- gardening and maintenance of the centre.</w:t>
-      </w:r>
-    </w:p>
-    <w:p>
-      <w:pPr>
-        <w:rPr>
-          <w:rFonts w:ascii="Tw Cen MT" w:hAnsi="Tw Cen MT"/>
-          <w:b/>
           <w:sz w:val="24"/>
           <w:szCs w:val="24"/>
         </w:rPr>
@@ -2087,16 +1794,16 @@
         <mc:AlternateContent>
           <mc:Choice Requires="wps">
             <w:drawing>
-              <wp:anchor distT="0" distB="0" distL="114300" distR="114300" simplePos="0" relativeHeight="251659264" behindDoc="0" locked="0" layoutInCell="1" allowOverlap="1" wp14:anchorId="04F79456" wp14:editId="71CD7CA7">
+              <wp:anchor distT="0" distB="0" distL="114300" distR="114300" simplePos="0" relativeHeight="251659264" behindDoc="0" locked="0" layoutInCell="1" allowOverlap="1" wp14:anchorId="04F79456" wp14:editId="164B8535">
                 <wp:simplePos x="0" y="0"/>
                 <wp:positionH relativeFrom="page">
-                  <wp:posOffset>3911600</wp:posOffset>
+                  <wp:posOffset>3909646</wp:posOffset>
                 </wp:positionH>
                 <wp:positionV relativeFrom="paragraph">
-                  <wp:posOffset>330835</wp:posOffset>
+                  <wp:posOffset>329809</wp:posOffset>
                 </wp:positionV>
-                <wp:extent cx="3048000" cy="972820"/>
-                <wp:effectExtent l="0" t="0" r="0" b="0"/>
+                <wp:extent cx="3048000" cy="638908"/>
+                <wp:effectExtent l="0" t="0" r="0" b="8890"/>
                 <wp:wrapNone/>
                 <wp:docPr id="1" name="Text Box 1"/>
                 <wp:cNvGraphicFramePr/>
@@ -2107,7 +1814,7 @@
                       <wps:spPr>
                         <a:xfrm>
                           <a:off x="0" y="0"/>
-                          <a:ext cx="3048000" cy="972820"/>
+                          <a:ext cx="3048000" cy="638908"/>
                         </a:xfrm>
                         <a:prstGeom prst="rect">
                           <a:avLst/>
@@ -2224,7 +1931,7 @@
                 <v:stroke joinstyle="miter"/>
                 <v:path gradientshapeok="t" o:connecttype="rect"/>
               </v:shapetype>
-              <v:shape id="Text Box 1" o:spid="_x0000_s1026" type="#_x0000_t202" style="position:absolute;margin-left:308pt;margin-top:26.05pt;width:240pt;height:76.6pt;z-index:251659264;visibility:visible;mso-wrap-style:square;mso-width-percent:0;mso-height-percent:0;mso-wrap-distance-left:9pt;mso-wrap-distance-top:0;mso-wrap-distance-right:9pt;mso-wrap-distance-bottom:0;mso-position-horizontal:absolute;mso-position-horizontal-relative:page;mso-position-vertical:absolute;mso-position-vertical-relative:text;mso-width-percent:0;mso-height-percent:0;mso-width-relative:margin;mso-height-relative:margin;v-text-anchor:top" o:gfxdata="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" fillcolor="white [3201]" stroked="f" strokeweight=".5pt">
+              <v:shape id="Text Box 1" o:spid="_x0000_s1026" type="#_x0000_t202" style="position:absolute;margin-left:307.85pt;margin-top:25.95pt;width:240pt;height:50.3pt;z-index:251659264;visibility:visible;mso-wrap-style:square;mso-width-percent:0;mso-height-percent:0;mso-wrap-distance-left:9pt;mso-wrap-distance-top:0;mso-wrap-distance-right:9pt;mso-wrap-distance-bottom:0;mso-position-horizontal:absolute;mso-position-horizontal-relative:page;mso-position-vertical:absolute;mso-position-vertical-relative:text;mso-width-percent:0;mso-height-percent:0;mso-width-relative:margin;mso-height-relative:margin;v-text-anchor:top" o:gfxdata="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" fillcolor="white [3201]" stroked="f" strokeweight=".5pt">
                 <v:textbox>
                   <w:txbxContent>
                     <w:p>
@@ -2308,16 +2015,16 @@
         <mc:AlternateContent>
           <mc:Choice Requires="wps">
             <w:drawing>
-              <wp:anchor distT="0" distB="0" distL="114300" distR="114300" simplePos="0" relativeHeight="251670528" behindDoc="0" locked="0" layoutInCell="1" allowOverlap="1" wp14:anchorId="1E88C6A5" wp14:editId="4755C567">
+              <wp:anchor distT="0" distB="0" distL="114300" distR="114300" simplePos="0" relativeHeight="251670528" behindDoc="0" locked="0" layoutInCell="1" allowOverlap="1" wp14:anchorId="1E88C6A5" wp14:editId="21347E91">
                 <wp:simplePos x="0" y="0"/>
                 <wp:positionH relativeFrom="margin">
-                  <wp:posOffset>100965</wp:posOffset>
+                  <wp:posOffset>102968</wp:posOffset>
                 </wp:positionH>
                 <wp:positionV relativeFrom="paragraph">
-                  <wp:posOffset>299085</wp:posOffset>
+                  <wp:posOffset>300502</wp:posOffset>
                 </wp:positionV>
-                <wp:extent cx="3124200" cy="695325"/>
-                <wp:effectExtent l="0" t="0" r="0" b="9525"/>
+                <wp:extent cx="3124200" cy="620053"/>
+                <wp:effectExtent l="0" t="0" r="0" b="8890"/>
                 <wp:wrapNone/>
                 <wp:docPr id="7" name="Text Box 7"/>
                 <wp:cNvGraphicFramePr/>
@@ -2328,7 +2035,7 @@
                       <wps:spPr>
                         <a:xfrm>
                           <a:off x="0" y="0"/>
-                          <a:ext cx="3124200" cy="695325"/>
+                          <a:ext cx="3124200" cy="620053"/>
                         </a:xfrm>
                         <a:prstGeom prst="rect">
                           <a:avLst/>
@@ -2475,7 +2182,7 @@
           </mc:Choice>
           <mc:Fallback>
             <w:pict>
-              <v:shape w14:anchorId="1E88C6A5" id="Text Box 7" o:spid="_x0000_s1027" type="#_x0000_t202" style="position:absolute;margin-left:7.95pt;margin-top:23.55pt;width:246pt;height:54.75pt;z-index:251670528;visibility:visible;mso-wrap-style:square;mso-width-percent:0;mso-height-percent:0;mso-wrap-distance-left:9pt;mso-wrap-distance-top:0;mso-wrap-distance-right:9pt;mso-wrap-distance-bottom:0;mso-position-horizontal:absolute;mso-position-horizontal-relative:margin;mso-position-vertical:absolute;mso-position-vertical-relative:text;mso-width-percent:0;mso-height-percent:0;mso-width-relative:margin;mso-height-relative:margin;v-text-anchor:top" o:gfxdata="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" fillcolor="white [3201]" stroked="f" strokeweight=".5pt">
+              <v:shape w14:anchorId="1E88C6A5" id="Text Box 7" o:spid="_x0000_s1027" type="#_x0000_t202" style="position:absolute;margin-left:8.1pt;margin-top:23.65pt;width:246pt;height:48.8pt;z-index:251670528;visibility:visible;mso-wrap-style:square;mso-width-percent:0;mso-height-percent:0;mso-wrap-distance-left:9pt;mso-wrap-distance-top:0;mso-wrap-distance-right:9pt;mso-wrap-distance-bottom:0;mso-position-horizontal:absolute;mso-position-horizontal-relative:margin;mso-position-vertical:absolute;mso-position-vertical-relative:text;mso-width-percent:0;mso-height-percent:0;mso-width-relative:margin;mso-height-relative:margin;v-text-anchor:top" o:gfxdata="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" fillcolor="white [3201]" stroked="f" strokeweight=".5pt">
                 <v:textbox>
                   <w:txbxContent>
                     <w:p>
@@ -3028,6 +2735,119 @@
     </w:lvl>
   </w:abstractNum>
   <w:abstractNum w:abstractNumId="3" w15:restartNumberingAfterBreak="0">
+    <w:nsid w:val="1D131B3E"/>
+    <w:multiLevelType w:val="hybridMultilevel"/>
+    <w:tmpl w:val="30D6E74E"/>
+    <w:lvl w:ilvl="0" w:tplc="08090001">
+      <w:start w:val="1"/>
+      <w:numFmt w:val="bullet"/>
+      <w:lvlText w:val=""/>
+      <w:lvlJc w:val="left"/>
+      <w:pPr>
+        <w:ind w:left="720" w:hanging="360"/>
+      </w:pPr>
+      <w:rPr>
+        <w:rFonts w:ascii="Symbol" w:hAnsi="Symbol" w:hint="default"/>
+      </w:rPr>
+    </w:lvl>
+    <w:lvl w:ilvl="1" w:tplc="08090003" w:tentative="1">
+      <w:start w:val="1"/>
+      <w:numFmt w:val="bullet"/>
+      <w:lvlText w:val="o"/>
+      <w:lvlJc w:val="left"/>
+      <w:pPr>
+        <w:ind w:left="1440" w:hanging="360"/>
+      </w:pPr>
+      <w:rPr>
+        <w:rFonts w:ascii="Courier New" w:hAnsi="Courier New" w:cs="Courier New" w:hint="default"/>
+      </w:rPr>
+    </w:lvl>
+    <w:lvl w:ilvl="2" w:tplc="08090005" w:tentative="1">
+      <w:start w:val="1"/>
+      <w:numFmt w:val="bullet"/>
+      <w:lvlText w:val=""/>
+      <w:lvlJc w:val="left"/>
+      <w:pPr>
+        <w:ind w:left="2160" w:hanging="360"/>
+      </w:pPr>
+      <w:rPr>
+        <w:rFonts w:ascii="Wingdings" w:hAnsi="Wingdings" w:hint="default"/>
+      </w:rPr>
+    </w:lvl>
+    <w:lvl w:ilvl="3" w:tplc="08090001" w:tentative="1">
+      <w:start w:val="1"/>
+      <w:numFmt w:val="bullet"/>
+      <w:lvlText w:val=""/>
+      <w:lvlJc w:val="left"/>
+      <w:pPr>
+        <w:ind w:left="2880" w:hanging="360"/>
+      </w:pPr>
+      <w:rPr>
+        <w:rFonts w:ascii="Symbol" w:hAnsi="Symbol" w:hint="default"/>
+      </w:rPr>
+    </w:lvl>
+    <w:lvl w:ilvl="4" w:tplc="08090003" w:tentative="1">
+      <w:start w:val="1"/>
+      <w:numFmt w:val="bullet"/>
+      <w:lvlText w:val="o"/>
+      <w:lvlJc w:val="left"/>
+      <w:pPr>
+        <w:ind w:left="3600" w:hanging="360"/>
+      </w:pPr>
+      <w:rPr>
+        <w:rFonts w:ascii="Courier New" w:hAnsi="Courier New" w:cs="Courier New" w:hint="default"/>
+      </w:rPr>
+    </w:lvl>
+    <w:lvl w:ilvl="5" w:tplc="08090005" w:tentative="1">
+      <w:start w:val="1"/>
+      <w:numFmt w:val="bullet"/>
+      <w:lvlText w:val=""/>
+      <w:lvlJc w:val="left"/>
+      <w:pPr>
+        <w:ind w:left="4320" w:hanging="360"/>
+      </w:pPr>
+      <w:rPr>
+        <w:rFonts w:ascii="Wingdings" w:hAnsi="Wingdings" w:hint="default"/>
+      </w:rPr>
+    </w:lvl>
+    <w:lvl w:ilvl="6" w:tplc="08090001" w:tentative="1">
+      <w:start w:val="1"/>
+      <w:numFmt w:val="bullet"/>
+      <w:lvlText w:val=""/>
+      <w:lvlJc w:val="left"/>
+      <w:pPr>
+        <w:ind w:left="5040" w:hanging="360"/>
+      </w:pPr>
+      <w:rPr>
+        <w:rFonts w:ascii="Symbol" w:hAnsi="Symbol" w:hint="default"/>
+      </w:rPr>
+    </w:lvl>
+    <w:lvl w:ilvl="7" w:tplc="08090003" w:tentative="1">
+      <w:start w:val="1"/>
+      <w:numFmt w:val="bullet"/>
+      <w:lvlText w:val="o"/>
+      <w:lvlJc w:val="left"/>
+      <w:pPr>
+        <w:ind w:left="5760" w:hanging="360"/>
+      </w:pPr>
+      <w:rPr>
+        <w:rFonts w:ascii="Courier New" w:hAnsi="Courier New" w:cs="Courier New" w:hint="default"/>
+      </w:rPr>
+    </w:lvl>
+    <w:lvl w:ilvl="8" w:tplc="08090005" w:tentative="1">
+      <w:start w:val="1"/>
+      <w:numFmt w:val="bullet"/>
+      <w:lvlText w:val=""/>
+      <w:lvlJc w:val="left"/>
+      <w:pPr>
+        <w:ind w:left="6480" w:hanging="360"/>
+      </w:pPr>
+      <w:rPr>
+        <w:rFonts w:ascii="Wingdings" w:hAnsi="Wingdings" w:hint="default"/>
+      </w:rPr>
+    </w:lvl>
+  </w:abstractNum>
+  <w:abstractNum w:abstractNumId="4" w15:restartNumberingAfterBreak="0">
     <w:nsid w:val="29491B5A"/>
     <w:multiLevelType w:val="hybridMultilevel"/>
     <w:tmpl w:val="0BC2937A"/>
@@ -3140,7 +2960,7 @@
       </w:rPr>
     </w:lvl>
   </w:abstractNum>
-  <w:abstractNum w:abstractNumId="4" w15:restartNumberingAfterBreak="0">
+  <w:abstractNum w:abstractNumId="5" w15:restartNumberingAfterBreak="0">
     <w:nsid w:val="452862EC"/>
     <w:multiLevelType w:val="hybridMultilevel"/>
     <w:tmpl w:val="64BE57C4"/>
@@ -3253,7 +3073,120 @@
       </w:rPr>
     </w:lvl>
   </w:abstractNum>
-  <w:abstractNum w:abstractNumId="5" w15:restartNumberingAfterBreak="0">
+  <w:abstractNum w:abstractNumId="6" w15:restartNumberingAfterBreak="0">
+    <w:nsid w:val="4BEC51D2"/>
+    <w:multiLevelType w:val="hybridMultilevel"/>
+    <w:tmpl w:val="3A9E4FB2"/>
+    <w:lvl w:ilvl="0" w:tplc="08090001">
+      <w:start w:val="1"/>
+      <w:numFmt w:val="bullet"/>
+      <w:lvlText w:val=""/>
+      <w:lvlJc w:val="left"/>
+      <w:pPr>
+        <w:ind w:left="720" w:hanging="360"/>
+      </w:pPr>
+      <w:rPr>
+        <w:rFonts w:ascii="Symbol" w:hAnsi="Symbol" w:hint="default"/>
+      </w:rPr>
+    </w:lvl>
+    <w:lvl w:ilvl="1" w:tplc="08090003" w:tentative="1">
+      <w:start w:val="1"/>
+      <w:numFmt w:val="bullet"/>
+      <w:lvlText w:val="o"/>
+      <w:lvlJc w:val="left"/>
+      <w:pPr>
+        <w:ind w:left="1440" w:hanging="360"/>
+      </w:pPr>
+      <w:rPr>
+        <w:rFonts w:ascii="Courier New" w:hAnsi="Courier New" w:cs="Courier New" w:hint="default"/>
+      </w:rPr>
+    </w:lvl>
+    <w:lvl w:ilvl="2" w:tplc="08090005" w:tentative="1">
+      <w:start w:val="1"/>
+      <w:numFmt w:val="bullet"/>
+      <w:lvlText w:val=""/>
+      <w:lvlJc w:val="left"/>
+      <w:pPr>
+        <w:ind w:left="2160" w:hanging="360"/>
+      </w:pPr>
+      <w:rPr>
+        <w:rFonts w:ascii="Wingdings" w:hAnsi="Wingdings" w:hint="default"/>
+      </w:rPr>
+    </w:lvl>
+    <w:lvl w:ilvl="3" w:tplc="08090001" w:tentative="1">
+      <w:start w:val="1"/>
+      <w:numFmt w:val="bullet"/>
+      <w:lvlText w:val=""/>
+      <w:lvlJc w:val="left"/>
+      <w:pPr>
+        <w:ind w:left="2880" w:hanging="360"/>
+      </w:pPr>
+      <w:rPr>
+        <w:rFonts w:ascii="Symbol" w:hAnsi="Symbol" w:hint="default"/>
+      </w:rPr>
+    </w:lvl>
+    <w:lvl w:ilvl="4" w:tplc="08090003" w:tentative="1">
+      <w:start w:val="1"/>
+      <w:numFmt w:val="bullet"/>
+      <w:lvlText w:val="o"/>
+      <w:lvlJc w:val="left"/>
+      <w:pPr>
+        <w:ind w:left="3600" w:hanging="360"/>
+      </w:pPr>
+      <w:rPr>
+        <w:rFonts w:ascii="Courier New" w:hAnsi="Courier New" w:cs="Courier New" w:hint="default"/>
+      </w:rPr>
+    </w:lvl>
+    <w:lvl w:ilvl="5" w:tplc="08090005" w:tentative="1">
+      <w:start w:val="1"/>
+      <w:numFmt w:val="bullet"/>
+      <w:lvlText w:val=""/>
+      <w:lvlJc w:val="left"/>
+      <w:pPr>
+        <w:ind w:left="4320" w:hanging="360"/>
+      </w:pPr>
+      <w:rPr>
+        <w:rFonts w:ascii="Wingdings" w:hAnsi="Wingdings" w:hint="default"/>
+      </w:rPr>
+    </w:lvl>
+    <w:lvl w:ilvl="6" w:tplc="08090001" w:tentative="1">
+      <w:start w:val="1"/>
+      <w:numFmt w:val="bullet"/>
+      <w:lvlText w:val=""/>
+      <w:lvlJc w:val="left"/>
+      <w:pPr>
+        <w:ind w:left="5040" w:hanging="360"/>
+      </w:pPr>
+      <w:rPr>
+        <w:rFonts w:ascii="Symbol" w:hAnsi="Symbol" w:hint="default"/>
+      </w:rPr>
+    </w:lvl>
+    <w:lvl w:ilvl="7" w:tplc="08090003" w:tentative="1">
+      <w:start w:val="1"/>
+      <w:numFmt w:val="bullet"/>
+      <w:lvlText w:val="o"/>
+      <w:lvlJc w:val="left"/>
+      <w:pPr>
+        <w:ind w:left="5760" w:hanging="360"/>
+      </w:pPr>
+      <w:rPr>
+        <w:rFonts w:ascii="Courier New" w:hAnsi="Courier New" w:cs="Courier New" w:hint="default"/>
+      </w:rPr>
+    </w:lvl>
+    <w:lvl w:ilvl="8" w:tplc="08090005" w:tentative="1">
+      <w:start w:val="1"/>
+      <w:numFmt w:val="bullet"/>
+      <w:lvlText w:val=""/>
+      <w:lvlJc w:val="left"/>
+      <w:pPr>
+        <w:ind w:left="6480" w:hanging="360"/>
+      </w:pPr>
+      <w:rPr>
+        <w:rFonts w:ascii="Wingdings" w:hAnsi="Wingdings" w:hint="default"/>
+      </w:rPr>
+    </w:lvl>
+  </w:abstractNum>
+  <w:abstractNum w:abstractNumId="7" w15:restartNumberingAfterBreak="0">
     <w:nsid w:val="4BF548E7"/>
     <w:multiLevelType w:val="hybridMultilevel"/>
     <w:tmpl w:val="91F022DC"/>
@@ -3342,7 +3275,7 @@
       </w:pPr>
     </w:lvl>
   </w:abstractNum>
-  <w:abstractNum w:abstractNumId="6" w15:restartNumberingAfterBreak="0">
+  <w:abstractNum w:abstractNumId="8" w15:restartNumberingAfterBreak="0">
     <w:nsid w:val="51946865"/>
     <w:multiLevelType w:val="hybridMultilevel"/>
     <w:tmpl w:val="5622CF48"/>
@@ -3455,7 +3388,119 @@
       </w:rPr>
     </w:lvl>
   </w:abstractNum>
-  <w:abstractNum w:abstractNumId="7" w15:restartNumberingAfterBreak="0">
+  <w:abstractNum w:abstractNumId="9" w15:restartNumberingAfterBreak="0">
+    <w:nsid w:val="59CC428D"/>
+    <w:multiLevelType w:val="hybridMultilevel"/>
+    <w:tmpl w:val="0CF0CA44"/>
+    <w:lvl w:ilvl="0" w:tplc="034CE47C">
+      <w:numFmt w:val="bullet"/>
+      <w:lvlText w:val="-"/>
+      <w:lvlJc w:val="left"/>
+      <w:pPr>
+        <w:ind w:left="720" w:hanging="360"/>
+      </w:pPr>
+      <w:rPr>
+        <w:rFonts w:ascii="Tw Cen MT" w:eastAsiaTheme="minorHAnsi" w:hAnsi="Tw Cen MT" w:cstheme="minorBidi" w:hint="default"/>
+      </w:rPr>
+    </w:lvl>
+    <w:lvl w:ilvl="1" w:tplc="08090003" w:tentative="1">
+      <w:start w:val="1"/>
+      <w:numFmt w:val="bullet"/>
+      <w:lvlText w:val="o"/>
+      <w:lvlJc w:val="left"/>
+      <w:pPr>
+        <w:ind w:left="1440" w:hanging="360"/>
+      </w:pPr>
+      <w:rPr>
+        <w:rFonts w:ascii="Courier New" w:hAnsi="Courier New" w:cs="Courier New" w:hint="default"/>
+      </w:rPr>
+    </w:lvl>
+    <w:lvl w:ilvl="2" w:tplc="08090005" w:tentative="1">
+      <w:start w:val="1"/>
+      <w:numFmt w:val="bullet"/>
+      <w:lvlText w:val=""/>
+      <w:lvlJc w:val="left"/>
+      <w:pPr>
+        <w:ind w:left="2160" w:hanging="360"/>
+      </w:pPr>
+      <w:rPr>
+        <w:rFonts w:ascii="Wingdings" w:hAnsi="Wingdings" w:hint="default"/>
+      </w:rPr>
+    </w:lvl>
+    <w:lvl w:ilvl="3" w:tplc="08090001" w:tentative="1">
+      <w:start w:val="1"/>
+      <w:numFmt w:val="bullet"/>
+      <w:lvlText w:val=""/>
+      <w:lvlJc w:val="left"/>
+      <w:pPr>
+        <w:ind w:left="2880" w:hanging="360"/>
+      </w:pPr>
+      <w:rPr>
+        <w:rFonts w:ascii="Symbol" w:hAnsi="Symbol" w:hint="default"/>
+      </w:rPr>
+    </w:lvl>
+    <w:lvl w:ilvl="4" w:tplc="08090003" w:tentative="1">
+      <w:start w:val="1"/>
+      <w:numFmt w:val="bullet"/>
+      <w:lvlText w:val="o"/>
+      <w:lvlJc w:val="left"/>
+      <w:pPr>
+        <w:ind w:left="3600" w:hanging="360"/>
+      </w:pPr>
+      <w:rPr>
+        <w:rFonts w:ascii="Courier New" w:hAnsi="Courier New" w:cs="Courier New" w:hint="default"/>
+      </w:rPr>
+    </w:lvl>
+    <w:lvl w:ilvl="5" w:tplc="08090005" w:tentative="1">
+      <w:start w:val="1"/>
+      <w:numFmt w:val="bullet"/>
+      <w:lvlText w:val=""/>
+      <w:lvlJc w:val="left"/>
+      <w:pPr>
+        <w:ind w:left="4320" w:hanging="360"/>
+      </w:pPr>
+      <w:rPr>
+        <w:rFonts w:ascii="Wingdings" w:hAnsi="Wingdings" w:hint="default"/>
+      </w:rPr>
+    </w:lvl>
+    <w:lvl w:ilvl="6" w:tplc="08090001" w:tentative="1">
+      <w:start w:val="1"/>
+      <w:numFmt w:val="bullet"/>
+      <w:lvlText w:val=""/>
+      <w:lvlJc w:val="left"/>
+      <w:pPr>
+        <w:ind w:left="5040" w:hanging="360"/>
+      </w:pPr>
+      <w:rPr>
+        <w:rFonts w:ascii="Symbol" w:hAnsi="Symbol" w:hint="default"/>
+      </w:rPr>
+    </w:lvl>
+    <w:lvl w:ilvl="7" w:tplc="08090003" w:tentative="1">
+      <w:start w:val="1"/>
+      <w:numFmt w:val="bullet"/>
+      <w:lvlText w:val="o"/>
+      <w:lvlJc w:val="left"/>
+      <w:pPr>
+        <w:ind w:left="5760" w:hanging="360"/>
+      </w:pPr>
+      <w:rPr>
+        <w:rFonts w:ascii="Courier New" w:hAnsi="Courier New" w:cs="Courier New" w:hint="default"/>
+      </w:rPr>
+    </w:lvl>
+    <w:lvl w:ilvl="8" w:tplc="08090005" w:tentative="1">
+      <w:start w:val="1"/>
+      <w:numFmt w:val="bullet"/>
+      <w:lvlText w:val=""/>
+      <w:lvlJc w:val="left"/>
+      <w:pPr>
+        <w:ind w:left="6480" w:hanging="360"/>
+      </w:pPr>
+      <w:rPr>
+        <w:rFonts w:ascii="Wingdings" w:hAnsi="Wingdings" w:hint="default"/>
+      </w:rPr>
+    </w:lvl>
+  </w:abstractNum>
+  <w:abstractNum w:abstractNumId="10" w15:restartNumberingAfterBreak="0">
     <w:nsid w:val="5B8678B7"/>
     <w:multiLevelType w:val="hybridMultilevel"/>
     <w:tmpl w:val="CCB0387A"/>
@@ -3568,7 +3613,7 @@
       </w:rPr>
     </w:lvl>
   </w:abstractNum>
-  <w:abstractNum w:abstractNumId="8" w15:restartNumberingAfterBreak="0">
+  <w:abstractNum w:abstractNumId="11" w15:restartNumberingAfterBreak="0">
     <w:nsid w:val="6A852F6E"/>
     <w:multiLevelType w:val="hybridMultilevel"/>
     <w:tmpl w:val="D3BA0334"/>
@@ -3681,32 +3726,157 @@
       </w:rPr>
     </w:lvl>
   </w:abstractNum>
+  <w:abstractNum w:abstractNumId="12" w15:restartNumberingAfterBreak="0">
+    <w:nsid w:val="7EB66C2B"/>
+    <w:multiLevelType w:val="hybridMultilevel"/>
+    <w:tmpl w:val="DA8CC1B4"/>
+    <w:lvl w:ilvl="0" w:tplc="08090001">
+      <w:start w:val="1"/>
+      <w:numFmt w:val="bullet"/>
+      <w:lvlText w:val=""/>
+      <w:lvlJc w:val="left"/>
+      <w:pPr>
+        <w:ind w:left="720" w:hanging="360"/>
+      </w:pPr>
+      <w:rPr>
+        <w:rFonts w:ascii="Symbol" w:hAnsi="Symbol" w:hint="default"/>
+      </w:rPr>
+    </w:lvl>
+    <w:lvl w:ilvl="1" w:tplc="08090003" w:tentative="1">
+      <w:start w:val="1"/>
+      <w:numFmt w:val="bullet"/>
+      <w:lvlText w:val="o"/>
+      <w:lvlJc w:val="left"/>
+      <w:pPr>
+        <w:ind w:left="1440" w:hanging="360"/>
+      </w:pPr>
+      <w:rPr>
+        <w:rFonts w:ascii="Courier New" w:hAnsi="Courier New" w:cs="Courier New" w:hint="default"/>
+      </w:rPr>
+    </w:lvl>
+    <w:lvl w:ilvl="2" w:tplc="08090005" w:tentative="1">
+      <w:start w:val="1"/>
+      <w:numFmt w:val="bullet"/>
+      <w:lvlText w:val=""/>
+      <w:lvlJc w:val="left"/>
+      <w:pPr>
+        <w:ind w:left="2160" w:hanging="360"/>
+      </w:pPr>
+      <w:rPr>
+        <w:rFonts w:ascii="Wingdings" w:hAnsi="Wingdings" w:hint="default"/>
+      </w:rPr>
+    </w:lvl>
+    <w:lvl w:ilvl="3" w:tplc="08090001" w:tentative="1">
+      <w:start w:val="1"/>
+      <w:numFmt w:val="bullet"/>
+      <w:lvlText w:val=""/>
+      <w:lvlJc w:val="left"/>
+      <w:pPr>
+        <w:ind w:left="2880" w:hanging="360"/>
+      </w:pPr>
+      <w:rPr>
+        <w:rFonts w:ascii="Symbol" w:hAnsi="Symbol" w:hint="default"/>
+      </w:rPr>
+    </w:lvl>
+    <w:lvl w:ilvl="4" w:tplc="08090003" w:tentative="1">
+      <w:start w:val="1"/>
+      <w:numFmt w:val="bullet"/>
+      <w:lvlText w:val="o"/>
+      <w:lvlJc w:val="left"/>
+      <w:pPr>
+        <w:ind w:left="3600" w:hanging="360"/>
+      </w:pPr>
+      <w:rPr>
+        <w:rFonts w:ascii="Courier New" w:hAnsi="Courier New" w:cs="Courier New" w:hint="default"/>
+      </w:rPr>
+    </w:lvl>
+    <w:lvl w:ilvl="5" w:tplc="08090005" w:tentative="1">
+      <w:start w:val="1"/>
+      <w:numFmt w:val="bullet"/>
+      <w:lvlText w:val=""/>
+      <w:lvlJc w:val="left"/>
+      <w:pPr>
+        <w:ind w:left="4320" w:hanging="360"/>
+      </w:pPr>
+      <w:rPr>
+        <w:rFonts w:ascii="Wingdings" w:hAnsi="Wingdings" w:hint="default"/>
+      </w:rPr>
+    </w:lvl>
+    <w:lvl w:ilvl="6" w:tplc="08090001" w:tentative="1">
+      <w:start w:val="1"/>
+      <w:numFmt w:val="bullet"/>
+      <w:lvlText w:val=""/>
+      <w:lvlJc w:val="left"/>
+      <w:pPr>
+        <w:ind w:left="5040" w:hanging="360"/>
+      </w:pPr>
+      <w:rPr>
+        <w:rFonts w:ascii="Symbol" w:hAnsi="Symbol" w:hint="default"/>
+      </w:rPr>
+    </w:lvl>
+    <w:lvl w:ilvl="7" w:tplc="08090003" w:tentative="1">
+      <w:start w:val="1"/>
+      <w:numFmt w:val="bullet"/>
+      <w:lvlText w:val="o"/>
+      <w:lvlJc w:val="left"/>
+      <w:pPr>
+        <w:ind w:left="5760" w:hanging="360"/>
+      </w:pPr>
+      <w:rPr>
+        <w:rFonts w:ascii="Courier New" w:hAnsi="Courier New" w:cs="Courier New" w:hint="default"/>
+      </w:rPr>
+    </w:lvl>
+    <w:lvl w:ilvl="8" w:tplc="08090005" w:tentative="1">
+      <w:start w:val="1"/>
+      <w:numFmt w:val="bullet"/>
+      <w:lvlText w:val=""/>
+      <w:lvlJc w:val="left"/>
+      <w:pPr>
+        <w:ind w:left="6480" w:hanging="360"/>
+      </w:pPr>
+      <w:rPr>
+        <w:rFonts w:ascii="Wingdings" w:hAnsi="Wingdings" w:hint="default"/>
+      </w:rPr>
+    </w:lvl>
+  </w:abstractNum>
   <w:num w:numId="1" w16cid:durableId="545871437">
-    <w:abstractNumId w:val="5"/>
+    <w:abstractNumId w:val="7"/>
   </w:num>
   <w:num w:numId="2" w16cid:durableId="496456160">
     <w:abstractNumId w:val="1"/>
   </w:num>
   <w:num w:numId="3" w16cid:durableId="2142573988">
-    <w:abstractNumId w:val="3"/>
+    <w:abstractNumId w:val="4"/>
   </w:num>
   <w:num w:numId="4" w16cid:durableId="1447848611">
-    <w:abstractNumId w:val="6"/>
+    <w:abstractNumId w:val="8"/>
   </w:num>
   <w:num w:numId="5" w16cid:durableId="908687168">
-    <w:abstractNumId w:val="8"/>
+    <w:abstractNumId w:val="11"/>
   </w:num>
   <w:num w:numId="6" w16cid:durableId="1594586417">
     <w:abstractNumId w:val="0"/>
   </w:num>
   <w:num w:numId="7" w16cid:durableId="94978508">
-    <w:abstractNumId w:val="4"/>
+    <w:abstractNumId w:val="5"/>
   </w:num>
   <w:num w:numId="8" w16cid:durableId="789591293">
     <w:abstractNumId w:val="2"/>
   </w:num>
   <w:num w:numId="9" w16cid:durableId="969895271">
-    <w:abstractNumId w:val="7"/>
+    <w:abstractNumId w:val="10"/>
+  </w:num>
+  <w:num w:numId="10" w16cid:durableId="1121345181">
+    <w:abstractNumId w:val="9"/>
+  </w:num>
+  <w:num w:numId="11" w16cid:durableId="2077780512">
+    <w:abstractNumId w:val="3"/>
+  </w:num>
+  <w:num w:numId="12" w16cid:durableId="1280648159">
+    <w:abstractNumId w:val="6"/>
+  </w:num>
+  <w:num w:numId="13" w16cid:durableId="1384520101">
+    <w:abstractNumId w:val="12"/>
   </w:num>
 </w:numbering>
 </file>
@@ -4117,7 +4287,6 @@
   <w:style w:type="character" w:default="1" w:styleId="DefaultParagraphFont">
     <w:name w:val="Default Paragraph Font"/>
     <w:uiPriority w:val="1"/>
-    <w:semiHidden/>
     <w:unhideWhenUsed/>
   </w:style>
   <w:style w:type="table" w:default="1" w:styleId="TableNormal">

</xml_diff>

<commit_message>
Jh14/update cv info (#14)
Include profile section in CV
</commit_message>
<xml_diff>
--- a/public/CV.docx
+++ b/public/CV.docx
@@ -72,16 +72,6 @@
           <w:tcPr>
             <w:tcW w:w="4757" w:type="dxa"/>
           </w:tcPr>
-          <w:p>
-            <w:pPr>
-              <w:spacing w:after="0"/>
-              <w:rPr>
-                <w:rFonts w:ascii="Tw Cen MT" w:hAnsi="Tw Cen MT"/>
-                <w:sz w:val="6"/>
-                <w:szCs w:val="4"/>
-              </w:rPr>
-            </w:pPr>
-          </w:p>
           <w:p>
             <w:pPr>
               <w:spacing w:after="0"/>
@@ -203,6 +193,32 @@
               <w:t>7504 456577</w:t>
             </w:r>
           </w:p>
+          <w:p>
+            <w:pPr>
+              <w:spacing w:after="0"/>
+              <w:rPr>
+                <w:rFonts w:ascii="Tw Cen MT" w:hAnsi="Tw Cen MT"/>
+                <w:sz w:val="24"/>
+              </w:rPr>
+            </w:pPr>
+            <w:r>
+              <w:rPr>
+                <w:rFonts w:ascii="Tw Cen MT" w:hAnsi="Tw Cen MT"/>
+                <w:sz w:val="24"/>
+              </w:rPr>
+              <w:t xml:space="preserve">LinkedIn          </w:t>
+            </w:r>
+            <w:hyperlink r:id="rId6" w:history="1">
+              <w:r>
+                <w:rPr>
+                  <w:rStyle w:val="Hyperlink"/>
+                  <w:rFonts w:ascii="Tw Cen MT" w:hAnsi="Tw Cen MT"/>
+                  <w:sz w:val="24"/>
+                </w:rPr>
+                <w:t>James Hirst</w:t>
+              </w:r>
+            </w:hyperlink>
+          </w:p>
         </w:tc>
       </w:tr>
     </w:tbl>
@@ -236,7 +252,657 @@
         <mc:AlternateContent>
           <mc:Choice Requires="wps">
             <w:drawing>
-              <wp:anchor distT="0" distB="0" distL="114300" distR="114300" simplePos="0" relativeHeight="251668480" behindDoc="0" locked="0" layoutInCell="1" allowOverlap="1" wp14:anchorId="79F2B61C" wp14:editId="6F4146C8">
+              <wp:anchor distT="0" distB="0" distL="114300" distR="114300" simplePos="0" relativeHeight="251676672" behindDoc="0" locked="0" layoutInCell="1" allowOverlap="1" wp14:anchorId="59052C27" wp14:editId="2516EE9A">
+                <wp:simplePos x="0" y="0"/>
+                <wp:positionH relativeFrom="column">
+                  <wp:posOffset>5715</wp:posOffset>
+                </wp:positionH>
+                <wp:positionV relativeFrom="paragraph">
+                  <wp:posOffset>188112</wp:posOffset>
+                </wp:positionV>
+                <wp:extent cx="6007100" cy="0"/>
+                <wp:effectExtent l="0" t="0" r="0" b="0"/>
+                <wp:wrapNone/>
+                <wp:docPr id="4" name="Straight Connector 4"/>
+                <wp:cNvGraphicFramePr/>
+                <a:graphic xmlns:a="http://schemas.openxmlformats.org/drawingml/2006/main">
+                  <a:graphicData uri="http://schemas.microsoft.com/office/word/2010/wordprocessingShape">
+                    <wps:wsp>
+                      <wps:cNvCnPr/>
+                      <wps:spPr>
+                        <a:xfrm flipV="1">
+                          <a:off x="0" y="0"/>
+                          <a:ext cx="6007100" cy="0"/>
+                        </a:xfrm>
+                        <a:prstGeom prst="line">
+                          <a:avLst/>
+                        </a:prstGeom>
+                        <a:ln w="15875">
+                          <a:solidFill>
+                            <a:schemeClr val="tx1"/>
+                          </a:solidFill>
+                        </a:ln>
+                      </wps:spPr>
+                      <wps:style>
+                        <a:lnRef idx="1">
+                          <a:schemeClr val="accent1"/>
+                        </a:lnRef>
+                        <a:fillRef idx="0">
+                          <a:schemeClr val="accent1"/>
+                        </a:fillRef>
+                        <a:effectRef idx="0">
+                          <a:schemeClr val="accent1"/>
+                        </a:effectRef>
+                        <a:fontRef idx="minor">
+                          <a:schemeClr val="tx1"/>
+                        </a:fontRef>
+                      </wps:style>
+                      <wps:bodyPr/>
+                    </wps:wsp>
+                  </a:graphicData>
+                </a:graphic>
+                <wp14:sizeRelV relativeFrom="margin">
+                  <wp14:pctHeight>0</wp14:pctHeight>
+                </wp14:sizeRelV>
+              </wp:anchor>
+            </w:drawing>
+          </mc:Choice>
+          <mc:Fallback>
+            <w:pict>
+              <v:line w14:anchorId="4EC38FA6" id="Straight Connector 4" o:spid="_x0000_s1026" style="position:absolute;flip:y;z-index:251676672;visibility:visible;mso-wrap-style:square;mso-height-percent:0;mso-wrap-distance-left:9pt;mso-wrap-distance-top:0;mso-wrap-distance-right:9pt;mso-wrap-distance-bottom:0;mso-position-horizontal:absolute;mso-position-horizontal-relative:text;mso-position-vertical:absolute;mso-position-vertical-relative:text;mso-height-percent:0;mso-height-relative:margin" from=".45pt,14.8pt" to="473.45pt,14.8pt" o:gfxdata="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" strokecolor="black [3213]" strokeweight="1.25pt">
+                <v:stroke joinstyle="miter"/>
+              </v:line>
+            </w:pict>
+          </mc:Fallback>
+        </mc:AlternateContent>
+      </w:r>
+      <w:r>
+        <w:rPr>
+          <w:rFonts w:ascii="Tw Cen MT" w:hAnsi="Tw Cen MT"/>
+          <w:b/>
+          <w:sz w:val="24"/>
+          <w:szCs w:val="24"/>
+        </w:rPr>
+        <w:t>Profile</w:t>
+      </w:r>
+      <w:r>
+        <w:rPr>
+          <w:rFonts w:ascii="Tw Cen MT" w:hAnsi="Tw Cen MT"/>
+          <w:b/>
+          <w:sz w:val="24"/>
+          <w:szCs w:val="24"/>
+        </w:rPr>
+        <w:t>:</w:t>
+      </w:r>
+    </w:p>
+    <w:p>
+      <w:pPr>
+        <w:rPr>
+          <w:rFonts w:ascii="Tw Cen MT" w:hAnsi="Tw Cen MT"/>
+        </w:rPr>
+      </w:pPr>
+      <w:r>
+        <w:rPr>
+          <w:rFonts w:ascii="Tw Cen MT" w:hAnsi="Tw Cen MT"/>
+        </w:rPr>
+        <w:t>Software Engineer with Python and Rust expertise, and experience in developing robust applications on Azure using Kubernetes. Skilled in communication and presentation, and passionate about climate tech solutions.</w:t>
+      </w:r>
+    </w:p>
+    <w:p>
+      <w:pPr>
+        <w:rPr>
+          <w:rFonts w:ascii="Tw Cen MT" w:hAnsi="Tw Cen MT"/>
+          <w:b/>
+          <w:sz w:val="26"/>
+          <w:szCs w:val="26"/>
+        </w:rPr>
+      </w:pPr>
+      <w:r>
+        <w:rPr>
+          <w:rFonts w:ascii="Tw Cen MT" w:hAnsi="Tw Cen MT"/>
+          <w:b/>
+          <w:noProof/>
+          <w:sz w:val="24"/>
+          <w:szCs w:val="24"/>
+        </w:rPr>
+        <mc:AlternateContent>
+          <mc:Choice Requires="wps">
+            <w:drawing>
+              <wp:anchor distT="0" distB="0" distL="114300" distR="114300" simplePos="0" relativeHeight="251674624" behindDoc="0" locked="0" layoutInCell="1" allowOverlap="1" wp14:anchorId="06D268AE" wp14:editId="7561000C">
+                <wp:simplePos x="0" y="0"/>
+                <wp:positionH relativeFrom="column">
+                  <wp:posOffset>979</wp:posOffset>
+                </wp:positionH>
+                <wp:positionV relativeFrom="paragraph">
+                  <wp:posOffset>189865</wp:posOffset>
+                </wp:positionV>
+                <wp:extent cx="6007100" cy="0"/>
+                <wp:effectExtent l="0" t="0" r="0" b="0"/>
+                <wp:wrapNone/>
+                <wp:docPr id="3" name="Straight Connector 3"/>
+                <wp:cNvGraphicFramePr/>
+                <a:graphic xmlns:a="http://schemas.openxmlformats.org/drawingml/2006/main">
+                  <a:graphicData uri="http://schemas.microsoft.com/office/word/2010/wordprocessingShape">
+                    <wps:wsp>
+                      <wps:cNvCnPr/>
+                      <wps:spPr>
+                        <a:xfrm flipV="1">
+                          <a:off x="0" y="0"/>
+                          <a:ext cx="6007100" cy="0"/>
+                        </a:xfrm>
+                        <a:prstGeom prst="line">
+                          <a:avLst/>
+                        </a:prstGeom>
+                        <a:ln w="15875">
+                          <a:solidFill>
+                            <a:schemeClr val="tx1"/>
+                          </a:solidFill>
+                        </a:ln>
+                      </wps:spPr>
+                      <wps:style>
+                        <a:lnRef idx="1">
+                          <a:schemeClr val="accent1"/>
+                        </a:lnRef>
+                        <a:fillRef idx="0">
+                          <a:schemeClr val="accent1"/>
+                        </a:fillRef>
+                        <a:effectRef idx="0">
+                          <a:schemeClr val="accent1"/>
+                        </a:effectRef>
+                        <a:fontRef idx="minor">
+                          <a:schemeClr val="tx1"/>
+                        </a:fontRef>
+                      </wps:style>
+                      <wps:bodyPr/>
+                    </wps:wsp>
+                  </a:graphicData>
+                </a:graphic>
+                <wp14:sizeRelV relativeFrom="margin">
+                  <wp14:pctHeight>0</wp14:pctHeight>
+                </wp14:sizeRelV>
+              </wp:anchor>
+            </w:drawing>
+          </mc:Choice>
+          <mc:Fallback>
+            <w:pict>
+              <v:line w14:anchorId="18941E32" id="Straight Connector 3" o:spid="_x0000_s1026" style="position:absolute;flip:y;z-index:251674624;visibility:visible;mso-wrap-style:square;mso-height-percent:0;mso-wrap-distance-left:9pt;mso-wrap-distance-top:0;mso-wrap-distance-right:9pt;mso-wrap-distance-bottom:0;mso-position-horizontal:absolute;mso-position-horizontal-relative:text;mso-position-vertical:absolute;mso-position-vertical-relative:text;mso-height-percent:0;mso-height-relative:margin" from=".1pt,14.95pt" to="473.1pt,14.95pt" o:gfxdata="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" strokecolor="black [3213]" strokeweight="1.25pt">
+                <v:stroke joinstyle="miter"/>
+              </v:line>
+            </w:pict>
+          </mc:Fallback>
+        </mc:AlternateContent>
+      </w:r>
+      <w:r>
+        <w:rPr>
+          <w:rFonts w:ascii="Tw Cen MT" w:hAnsi="Tw Cen MT"/>
+          <w:b/>
+          <w:noProof/>
+          <w:sz w:val="24"/>
+          <w:szCs w:val="24"/>
+        </w:rPr>
+        <w:t>Software</w:t>
+      </w:r>
+      <w:r>
+        <w:rPr>
+          <w:rFonts w:ascii="Tw Cen MT" w:hAnsi="Tw Cen MT"/>
+          <w:b/>
+          <w:sz w:val="24"/>
+          <w:szCs w:val="24"/>
+        </w:rPr>
+        <w:t xml:space="preserve"> Experience:</w:t>
+      </w:r>
+    </w:p>
+    <w:p>
+      <w:pPr>
+        <w:pStyle w:val="ListParagraph"/>
+        <w:numPr>
+          <w:ilvl w:val="0"/>
+          <w:numId w:val="5"/>
+        </w:numPr>
+        <w:rPr>
+          <w:rFonts w:ascii="Tw Cen MT" w:hAnsi="Tw Cen MT"/>
+          <w:u w:val="single"/>
+        </w:rPr>
+      </w:pPr>
+      <w:r>
+        <w:rPr>
+          <w:rFonts w:ascii="Tw Cen MT" w:hAnsi="Tw Cen MT"/>
+        </w:rPr>
+        <w:t xml:space="preserve">Software Engineer, Microsoft (Sep 2022-Present) </w:t>
+      </w:r>
+    </w:p>
+    <w:p>
+      <w:pPr>
+        <w:pStyle w:val="ListParagraph"/>
+        <w:numPr>
+          <w:ilvl w:val="1"/>
+          <w:numId w:val="5"/>
+        </w:numPr>
+        <w:rPr>
+          <w:rFonts w:ascii="Tw Cen MT" w:hAnsi="Tw Cen MT"/>
+          <w:u w:val="single"/>
+        </w:rPr>
+      </w:pPr>
+      <w:r>
+        <w:rPr>
+          <w:rFonts w:ascii="Tw Cen MT" w:hAnsi="Tw Cen MT"/>
+        </w:rPr>
+        <w:t>Developed a Rust based solution to configuration translation with an extensive testing framework.</w:t>
+      </w:r>
+    </w:p>
+    <w:p>
+      <w:pPr>
+        <w:pStyle w:val="ListParagraph"/>
+        <w:numPr>
+          <w:ilvl w:val="1"/>
+          <w:numId w:val="5"/>
+        </w:numPr>
+        <w:rPr>
+          <w:rFonts w:ascii="Tw Cen MT" w:hAnsi="Tw Cen MT"/>
+          <w:u w:val="single"/>
+        </w:rPr>
+      </w:pPr>
+      <w:r>
+        <w:rPr>
+          <w:rFonts w:ascii="Tw Cen MT" w:hAnsi="Tw Cen MT"/>
+        </w:rPr>
+        <w:t>D</w:t>
+      </w:r>
+      <w:r>
+        <w:rPr>
+          <w:rFonts w:ascii="Tw Cen MT" w:hAnsi="Tw Cen MT"/>
+        </w:rPr>
+        <w:t>eploy</w:t>
+      </w:r>
+      <w:r>
+        <w:rPr>
+          <w:rFonts w:ascii="Tw Cen MT" w:hAnsi="Tw Cen MT"/>
+        </w:rPr>
+        <w:t>ed</w:t>
+      </w:r>
+      <w:r>
+        <w:rPr>
+          <w:rFonts w:ascii="Tw Cen MT" w:hAnsi="Tw Cen MT"/>
+        </w:rPr>
+        <w:t xml:space="preserve"> a voicemail solution</w:t>
+      </w:r>
+      <w:r>
+        <w:rPr>
+          <w:rFonts w:ascii="Tw Cen MT" w:hAnsi="Tw Cen MT"/>
+        </w:rPr>
+        <w:t xml:space="preserve"> on Azure</w:t>
+      </w:r>
+      <w:r>
+        <w:rPr>
+          <w:rFonts w:ascii="Tw Cen MT" w:hAnsi="Tw Cen MT"/>
+        </w:rPr>
+        <w:t xml:space="preserve"> for a large telco</w:t>
+      </w:r>
+      <w:r>
+        <w:rPr>
+          <w:rFonts w:ascii="Tw Cen MT" w:hAnsi="Tw Cen MT"/>
+        </w:rPr>
+        <w:t xml:space="preserve"> u</w:t>
+      </w:r>
+      <w:r>
+        <w:rPr>
+          <w:rFonts w:ascii="Tw Cen MT" w:hAnsi="Tw Cen MT"/>
+        </w:rPr>
+        <w:t>s</w:t>
+      </w:r>
+      <w:r>
+        <w:rPr>
+          <w:rFonts w:ascii="Tw Cen MT" w:hAnsi="Tw Cen MT"/>
+        </w:rPr>
+        <w:t xml:space="preserve">ing </w:t>
+      </w:r>
+      <w:r>
+        <w:rPr>
+          <w:rFonts w:ascii="Tw Cen MT" w:hAnsi="Tw Cen MT"/>
+        </w:rPr>
+        <w:t xml:space="preserve">Kubernetes </w:t>
+      </w:r>
+      <w:r>
+        <w:rPr>
+          <w:rFonts w:ascii="Tw Cen MT" w:hAnsi="Tw Cen MT"/>
+        </w:rPr>
+        <w:t>clusters.</w:t>
+      </w:r>
+    </w:p>
+    <w:p>
+      <w:pPr>
+        <w:pStyle w:val="ListParagraph"/>
+        <w:numPr>
+          <w:ilvl w:val="1"/>
+          <w:numId w:val="5"/>
+        </w:numPr>
+        <w:rPr>
+          <w:rFonts w:ascii="Tw Cen MT" w:hAnsi="Tw Cen MT"/>
+        </w:rPr>
+      </w:pPr>
+      <w:r>
+        <w:rPr>
+          <w:rFonts w:ascii="Tw Cen MT" w:hAnsi="Tw Cen MT"/>
+        </w:rPr>
+        <w:t xml:space="preserve">Wrote and owned an </w:t>
+      </w:r>
+      <w:r>
+        <w:rPr>
+          <w:rFonts w:ascii="Tw Cen MT" w:hAnsi="Tw Cen MT"/>
+        </w:rPr>
+        <w:t xml:space="preserve">automation </w:t>
+      </w:r>
+      <w:r>
+        <w:rPr>
+          <w:rFonts w:ascii="Tw Cen MT" w:hAnsi="Tw Cen MT"/>
+        </w:rPr>
+        <w:t xml:space="preserve">bot </w:t>
+      </w:r>
+      <w:r>
+        <w:rPr>
+          <w:rFonts w:ascii="Tw Cen MT" w:hAnsi="Tw Cen MT"/>
+        </w:rPr>
+        <w:t>to manage and fix CVEs</w:t>
+      </w:r>
+      <w:r>
+        <w:rPr>
+          <w:rFonts w:ascii="Tw Cen MT" w:hAnsi="Tw Cen MT"/>
+        </w:rPr>
+        <w:t xml:space="preserve"> using Python.</w:t>
+      </w:r>
+    </w:p>
+    <w:p>
+      <w:pPr>
+        <w:pStyle w:val="ListParagraph"/>
+        <w:numPr>
+          <w:ilvl w:val="1"/>
+          <w:numId w:val="5"/>
+        </w:numPr>
+        <w:rPr>
+          <w:rFonts w:ascii="Tw Cen MT" w:hAnsi="Tw Cen MT"/>
+          <w:u w:val="single"/>
+        </w:rPr>
+      </w:pPr>
+      <w:r>
+        <w:rPr>
+          <w:rFonts w:ascii="Tw Cen MT" w:hAnsi="Tw Cen MT"/>
+        </w:rPr>
+        <w:t>Scrum master for a team of 10</w:t>
+      </w:r>
+      <w:r>
+        <w:rPr>
+          <w:rFonts w:ascii="Tw Cen MT" w:hAnsi="Tw Cen MT"/>
+        </w:rPr>
+        <w:t>, achieving more efficient impact driven meetings.</w:t>
+      </w:r>
+    </w:p>
+    <w:p>
+      <w:pPr>
+        <w:pStyle w:val="ListParagraph"/>
+        <w:numPr>
+          <w:ilvl w:val="1"/>
+          <w:numId w:val="5"/>
+        </w:numPr>
+        <w:rPr>
+          <w:rFonts w:ascii="Tw Cen MT" w:hAnsi="Tw Cen MT"/>
+          <w:u w:val="single"/>
+        </w:rPr>
+      </w:pPr>
+      <w:r>
+        <w:rPr>
+          <w:rFonts w:ascii="Tw Cen MT" w:hAnsi="Tw Cen MT"/>
+        </w:rPr>
+        <w:t>Worked with Java and JavaScript to maintain a workplace messaging app.</w:t>
+      </w:r>
+    </w:p>
+    <w:p>
+      <w:pPr>
+        <w:pStyle w:val="ListParagraph"/>
+        <w:numPr>
+          <w:ilvl w:val="1"/>
+          <w:numId w:val="5"/>
+        </w:numPr>
+        <w:rPr>
+          <w:rFonts w:ascii="Tw Cen MT" w:hAnsi="Tw Cen MT"/>
+          <w:u w:val="single"/>
+        </w:rPr>
+      </w:pPr>
+      <w:r>
+        <w:rPr>
+          <w:rFonts w:ascii="Tw Cen MT" w:hAnsi="Tw Cen MT"/>
+        </w:rPr>
+        <w:t>Gave</w:t>
+      </w:r>
+      <w:r>
+        <w:rPr>
+          <w:rFonts w:ascii="Tw Cen MT" w:hAnsi="Tw Cen MT"/>
+        </w:rPr>
+        <w:t xml:space="preserve"> demos to 100+ people</w:t>
+      </w:r>
+      <w:r>
+        <w:rPr>
+          <w:rFonts w:ascii="Tw Cen MT" w:hAnsi="Tw Cen MT"/>
+        </w:rPr>
+        <w:t xml:space="preserve"> on the uses and capabilities of GitHub Copilot</w:t>
+      </w:r>
+      <w:r>
+        <w:rPr>
+          <w:rFonts w:ascii="Tw Cen MT" w:hAnsi="Tw Cen MT"/>
+        </w:rPr>
+        <w:t>.</w:t>
+      </w:r>
+    </w:p>
+    <w:p>
+      <w:pPr>
+        <w:pStyle w:val="ListParagraph"/>
+        <w:numPr>
+          <w:ilvl w:val="1"/>
+          <w:numId w:val="5"/>
+        </w:numPr>
+        <w:rPr>
+          <w:rFonts w:ascii="Tw Cen MT" w:hAnsi="Tw Cen MT"/>
+          <w:u w:val="single"/>
+        </w:rPr>
+      </w:pPr>
+      <w:r>
+        <w:rPr>
+          <w:rFonts w:ascii="Tw Cen MT" w:hAnsi="Tw Cen MT"/>
+        </w:rPr>
+        <w:t>Running a sustainability series, personally giving talks on fishing and carbon removal companies.</w:t>
+      </w:r>
+    </w:p>
+    <w:p>
+      <w:pPr>
+        <w:pStyle w:val="ListParagraph"/>
+        <w:numPr>
+          <w:ilvl w:val="0"/>
+          <w:numId w:val="5"/>
+        </w:numPr>
+        <w:rPr>
+          <w:rFonts w:ascii="Tw Cen MT" w:hAnsi="Tw Cen MT"/>
+          <w:u w:val="single"/>
+        </w:rPr>
+      </w:pPr>
+      <w:r>
+        <w:rPr>
+          <w:rFonts w:ascii="Tw Cen MT" w:hAnsi="Tw Cen MT"/>
+        </w:rPr>
+        <w:t xml:space="preserve">Built a personal website using React - </w:t>
+      </w:r>
+      <w:hyperlink r:id="rId7" w:history="1">
+        <w:r>
+          <w:rPr>
+            <w:rStyle w:val="Hyperlink"/>
+            <w:rFonts w:ascii="Tw Cen MT" w:hAnsi="Tw Cen MT"/>
+          </w:rPr>
+          <w:t>https://www.jamesjhirst.com/</w:t>
+        </w:r>
+      </w:hyperlink>
+      <w:r>
+        <w:rPr>
+          <w:rFonts w:ascii="Tw Cen MT" w:hAnsi="Tw Cen MT"/>
+        </w:rPr>
+        <w:t>.</w:t>
+      </w:r>
+    </w:p>
+    <w:p>
+      <w:pPr>
+        <w:pStyle w:val="ListParagraph"/>
+        <w:numPr>
+          <w:ilvl w:val="0"/>
+          <w:numId w:val="5"/>
+        </w:numPr>
+        <w:rPr>
+          <w:rFonts w:ascii="Tw Cen MT" w:hAnsi="Tw Cen MT"/>
+        </w:rPr>
+      </w:pPr>
+      <w:r>
+        <w:rPr>
+          <w:rFonts w:ascii="Tw Cen MT" w:hAnsi="Tw Cen MT"/>
+        </w:rPr>
+        <w:t xml:space="preserve">Volunteer Machine Learning Engineer, </w:t>
+      </w:r>
+      <w:hyperlink r:id="rId8" w:history="1">
+        <w:r>
+          <w:rPr>
+            <w:rStyle w:val="Hyperlink"/>
+            <w:rFonts w:ascii="Tw Cen MT" w:hAnsi="Tw Cen MT"/>
+          </w:rPr>
+          <w:t>Shark Trust</w:t>
+        </w:r>
+      </w:hyperlink>
+      <w:r>
+        <w:rPr>
+          <w:rFonts w:ascii="Tw Cen MT" w:hAnsi="Tw Cen MT"/>
+        </w:rPr>
+        <w:t xml:space="preserve"> (2023-Present) classifying shark and ray eggs by species to substitute for manual classification.</w:t>
+      </w:r>
+    </w:p>
+    <w:p>
+      <w:pPr>
+        <w:pStyle w:val="ListParagraph"/>
+        <w:numPr>
+          <w:ilvl w:val="0"/>
+          <w:numId w:val="5"/>
+        </w:numPr>
+        <w:rPr>
+          <w:rFonts w:ascii="Tw Cen MT" w:hAnsi="Tw Cen MT"/>
+          <w:u w:val="single"/>
+        </w:rPr>
+      </w:pPr>
+      <w:r>
+        <w:rPr>
+          <w:rFonts w:ascii="Tw Cen MT" w:hAnsi="Tw Cen MT"/>
+        </w:rPr>
+        <w:t>Machine Learning Engineer, Cambridge (2022), w</w:t>
+      </w:r>
+      <w:r>
+        <w:rPr>
+          <w:rFonts w:ascii="Tw Cen MT" w:hAnsi="Tw Cen MT"/>
+        </w:rPr>
+        <w:t xml:space="preserve">orked on a </w:t>
+      </w:r>
+      <w:r>
+        <w:rPr>
+          <w:rFonts w:ascii="Tw Cen MT" w:hAnsi="Tw Cen MT"/>
+        </w:rPr>
+        <w:t>m</w:t>
+      </w:r>
+      <w:r>
+        <w:rPr>
+          <w:rFonts w:ascii="Tw Cen MT" w:hAnsi="Tw Cen MT"/>
+        </w:rPr>
+        <w:t xml:space="preserve">achine </w:t>
+      </w:r>
+      <w:r>
+        <w:rPr>
+          <w:rFonts w:ascii="Tw Cen MT" w:hAnsi="Tw Cen MT"/>
+        </w:rPr>
+        <w:t>l</w:t>
+      </w:r>
+      <w:r>
+        <w:rPr>
+          <w:rFonts w:ascii="Tw Cen MT" w:hAnsi="Tw Cen MT"/>
+        </w:rPr>
+        <w:t xml:space="preserve">earning </w:t>
+      </w:r>
+      <w:r>
+        <w:rPr>
+          <w:rFonts w:ascii="Tw Cen MT" w:hAnsi="Tw Cen MT"/>
+        </w:rPr>
+        <w:t>e</w:t>
+      </w:r>
+      <w:r>
+        <w:rPr>
+          <w:rFonts w:ascii="Tw Cen MT" w:hAnsi="Tw Cen MT"/>
+        </w:rPr>
+        <w:t>cology project using Detectron2 to predict the location of tree crowns to improve estimates of carbon store in forests and other locations. Resulted in a scientific paper published in a variety of journals.</w:t>
+      </w:r>
+    </w:p>
+    <w:p>
+      <w:pPr>
+        <w:pStyle w:val="ListParagraph"/>
+        <w:numPr>
+          <w:ilvl w:val="0"/>
+          <w:numId w:val="5"/>
+        </w:numPr>
+        <w:rPr>
+          <w:rFonts w:ascii="Tw Cen MT" w:hAnsi="Tw Cen MT"/>
+          <w:u w:val="single"/>
+        </w:rPr>
+      </w:pPr>
+      <w:r>
+        <w:rPr>
+          <w:rFonts w:ascii="Tw Cen MT" w:hAnsi="Tw Cen MT"/>
+        </w:rPr>
+        <w:t>Software Engineer</w:t>
+      </w:r>
+      <w:r>
+        <w:rPr>
+          <w:rFonts w:ascii="Tw Cen MT" w:hAnsi="Tw Cen MT"/>
+        </w:rPr>
+        <w:t>,</w:t>
+      </w:r>
+      <w:r>
+        <w:rPr>
+          <w:rFonts w:ascii="Tw Cen MT" w:hAnsi="Tw Cen MT"/>
+        </w:rPr>
+        <w:t xml:space="preserve"> Microsoft, 8-week virtual internship (2021)</w:t>
+      </w:r>
+      <w:r>
+        <w:rPr>
+          <w:rFonts w:ascii="Tw Cen MT" w:hAnsi="Tw Cen MT"/>
+        </w:rPr>
+        <w:t>, wrote</w:t>
+      </w:r>
+      <w:r>
+        <w:rPr>
+          <w:rFonts w:ascii="Tw Cen MT" w:hAnsi="Tw Cen MT"/>
+        </w:rPr>
+        <w:t xml:space="preserve"> Python to improve the automation of VM deployment and management for products in the telecoms sector.</w:t>
+      </w:r>
+    </w:p>
+    <w:p>
+      <w:pPr>
+        <w:rPr>
+          <w:rFonts w:ascii="Tw Cen MT" w:hAnsi="Tw Cen MT"/>
+          <w:b/>
+          <w:sz w:val="26"/>
+          <w:szCs w:val="26"/>
+        </w:rPr>
+      </w:pPr>
+      <w:r>
+        <w:rPr>
+          <w:rFonts w:ascii="Tw Cen MT" w:hAnsi="Tw Cen MT"/>
+          <w:b/>
+          <w:noProof/>
+          <w:sz w:val="24"/>
+          <w:szCs w:val="24"/>
+        </w:rPr>
+        <mc:AlternateContent>
+          <mc:Choice Requires="wps">
+            <w:drawing>
+              <wp:anchor distT="0" distB="0" distL="114300" distR="114300" simplePos="0" relativeHeight="251668480" behindDoc="0" locked="0" layoutInCell="1" allowOverlap="1" wp14:anchorId="79F2B61C" wp14:editId="1ED60913">
                 <wp:simplePos x="0" y="0"/>
                 <wp:positionH relativeFrom="column">
                   <wp:posOffset>979</wp:posOffset>
@@ -293,7 +959,7 @@
           </mc:Choice>
           <mc:Fallback>
             <w:pict>
-              <v:line w14:anchorId="5868D9B3" id="Straight Connector 6" o:spid="_x0000_s1026" style="position:absolute;flip:y;z-index:251668480;visibility:visible;mso-wrap-style:square;mso-height-percent:0;mso-wrap-distance-left:9pt;mso-wrap-distance-top:0;mso-wrap-distance-right:9pt;mso-wrap-distance-bottom:0;mso-position-horizontal:absolute;mso-position-horizontal-relative:text;mso-position-vertical:absolute;mso-position-vertical-relative:text;mso-height-percent:0;mso-height-relative:margin" from=".1pt,14.1pt" to="473.1pt,14.1pt" o:gfxdata="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" strokecolor="black [3213]" strokeweight="1.25pt">
+              <v:line w14:anchorId="1493C408" id="Straight Connector 6" o:spid="_x0000_s1026" style="position:absolute;flip:y;z-index:251668480;visibility:visible;mso-wrap-style:square;mso-height-percent:0;mso-wrap-distance-left:9pt;mso-wrap-distance-top:0;mso-wrap-distance-right:9pt;mso-wrap-distance-bottom:0;mso-position-horizontal:absolute;mso-position-horizontal-relative:text;mso-position-vertical:absolute;mso-position-vertical-relative:text;mso-height-percent:0;mso-height-relative:margin" from=".1pt,14.1pt" to="473.1pt,14.1pt" o:gfxdata="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" strokecolor="black [3213]" strokeweight="1.25pt">
                 <v:stroke joinstyle="miter"/>
               </v:line>
             </w:pict>
@@ -716,54 +1382,25 @@
         </w:numPr>
         <w:rPr>
           <w:rFonts w:ascii="Tw Cen MT" w:hAnsi="Tw Cen MT"/>
-        </w:rPr>
-      </w:pPr>
-      <w:r>
-        <w:rPr>
-          <w:rFonts w:ascii="Tw Cen MT" w:hAnsi="Tw Cen MT"/>
-        </w:rPr>
-        <w:t xml:space="preserve">AS- Level: </w:t>
-      </w:r>
-      <w:r>
-        <w:rPr>
-          <w:rFonts w:ascii="Tw Cen MT" w:hAnsi="Tw Cen MT"/>
-        </w:rPr>
-        <w:t>1</w:t>
-      </w:r>
-      <w:r>
-        <w:rPr>
-          <w:rFonts w:ascii="Tw Cen MT" w:hAnsi="Tw Cen MT"/>
-        </w:rPr>
-        <w:t>x A- Economics</w:t>
+          <w:b/>
+        </w:rPr>
+      </w:pPr>
+      <w:r>
+        <w:rPr>
+          <w:rFonts w:ascii="Tw Cen MT" w:hAnsi="Tw Cen MT"/>
+          <w:bCs/>
+        </w:rPr>
+        <w:t>IGCSE/ GCSE: 14x A*’s and an A</w:t>
       </w:r>
     </w:p>
     <w:p>
       <w:pPr>
-        <w:pStyle w:val="ListParagraph"/>
-        <w:numPr>
-          <w:ilvl w:val="0"/>
-          <w:numId w:val="8"/>
-        </w:numPr>
         <w:rPr>
           <w:rFonts w:ascii="Tw Cen MT" w:hAnsi="Tw Cen MT"/>
           <w:b/>
-        </w:rPr>
-      </w:pPr>
-      <w:r>
-        <w:rPr>
-          <w:rFonts w:ascii="Tw Cen MT" w:hAnsi="Tw Cen MT"/>
           <w:bCs/>
-        </w:rPr>
-        <w:t>IGCSE/ GCSE: 14x A*’s and an A</w:t>
-      </w:r>
-    </w:p>
-    <w:p>
-      <w:pPr>
-        <w:rPr>
-          <w:rFonts w:ascii="Tw Cen MT" w:hAnsi="Tw Cen MT"/>
-          <w:b/>
-          <w:sz w:val="26"/>
-          <w:szCs w:val="26"/>
+          <w:sz w:val="24"/>
+          <w:szCs w:val="24"/>
         </w:rPr>
       </w:pPr>
       <w:r>
@@ -777,783 +1414,7 @@
         <mc:AlternateContent>
           <mc:Choice Requires="wps">
             <w:drawing>
-              <wp:anchor distT="0" distB="0" distL="114300" distR="114300" simplePos="0" relativeHeight="251662336" behindDoc="0" locked="0" layoutInCell="1" allowOverlap="1" wp14:anchorId="3A991878" wp14:editId="12EB5E3E">
-                <wp:simplePos x="0" y="0"/>
-                <wp:positionH relativeFrom="column">
-                  <wp:posOffset>979</wp:posOffset>
-                </wp:positionH>
-                <wp:positionV relativeFrom="paragraph">
-                  <wp:posOffset>189865</wp:posOffset>
-                </wp:positionV>
-                <wp:extent cx="6007100" cy="0"/>
-                <wp:effectExtent l="0" t="0" r="0" b="0"/>
-                <wp:wrapNone/>
-                <wp:docPr id="3" name="Straight Connector 3"/>
-                <wp:cNvGraphicFramePr/>
-                <a:graphic xmlns:a="http://schemas.openxmlformats.org/drawingml/2006/main">
-                  <a:graphicData uri="http://schemas.microsoft.com/office/word/2010/wordprocessingShape">
-                    <wps:wsp>
-                      <wps:cNvCnPr/>
-                      <wps:spPr>
-                        <a:xfrm flipV="1">
-                          <a:off x="0" y="0"/>
-                          <a:ext cx="6007100" cy="0"/>
-                        </a:xfrm>
-                        <a:prstGeom prst="line">
-                          <a:avLst/>
-                        </a:prstGeom>
-                        <a:ln w="15875">
-                          <a:solidFill>
-                            <a:schemeClr val="tx1"/>
-                          </a:solidFill>
-                        </a:ln>
-                      </wps:spPr>
-                      <wps:style>
-                        <a:lnRef idx="1">
-                          <a:schemeClr val="accent1"/>
-                        </a:lnRef>
-                        <a:fillRef idx="0">
-                          <a:schemeClr val="accent1"/>
-                        </a:fillRef>
-                        <a:effectRef idx="0">
-                          <a:schemeClr val="accent1"/>
-                        </a:effectRef>
-                        <a:fontRef idx="minor">
-                          <a:schemeClr val="tx1"/>
-                        </a:fontRef>
-                      </wps:style>
-                      <wps:bodyPr/>
-                    </wps:wsp>
-                  </a:graphicData>
-                </a:graphic>
-                <wp14:sizeRelV relativeFrom="margin">
-                  <wp14:pctHeight>0</wp14:pctHeight>
-                </wp14:sizeRelV>
-              </wp:anchor>
-            </w:drawing>
-          </mc:Choice>
-          <mc:Fallback>
-            <w:pict>
-              <v:line w14:anchorId="52B57508" id="Straight Connector 3" o:spid="_x0000_s1026" style="position:absolute;flip:y;z-index:251662336;visibility:visible;mso-wrap-style:square;mso-height-percent:0;mso-wrap-distance-left:9pt;mso-wrap-distance-top:0;mso-wrap-distance-right:9pt;mso-wrap-distance-bottom:0;mso-position-horizontal:absolute;mso-position-horizontal-relative:text;mso-position-vertical:absolute;mso-position-vertical-relative:text;mso-height-percent:0;mso-height-relative:margin" from=".1pt,14.95pt" to="473.1pt,14.95pt" o:gfxdata="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" strokecolor="black [3213]" strokeweight="1.25pt">
-                <v:stroke joinstyle="miter"/>
-              </v:line>
-            </w:pict>
-          </mc:Fallback>
-        </mc:AlternateContent>
-      </w:r>
-      <w:r>
-        <w:rPr>
-          <w:rFonts w:ascii="Tw Cen MT" w:hAnsi="Tw Cen MT"/>
-          <w:b/>
-          <w:noProof/>
-          <w:sz w:val="24"/>
-          <w:szCs w:val="24"/>
-        </w:rPr>
-        <w:t>Software</w:t>
-      </w:r>
-      <w:r>
-        <w:rPr>
-          <w:rFonts w:ascii="Tw Cen MT" w:hAnsi="Tw Cen MT"/>
-          <w:b/>
-          <w:sz w:val="24"/>
-          <w:szCs w:val="24"/>
-        </w:rPr>
-        <w:t xml:space="preserve"> Experience:</w:t>
-      </w:r>
-    </w:p>
-    <w:p>
-      <w:pPr>
-        <w:pStyle w:val="ListParagraph"/>
-        <w:numPr>
-          <w:ilvl w:val="0"/>
-          <w:numId w:val="5"/>
-        </w:numPr>
-        <w:rPr>
-          <w:rFonts w:ascii="Tw Cen MT" w:hAnsi="Tw Cen MT"/>
-          <w:u w:val="single"/>
-        </w:rPr>
-      </w:pPr>
-      <w:r>
-        <w:rPr>
-          <w:rFonts w:ascii="Tw Cen MT" w:hAnsi="Tw Cen MT"/>
-        </w:rPr>
-        <w:t>Software Engineer</w:t>
-      </w:r>
-      <w:r>
-        <w:rPr>
-          <w:rFonts w:ascii="Tw Cen MT" w:hAnsi="Tw Cen MT"/>
-        </w:rPr>
-        <w:t xml:space="preserve">, </w:t>
-      </w:r>
-      <w:r>
-        <w:rPr>
-          <w:rFonts w:ascii="Tw Cen MT" w:hAnsi="Tw Cen MT"/>
-        </w:rPr>
-        <w:t xml:space="preserve">Microsoft (Sep 2022-Present) </w:t>
-      </w:r>
-    </w:p>
-    <w:p>
-      <w:pPr>
-        <w:pStyle w:val="ListParagraph"/>
-        <w:numPr>
-          <w:ilvl w:val="1"/>
-          <w:numId w:val="5"/>
-        </w:numPr>
-        <w:rPr>
-          <w:rFonts w:ascii="Tw Cen MT" w:hAnsi="Tw Cen MT"/>
-          <w:u w:val="single"/>
-        </w:rPr>
-      </w:pPr>
-      <w:r>
-        <w:rPr>
-          <w:rFonts w:ascii="Tw Cen MT" w:hAnsi="Tw Cen MT"/>
-        </w:rPr>
-        <w:t>Developed a Rust based solution to configuration translation with an extensive testing framework.</w:t>
-      </w:r>
-    </w:p>
-    <w:p>
-      <w:pPr>
-        <w:pStyle w:val="ListParagraph"/>
-        <w:numPr>
-          <w:ilvl w:val="1"/>
-          <w:numId w:val="5"/>
-        </w:numPr>
-        <w:rPr>
-          <w:rFonts w:ascii="Tw Cen MT" w:hAnsi="Tw Cen MT"/>
-          <w:u w:val="single"/>
-        </w:rPr>
-      </w:pPr>
-      <w:r>
-        <w:rPr>
-          <w:rFonts w:ascii="Tw Cen MT" w:hAnsi="Tw Cen MT"/>
-        </w:rPr>
-        <w:t>D</w:t>
-      </w:r>
-      <w:r>
-        <w:rPr>
-          <w:rFonts w:ascii="Tw Cen MT" w:hAnsi="Tw Cen MT"/>
-        </w:rPr>
-        <w:t>eploy</w:t>
-      </w:r>
-      <w:r>
-        <w:rPr>
-          <w:rFonts w:ascii="Tw Cen MT" w:hAnsi="Tw Cen MT"/>
-        </w:rPr>
-        <w:t>ed</w:t>
-      </w:r>
-      <w:r>
-        <w:rPr>
-          <w:rFonts w:ascii="Tw Cen MT" w:hAnsi="Tw Cen MT"/>
-        </w:rPr>
-        <w:t xml:space="preserve"> </w:t>
-      </w:r>
-      <w:r>
-        <w:rPr>
-          <w:rFonts w:ascii="Tw Cen MT" w:hAnsi="Tw Cen MT"/>
-        </w:rPr>
-        <w:t>a voicemail solution</w:t>
-      </w:r>
-      <w:r>
-        <w:rPr>
-          <w:rFonts w:ascii="Tw Cen MT" w:hAnsi="Tw Cen MT"/>
-        </w:rPr>
-        <w:t xml:space="preserve"> on Azure</w:t>
-      </w:r>
-      <w:r>
-        <w:rPr>
-          <w:rFonts w:ascii="Tw Cen MT" w:hAnsi="Tw Cen MT"/>
-        </w:rPr>
-        <w:t xml:space="preserve"> for</w:t>
-      </w:r>
-      <w:r>
-        <w:rPr>
-          <w:rFonts w:ascii="Tw Cen MT" w:hAnsi="Tw Cen MT"/>
-        </w:rPr>
-        <w:t xml:space="preserve"> a</w:t>
-      </w:r>
-      <w:r>
-        <w:rPr>
-          <w:rFonts w:ascii="Tw Cen MT" w:hAnsi="Tw Cen MT"/>
-        </w:rPr>
-        <w:t xml:space="preserve"> large </w:t>
-      </w:r>
-      <w:r>
-        <w:rPr>
-          <w:rFonts w:ascii="Tw Cen MT" w:hAnsi="Tw Cen MT"/>
-        </w:rPr>
-        <w:t>tel</w:t>
-      </w:r>
-      <w:r>
-        <w:rPr>
-          <w:rFonts w:ascii="Tw Cen MT" w:hAnsi="Tw Cen MT"/>
-        </w:rPr>
-        <w:t>co</w:t>
-      </w:r>
-      <w:r>
-        <w:rPr>
-          <w:rFonts w:ascii="Tw Cen MT" w:hAnsi="Tw Cen MT"/>
-        </w:rPr>
-        <w:t xml:space="preserve"> u</w:t>
-      </w:r>
-      <w:r>
-        <w:rPr>
-          <w:rFonts w:ascii="Tw Cen MT" w:hAnsi="Tw Cen MT"/>
-        </w:rPr>
-        <w:t>s</w:t>
-      </w:r>
-      <w:r>
-        <w:rPr>
-          <w:rFonts w:ascii="Tw Cen MT" w:hAnsi="Tw Cen MT"/>
-        </w:rPr>
-        <w:t xml:space="preserve">ing </w:t>
-      </w:r>
-      <w:r>
-        <w:rPr>
-          <w:rFonts w:ascii="Tw Cen MT" w:hAnsi="Tw Cen MT"/>
-        </w:rPr>
-        <w:t xml:space="preserve">Kubernetes </w:t>
-      </w:r>
-      <w:r>
-        <w:rPr>
-          <w:rFonts w:ascii="Tw Cen MT" w:hAnsi="Tw Cen MT"/>
-        </w:rPr>
-        <w:t>clusters.</w:t>
-      </w:r>
-    </w:p>
-    <w:p>
-      <w:pPr>
-        <w:pStyle w:val="ListParagraph"/>
-        <w:numPr>
-          <w:ilvl w:val="1"/>
-          <w:numId w:val="5"/>
-        </w:numPr>
-        <w:rPr>
-          <w:rFonts w:ascii="Tw Cen MT" w:hAnsi="Tw Cen MT"/>
-          <w:u w:val="single"/>
-        </w:rPr>
-      </w:pPr>
-      <w:r>
-        <w:rPr>
-          <w:rFonts w:ascii="Tw Cen MT" w:hAnsi="Tw Cen MT"/>
-        </w:rPr>
-        <w:t>Wrote and owned</w:t>
-      </w:r>
-      <w:r>
-        <w:rPr>
-          <w:rFonts w:ascii="Tw Cen MT" w:hAnsi="Tw Cen MT"/>
-        </w:rPr>
-        <w:t xml:space="preserve"> </w:t>
-      </w:r>
-      <w:r>
-        <w:rPr>
-          <w:rFonts w:ascii="Tw Cen MT" w:hAnsi="Tw Cen MT"/>
-        </w:rPr>
-        <w:t xml:space="preserve">an </w:t>
-      </w:r>
-      <w:r>
-        <w:rPr>
-          <w:rFonts w:ascii="Tw Cen MT" w:hAnsi="Tw Cen MT"/>
-        </w:rPr>
-        <w:t xml:space="preserve">automation </w:t>
-      </w:r>
-      <w:r>
-        <w:rPr>
-          <w:rFonts w:ascii="Tw Cen MT" w:hAnsi="Tw Cen MT"/>
-        </w:rPr>
-        <w:t>bot</w:t>
-      </w:r>
-      <w:r>
-        <w:rPr>
-          <w:rFonts w:ascii="Tw Cen MT" w:hAnsi="Tw Cen MT"/>
-        </w:rPr>
-        <w:t xml:space="preserve"> </w:t>
-      </w:r>
-      <w:r>
-        <w:rPr>
-          <w:rFonts w:ascii="Tw Cen MT" w:hAnsi="Tw Cen MT"/>
-        </w:rPr>
-        <w:t>to manage and fix CVEs</w:t>
-      </w:r>
-      <w:r>
-        <w:rPr>
-          <w:rFonts w:ascii="Tw Cen MT" w:hAnsi="Tw Cen MT"/>
-        </w:rPr>
-        <w:t xml:space="preserve"> </w:t>
-      </w:r>
-      <w:r>
-        <w:rPr>
-          <w:rFonts w:ascii="Tw Cen MT" w:hAnsi="Tw Cen MT"/>
-        </w:rPr>
-        <w:t>using Python</w:t>
-      </w:r>
-      <w:r>
-        <w:rPr>
-          <w:rFonts w:ascii="Tw Cen MT" w:hAnsi="Tw Cen MT"/>
-        </w:rPr>
-        <w:t>.</w:t>
-      </w:r>
-    </w:p>
-    <w:p>
-      <w:pPr>
-        <w:pStyle w:val="ListParagraph"/>
-        <w:numPr>
-          <w:ilvl w:val="1"/>
-          <w:numId w:val="5"/>
-        </w:numPr>
-        <w:rPr>
-          <w:rFonts w:ascii="Tw Cen MT" w:hAnsi="Tw Cen MT"/>
-          <w:u w:val="single"/>
-        </w:rPr>
-      </w:pPr>
-      <w:r>
-        <w:rPr>
-          <w:rFonts w:ascii="Tw Cen MT" w:hAnsi="Tw Cen MT"/>
-        </w:rPr>
-        <w:t>Scrum master for a team of 10</w:t>
-      </w:r>
-      <w:r>
-        <w:rPr>
-          <w:rFonts w:ascii="Tw Cen MT" w:hAnsi="Tw Cen MT"/>
-        </w:rPr>
-        <w:t>.</w:t>
-      </w:r>
-    </w:p>
-    <w:p>
-      <w:pPr>
-        <w:pStyle w:val="ListParagraph"/>
-        <w:numPr>
-          <w:ilvl w:val="1"/>
-          <w:numId w:val="5"/>
-        </w:numPr>
-        <w:rPr>
-          <w:rFonts w:ascii="Tw Cen MT" w:hAnsi="Tw Cen MT"/>
-          <w:u w:val="single"/>
-        </w:rPr>
-      </w:pPr>
-      <w:r>
-        <w:rPr>
-          <w:rFonts w:ascii="Tw Cen MT" w:hAnsi="Tw Cen MT"/>
-        </w:rPr>
-        <w:t>Worked with</w:t>
-      </w:r>
-      <w:r>
-        <w:rPr>
-          <w:rFonts w:ascii="Tw Cen MT" w:hAnsi="Tw Cen MT"/>
-        </w:rPr>
-        <w:t xml:space="preserve"> Java and </w:t>
-      </w:r>
-      <w:r>
-        <w:rPr>
-          <w:rFonts w:ascii="Tw Cen MT" w:hAnsi="Tw Cen MT"/>
-        </w:rPr>
-        <w:t>JavaScript</w:t>
-      </w:r>
-      <w:r>
-        <w:rPr>
-          <w:rFonts w:ascii="Tw Cen MT" w:hAnsi="Tw Cen MT"/>
-        </w:rPr>
-        <w:t xml:space="preserve"> to maintain a</w:t>
-      </w:r>
-      <w:r>
-        <w:rPr>
-          <w:rFonts w:ascii="Tw Cen MT" w:hAnsi="Tw Cen MT"/>
-        </w:rPr>
-        <w:t xml:space="preserve"> </w:t>
-      </w:r>
-      <w:r>
-        <w:rPr>
-          <w:rFonts w:ascii="Tw Cen MT" w:hAnsi="Tw Cen MT"/>
-        </w:rPr>
-        <w:t>workplace</w:t>
-      </w:r>
-      <w:r>
-        <w:rPr>
-          <w:rFonts w:ascii="Tw Cen MT" w:hAnsi="Tw Cen MT"/>
-        </w:rPr>
-        <w:t xml:space="preserve"> messagi</w:t>
-      </w:r>
-      <w:r>
-        <w:rPr>
-          <w:rFonts w:ascii="Tw Cen MT" w:hAnsi="Tw Cen MT"/>
-        </w:rPr>
-        <w:t xml:space="preserve">ng </w:t>
-      </w:r>
-      <w:r>
-        <w:rPr>
-          <w:rFonts w:ascii="Tw Cen MT" w:hAnsi="Tw Cen MT"/>
-        </w:rPr>
-        <w:t>app.</w:t>
-      </w:r>
-    </w:p>
-    <w:p>
-      <w:pPr>
-        <w:pStyle w:val="ListParagraph"/>
-        <w:numPr>
-          <w:ilvl w:val="1"/>
-          <w:numId w:val="5"/>
-        </w:numPr>
-        <w:rPr>
-          <w:rFonts w:ascii="Tw Cen MT" w:hAnsi="Tw Cen MT"/>
-          <w:u w:val="single"/>
-        </w:rPr>
-      </w:pPr>
-      <w:r>
-        <w:rPr>
-          <w:rFonts w:ascii="Tw Cen MT" w:hAnsi="Tw Cen MT"/>
-        </w:rPr>
-        <w:t>Gave</w:t>
-      </w:r>
-      <w:r>
-        <w:rPr>
-          <w:rFonts w:ascii="Tw Cen MT" w:hAnsi="Tw Cen MT"/>
-        </w:rPr>
-        <w:t xml:space="preserve"> demos to 100+ people</w:t>
-      </w:r>
-      <w:r>
-        <w:rPr>
-          <w:rFonts w:ascii="Tw Cen MT" w:hAnsi="Tw Cen MT"/>
-        </w:rPr>
-        <w:t xml:space="preserve"> on the uses and capabilities of GitHub Copilot</w:t>
-      </w:r>
-      <w:r>
-        <w:rPr>
-          <w:rFonts w:ascii="Tw Cen MT" w:hAnsi="Tw Cen MT"/>
-        </w:rPr>
-        <w:t>.</w:t>
-      </w:r>
-    </w:p>
-    <w:p>
-      <w:pPr>
-        <w:pStyle w:val="ListParagraph"/>
-        <w:numPr>
-          <w:ilvl w:val="1"/>
-          <w:numId w:val="5"/>
-        </w:numPr>
-        <w:rPr>
-          <w:rFonts w:ascii="Tw Cen MT" w:hAnsi="Tw Cen MT"/>
-          <w:u w:val="single"/>
-        </w:rPr>
-      </w:pPr>
-      <w:r>
-        <w:rPr>
-          <w:rFonts w:ascii="Tw Cen MT" w:hAnsi="Tw Cen MT"/>
-        </w:rPr>
-        <w:t>R</w:t>
-      </w:r>
-      <w:r>
-        <w:rPr>
-          <w:rFonts w:ascii="Tw Cen MT" w:hAnsi="Tw Cen MT"/>
-        </w:rPr>
-        <w:t>u</w:t>
-      </w:r>
-      <w:r>
-        <w:rPr>
-          <w:rFonts w:ascii="Tw Cen MT" w:hAnsi="Tw Cen MT"/>
-        </w:rPr>
-        <w:t>n</w:t>
-      </w:r>
-      <w:r>
-        <w:rPr>
-          <w:rFonts w:ascii="Tw Cen MT" w:hAnsi="Tw Cen MT"/>
-        </w:rPr>
-        <w:t>ning</w:t>
-      </w:r>
-      <w:r>
-        <w:rPr>
-          <w:rFonts w:ascii="Tw Cen MT" w:hAnsi="Tw Cen MT"/>
-        </w:rPr>
-        <w:t xml:space="preserve"> a sustainability series, personally giving talks on fishing and carbon removal companies.</w:t>
-      </w:r>
-    </w:p>
-    <w:p>
-      <w:pPr>
-        <w:pStyle w:val="ListParagraph"/>
-        <w:numPr>
-          <w:ilvl w:val="0"/>
-          <w:numId w:val="5"/>
-        </w:numPr>
-        <w:rPr>
-          <w:rFonts w:ascii="Tw Cen MT" w:hAnsi="Tw Cen MT"/>
-          <w:u w:val="single"/>
-        </w:rPr>
-      </w:pPr>
-      <w:r>
-        <w:rPr>
-          <w:rFonts w:ascii="Tw Cen MT" w:hAnsi="Tw Cen MT"/>
-        </w:rPr>
-        <w:t>Built a</w:t>
-      </w:r>
-      <w:r>
-        <w:rPr>
-          <w:rFonts w:ascii="Tw Cen MT" w:hAnsi="Tw Cen MT"/>
-        </w:rPr>
-        <w:t xml:space="preserve"> personal</w:t>
-      </w:r>
-      <w:r>
-        <w:rPr>
-          <w:rFonts w:ascii="Tw Cen MT" w:hAnsi="Tw Cen MT"/>
-        </w:rPr>
-        <w:t xml:space="preserve"> website using React</w:t>
-      </w:r>
-      <w:r>
-        <w:rPr>
-          <w:rFonts w:ascii="Tw Cen MT" w:hAnsi="Tw Cen MT"/>
-        </w:rPr>
-        <w:t xml:space="preserve"> -</w:t>
-      </w:r>
-      <w:r>
-        <w:rPr>
-          <w:rFonts w:ascii="Tw Cen MT" w:hAnsi="Tw Cen MT"/>
-        </w:rPr>
-        <w:t xml:space="preserve"> </w:t>
-      </w:r>
-      <w:hyperlink r:id="rId6" w:history="1">
-        <w:r>
-          <w:rPr>
-            <w:rStyle w:val="Hyperlink"/>
-            <w:rFonts w:ascii="Tw Cen MT" w:hAnsi="Tw Cen MT"/>
-          </w:rPr>
-          <w:t>https://www.jamesjhirst.com/</w:t>
-        </w:r>
-      </w:hyperlink>
-      <w:r>
-        <w:rPr>
-          <w:rFonts w:ascii="Tw Cen MT" w:hAnsi="Tw Cen MT"/>
-        </w:rPr>
-        <w:t>.</w:t>
-      </w:r>
-    </w:p>
-    <w:p>
-      <w:pPr>
-        <w:pStyle w:val="ListParagraph"/>
-        <w:numPr>
-          <w:ilvl w:val="0"/>
-          <w:numId w:val="5"/>
-        </w:numPr>
-        <w:rPr>
-          <w:rFonts w:ascii="Tw Cen MT" w:hAnsi="Tw Cen MT"/>
-        </w:rPr>
-      </w:pPr>
-      <w:r>
-        <w:rPr>
-          <w:rFonts w:ascii="Tw Cen MT" w:hAnsi="Tw Cen MT"/>
-        </w:rPr>
-        <w:t xml:space="preserve">Volunteer </w:t>
-      </w:r>
-      <w:r>
-        <w:rPr>
-          <w:rFonts w:ascii="Tw Cen MT" w:hAnsi="Tw Cen MT"/>
-        </w:rPr>
-        <w:t xml:space="preserve">Machine Learning Engineer, </w:t>
-      </w:r>
-      <w:hyperlink r:id="rId7" w:history="1">
-        <w:r>
-          <w:rPr>
-            <w:rStyle w:val="Hyperlink"/>
-            <w:rFonts w:ascii="Tw Cen MT" w:hAnsi="Tw Cen MT"/>
-          </w:rPr>
-          <w:t>Shark Trust</w:t>
-        </w:r>
-      </w:hyperlink>
-      <w:r>
-        <w:rPr>
-          <w:rFonts w:ascii="Tw Cen MT" w:hAnsi="Tw Cen MT"/>
-        </w:rPr>
-        <w:t xml:space="preserve"> </w:t>
-      </w:r>
-      <w:r>
-        <w:rPr>
-          <w:rFonts w:ascii="Tw Cen MT" w:hAnsi="Tw Cen MT"/>
-        </w:rPr>
-        <w:t xml:space="preserve">(2023-Present) </w:t>
-      </w:r>
-      <w:r>
-        <w:rPr>
-          <w:rFonts w:ascii="Tw Cen MT" w:hAnsi="Tw Cen MT"/>
-        </w:rPr>
-        <w:t>classi</w:t>
-      </w:r>
-      <w:r>
-        <w:rPr>
-          <w:rFonts w:ascii="Tw Cen MT" w:hAnsi="Tw Cen MT"/>
-        </w:rPr>
-        <w:t xml:space="preserve">fying </w:t>
-      </w:r>
-      <w:r>
-        <w:rPr>
-          <w:rFonts w:ascii="Tw Cen MT" w:hAnsi="Tw Cen MT"/>
-        </w:rPr>
-        <w:t>shark and ray eggs by species to substitute for manual classification.</w:t>
-      </w:r>
-    </w:p>
-    <w:p>
-      <w:pPr>
-        <w:pStyle w:val="ListParagraph"/>
-        <w:numPr>
-          <w:ilvl w:val="0"/>
-          <w:numId w:val="5"/>
-        </w:numPr>
-        <w:rPr>
-          <w:rFonts w:ascii="Tw Cen MT" w:hAnsi="Tw Cen MT"/>
-          <w:u w:val="single"/>
-        </w:rPr>
-      </w:pPr>
-      <w:r>
-        <w:rPr>
-          <w:rFonts w:ascii="Tw Cen MT" w:hAnsi="Tw Cen MT"/>
-        </w:rPr>
-        <w:t>Machine Learning Engineer, Cambridge (2022), w</w:t>
-      </w:r>
-      <w:r>
-        <w:rPr>
-          <w:rFonts w:ascii="Tw Cen MT" w:hAnsi="Tw Cen MT"/>
-        </w:rPr>
-        <w:t xml:space="preserve">orked on a </w:t>
-      </w:r>
-      <w:r>
-        <w:rPr>
-          <w:rFonts w:ascii="Tw Cen MT" w:hAnsi="Tw Cen MT"/>
-        </w:rPr>
-        <w:t>m</w:t>
-      </w:r>
-      <w:r>
-        <w:rPr>
-          <w:rFonts w:ascii="Tw Cen MT" w:hAnsi="Tw Cen MT"/>
-        </w:rPr>
-        <w:t xml:space="preserve">achine </w:t>
-      </w:r>
-      <w:r>
-        <w:rPr>
-          <w:rFonts w:ascii="Tw Cen MT" w:hAnsi="Tw Cen MT"/>
-        </w:rPr>
-        <w:t>l</w:t>
-      </w:r>
-      <w:r>
-        <w:rPr>
-          <w:rFonts w:ascii="Tw Cen MT" w:hAnsi="Tw Cen MT"/>
-        </w:rPr>
-        <w:t xml:space="preserve">earning </w:t>
-      </w:r>
-      <w:r>
-        <w:rPr>
-          <w:rFonts w:ascii="Tw Cen MT" w:hAnsi="Tw Cen MT"/>
-        </w:rPr>
-        <w:t>e</w:t>
-      </w:r>
-      <w:r>
-        <w:rPr>
-          <w:rFonts w:ascii="Tw Cen MT" w:hAnsi="Tw Cen MT"/>
-        </w:rPr>
-        <w:t>cology project using Detectron2 to predict the location of tree crowns to improve estimates of carbon store in forests and other locations. Resulted in a scientific paper published in a variety of journals.</w:t>
-      </w:r>
-    </w:p>
-    <w:p>
-      <w:pPr>
-        <w:pStyle w:val="ListParagraph"/>
-        <w:numPr>
-          <w:ilvl w:val="0"/>
-          <w:numId w:val="5"/>
-        </w:numPr>
-        <w:rPr>
-          <w:rFonts w:ascii="Tw Cen MT" w:hAnsi="Tw Cen MT"/>
-          <w:u w:val="single"/>
-        </w:rPr>
-      </w:pPr>
-      <w:r>
-        <w:rPr>
-          <w:rFonts w:ascii="Tw Cen MT" w:hAnsi="Tw Cen MT"/>
-        </w:rPr>
-        <w:t>Software Engineer</w:t>
-      </w:r>
-      <w:r>
-        <w:rPr>
-          <w:rFonts w:ascii="Tw Cen MT" w:hAnsi="Tw Cen MT"/>
-        </w:rPr>
-        <w:t>,</w:t>
-      </w:r>
-      <w:r>
-        <w:rPr>
-          <w:rFonts w:ascii="Tw Cen MT" w:hAnsi="Tw Cen MT"/>
-        </w:rPr>
-        <w:t xml:space="preserve"> Microsoft, 8-week virtual internship</w:t>
-      </w:r>
-      <w:r>
-        <w:rPr>
-          <w:rFonts w:ascii="Tw Cen MT" w:hAnsi="Tw Cen MT"/>
-        </w:rPr>
-        <w:t xml:space="preserve"> (2021)</w:t>
-      </w:r>
-      <w:r>
-        <w:rPr>
-          <w:rFonts w:ascii="Tw Cen MT" w:hAnsi="Tw Cen MT"/>
-        </w:rPr>
-        <w:t>, wrote</w:t>
-      </w:r>
-      <w:r>
-        <w:rPr>
-          <w:rFonts w:ascii="Tw Cen MT" w:hAnsi="Tw Cen MT"/>
-        </w:rPr>
-        <w:t xml:space="preserve"> </w:t>
-      </w:r>
-      <w:r>
-        <w:rPr>
-          <w:rFonts w:ascii="Tw Cen MT" w:hAnsi="Tw Cen MT"/>
-        </w:rPr>
-        <w:t>P</w:t>
-      </w:r>
-      <w:r>
-        <w:rPr>
-          <w:rFonts w:ascii="Tw Cen MT" w:hAnsi="Tw Cen MT"/>
-        </w:rPr>
-        <w:t xml:space="preserve">ython to improve the automation of </w:t>
-      </w:r>
-      <w:r>
-        <w:rPr>
-          <w:rFonts w:ascii="Tw Cen MT" w:hAnsi="Tw Cen MT"/>
-        </w:rPr>
-        <w:t>VM deployment and</w:t>
-      </w:r>
-      <w:r>
-        <w:rPr>
-          <w:rFonts w:ascii="Tw Cen MT" w:hAnsi="Tw Cen MT"/>
-        </w:rPr>
-        <w:t xml:space="preserve"> management f</w:t>
-      </w:r>
-      <w:r>
-        <w:rPr>
-          <w:rFonts w:ascii="Tw Cen MT" w:hAnsi="Tw Cen MT"/>
-        </w:rPr>
-        <w:t>or</w:t>
-      </w:r>
-      <w:r>
-        <w:rPr>
-          <w:rFonts w:ascii="Tw Cen MT" w:hAnsi="Tw Cen MT"/>
-        </w:rPr>
-        <w:t xml:space="preserve"> products in the telecoms sector.</w:t>
-      </w:r>
-    </w:p>
-    <w:p>
-      <w:pPr>
-        <w:rPr>
-          <w:rFonts w:ascii="Tw Cen MT" w:hAnsi="Tw Cen MT"/>
-          <w:b/>
-          <w:bCs/>
-          <w:sz w:val="24"/>
-          <w:szCs w:val="24"/>
-        </w:rPr>
-      </w:pPr>
-      <w:r>
-        <w:rPr>
-          <w:rFonts w:ascii="Tw Cen MT" w:hAnsi="Tw Cen MT"/>
-          <w:b/>
-          <w:noProof/>
-          <w:sz w:val="24"/>
-          <w:szCs w:val="24"/>
-        </w:rPr>
-        <mc:AlternateContent>
-          <mc:Choice Requires="wps">
-            <w:drawing>
-              <wp:anchor distT="0" distB="0" distL="114300" distR="114300" simplePos="0" relativeHeight="251672576" behindDoc="0" locked="0" layoutInCell="1" allowOverlap="1" wp14:anchorId="433A1D9C" wp14:editId="0B06B2D2">
+              <wp:anchor distT="0" distB="0" distL="114300" distR="114300" simplePos="0" relativeHeight="251672576" behindDoc="0" locked="0" layoutInCell="1" allowOverlap="1" wp14:anchorId="433A1D9C" wp14:editId="1E231289">
                 <wp:simplePos x="0" y="0"/>
                 <wp:positionH relativeFrom="margin">
                   <wp:align>left</wp:align>
@@ -1610,7 +1471,7 @@
           </mc:Choice>
           <mc:Fallback>
             <w:pict>
-              <v:line w14:anchorId="0BF7348D" id="Straight Connector 610557234" o:spid="_x0000_s1026" style="position:absolute;flip:y;z-index:251672576;visibility:visible;mso-wrap-style:square;mso-height-percent:0;mso-wrap-distance-left:9pt;mso-wrap-distance-top:0;mso-wrap-distance-right:9pt;mso-wrap-distance-bottom:0;mso-position-horizontal:left;mso-position-horizontal-relative:margin;mso-position-vertical:absolute;mso-position-vertical-relative:text;mso-height-percent:0;mso-height-relative:margin" from="0,14.7pt" to="473pt,14.7pt" o:gfxdata="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" strokecolor="black [3213]" strokeweight="1.25pt">
+              <v:line w14:anchorId="20418848" id="Straight Connector 610557234" o:spid="_x0000_s1026" style="position:absolute;flip:y;z-index:251672576;visibility:visible;mso-wrap-style:square;mso-height-percent:0;mso-wrap-distance-left:9pt;mso-wrap-distance-top:0;mso-wrap-distance-right:9pt;mso-wrap-distance-bottom:0;mso-position-horizontal:left;mso-position-horizontal-relative:margin;mso-position-vertical:absolute;mso-position-vertical-relative:text;mso-height-percent:0;mso-height-relative:margin" from="0,14.7pt" to="473pt,14.7pt" o:gfxdata="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" strokecolor="black [3213]" strokeweight="1.25pt">
                 <v:stroke joinstyle="miter"/>
                 <w10:wrap anchorx="margin"/>
               </v:line>
@@ -1828,7 +1689,7 @@
         </w:rPr>
         <w:t xml:space="preserve"> </w:t>
       </w:r>
-      <w:hyperlink r:id="rId8" w:history="1">
+      <w:hyperlink r:id="rId9" w:history="1">
         <w:r>
           <w:rPr>
             <w:rStyle w:val="Hyperlink"/>
@@ -1918,160 +1779,6 @@
         <w:rPr>
           <w:rFonts w:ascii="Tw Cen MT" w:hAnsi="Tw Cen MT"/>
           <w:b/>
-          <w:sz w:val="26"/>
-          <w:szCs w:val="26"/>
-        </w:rPr>
-      </w:pPr>
-      <w:r>
-        <w:rPr>
-          <w:rFonts w:ascii="Tw Cen MT" w:hAnsi="Tw Cen MT"/>
-          <w:b/>
-          <w:noProof/>
-          <w:sz w:val="24"/>
-          <w:szCs w:val="24"/>
-        </w:rPr>
-        <mc:AlternateContent>
-          <mc:Choice Requires="wps">
-            <w:drawing>
-              <wp:anchor distT="0" distB="0" distL="114300" distR="114300" simplePos="0" relativeHeight="251664384" behindDoc="0" locked="0" layoutInCell="1" allowOverlap="1" wp14:anchorId="59DD76E2" wp14:editId="1E626466">
-                <wp:simplePos x="0" y="0"/>
-                <wp:positionH relativeFrom="column">
-                  <wp:posOffset>5715</wp:posOffset>
-                </wp:positionH>
-                <wp:positionV relativeFrom="paragraph">
-                  <wp:posOffset>188112</wp:posOffset>
-                </wp:positionV>
-                <wp:extent cx="6007100" cy="0"/>
-                <wp:effectExtent l="0" t="0" r="0" b="0"/>
-                <wp:wrapNone/>
-                <wp:docPr id="4" name="Straight Connector 4"/>
-                <wp:cNvGraphicFramePr/>
-                <a:graphic xmlns:a="http://schemas.openxmlformats.org/drawingml/2006/main">
-                  <a:graphicData uri="http://schemas.microsoft.com/office/word/2010/wordprocessingShape">
-                    <wps:wsp>
-                      <wps:cNvCnPr/>
-                      <wps:spPr>
-                        <a:xfrm flipV="1">
-                          <a:off x="0" y="0"/>
-                          <a:ext cx="6007100" cy="0"/>
-                        </a:xfrm>
-                        <a:prstGeom prst="line">
-                          <a:avLst/>
-                        </a:prstGeom>
-                        <a:ln w="15875">
-                          <a:solidFill>
-                            <a:schemeClr val="tx1"/>
-                          </a:solidFill>
-                        </a:ln>
-                      </wps:spPr>
-                      <wps:style>
-                        <a:lnRef idx="1">
-                          <a:schemeClr val="accent1"/>
-                        </a:lnRef>
-                        <a:fillRef idx="0">
-                          <a:schemeClr val="accent1"/>
-                        </a:fillRef>
-                        <a:effectRef idx="0">
-                          <a:schemeClr val="accent1"/>
-                        </a:effectRef>
-                        <a:fontRef idx="minor">
-                          <a:schemeClr val="tx1"/>
-                        </a:fontRef>
-                      </wps:style>
-                      <wps:bodyPr/>
-                    </wps:wsp>
-                  </a:graphicData>
-                </a:graphic>
-                <wp14:sizeRelV relativeFrom="margin">
-                  <wp14:pctHeight>0</wp14:pctHeight>
-                </wp14:sizeRelV>
-              </wp:anchor>
-            </w:drawing>
-          </mc:Choice>
-          <mc:Fallback>
-            <w:pict>
-              <v:line w14:anchorId="54329AE1" id="Straight Connector 4" o:spid="_x0000_s1026" style="position:absolute;flip:y;z-index:251664384;visibility:visible;mso-wrap-style:square;mso-height-percent:0;mso-wrap-distance-left:9pt;mso-wrap-distance-top:0;mso-wrap-distance-right:9pt;mso-wrap-distance-bottom:0;mso-position-horizontal:absolute;mso-position-horizontal-relative:text;mso-position-vertical:absolute;mso-position-vertical-relative:text;mso-height-percent:0;mso-height-relative:margin" from=".45pt,14.8pt" to="473.45pt,14.8pt" o:gfxdata="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" strokecolor="black [3213]" strokeweight="1.25pt">
-                <v:stroke joinstyle="miter"/>
-              </v:line>
-            </w:pict>
-          </mc:Fallback>
-        </mc:AlternateContent>
-      </w:r>
-      <w:r>
-        <w:rPr>
-          <w:rFonts w:ascii="Tw Cen MT" w:hAnsi="Tw Cen MT"/>
-          <w:b/>
-          <w:sz w:val="24"/>
-          <w:szCs w:val="24"/>
-        </w:rPr>
-        <w:t>Volunteer Work:</w:t>
-      </w:r>
-    </w:p>
-    <w:p>
-      <w:pPr>
-        <w:pStyle w:val="ListParagraph"/>
-        <w:numPr>
-          <w:ilvl w:val="0"/>
-          <w:numId w:val="6"/>
-        </w:numPr>
-        <w:rPr>
-          <w:rFonts w:ascii="Tw Cen MT" w:hAnsi="Tw Cen MT"/>
-          <w:szCs w:val="20"/>
-        </w:rPr>
-      </w:pPr>
-      <w:r>
-        <w:rPr>
-          <w:rFonts w:ascii="Tw Cen MT" w:hAnsi="Tw Cen MT"/>
-          <w:szCs w:val="20"/>
-        </w:rPr>
-        <w:t>Kids Inspire- raising awareness for mental instabilities and disabilities in children.</w:t>
-      </w:r>
-    </w:p>
-    <w:p>
-      <w:pPr>
-        <w:pStyle w:val="ListParagraph"/>
-        <w:numPr>
-          <w:ilvl w:val="0"/>
-          <w:numId w:val="6"/>
-        </w:numPr>
-        <w:rPr>
-          <w:rFonts w:ascii="Tw Cen MT" w:hAnsi="Tw Cen MT"/>
-          <w:szCs w:val="20"/>
-        </w:rPr>
-      </w:pPr>
-      <w:r>
-        <w:rPr>
-          <w:rFonts w:ascii="Tw Cen MT" w:hAnsi="Tw Cen MT"/>
-          <w:szCs w:val="20"/>
-        </w:rPr>
-        <w:t>Chelmsford Boys Club- painting and renovating youth rooms.</w:t>
-      </w:r>
-    </w:p>
-    <w:p>
-      <w:pPr>
-        <w:pStyle w:val="ListParagraph"/>
-        <w:numPr>
-          <w:ilvl w:val="0"/>
-          <w:numId w:val="6"/>
-        </w:numPr>
-        <w:rPr>
-          <w:rFonts w:ascii="Tw Cen MT" w:hAnsi="Tw Cen MT"/>
-          <w:szCs w:val="20"/>
-        </w:rPr>
-      </w:pPr>
-      <w:r>
-        <w:rPr>
-          <w:rFonts w:ascii="Tw Cen MT" w:hAnsi="Tw Cen MT"/>
-          <w:szCs w:val="20"/>
-        </w:rPr>
-        <w:t>Youth Enquiry Centre Colchester- gardening and maintenance of the centre.</w:t>
-      </w:r>
-    </w:p>
-    <w:p>
-      <w:pPr>
-        <w:rPr>
-          <w:rFonts w:ascii="Tw Cen MT" w:hAnsi="Tw Cen MT"/>
-          <w:b/>
           <w:sz w:val="24"/>
           <w:szCs w:val="24"/>
         </w:rPr>
@@ -2087,16 +1794,16 @@
         <mc:AlternateContent>
           <mc:Choice Requires="wps">
             <w:drawing>
-              <wp:anchor distT="0" distB="0" distL="114300" distR="114300" simplePos="0" relativeHeight="251659264" behindDoc="0" locked="0" layoutInCell="1" allowOverlap="1" wp14:anchorId="04F79456" wp14:editId="71CD7CA7">
+              <wp:anchor distT="0" distB="0" distL="114300" distR="114300" simplePos="0" relativeHeight="251659264" behindDoc="0" locked="0" layoutInCell="1" allowOverlap="1" wp14:anchorId="04F79456" wp14:editId="164B8535">
                 <wp:simplePos x="0" y="0"/>
                 <wp:positionH relativeFrom="page">
-                  <wp:posOffset>3911600</wp:posOffset>
+                  <wp:posOffset>3909646</wp:posOffset>
                 </wp:positionH>
                 <wp:positionV relativeFrom="paragraph">
-                  <wp:posOffset>330835</wp:posOffset>
+                  <wp:posOffset>329809</wp:posOffset>
                 </wp:positionV>
-                <wp:extent cx="3048000" cy="972820"/>
-                <wp:effectExtent l="0" t="0" r="0" b="0"/>
+                <wp:extent cx="3048000" cy="638908"/>
+                <wp:effectExtent l="0" t="0" r="0" b="8890"/>
                 <wp:wrapNone/>
                 <wp:docPr id="1" name="Text Box 1"/>
                 <wp:cNvGraphicFramePr/>
@@ -2107,7 +1814,7 @@
                       <wps:spPr>
                         <a:xfrm>
                           <a:off x="0" y="0"/>
-                          <a:ext cx="3048000" cy="972820"/>
+                          <a:ext cx="3048000" cy="638908"/>
                         </a:xfrm>
                         <a:prstGeom prst="rect">
                           <a:avLst/>
@@ -2224,7 +1931,7 @@
                 <v:stroke joinstyle="miter"/>
                 <v:path gradientshapeok="t" o:connecttype="rect"/>
               </v:shapetype>
-              <v:shape id="Text Box 1" o:spid="_x0000_s1026" type="#_x0000_t202" style="position:absolute;margin-left:308pt;margin-top:26.05pt;width:240pt;height:76.6pt;z-index:251659264;visibility:visible;mso-wrap-style:square;mso-width-percent:0;mso-height-percent:0;mso-wrap-distance-left:9pt;mso-wrap-distance-top:0;mso-wrap-distance-right:9pt;mso-wrap-distance-bottom:0;mso-position-horizontal:absolute;mso-position-horizontal-relative:page;mso-position-vertical:absolute;mso-position-vertical-relative:text;mso-width-percent:0;mso-height-percent:0;mso-width-relative:margin;mso-height-relative:margin;v-text-anchor:top" o:gfxdata="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" fillcolor="white [3201]" stroked="f" strokeweight=".5pt">
+              <v:shape id="Text Box 1" o:spid="_x0000_s1026" type="#_x0000_t202" style="position:absolute;margin-left:307.85pt;margin-top:25.95pt;width:240pt;height:50.3pt;z-index:251659264;visibility:visible;mso-wrap-style:square;mso-width-percent:0;mso-height-percent:0;mso-wrap-distance-left:9pt;mso-wrap-distance-top:0;mso-wrap-distance-right:9pt;mso-wrap-distance-bottom:0;mso-position-horizontal:absolute;mso-position-horizontal-relative:page;mso-position-vertical:absolute;mso-position-vertical-relative:text;mso-width-percent:0;mso-height-percent:0;mso-width-relative:margin;mso-height-relative:margin;v-text-anchor:top" o:gfxdata="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" fillcolor="white [3201]" stroked="f" strokeweight=".5pt">
                 <v:textbox>
                   <w:txbxContent>
                     <w:p>
@@ -2308,16 +2015,16 @@
         <mc:AlternateContent>
           <mc:Choice Requires="wps">
             <w:drawing>
-              <wp:anchor distT="0" distB="0" distL="114300" distR="114300" simplePos="0" relativeHeight="251670528" behindDoc="0" locked="0" layoutInCell="1" allowOverlap="1" wp14:anchorId="1E88C6A5" wp14:editId="4755C567">
+              <wp:anchor distT="0" distB="0" distL="114300" distR="114300" simplePos="0" relativeHeight="251670528" behindDoc="0" locked="0" layoutInCell="1" allowOverlap="1" wp14:anchorId="1E88C6A5" wp14:editId="21347E91">
                 <wp:simplePos x="0" y="0"/>
                 <wp:positionH relativeFrom="margin">
-                  <wp:posOffset>100965</wp:posOffset>
+                  <wp:posOffset>102968</wp:posOffset>
                 </wp:positionH>
                 <wp:positionV relativeFrom="paragraph">
-                  <wp:posOffset>299085</wp:posOffset>
+                  <wp:posOffset>300502</wp:posOffset>
                 </wp:positionV>
-                <wp:extent cx="3124200" cy="695325"/>
-                <wp:effectExtent l="0" t="0" r="0" b="9525"/>
+                <wp:extent cx="3124200" cy="620053"/>
+                <wp:effectExtent l="0" t="0" r="0" b="8890"/>
                 <wp:wrapNone/>
                 <wp:docPr id="7" name="Text Box 7"/>
                 <wp:cNvGraphicFramePr/>
@@ -2328,7 +2035,7 @@
                       <wps:spPr>
                         <a:xfrm>
                           <a:off x="0" y="0"/>
-                          <a:ext cx="3124200" cy="695325"/>
+                          <a:ext cx="3124200" cy="620053"/>
                         </a:xfrm>
                         <a:prstGeom prst="rect">
                           <a:avLst/>
@@ -2475,7 +2182,7 @@
           </mc:Choice>
           <mc:Fallback>
             <w:pict>
-              <v:shape w14:anchorId="1E88C6A5" id="Text Box 7" o:spid="_x0000_s1027" type="#_x0000_t202" style="position:absolute;margin-left:7.95pt;margin-top:23.55pt;width:246pt;height:54.75pt;z-index:251670528;visibility:visible;mso-wrap-style:square;mso-width-percent:0;mso-height-percent:0;mso-wrap-distance-left:9pt;mso-wrap-distance-top:0;mso-wrap-distance-right:9pt;mso-wrap-distance-bottom:0;mso-position-horizontal:absolute;mso-position-horizontal-relative:margin;mso-position-vertical:absolute;mso-position-vertical-relative:text;mso-width-percent:0;mso-height-percent:0;mso-width-relative:margin;mso-height-relative:margin;v-text-anchor:top" o:gfxdata="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" fillcolor="white [3201]" stroked="f" strokeweight=".5pt">
+              <v:shape w14:anchorId="1E88C6A5" id="Text Box 7" o:spid="_x0000_s1027" type="#_x0000_t202" style="position:absolute;margin-left:8.1pt;margin-top:23.65pt;width:246pt;height:48.8pt;z-index:251670528;visibility:visible;mso-wrap-style:square;mso-width-percent:0;mso-height-percent:0;mso-wrap-distance-left:9pt;mso-wrap-distance-top:0;mso-wrap-distance-right:9pt;mso-wrap-distance-bottom:0;mso-position-horizontal:absolute;mso-position-horizontal-relative:margin;mso-position-vertical:absolute;mso-position-vertical-relative:text;mso-width-percent:0;mso-height-percent:0;mso-width-relative:margin;mso-height-relative:margin;v-text-anchor:top" o:gfxdata="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" fillcolor="white [3201]" stroked="f" strokeweight=".5pt">
                 <v:textbox>
                   <w:txbxContent>
                     <w:p>
@@ -3028,6 +2735,119 @@
     </w:lvl>
   </w:abstractNum>
   <w:abstractNum w:abstractNumId="3" w15:restartNumberingAfterBreak="0">
+    <w:nsid w:val="1D131B3E"/>
+    <w:multiLevelType w:val="hybridMultilevel"/>
+    <w:tmpl w:val="30D6E74E"/>
+    <w:lvl w:ilvl="0" w:tplc="08090001">
+      <w:start w:val="1"/>
+      <w:numFmt w:val="bullet"/>
+      <w:lvlText w:val=""/>
+      <w:lvlJc w:val="left"/>
+      <w:pPr>
+        <w:ind w:left="720" w:hanging="360"/>
+      </w:pPr>
+      <w:rPr>
+        <w:rFonts w:ascii="Symbol" w:hAnsi="Symbol" w:hint="default"/>
+      </w:rPr>
+    </w:lvl>
+    <w:lvl w:ilvl="1" w:tplc="08090003" w:tentative="1">
+      <w:start w:val="1"/>
+      <w:numFmt w:val="bullet"/>
+      <w:lvlText w:val="o"/>
+      <w:lvlJc w:val="left"/>
+      <w:pPr>
+        <w:ind w:left="1440" w:hanging="360"/>
+      </w:pPr>
+      <w:rPr>
+        <w:rFonts w:ascii="Courier New" w:hAnsi="Courier New" w:cs="Courier New" w:hint="default"/>
+      </w:rPr>
+    </w:lvl>
+    <w:lvl w:ilvl="2" w:tplc="08090005" w:tentative="1">
+      <w:start w:val="1"/>
+      <w:numFmt w:val="bullet"/>
+      <w:lvlText w:val=""/>
+      <w:lvlJc w:val="left"/>
+      <w:pPr>
+        <w:ind w:left="2160" w:hanging="360"/>
+      </w:pPr>
+      <w:rPr>
+        <w:rFonts w:ascii="Wingdings" w:hAnsi="Wingdings" w:hint="default"/>
+      </w:rPr>
+    </w:lvl>
+    <w:lvl w:ilvl="3" w:tplc="08090001" w:tentative="1">
+      <w:start w:val="1"/>
+      <w:numFmt w:val="bullet"/>
+      <w:lvlText w:val=""/>
+      <w:lvlJc w:val="left"/>
+      <w:pPr>
+        <w:ind w:left="2880" w:hanging="360"/>
+      </w:pPr>
+      <w:rPr>
+        <w:rFonts w:ascii="Symbol" w:hAnsi="Symbol" w:hint="default"/>
+      </w:rPr>
+    </w:lvl>
+    <w:lvl w:ilvl="4" w:tplc="08090003" w:tentative="1">
+      <w:start w:val="1"/>
+      <w:numFmt w:val="bullet"/>
+      <w:lvlText w:val="o"/>
+      <w:lvlJc w:val="left"/>
+      <w:pPr>
+        <w:ind w:left="3600" w:hanging="360"/>
+      </w:pPr>
+      <w:rPr>
+        <w:rFonts w:ascii="Courier New" w:hAnsi="Courier New" w:cs="Courier New" w:hint="default"/>
+      </w:rPr>
+    </w:lvl>
+    <w:lvl w:ilvl="5" w:tplc="08090005" w:tentative="1">
+      <w:start w:val="1"/>
+      <w:numFmt w:val="bullet"/>
+      <w:lvlText w:val=""/>
+      <w:lvlJc w:val="left"/>
+      <w:pPr>
+        <w:ind w:left="4320" w:hanging="360"/>
+      </w:pPr>
+      <w:rPr>
+        <w:rFonts w:ascii="Wingdings" w:hAnsi="Wingdings" w:hint="default"/>
+      </w:rPr>
+    </w:lvl>
+    <w:lvl w:ilvl="6" w:tplc="08090001" w:tentative="1">
+      <w:start w:val="1"/>
+      <w:numFmt w:val="bullet"/>
+      <w:lvlText w:val=""/>
+      <w:lvlJc w:val="left"/>
+      <w:pPr>
+        <w:ind w:left="5040" w:hanging="360"/>
+      </w:pPr>
+      <w:rPr>
+        <w:rFonts w:ascii="Symbol" w:hAnsi="Symbol" w:hint="default"/>
+      </w:rPr>
+    </w:lvl>
+    <w:lvl w:ilvl="7" w:tplc="08090003" w:tentative="1">
+      <w:start w:val="1"/>
+      <w:numFmt w:val="bullet"/>
+      <w:lvlText w:val="o"/>
+      <w:lvlJc w:val="left"/>
+      <w:pPr>
+        <w:ind w:left="5760" w:hanging="360"/>
+      </w:pPr>
+      <w:rPr>
+        <w:rFonts w:ascii="Courier New" w:hAnsi="Courier New" w:cs="Courier New" w:hint="default"/>
+      </w:rPr>
+    </w:lvl>
+    <w:lvl w:ilvl="8" w:tplc="08090005" w:tentative="1">
+      <w:start w:val="1"/>
+      <w:numFmt w:val="bullet"/>
+      <w:lvlText w:val=""/>
+      <w:lvlJc w:val="left"/>
+      <w:pPr>
+        <w:ind w:left="6480" w:hanging="360"/>
+      </w:pPr>
+      <w:rPr>
+        <w:rFonts w:ascii="Wingdings" w:hAnsi="Wingdings" w:hint="default"/>
+      </w:rPr>
+    </w:lvl>
+  </w:abstractNum>
+  <w:abstractNum w:abstractNumId="4" w15:restartNumberingAfterBreak="0">
     <w:nsid w:val="29491B5A"/>
     <w:multiLevelType w:val="hybridMultilevel"/>
     <w:tmpl w:val="0BC2937A"/>
@@ -3140,7 +2960,7 @@
       </w:rPr>
     </w:lvl>
   </w:abstractNum>
-  <w:abstractNum w:abstractNumId="4" w15:restartNumberingAfterBreak="0">
+  <w:abstractNum w:abstractNumId="5" w15:restartNumberingAfterBreak="0">
     <w:nsid w:val="452862EC"/>
     <w:multiLevelType w:val="hybridMultilevel"/>
     <w:tmpl w:val="64BE57C4"/>
@@ -3253,7 +3073,120 @@
       </w:rPr>
     </w:lvl>
   </w:abstractNum>
-  <w:abstractNum w:abstractNumId="5" w15:restartNumberingAfterBreak="0">
+  <w:abstractNum w:abstractNumId="6" w15:restartNumberingAfterBreak="0">
+    <w:nsid w:val="4BEC51D2"/>
+    <w:multiLevelType w:val="hybridMultilevel"/>
+    <w:tmpl w:val="3A9E4FB2"/>
+    <w:lvl w:ilvl="0" w:tplc="08090001">
+      <w:start w:val="1"/>
+      <w:numFmt w:val="bullet"/>
+      <w:lvlText w:val=""/>
+      <w:lvlJc w:val="left"/>
+      <w:pPr>
+        <w:ind w:left="720" w:hanging="360"/>
+      </w:pPr>
+      <w:rPr>
+        <w:rFonts w:ascii="Symbol" w:hAnsi="Symbol" w:hint="default"/>
+      </w:rPr>
+    </w:lvl>
+    <w:lvl w:ilvl="1" w:tplc="08090003" w:tentative="1">
+      <w:start w:val="1"/>
+      <w:numFmt w:val="bullet"/>
+      <w:lvlText w:val="o"/>
+      <w:lvlJc w:val="left"/>
+      <w:pPr>
+        <w:ind w:left="1440" w:hanging="360"/>
+      </w:pPr>
+      <w:rPr>
+        <w:rFonts w:ascii="Courier New" w:hAnsi="Courier New" w:cs="Courier New" w:hint="default"/>
+      </w:rPr>
+    </w:lvl>
+    <w:lvl w:ilvl="2" w:tplc="08090005" w:tentative="1">
+      <w:start w:val="1"/>
+      <w:numFmt w:val="bullet"/>
+      <w:lvlText w:val=""/>
+      <w:lvlJc w:val="left"/>
+      <w:pPr>
+        <w:ind w:left="2160" w:hanging="360"/>
+      </w:pPr>
+      <w:rPr>
+        <w:rFonts w:ascii="Wingdings" w:hAnsi="Wingdings" w:hint="default"/>
+      </w:rPr>
+    </w:lvl>
+    <w:lvl w:ilvl="3" w:tplc="08090001" w:tentative="1">
+      <w:start w:val="1"/>
+      <w:numFmt w:val="bullet"/>
+      <w:lvlText w:val=""/>
+      <w:lvlJc w:val="left"/>
+      <w:pPr>
+        <w:ind w:left="2880" w:hanging="360"/>
+      </w:pPr>
+      <w:rPr>
+        <w:rFonts w:ascii="Symbol" w:hAnsi="Symbol" w:hint="default"/>
+      </w:rPr>
+    </w:lvl>
+    <w:lvl w:ilvl="4" w:tplc="08090003" w:tentative="1">
+      <w:start w:val="1"/>
+      <w:numFmt w:val="bullet"/>
+      <w:lvlText w:val="o"/>
+      <w:lvlJc w:val="left"/>
+      <w:pPr>
+        <w:ind w:left="3600" w:hanging="360"/>
+      </w:pPr>
+      <w:rPr>
+        <w:rFonts w:ascii="Courier New" w:hAnsi="Courier New" w:cs="Courier New" w:hint="default"/>
+      </w:rPr>
+    </w:lvl>
+    <w:lvl w:ilvl="5" w:tplc="08090005" w:tentative="1">
+      <w:start w:val="1"/>
+      <w:numFmt w:val="bullet"/>
+      <w:lvlText w:val=""/>
+      <w:lvlJc w:val="left"/>
+      <w:pPr>
+        <w:ind w:left="4320" w:hanging="360"/>
+      </w:pPr>
+      <w:rPr>
+        <w:rFonts w:ascii="Wingdings" w:hAnsi="Wingdings" w:hint="default"/>
+      </w:rPr>
+    </w:lvl>
+    <w:lvl w:ilvl="6" w:tplc="08090001" w:tentative="1">
+      <w:start w:val="1"/>
+      <w:numFmt w:val="bullet"/>
+      <w:lvlText w:val=""/>
+      <w:lvlJc w:val="left"/>
+      <w:pPr>
+        <w:ind w:left="5040" w:hanging="360"/>
+      </w:pPr>
+      <w:rPr>
+        <w:rFonts w:ascii="Symbol" w:hAnsi="Symbol" w:hint="default"/>
+      </w:rPr>
+    </w:lvl>
+    <w:lvl w:ilvl="7" w:tplc="08090003" w:tentative="1">
+      <w:start w:val="1"/>
+      <w:numFmt w:val="bullet"/>
+      <w:lvlText w:val="o"/>
+      <w:lvlJc w:val="left"/>
+      <w:pPr>
+        <w:ind w:left="5760" w:hanging="360"/>
+      </w:pPr>
+      <w:rPr>
+        <w:rFonts w:ascii="Courier New" w:hAnsi="Courier New" w:cs="Courier New" w:hint="default"/>
+      </w:rPr>
+    </w:lvl>
+    <w:lvl w:ilvl="8" w:tplc="08090005" w:tentative="1">
+      <w:start w:val="1"/>
+      <w:numFmt w:val="bullet"/>
+      <w:lvlText w:val=""/>
+      <w:lvlJc w:val="left"/>
+      <w:pPr>
+        <w:ind w:left="6480" w:hanging="360"/>
+      </w:pPr>
+      <w:rPr>
+        <w:rFonts w:ascii="Wingdings" w:hAnsi="Wingdings" w:hint="default"/>
+      </w:rPr>
+    </w:lvl>
+  </w:abstractNum>
+  <w:abstractNum w:abstractNumId="7" w15:restartNumberingAfterBreak="0">
     <w:nsid w:val="4BF548E7"/>
     <w:multiLevelType w:val="hybridMultilevel"/>
     <w:tmpl w:val="91F022DC"/>
@@ -3342,7 +3275,7 @@
       </w:pPr>
     </w:lvl>
   </w:abstractNum>
-  <w:abstractNum w:abstractNumId="6" w15:restartNumberingAfterBreak="0">
+  <w:abstractNum w:abstractNumId="8" w15:restartNumberingAfterBreak="0">
     <w:nsid w:val="51946865"/>
     <w:multiLevelType w:val="hybridMultilevel"/>
     <w:tmpl w:val="5622CF48"/>
@@ -3455,7 +3388,119 @@
       </w:rPr>
     </w:lvl>
   </w:abstractNum>
-  <w:abstractNum w:abstractNumId="7" w15:restartNumberingAfterBreak="0">
+  <w:abstractNum w:abstractNumId="9" w15:restartNumberingAfterBreak="0">
+    <w:nsid w:val="59CC428D"/>
+    <w:multiLevelType w:val="hybridMultilevel"/>
+    <w:tmpl w:val="0CF0CA44"/>
+    <w:lvl w:ilvl="0" w:tplc="034CE47C">
+      <w:numFmt w:val="bullet"/>
+      <w:lvlText w:val="-"/>
+      <w:lvlJc w:val="left"/>
+      <w:pPr>
+        <w:ind w:left="720" w:hanging="360"/>
+      </w:pPr>
+      <w:rPr>
+        <w:rFonts w:ascii="Tw Cen MT" w:eastAsiaTheme="minorHAnsi" w:hAnsi="Tw Cen MT" w:cstheme="minorBidi" w:hint="default"/>
+      </w:rPr>
+    </w:lvl>
+    <w:lvl w:ilvl="1" w:tplc="08090003" w:tentative="1">
+      <w:start w:val="1"/>
+      <w:numFmt w:val="bullet"/>
+      <w:lvlText w:val="o"/>
+      <w:lvlJc w:val="left"/>
+      <w:pPr>
+        <w:ind w:left="1440" w:hanging="360"/>
+      </w:pPr>
+      <w:rPr>
+        <w:rFonts w:ascii="Courier New" w:hAnsi="Courier New" w:cs="Courier New" w:hint="default"/>
+      </w:rPr>
+    </w:lvl>
+    <w:lvl w:ilvl="2" w:tplc="08090005" w:tentative="1">
+      <w:start w:val="1"/>
+      <w:numFmt w:val="bullet"/>
+      <w:lvlText w:val=""/>
+      <w:lvlJc w:val="left"/>
+      <w:pPr>
+        <w:ind w:left="2160" w:hanging="360"/>
+      </w:pPr>
+      <w:rPr>
+        <w:rFonts w:ascii="Wingdings" w:hAnsi="Wingdings" w:hint="default"/>
+      </w:rPr>
+    </w:lvl>
+    <w:lvl w:ilvl="3" w:tplc="08090001" w:tentative="1">
+      <w:start w:val="1"/>
+      <w:numFmt w:val="bullet"/>
+      <w:lvlText w:val=""/>
+      <w:lvlJc w:val="left"/>
+      <w:pPr>
+        <w:ind w:left="2880" w:hanging="360"/>
+      </w:pPr>
+      <w:rPr>
+        <w:rFonts w:ascii="Symbol" w:hAnsi="Symbol" w:hint="default"/>
+      </w:rPr>
+    </w:lvl>
+    <w:lvl w:ilvl="4" w:tplc="08090003" w:tentative="1">
+      <w:start w:val="1"/>
+      <w:numFmt w:val="bullet"/>
+      <w:lvlText w:val="o"/>
+      <w:lvlJc w:val="left"/>
+      <w:pPr>
+        <w:ind w:left="3600" w:hanging="360"/>
+      </w:pPr>
+      <w:rPr>
+        <w:rFonts w:ascii="Courier New" w:hAnsi="Courier New" w:cs="Courier New" w:hint="default"/>
+      </w:rPr>
+    </w:lvl>
+    <w:lvl w:ilvl="5" w:tplc="08090005" w:tentative="1">
+      <w:start w:val="1"/>
+      <w:numFmt w:val="bullet"/>
+      <w:lvlText w:val=""/>
+      <w:lvlJc w:val="left"/>
+      <w:pPr>
+        <w:ind w:left="4320" w:hanging="360"/>
+      </w:pPr>
+      <w:rPr>
+        <w:rFonts w:ascii="Wingdings" w:hAnsi="Wingdings" w:hint="default"/>
+      </w:rPr>
+    </w:lvl>
+    <w:lvl w:ilvl="6" w:tplc="08090001" w:tentative="1">
+      <w:start w:val="1"/>
+      <w:numFmt w:val="bullet"/>
+      <w:lvlText w:val=""/>
+      <w:lvlJc w:val="left"/>
+      <w:pPr>
+        <w:ind w:left="5040" w:hanging="360"/>
+      </w:pPr>
+      <w:rPr>
+        <w:rFonts w:ascii="Symbol" w:hAnsi="Symbol" w:hint="default"/>
+      </w:rPr>
+    </w:lvl>
+    <w:lvl w:ilvl="7" w:tplc="08090003" w:tentative="1">
+      <w:start w:val="1"/>
+      <w:numFmt w:val="bullet"/>
+      <w:lvlText w:val="o"/>
+      <w:lvlJc w:val="left"/>
+      <w:pPr>
+        <w:ind w:left="5760" w:hanging="360"/>
+      </w:pPr>
+      <w:rPr>
+        <w:rFonts w:ascii="Courier New" w:hAnsi="Courier New" w:cs="Courier New" w:hint="default"/>
+      </w:rPr>
+    </w:lvl>
+    <w:lvl w:ilvl="8" w:tplc="08090005" w:tentative="1">
+      <w:start w:val="1"/>
+      <w:numFmt w:val="bullet"/>
+      <w:lvlText w:val=""/>
+      <w:lvlJc w:val="left"/>
+      <w:pPr>
+        <w:ind w:left="6480" w:hanging="360"/>
+      </w:pPr>
+      <w:rPr>
+        <w:rFonts w:ascii="Wingdings" w:hAnsi="Wingdings" w:hint="default"/>
+      </w:rPr>
+    </w:lvl>
+  </w:abstractNum>
+  <w:abstractNum w:abstractNumId="10" w15:restartNumberingAfterBreak="0">
     <w:nsid w:val="5B8678B7"/>
     <w:multiLevelType w:val="hybridMultilevel"/>
     <w:tmpl w:val="CCB0387A"/>
@@ -3568,7 +3613,7 @@
       </w:rPr>
     </w:lvl>
   </w:abstractNum>
-  <w:abstractNum w:abstractNumId="8" w15:restartNumberingAfterBreak="0">
+  <w:abstractNum w:abstractNumId="11" w15:restartNumberingAfterBreak="0">
     <w:nsid w:val="6A852F6E"/>
     <w:multiLevelType w:val="hybridMultilevel"/>
     <w:tmpl w:val="D3BA0334"/>
@@ -3681,32 +3726,157 @@
       </w:rPr>
     </w:lvl>
   </w:abstractNum>
+  <w:abstractNum w:abstractNumId="12" w15:restartNumberingAfterBreak="0">
+    <w:nsid w:val="7EB66C2B"/>
+    <w:multiLevelType w:val="hybridMultilevel"/>
+    <w:tmpl w:val="DA8CC1B4"/>
+    <w:lvl w:ilvl="0" w:tplc="08090001">
+      <w:start w:val="1"/>
+      <w:numFmt w:val="bullet"/>
+      <w:lvlText w:val=""/>
+      <w:lvlJc w:val="left"/>
+      <w:pPr>
+        <w:ind w:left="720" w:hanging="360"/>
+      </w:pPr>
+      <w:rPr>
+        <w:rFonts w:ascii="Symbol" w:hAnsi="Symbol" w:hint="default"/>
+      </w:rPr>
+    </w:lvl>
+    <w:lvl w:ilvl="1" w:tplc="08090003" w:tentative="1">
+      <w:start w:val="1"/>
+      <w:numFmt w:val="bullet"/>
+      <w:lvlText w:val="o"/>
+      <w:lvlJc w:val="left"/>
+      <w:pPr>
+        <w:ind w:left="1440" w:hanging="360"/>
+      </w:pPr>
+      <w:rPr>
+        <w:rFonts w:ascii="Courier New" w:hAnsi="Courier New" w:cs="Courier New" w:hint="default"/>
+      </w:rPr>
+    </w:lvl>
+    <w:lvl w:ilvl="2" w:tplc="08090005" w:tentative="1">
+      <w:start w:val="1"/>
+      <w:numFmt w:val="bullet"/>
+      <w:lvlText w:val=""/>
+      <w:lvlJc w:val="left"/>
+      <w:pPr>
+        <w:ind w:left="2160" w:hanging="360"/>
+      </w:pPr>
+      <w:rPr>
+        <w:rFonts w:ascii="Wingdings" w:hAnsi="Wingdings" w:hint="default"/>
+      </w:rPr>
+    </w:lvl>
+    <w:lvl w:ilvl="3" w:tplc="08090001" w:tentative="1">
+      <w:start w:val="1"/>
+      <w:numFmt w:val="bullet"/>
+      <w:lvlText w:val=""/>
+      <w:lvlJc w:val="left"/>
+      <w:pPr>
+        <w:ind w:left="2880" w:hanging="360"/>
+      </w:pPr>
+      <w:rPr>
+        <w:rFonts w:ascii="Symbol" w:hAnsi="Symbol" w:hint="default"/>
+      </w:rPr>
+    </w:lvl>
+    <w:lvl w:ilvl="4" w:tplc="08090003" w:tentative="1">
+      <w:start w:val="1"/>
+      <w:numFmt w:val="bullet"/>
+      <w:lvlText w:val="o"/>
+      <w:lvlJc w:val="left"/>
+      <w:pPr>
+        <w:ind w:left="3600" w:hanging="360"/>
+      </w:pPr>
+      <w:rPr>
+        <w:rFonts w:ascii="Courier New" w:hAnsi="Courier New" w:cs="Courier New" w:hint="default"/>
+      </w:rPr>
+    </w:lvl>
+    <w:lvl w:ilvl="5" w:tplc="08090005" w:tentative="1">
+      <w:start w:val="1"/>
+      <w:numFmt w:val="bullet"/>
+      <w:lvlText w:val=""/>
+      <w:lvlJc w:val="left"/>
+      <w:pPr>
+        <w:ind w:left="4320" w:hanging="360"/>
+      </w:pPr>
+      <w:rPr>
+        <w:rFonts w:ascii="Wingdings" w:hAnsi="Wingdings" w:hint="default"/>
+      </w:rPr>
+    </w:lvl>
+    <w:lvl w:ilvl="6" w:tplc="08090001" w:tentative="1">
+      <w:start w:val="1"/>
+      <w:numFmt w:val="bullet"/>
+      <w:lvlText w:val=""/>
+      <w:lvlJc w:val="left"/>
+      <w:pPr>
+        <w:ind w:left="5040" w:hanging="360"/>
+      </w:pPr>
+      <w:rPr>
+        <w:rFonts w:ascii="Symbol" w:hAnsi="Symbol" w:hint="default"/>
+      </w:rPr>
+    </w:lvl>
+    <w:lvl w:ilvl="7" w:tplc="08090003" w:tentative="1">
+      <w:start w:val="1"/>
+      <w:numFmt w:val="bullet"/>
+      <w:lvlText w:val="o"/>
+      <w:lvlJc w:val="left"/>
+      <w:pPr>
+        <w:ind w:left="5760" w:hanging="360"/>
+      </w:pPr>
+      <w:rPr>
+        <w:rFonts w:ascii="Courier New" w:hAnsi="Courier New" w:cs="Courier New" w:hint="default"/>
+      </w:rPr>
+    </w:lvl>
+    <w:lvl w:ilvl="8" w:tplc="08090005" w:tentative="1">
+      <w:start w:val="1"/>
+      <w:numFmt w:val="bullet"/>
+      <w:lvlText w:val=""/>
+      <w:lvlJc w:val="left"/>
+      <w:pPr>
+        <w:ind w:left="6480" w:hanging="360"/>
+      </w:pPr>
+      <w:rPr>
+        <w:rFonts w:ascii="Wingdings" w:hAnsi="Wingdings" w:hint="default"/>
+      </w:rPr>
+    </w:lvl>
+  </w:abstractNum>
   <w:num w:numId="1" w16cid:durableId="545871437">
-    <w:abstractNumId w:val="5"/>
+    <w:abstractNumId w:val="7"/>
   </w:num>
   <w:num w:numId="2" w16cid:durableId="496456160">
     <w:abstractNumId w:val="1"/>
   </w:num>
   <w:num w:numId="3" w16cid:durableId="2142573988">
-    <w:abstractNumId w:val="3"/>
+    <w:abstractNumId w:val="4"/>
   </w:num>
   <w:num w:numId="4" w16cid:durableId="1447848611">
-    <w:abstractNumId w:val="6"/>
+    <w:abstractNumId w:val="8"/>
   </w:num>
   <w:num w:numId="5" w16cid:durableId="908687168">
-    <w:abstractNumId w:val="8"/>
+    <w:abstractNumId w:val="11"/>
   </w:num>
   <w:num w:numId="6" w16cid:durableId="1594586417">
     <w:abstractNumId w:val="0"/>
   </w:num>
   <w:num w:numId="7" w16cid:durableId="94978508">
-    <w:abstractNumId w:val="4"/>
+    <w:abstractNumId w:val="5"/>
   </w:num>
   <w:num w:numId="8" w16cid:durableId="789591293">
     <w:abstractNumId w:val="2"/>
   </w:num>
   <w:num w:numId="9" w16cid:durableId="969895271">
-    <w:abstractNumId w:val="7"/>
+    <w:abstractNumId w:val="10"/>
+  </w:num>
+  <w:num w:numId="10" w16cid:durableId="1121345181">
+    <w:abstractNumId w:val="9"/>
+  </w:num>
+  <w:num w:numId="11" w16cid:durableId="2077780512">
+    <w:abstractNumId w:val="3"/>
+  </w:num>
+  <w:num w:numId="12" w16cid:durableId="1280648159">
+    <w:abstractNumId w:val="6"/>
+  </w:num>
+  <w:num w:numId="13" w16cid:durableId="1384520101">
+    <w:abstractNumId w:val="12"/>
   </w:num>
 </w:numbering>
 </file>
@@ -4117,7 +4287,6 @@
   <w:style w:type="character" w:default="1" w:styleId="DefaultParagraphFont">
     <w:name w:val="Default Paragraph Font"/>
     <w:uiPriority w:val="1"/>
-    <w:semiHidden/>
     <w:unhideWhenUsed/>
   </w:style>
   <w:style w:type="table" w:default="1" w:styleId="TableNormal">

</xml_diff>

<commit_message>
Include skills in CV section (#15)
* Include profile in CV

* pdf

* Improving skills section

---------

Co-authored-by: James Hirst <jameshirst@microsoft.com>
</commit_message>
<xml_diff>
--- a/public/CV.docx
+++ b/public/CV.docx
@@ -138,7 +138,7 @@
               </w:rPr>
               <w:tab/>
             </w:r>
-            <w:hyperlink r:id="rId5" w:history="1">
+            <w:hyperlink r:id="rId6" w:history="1">
               <w:r>
                 <w:rPr>
                   <w:rStyle w:val="Hyperlink"/>
@@ -208,7 +208,7 @@
               </w:rPr>
               <w:t xml:space="preserve">LinkedIn          </w:t>
             </w:r>
-            <w:hyperlink r:id="rId6" w:history="1">
+            <w:hyperlink r:id="rId7" w:history="1">
               <w:r>
                 <w:rPr>
                   <w:rStyle w:val="Hyperlink"/>
@@ -231,16 +231,6 @@
           <w:szCs w:val="8"/>
         </w:rPr>
       </w:pPr>
-    </w:p>
-    <w:p>
-      <w:pPr>
-        <w:rPr>
-          <w:rFonts w:ascii="Tw Cen MT" w:hAnsi="Tw Cen MT"/>
-          <w:b/>
-          <w:sz w:val="26"/>
-          <w:szCs w:val="26"/>
-        </w:rPr>
-      </w:pPr>
       <w:r>
         <w:rPr>
           <w:rFonts w:ascii="Tw Cen MT" w:hAnsi="Tw Cen MT"/>
@@ -252,18 +242,693 @@
         <mc:AlternateContent>
           <mc:Choice Requires="wps">
             <w:drawing>
-              <wp:anchor distT="0" distB="0" distL="114300" distR="114300" simplePos="0" relativeHeight="251676672" behindDoc="0" locked="0" layoutInCell="1" allowOverlap="1" wp14:anchorId="59052C27" wp14:editId="2516EE9A">
+              <wp:anchor distT="45720" distB="45720" distL="114300" distR="114300" simplePos="0" relativeHeight="251678720" behindDoc="0" locked="0" layoutInCell="1" allowOverlap="1" wp14:anchorId="6EA97FC4" wp14:editId="10746056">
+                <wp:simplePos x="0" y="0"/>
+                <wp:positionH relativeFrom="margin">
+                  <wp:posOffset>3312271</wp:posOffset>
+                </wp:positionH>
+                <wp:positionV relativeFrom="paragraph">
+                  <wp:posOffset>901617</wp:posOffset>
+                </wp:positionV>
+                <wp:extent cx="1539240" cy="1409700"/>
+                <wp:effectExtent l="0" t="0" r="3810" b="0"/>
+                <wp:wrapSquare wrapText="bothSides"/>
+                <wp:docPr id="217" name="Text Box 2"/>
+                <wp:cNvGraphicFramePr>
+                  <a:graphicFrameLocks xmlns:a="http://schemas.openxmlformats.org/drawingml/2006/main"/>
+                </wp:cNvGraphicFramePr>
+                <a:graphic xmlns:a="http://schemas.openxmlformats.org/drawingml/2006/main">
+                  <a:graphicData uri="http://schemas.microsoft.com/office/word/2010/wordprocessingShape">
+                    <wps:wsp>
+                      <wps:cNvSpPr txBox="1">
+                        <a:spLocks noChangeArrowheads="1"/>
+                      </wps:cNvSpPr>
+                      <wps:spPr bwMode="auto">
+                        <a:xfrm>
+                          <a:off x="0" y="0"/>
+                          <a:ext cx="1539240" cy="1409700"/>
+                        </a:xfrm>
+                        <a:prstGeom prst="rect">
+                          <a:avLst/>
+                        </a:prstGeom>
+                        <a:solidFill>
+                          <a:srgbClr val="FFFFFF"/>
+                        </a:solidFill>
+                        <a:ln w="9525">
+                          <a:noFill/>
+                          <a:miter lim="800000"/>
+                          <a:headEnd/>
+                          <a:tailEnd/>
+                        </a:ln>
+                      </wps:spPr>
+                      <wps:txbx>
+                        <w:txbxContent>
+                          <w:p>
+                            <w:pPr>
+                              <w:rPr>
+                                <w:rFonts w:ascii="Tw Cen MT" w:hAnsi="Tw Cen MT"/>
+                                <w:b/>
+                                <w:bCs/>
+                                <w:sz w:val="24"/>
+                                <w:szCs w:val="24"/>
+                                <w:lang w:val="en-US"/>
+                              </w:rPr>
+                            </w:pPr>
+                            <w:r>
+                              <w:rPr>
+                                <w:rFonts w:ascii="Tw Cen MT" w:hAnsi="Tw Cen MT"/>
+                                <w:b/>
+                                <w:bCs/>
+                                <w:sz w:val="24"/>
+                                <w:szCs w:val="24"/>
+                                <w:lang w:val="en-US"/>
+                              </w:rPr>
+                              <w:t>Skills</w:t>
+                            </w:r>
+                            <w:r>
+                              <w:rPr>
+                                <w:rFonts w:ascii="Tw Cen MT" w:hAnsi="Tw Cen MT"/>
+                                <w:b/>
+                                <w:bCs/>
+                                <w:sz w:val="24"/>
+                                <w:szCs w:val="24"/>
+                                <w:lang w:val="en-US"/>
+                              </w:rPr>
+                              <w:t>:</w:t>
+                            </w:r>
+                          </w:p>
+                          <w:p>
+                            <w:pPr>
+                              <w:pStyle w:val="ListParagraph"/>
+                              <w:numPr>
+                                <w:ilvl w:val="0"/>
+                                <w:numId w:val="15"/>
+                              </w:numPr>
+                              <w:spacing w:after="0"/>
+                              <w:ind w:left="714" w:hanging="357"/>
+                              <w:rPr>
+                                <w:rFonts w:ascii="Tw Cen MT" w:hAnsi="Tw Cen MT"/>
+                                <w:lang w:val="en-US"/>
+                              </w:rPr>
+                            </w:pPr>
+                            <w:r>
+                              <w:rPr>
+                                <w:rFonts w:ascii="Tw Cen MT" w:hAnsi="Tw Cen MT"/>
+                                <w:lang w:val="en-US"/>
+                              </w:rPr>
+                              <w:t>Python</w:t>
+                            </w:r>
+                          </w:p>
+                          <w:p>
+                            <w:pPr>
+                              <w:pStyle w:val="ListParagraph"/>
+                              <w:numPr>
+                                <w:ilvl w:val="0"/>
+                                <w:numId w:val="15"/>
+                              </w:numPr>
+                              <w:spacing w:after="0"/>
+                              <w:ind w:left="714" w:hanging="357"/>
+                              <w:rPr>
+                                <w:rFonts w:ascii="Tw Cen MT" w:hAnsi="Tw Cen MT"/>
+                                <w:lang w:val="en-US"/>
+                              </w:rPr>
+                            </w:pPr>
+                            <w:r>
+                              <w:rPr>
+                                <w:rFonts w:ascii="Tw Cen MT" w:hAnsi="Tw Cen MT"/>
+                                <w:lang w:val="en-US"/>
+                              </w:rPr>
+                              <w:t>Rust</w:t>
+                            </w:r>
+                          </w:p>
+                          <w:p>
+                            <w:pPr>
+                              <w:pStyle w:val="ListParagraph"/>
+                              <w:numPr>
+                                <w:ilvl w:val="0"/>
+                                <w:numId w:val="15"/>
+                              </w:numPr>
+                              <w:spacing w:after="0"/>
+                              <w:ind w:left="714" w:hanging="357"/>
+                              <w:rPr>
+                                <w:rFonts w:ascii="Tw Cen MT" w:hAnsi="Tw Cen MT"/>
+                                <w:lang w:val="en-US"/>
+                              </w:rPr>
+                            </w:pPr>
+                            <w:r>
+                              <w:rPr>
+                                <w:rFonts w:ascii="Tw Cen MT" w:hAnsi="Tw Cen MT"/>
+                                <w:lang w:val="en-US"/>
+                              </w:rPr>
+                              <w:t>React</w:t>
+                            </w:r>
+                          </w:p>
+                          <w:p>
+                            <w:pPr>
+                              <w:pStyle w:val="ListParagraph"/>
+                              <w:numPr>
+                                <w:ilvl w:val="0"/>
+                                <w:numId w:val="15"/>
+                              </w:numPr>
+                              <w:spacing w:after="0"/>
+                              <w:ind w:left="714" w:hanging="357"/>
+                              <w:rPr>
+                                <w:rFonts w:ascii="Tw Cen MT" w:hAnsi="Tw Cen MT"/>
+                                <w:lang w:val="en-US"/>
+                              </w:rPr>
+                            </w:pPr>
+                            <w:r>
+                              <w:rPr>
+                                <w:rFonts w:ascii="Tw Cen MT" w:hAnsi="Tw Cen MT"/>
+                                <w:lang w:val="en-US"/>
+                              </w:rPr>
+                              <w:t>TypeScript</w:t>
+                            </w:r>
+                          </w:p>
+                          <w:p>
+                            <w:pPr>
+                              <w:pStyle w:val="ListParagraph"/>
+                              <w:numPr>
+                                <w:ilvl w:val="0"/>
+                                <w:numId w:val="15"/>
+                              </w:numPr>
+                              <w:spacing w:after="0"/>
+                              <w:ind w:left="714" w:hanging="357"/>
+                              <w:rPr>
+                                <w:rFonts w:ascii="Tw Cen MT" w:hAnsi="Tw Cen MT"/>
+                                <w:lang w:val="en-US"/>
+                              </w:rPr>
+                            </w:pPr>
+                            <w:r>
+                              <w:rPr>
+                                <w:rFonts w:ascii="Tw Cen MT" w:hAnsi="Tw Cen MT"/>
+                                <w:lang w:val="en-US"/>
+                              </w:rPr>
+                              <w:t>GitHub Copilot</w:t>
+                            </w:r>
+                          </w:p>
+                        </w:txbxContent>
+                      </wps:txbx>
+                      <wps:bodyPr rot="0" vert="horz" wrap="square" lIns="91440" tIns="45720" rIns="91440" bIns="45720" anchor="t" anchorCtr="0">
+                        <a:noAutofit/>
+                      </wps:bodyPr>
+                    </wps:wsp>
+                  </a:graphicData>
+                </a:graphic>
+                <wp14:sizeRelH relativeFrom="margin">
+                  <wp14:pctWidth>0</wp14:pctWidth>
+                </wp14:sizeRelH>
+                <wp14:sizeRelV relativeFrom="margin">
+                  <wp14:pctHeight>0</wp14:pctHeight>
+                </wp14:sizeRelV>
+              </wp:anchor>
+            </w:drawing>
+          </mc:Choice>
+          <mc:Fallback>
+            <w:pict>
+              <v:shapetype w14:anchorId="6EA97FC4" id="_x0000_t202" coordsize="21600,21600" o:spt="202" path="m,l,21600r21600,l21600,xe">
+                <v:stroke joinstyle="miter"/>
+                <v:path gradientshapeok="t" o:connecttype="rect"/>
+              </v:shapetype>
+              <v:shape id="Text Box 2" o:spid="_x0000_s1026" type="#_x0000_t202" style="position:absolute;margin-left:260.8pt;margin-top:71pt;width:121.2pt;height:111pt;z-index:251678720;visibility:visible;mso-wrap-style:square;mso-width-percent:0;mso-height-percent:0;mso-wrap-distance-left:9pt;mso-wrap-distance-top:3.6pt;mso-wrap-distance-right:9pt;mso-wrap-distance-bottom:3.6pt;mso-position-horizontal:absolute;mso-position-horizontal-relative:margin;mso-position-vertical:absolute;mso-position-vertical-relative:text;mso-width-percent:0;mso-height-percent:0;mso-width-relative:margin;mso-height-relative:margin;v-text-anchor:top" o:gfxdata="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" stroked="f">
+                <v:textbox>
+                  <w:txbxContent>
+                    <w:p>
+                      <w:pPr>
+                        <w:rPr>
+                          <w:rFonts w:ascii="Tw Cen MT" w:hAnsi="Tw Cen MT"/>
+                          <w:b/>
+                          <w:bCs/>
+                          <w:sz w:val="24"/>
+                          <w:szCs w:val="24"/>
+                          <w:lang w:val="en-US"/>
+                        </w:rPr>
+                      </w:pPr>
+                      <w:r>
+                        <w:rPr>
+                          <w:rFonts w:ascii="Tw Cen MT" w:hAnsi="Tw Cen MT"/>
+                          <w:b/>
+                          <w:bCs/>
+                          <w:sz w:val="24"/>
+                          <w:szCs w:val="24"/>
+                          <w:lang w:val="en-US"/>
+                        </w:rPr>
+                        <w:t>Skills</w:t>
+                      </w:r>
+                      <w:r>
+                        <w:rPr>
+                          <w:rFonts w:ascii="Tw Cen MT" w:hAnsi="Tw Cen MT"/>
+                          <w:b/>
+                          <w:bCs/>
+                          <w:sz w:val="24"/>
+                          <w:szCs w:val="24"/>
+                          <w:lang w:val="en-US"/>
+                        </w:rPr>
+                        <w:t>:</w:t>
+                      </w:r>
+                    </w:p>
+                    <w:p>
+                      <w:pPr>
+                        <w:pStyle w:val="ListParagraph"/>
+                        <w:numPr>
+                          <w:ilvl w:val="0"/>
+                          <w:numId w:val="15"/>
+                        </w:numPr>
+                        <w:spacing w:after="0"/>
+                        <w:ind w:left="714" w:hanging="357"/>
+                        <w:rPr>
+                          <w:rFonts w:ascii="Tw Cen MT" w:hAnsi="Tw Cen MT"/>
+                          <w:lang w:val="en-US"/>
+                        </w:rPr>
+                      </w:pPr>
+                      <w:r>
+                        <w:rPr>
+                          <w:rFonts w:ascii="Tw Cen MT" w:hAnsi="Tw Cen MT"/>
+                          <w:lang w:val="en-US"/>
+                        </w:rPr>
+                        <w:t>Python</w:t>
+                      </w:r>
+                    </w:p>
+                    <w:p>
+                      <w:pPr>
+                        <w:pStyle w:val="ListParagraph"/>
+                        <w:numPr>
+                          <w:ilvl w:val="0"/>
+                          <w:numId w:val="15"/>
+                        </w:numPr>
+                        <w:spacing w:after="0"/>
+                        <w:ind w:left="714" w:hanging="357"/>
+                        <w:rPr>
+                          <w:rFonts w:ascii="Tw Cen MT" w:hAnsi="Tw Cen MT"/>
+                          <w:lang w:val="en-US"/>
+                        </w:rPr>
+                      </w:pPr>
+                      <w:r>
+                        <w:rPr>
+                          <w:rFonts w:ascii="Tw Cen MT" w:hAnsi="Tw Cen MT"/>
+                          <w:lang w:val="en-US"/>
+                        </w:rPr>
+                        <w:t>Rust</w:t>
+                      </w:r>
+                    </w:p>
+                    <w:p>
+                      <w:pPr>
+                        <w:pStyle w:val="ListParagraph"/>
+                        <w:numPr>
+                          <w:ilvl w:val="0"/>
+                          <w:numId w:val="15"/>
+                        </w:numPr>
+                        <w:spacing w:after="0"/>
+                        <w:ind w:left="714" w:hanging="357"/>
+                        <w:rPr>
+                          <w:rFonts w:ascii="Tw Cen MT" w:hAnsi="Tw Cen MT"/>
+                          <w:lang w:val="en-US"/>
+                        </w:rPr>
+                      </w:pPr>
+                      <w:r>
+                        <w:rPr>
+                          <w:rFonts w:ascii="Tw Cen MT" w:hAnsi="Tw Cen MT"/>
+                          <w:lang w:val="en-US"/>
+                        </w:rPr>
+                        <w:t>React</w:t>
+                      </w:r>
+                    </w:p>
+                    <w:p>
+                      <w:pPr>
+                        <w:pStyle w:val="ListParagraph"/>
+                        <w:numPr>
+                          <w:ilvl w:val="0"/>
+                          <w:numId w:val="15"/>
+                        </w:numPr>
+                        <w:spacing w:after="0"/>
+                        <w:ind w:left="714" w:hanging="357"/>
+                        <w:rPr>
+                          <w:rFonts w:ascii="Tw Cen MT" w:hAnsi="Tw Cen MT"/>
+                          <w:lang w:val="en-US"/>
+                        </w:rPr>
+                      </w:pPr>
+                      <w:r>
+                        <w:rPr>
+                          <w:rFonts w:ascii="Tw Cen MT" w:hAnsi="Tw Cen MT"/>
+                          <w:lang w:val="en-US"/>
+                        </w:rPr>
+                        <w:t>TypeScript</w:t>
+                      </w:r>
+                    </w:p>
+                    <w:p>
+                      <w:pPr>
+                        <w:pStyle w:val="ListParagraph"/>
+                        <w:numPr>
+                          <w:ilvl w:val="0"/>
+                          <w:numId w:val="15"/>
+                        </w:numPr>
+                        <w:spacing w:after="0"/>
+                        <w:ind w:left="714" w:hanging="357"/>
+                        <w:rPr>
+                          <w:rFonts w:ascii="Tw Cen MT" w:hAnsi="Tw Cen MT"/>
+                          <w:lang w:val="en-US"/>
+                        </w:rPr>
+                      </w:pPr>
+                      <w:r>
+                        <w:rPr>
+                          <w:rFonts w:ascii="Tw Cen MT" w:hAnsi="Tw Cen MT"/>
+                          <w:lang w:val="en-US"/>
+                        </w:rPr>
+                        <w:t>GitHub Copilot</w:t>
+                      </w:r>
+                    </w:p>
+                  </w:txbxContent>
+                </v:textbox>
+                <w10:wrap type="square" anchorx="margin"/>
+              </v:shape>
+            </w:pict>
+          </mc:Fallback>
+        </mc:AlternateContent>
+      </w:r>
+    </w:p>
+    <w:p>
+      <w:pPr>
+        <w:tabs>
+          <w:tab w:val="center" w:pos="2684"/>
+        </w:tabs>
+        <w:rPr>
+          <w:rFonts w:ascii="Tw Cen MT" w:hAnsi="Tw Cen MT"/>
+          <w:b/>
+          <w:sz w:val="26"/>
+          <w:szCs w:val="26"/>
+        </w:rPr>
+      </w:pPr>
+      <w:r>
+        <w:rPr>
+          <w:rFonts w:ascii="Tw Cen MT" w:hAnsi="Tw Cen MT"/>
+          <w:b/>
+          <w:noProof/>
+          <w:sz w:val="24"/>
+          <w:szCs w:val="24"/>
+        </w:rPr>
+        <mc:AlternateContent>
+          <mc:Choice Requires="wps">
+            <w:drawing>
+              <wp:anchor distT="45720" distB="45720" distL="114300" distR="114300" simplePos="0" relativeHeight="251680768" behindDoc="0" locked="0" layoutInCell="1" allowOverlap="1" wp14:anchorId="58163154" wp14:editId="4E121D5F">
+                <wp:simplePos x="0" y="0"/>
+                <wp:positionH relativeFrom="margin">
+                  <wp:posOffset>4759960</wp:posOffset>
+                </wp:positionH>
+                <wp:positionV relativeFrom="paragraph">
+                  <wp:posOffset>241300</wp:posOffset>
+                </wp:positionV>
+                <wp:extent cx="1244600" cy="1083310"/>
+                <wp:effectExtent l="0" t="0" r="0" b="2540"/>
+                <wp:wrapSquare wrapText="bothSides"/>
+                <wp:docPr id="2079982525" name="Text Box 2"/>
+                <wp:cNvGraphicFramePr>
+                  <a:graphicFrameLocks xmlns:a="http://schemas.openxmlformats.org/drawingml/2006/main"/>
+                </wp:cNvGraphicFramePr>
+                <a:graphic xmlns:a="http://schemas.openxmlformats.org/drawingml/2006/main">
+                  <a:graphicData uri="http://schemas.microsoft.com/office/word/2010/wordprocessingShape">
+                    <wps:wsp>
+                      <wps:cNvSpPr txBox="1">
+                        <a:spLocks noChangeArrowheads="1"/>
+                      </wps:cNvSpPr>
+                      <wps:spPr bwMode="auto">
+                        <a:xfrm>
+                          <a:off x="0" y="0"/>
+                          <a:ext cx="1244600" cy="1083310"/>
+                        </a:xfrm>
+                        <a:prstGeom prst="rect">
+                          <a:avLst/>
+                        </a:prstGeom>
+                        <a:solidFill>
+                          <a:srgbClr val="FFFFFF"/>
+                        </a:solidFill>
+                        <a:ln w="9525">
+                          <a:noFill/>
+                          <a:miter lim="800000"/>
+                          <a:headEnd/>
+                          <a:tailEnd/>
+                        </a:ln>
+                      </wps:spPr>
+                      <wps:txbx>
+                        <w:txbxContent>
+                          <w:p>
+                            <w:pPr>
+                              <w:pStyle w:val="ListParagraph"/>
+                              <w:numPr>
+                                <w:ilvl w:val="0"/>
+                                <w:numId w:val="15"/>
+                              </w:numPr>
+                              <w:spacing w:after="0"/>
+                              <w:rPr>
+                                <w:rFonts w:ascii="Tw Cen MT" w:hAnsi="Tw Cen MT"/>
+                                <w:lang w:val="en-US"/>
+                              </w:rPr>
+                            </w:pPr>
+                            <w:r>
+                              <w:rPr>
+                                <w:rFonts w:ascii="Tw Cen MT" w:hAnsi="Tw Cen MT"/>
+                                <w:lang w:val="en-US"/>
+                              </w:rPr>
+                              <w:t>Azure</w:t>
+                            </w:r>
+                          </w:p>
+                          <w:p>
+                            <w:pPr>
+                              <w:pStyle w:val="ListParagraph"/>
+                              <w:numPr>
+                                <w:ilvl w:val="0"/>
+                                <w:numId w:val="15"/>
+                              </w:numPr>
+                              <w:spacing w:after="0"/>
+                              <w:rPr>
+                                <w:rFonts w:ascii="Tw Cen MT" w:hAnsi="Tw Cen MT"/>
+                                <w:lang w:val="en-US"/>
+                              </w:rPr>
+                            </w:pPr>
+                            <w:r>
+                              <w:rPr>
+                                <w:rFonts w:ascii="Tw Cen MT" w:hAnsi="Tw Cen MT"/>
+                                <w:lang w:val="en-US"/>
+                              </w:rPr>
+                              <w:t>Kubernetes</w:t>
+                            </w:r>
+                          </w:p>
+                          <w:p>
+                            <w:pPr>
+                              <w:pStyle w:val="ListParagraph"/>
+                              <w:numPr>
+                                <w:ilvl w:val="0"/>
+                                <w:numId w:val="15"/>
+                              </w:numPr>
+                              <w:spacing w:after="0"/>
+                              <w:rPr>
+                                <w:rFonts w:ascii="Tw Cen MT" w:hAnsi="Tw Cen MT"/>
+                                <w:lang w:val="en-US"/>
+                              </w:rPr>
+                            </w:pPr>
+                            <w:r>
+                              <w:rPr>
+                                <w:rFonts w:ascii="Tw Cen MT" w:hAnsi="Tw Cen MT"/>
+                                <w:lang w:val="en-US"/>
+                              </w:rPr>
+                              <w:t>Terraform</w:t>
+                            </w:r>
+                          </w:p>
+                          <w:p>
+                            <w:pPr>
+                              <w:pStyle w:val="ListParagraph"/>
+                              <w:numPr>
+                                <w:ilvl w:val="0"/>
+                                <w:numId w:val="15"/>
+                              </w:numPr>
+                              <w:rPr>
+                                <w:rFonts w:ascii="Tw Cen MT" w:hAnsi="Tw Cen MT"/>
+                                <w:lang w:val="en-US"/>
+                              </w:rPr>
+                            </w:pPr>
+                            <w:r>
+                              <w:rPr>
+                                <w:rFonts w:ascii="Tw Cen MT" w:hAnsi="Tw Cen MT"/>
+                                <w:lang w:val="en-US"/>
+                              </w:rPr>
+                              <w:t>TensorFlow</w:t>
+                            </w:r>
+                          </w:p>
+                          <w:p>
+                            <w:pPr>
+                              <w:pStyle w:val="ListParagraph"/>
+                              <w:numPr>
+                                <w:ilvl w:val="0"/>
+                                <w:numId w:val="15"/>
+                              </w:numPr>
+                              <w:rPr>
+                                <w:rFonts w:ascii="Tw Cen MT" w:hAnsi="Tw Cen MT"/>
+                                <w:lang w:val="en-US"/>
+                              </w:rPr>
+                            </w:pPr>
+                            <w:r>
+                              <w:rPr>
+                                <w:rFonts w:ascii="Tw Cen MT" w:hAnsi="Tw Cen MT"/>
+                                <w:lang w:val="en-US"/>
+                              </w:rPr>
+                              <w:t>HTML/CSS</w:t>
+                            </w:r>
+                          </w:p>
+                        </w:txbxContent>
+                      </wps:txbx>
+                      <wps:bodyPr rot="0" vert="horz" wrap="square" lIns="91440" tIns="45720" rIns="91440" bIns="45720" anchor="t" anchorCtr="0">
+                        <a:noAutofit/>
+                      </wps:bodyPr>
+                    </wps:wsp>
+                  </a:graphicData>
+                </a:graphic>
+                <wp14:sizeRelH relativeFrom="margin">
+                  <wp14:pctWidth>0</wp14:pctWidth>
+                </wp14:sizeRelH>
+                <wp14:sizeRelV relativeFrom="margin">
+                  <wp14:pctHeight>0</wp14:pctHeight>
+                </wp14:sizeRelV>
+              </wp:anchor>
+            </w:drawing>
+          </mc:Choice>
+          <mc:Fallback>
+            <w:pict>
+              <v:shape w14:anchorId="58163154" id="_x0000_s1027" type="#_x0000_t202" style="position:absolute;margin-left:374.8pt;margin-top:19pt;width:98pt;height:85.3pt;z-index:251680768;visibility:visible;mso-wrap-style:square;mso-width-percent:0;mso-height-percent:0;mso-wrap-distance-left:9pt;mso-wrap-distance-top:3.6pt;mso-wrap-distance-right:9pt;mso-wrap-distance-bottom:3.6pt;mso-position-horizontal:absolute;mso-position-horizontal-relative:margin;mso-position-vertical:absolute;mso-position-vertical-relative:text;mso-width-percent:0;mso-height-percent:0;mso-width-relative:margin;mso-height-relative:margin;v-text-anchor:top" o:gfxdata="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" stroked="f">
+                <v:textbox>
+                  <w:txbxContent>
+                    <w:p>
+                      <w:pPr>
+                        <w:pStyle w:val="ListParagraph"/>
+                        <w:numPr>
+                          <w:ilvl w:val="0"/>
+                          <w:numId w:val="15"/>
+                        </w:numPr>
+                        <w:spacing w:after="0"/>
+                        <w:rPr>
+                          <w:rFonts w:ascii="Tw Cen MT" w:hAnsi="Tw Cen MT"/>
+                          <w:lang w:val="en-US"/>
+                        </w:rPr>
+                      </w:pPr>
+                      <w:r>
+                        <w:rPr>
+                          <w:rFonts w:ascii="Tw Cen MT" w:hAnsi="Tw Cen MT"/>
+                          <w:lang w:val="en-US"/>
+                        </w:rPr>
+                        <w:t>Azure</w:t>
+                      </w:r>
+                    </w:p>
+                    <w:p>
+                      <w:pPr>
+                        <w:pStyle w:val="ListParagraph"/>
+                        <w:numPr>
+                          <w:ilvl w:val="0"/>
+                          <w:numId w:val="15"/>
+                        </w:numPr>
+                        <w:spacing w:after="0"/>
+                        <w:rPr>
+                          <w:rFonts w:ascii="Tw Cen MT" w:hAnsi="Tw Cen MT"/>
+                          <w:lang w:val="en-US"/>
+                        </w:rPr>
+                      </w:pPr>
+                      <w:r>
+                        <w:rPr>
+                          <w:rFonts w:ascii="Tw Cen MT" w:hAnsi="Tw Cen MT"/>
+                          <w:lang w:val="en-US"/>
+                        </w:rPr>
+                        <w:t>Kubernetes</w:t>
+                      </w:r>
+                    </w:p>
+                    <w:p>
+                      <w:pPr>
+                        <w:pStyle w:val="ListParagraph"/>
+                        <w:numPr>
+                          <w:ilvl w:val="0"/>
+                          <w:numId w:val="15"/>
+                        </w:numPr>
+                        <w:spacing w:after="0"/>
+                        <w:rPr>
+                          <w:rFonts w:ascii="Tw Cen MT" w:hAnsi="Tw Cen MT"/>
+                          <w:lang w:val="en-US"/>
+                        </w:rPr>
+                      </w:pPr>
+                      <w:r>
+                        <w:rPr>
+                          <w:rFonts w:ascii="Tw Cen MT" w:hAnsi="Tw Cen MT"/>
+                          <w:lang w:val="en-US"/>
+                        </w:rPr>
+                        <w:t>Terraform</w:t>
+                      </w:r>
+                    </w:p>
+                    <w:p>
+                      <w:pPr>
+                        <w:pStyle w:val="ListParagraph"/>
+                        <w:numPr>
+                          <w:ilvl w:val="0"/>
+                          <w:numId w:val="15"/>
+                        </w:numPr>
+                        <w:rPr>
+                          <w:rFonts w:ascii="Tw Cen MT" w:hAnsi="Tw Cen MT"/>
+                          <w:lang w:val="en-US"/>
+                        </w:rPr>
+                      </w:pPr>
+                      <w:r>
+                        <w:rPr>
+                          <w:rFonts w:ascii="Tw Cen MT" w:hAnsi="Tw Cen MT"/>
+                          <w:lang w:val="en-US"/>
+                        </w:rPr>
+                        <w:t>TensorFlow</w:t>
+                      </w:r>
+                    </w:p>
+                    <w:p>
+                      <w:pPr>
+                        <w:pStyle w:val="ListParagraph"/>
+                        <w:numPr>
+                          <w:ilvl w:val="0"/>
+                          <w:numId w:val="15"/>
+                        </w:numPr>
+                        <w:rPr>
+                          <w:rFonts w:ascii="Tw Cen MT" w:hAnsi="Tw Cen MT"/>
+                          <w:lang w:val="en-US"/>
+                        </w:rPr>
+                      </w:pPr>
+                      <w:r>
+                        <w:rPr>
+                          <w:rFonts w:ascii="Tw Cen MT" w:hAnsi="Tw Cen MT"/>
+                          <w:lang w:val="en-US"/>
+                        </w:rPr>
+                        <w:t>HTML/CSS</w:t>
+                      </w:r>
+                    </w:p>
+                  </w:txbxContent>
+                </v:textbox>
+                <w10:wrap type="square" anchorx="margin"/>
+              </v:shape>
+            </w:pict>
+          </mc:Fallback>
+        </mc:AlternateContent>
+      </w:r>
+      <w:r>
+        <w:rPr>
+          <w:rFonts w:ascii="Tw Cen MT" w:hAnsi="Tw Cen MT"/>
+          <w:b/>
+          <w:noProof/>
+          <w:sz w:val="24"/>
+          <w:szCs w:val="24"/>
+        </w:rPr>
+        <mc:AlternateContent>
+          <mc:Choice Requires="wps">
+            <w:drawing>
+              <wp:anchor distT="0" distB="0" distL="114300" distR="114300" simplePos="0" relativeHeight="251682816" behindDoc="0" locked="0" layoutInCell="1" allowOverlap="1" wp14:anchorId="710696AA" wp14:editId="312FFE44">
                 <wp:simplePos x="0" y="0"/>
                 <wp:positionH relativeFrom="column">
-                  <wp:posOffset>5715</wp:posOffset>
+                  <wp:posOffset>3447277</wp:posOffset>
                 </wp:positionH>
                 <wp:positionV relativeFrom="paragraph">
-                  <wp:posOffset>188112</wp:posOffset>
+                  <wp:posOffset>175895</wp:posOffset>
                 </wp:positionV>
-                <wp:extent cx="6007100" cy="0"/>
+                <wp:extent cx="2520000" cy="0"/>
                 <wp:effectExtent l="0" t="0" r="0" b="0"/>
                 <wp:wrapNone/>
-                <wp:docPr id="4" name="Straight Connector 4"/>
+                <wp:docPr id="1248915895" name="Straight Connector 1248915895"/>
                 <wp:cNvGraphicFramePr/>
                 <a:graphic xmlns:a="http://schemas.openxmlformats.org/drawingml/2006/main">
                   <a:graphicData uri="http://schemas.microsoft.com/office/word/2010/wordprocessingShape">
@@ -272,7 +937,7 @@
                       <wps:spPr>
                         <a:xfrm flipV="1">
                           <a:off x="0" y="0"/>
-                          <a:ext cx="6007100" cy="0"/>
+                          <a:ext cx="2520000" cy="0"/>
                         </a:xfrm>
                         <a:prstGeom prst="line">
                           <a:avLst/>
@@ -301,6 +966,9 @@
                     </wps:wsp>
                   </a:graphicData>
                 </a:graphic>
+                <wp14:sizeRelH relativeFrom="margin">
+                  <wp14:pctWidth>0</wp14:pctWidth>
+                </wp14:sizeRelH>
                 <wp14:sizeRelV relativeFrom="margin">
                   <wp14:pctHeight>0</wp14:pctHeight>
                 </wp14:sizeRelV>
@@ -309,7 +977,7 @@
           </mc:Choice>
           <mc:Fallback>
             <w:pict>
-              <v:line w14:anchorId="4EC38FA6" id="Straight Connector 4" o:spid="_x0000_s1026" style="position:absolute;flip:y;z-index:251676672;visibility:visible;mso-wrap-style:square;mso-height-percent:0;mso-wrap-distance-left:9pt;mso-wrap-distance-top:0;mso-wrap-distance-right:9pt;mso-wrap-distance-bottom:0;mso-position-horizontal:absolute;mso-position-horizontal-relative:text;mso-position-vertical:absolute;mso-position-vertical-relative:text;mso-height-percent:0;mso-height-relative:margin" from=".45pt,14.8pt" to="473.45pt,14.8pt" o:gfxdata="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" strokecolor="black [3213]" strokeweight="1.25pt">
+              <v:line w14:anchorId="4F51CAE3" id="Straight Connector 1248915895" o:spid="_x0000_s1026" style="position:absolute;flip:y;z-index:251682816;visibility:visible;mso-wrap-style:square;mso-width-percent:0;mso-height-percent:0;mso-wrap-distance-left:9pt;mso-wrap-distance-top:0;mso-wrap-distance-right:9pt;mso-wrap-distance-bottom:0;mso-position-horizontal:absolute;mso-position-horizontal-relative:text;mso-position-vertical:absolute;mso-position-vertical-relative:text;mso-width-percent:0;mso-height-percent:0;mso-width-relative:margin;mso-height-relative:margin" from="271.45pt,13.85pt" to="469.9pt,13.85pt" o:gfxdata="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" strokecolor="black [3213]" strokeweight="1.25pt">
                 <v:stroke joinstyle="miter"/>
               </v:line>
             </w:pict>
@@ -320,10 +988,89 @@
         <w:rPr>
           <w:rFonts w:ascii="Tw Cen MT" w:hAnsi="Tw Cen MT"/>
           <w:b/>
+          <w:noProof/>
           <w:sz w:val="24"/>
           <w:szCs w:val="24"/>
         </w:rPr>
-        <w:t>Profile</w:t>
+        <mc:AlternateContent>
+          <mc:Choice Requires="wps">
+            <w:drawing>
+              <wp:anchor distT="0" distB="0" distL="114300" distR="114300" simplePos="0" relativeHeight="251676672" behindDoc="0" locked="0" layoutInCell="1" allowOverlap="1" wp14:anchorId="59052C27" wp14:editId="717C6EB8">
+                <wp:simplePos x="0" y="0"/>
+                <wp:positionH relativeFrom="column">
+                  <wp:posOffset>5715</wp:posOffset>
+                </wp:positionH>
+                <wp:positionV relativeFrom="paragraph">
+                  <wp:posOffset>187960</wp:posOffset>
+                </wp:positionV>
+                <wp:extent cx="2988000" cy="0"/>
+                <wp:effectExtent l="0" t="0" r="0" b="0"/>
+                <wp:wrapNone/>
+                <wp:docPr id="4" name="Straight Connector 4"/>
+                <wp:cNvGraphicFramePr/>
+                <a:graphic xmlns:a="http://schemas.openxmlformats.org/drawingml/2006/main">
+                  <a:graphicData uri="http://schemas.microsoft.com/office/word/2010/wordprocessingShape">
+                    <wps:wsp>
+                      <wps:cNvCnPr/>
+                      <wps:spPr>
+                        <a:xfrm flipV="1">
+                          <a:off x="0" y="0"/>
+                          <a:ext cx="2988000" cy="0"/>
+                        </a:xfrm>
+                        <a:prstGeom prst="line">
+                          <a:avLst/>
+                        </a:prstGeom>
+                        <a:ln w="15875">
+                          <a:solidFill>
+                            <a:schemeClr val="tx1"/>
+                          </a:solidFill>
+                        </a:ln>
+                      </wps:spPr>
+                      <wps:style>
+                        <a:lnRef idx="1">
+                          <a:schemeClr val="accent1"/>
+                        </a:lnRef>
+                        <a:fillRef idx="0">
+                          <a:schemeClr val="accent1"/>
+                        </a:fillRef>
+                        <a:effectRef idx="0">
+                          <a:schemeClr val="accent1"/>
+                        </a:effectRef>
+                        <a:fontRef idx="minor">
+                          <a:schemeClr val="tx1"/>
+                        </a:fontRef>
+                      </wps:style>
+                      <wps:bodyPr/>
+                    </wps:wsp>
+                  </a:graphicData>
+                </a:graphic>
+                <wp14:sizeRelH relativeFrom="margin">
+                  <wp14:pctWidth>0</wp14:pctWidth>
+                </wp14:sizeRelH>
+                <wp14:sizeRelV relativeFrom="margin">
+                  <wp14:pctHeight>0</wp14:pctHeight>
+                </wp14:sizeRelV>
+              </wp:anchor>
+            </w:drawing>
+          </mc:Choice>
+          <mc:Fallback>
+            <w:pict>
+              <v:line w14:anchorId="3D41430F" id="Straight Connector 4" o:spid="_x0000_s1026" style="position:absolute;flip:y;z-index:251676672;visibility:visible;mso-wrap-style:square;mso-width-percent:0;mso-height-percent:0;mso-wrap-distance-left:9pt;mso-wrap-distance-top:0;mso-wrap-distance-right:9pt;mso-wrap-distance-bottom:0;mso-position-horizontal:absolute;mso-position-horizontal-relative:text;mso-position-vertical:absolute;mso-position-vertical-relative:text;mso-width-percent:0;mso-height-percent:0;mso-width-relative:margin;mso-height-relative:margin" from=".45pt,14.8pt" to="235.75pt,14.8pt" o:gfxdata="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" strokecolor="black [3213]" strokeweight="1.25pt">
+                <v:stroke joinstyle="miter"/>
+              </v:line>
+            </w:pict>
+          </mc:Fallback>
+        </mc:AlternateContent>
+      </w:r>
+      <w:r>
+        <w:rPr>
+          <w:rFonts w:ascii="Tw Cen MT" w:hAnsi="Tw Cen MT"/>
+          <w:b/>
+          <w:noProof/>
+          <w:sz w:val="24"/>
+          <w:szCs w:val="24"/>
+        </w:rPr>
+        <w:t>Software</w:t>
       </w:r>
       <w:r>
         <w:rPr>
@@ -332,7 +1079,25 @@
           <w:sz w:val="24"/>
           <w:szCs w:val="24"/>
         </w:rPr>
+        <w:t xml:space="preserve"> Engineer</w:t>
+      </w:r>
+      <w:r>
+        <w:rPr>
+          <w:rFonts w:ascii="Tw Cen MT" w:hAnsi="Tw Cen MT"/>
+          <w:b/>
+          <w:sz w:val="24"/>
+          <w:szCs w:val="24"/>
+        </w:rPr>
         <w:t>:</w:t>
+      </w:r>
+      <w:r>
+        <w:rPr>
+          <w:rFonts w:ascii="Tw Cen MT" w:hAnsi="Tw Cen MT"/>
+          <w:b/>
+          <w:sz w:val="24"/>
+          <w:szCs w:val="24"/>
+        </w:rPr>
+        <w:tab/>
       </w:r>
     </w:p>
     <w:p>
@@ -345,7 +1110,85 @@
         <w:rPr>
           <w:rFonts w:ascii="Tw Cen MT" w:hAnsi="Tw Cen MT"/>
         </w:rPr>
-        <w:t>Software Engineer with Python and Rust expertise, and experience in developing robust applications on Azure using Kubernetes. Skilled in communication and presentation, and passionate about climate tech solutions.</w:t>
+        <w:t>Software Engineer with</w:t>
+      </w:r>
+      <w:r>
+        <w:rPr>
+          <w:rFonts w:ascii="Tw Cen MT" w:hAnsi="Tw Cen MT"/>
+        </w:rPr>
+        <w:t xml:space="preserve"> </w:t>
+      </w:r>
+      <w:r>
+        <w:rPr>
+          <w:rFonts w:ascii="Tw Cen MT" w:hAnsi="Tw Cen MT"/>
+        </w:rPr>
+        <w:t xml:space="preserve">Python and Rust expertise, </w:t>
+      </w:r>
+      <w:r>
+        <w:rPr>
+          <w:rFonts w:ascii="Tw Cen MT" w:hAnsi="Tw Cen MT"/>
+        </w:rPr>
+        <w:t xml:space="preserve">and </w:t>
+      </w:r>
+      <w:r>
+        <w:rPr>
+          <w:rFonts w:ascii="Tw Cen MT" w:hAnsi="Tw Cen MT"/>
+        </w:rPr>
+        <w:t>experience</w:t>
+      </w:r>
+      <w:r>
+        <w:rPr>
+          <w:rFonts w:ascii="Tw Cen MT" w:hAnsi="Tw Cen MT"/>
+        </w:rPr>
+        <w:t xml:space="preserve"> </w:t>
+      </w:r>
+      <w:r>
+        <w:rPr>
+          <w:rFonts w:ascii="Tw Cen MT" w:hAnsi="Tw Cen MT"/>
+        </w:rPr>
+        <w:t xml:space="preserve">in developing robust applications on </w:t>
+      </w:r>
+      <w:r>
+        <w:rPr>
+          <w:rFonts w:ascii="Tw Cen MT" w:hAnsi="Tw Cen MT"/>
+        </w:rPr>
+        <w:t>the cloud</w:t>
+      </w:r>
+      <w:r>
+        <w:rPr>
+          <w:rFonts w:ascii="Tw Cen MT" w:hAnsi="Tw Cen MT"/>
+        </w:rPr>
+        <w:t xml:space="preserve"> using Kubernetes. </w:t>
+      </w:r>
+      <w:r>
+        <w:rPr>
+          <w:rFonts w:ascii="Tw Cen MT" w:hAnsi="Tw Cen MT"/>
+        </w:rPr>
+        <w:t>Proficient in Machine Learning technology and capable of owning and creating systems</w:t>
+      </w:r>
+      <w:r>
+        <w:rPr>
+          <w:rFonts w:ascii="Tw Cen MT" w:hAnsi="Tw Cen MT"/>
+        </w:rPr>
+        <w:t xml:space="preserve">. </w:t>
+      </w:r>
+      <w:r>
+        <w:rPr>
+          <w:rFonts w:ascii="Tw Cen MT" w:hAnsi="Tw Cen MT"/>
+        </w:rPr>
+        <w:t xml:space="preserve">Skilled in communication and presentation, and passionate </w:t>
+      </w:r>
+      <w:r>
+        <w:rPr>
+          <w:rFonts w:ascii="Tw Cen MT" w:hAnsi="Tw Cen MT"/>
+        </w:rPr>
+        <w:t>about technical problems</w:t>
+      </w:r>
+      <w:r>
+        <w:rPr>
+          <w:rFonts w:ascii="Tw Cen MT" w:hAnsi="Tw Cen MT"/>
+        </w:rPr>
+        <w:t>.</w:t>
       </w:r>
     </w:p>
     <w:p>
@@ -425,7 +1268,7 @@
           </mc:Choice>
           <mc:Fallback>
             <w:pict>
-              <v:line w14:anchorId="18941E32" id="Straight Connector 3" o:spid="_x0000_s1026" style="position:absolute;flip:y;z-index:251674624;visibility:visible;mso-wrap-style:square;mso-height-percent:0;mso-wrap-distance-left:9pt;mso-wrap-distance-top:0;mso-wrap-distance-right:9pt;mso-wrap-distance-bottom:0;mso-position-horizontal:absolute;mso-position-horizontal-relative:text;mso-position-vertical:absolute;mso-position-vertical-relative:text;mso-height-percent:0;mso-height-relative:margin" from=".1pt,14.95pt" to="473.1pt,14.95pt" o:gfxdata="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" strokecolor="black [3213]" strokeweight="1.25pt">
+              <v:line w14:anchorId="0F830D1C" id="Straight Connector 3" o:spid="_x0000_s1026" style="position:absolute;flip:y;z-index:251674624;visibility:visible;mso-wrap-style:square;mso-height-percent:0;mso-wrap-distance-left:9pt;mso-wrap-distance-top:0;mso-wrap-distance-right:9pt;mso-wrap-distance-bottom:0;mso-position-horizontal:absolute;mso-position-horizontal-relative:text;mso-position-vertical:absolute;mso-position-vertical-relative:text;mso-height-percent:0;mso-height-relative:margin" from=".1pt,14.95pt" to="473.1pt,14.95pt" o:gfxdata="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" strokecolor="black [3213]" strokeweight="1.25pt">
                 <v:stroke joinstyle="miter"/>
               </v:line>
             </w:pict>
@@ -436,20 +1279,10 @@
         <w:rPr>
           <w:rFonts w:ascii="Tw Cen MT" w:hAnsi="Tw Cen MT"/>
           <w:b/>
-          <w:noProof/>
           <w:sz w:val="24"/>
           <w:szCs w:val="24"/>
         </w:rPr>
-        <w:t>Software</w:t>
-      </w:r>
-      <w:r>
-        <w:rPr>
-          <w:rFonts w:ascii="Tw Cen MT" w:hAnsi="Tw Cen MT"/>
-          <w:b/>
-          <w:sz w:val="24"/>
-          <w:szCs w:val="24"/>
-        </w:rPr>
-        <w:t xml:space="preserve"> Experience:</w:t>
+        <w:t>Experience:</w:t>
       </w:r>
     </w:p>
     <w:p>
@@ -652,7 +1485,19 @@
         <w:rPr>
           <w:rFonts w:ascii="Tw Cen MT" w:hAnsi="Tw Cen MT"/>
         </w:rPr>
-        <w:t>Worked with Java and JavaScript to maintain a workplace messaging app.</w:t>
+        <w:t xml:space="preserve">Worked with Java and </w:t>
+      </w:r>
+      <w:r>
+        <w:rPr>
+          <w:rFonts w:ascii="Tw Cen MT" w:hAnsi="Tw Cen MT"/>
+        </w:rPr>
+        <w:t>Type</w:t>
+      </w:r>
+      <w:r>
+        <w:rPr>
+          <w:rFonts w:ascii="Tw Cen MT" w:hAnsi="Tw Cen MT"/>
+        </w:rPr>
+        <w:t>Script to maintain a workplace messaging app.</w:t>
       </w:r>
     </w:p>
     <w:p>
@@ -729,7 +1574,7 @@
         </w:rPr>
         <w:t xml:space="preserve">Built a personal website using React - </w:t>
       </w:r>
-      <w:hyperlink r:id="rId7" w:history="1">
+      <w:hyperlink r:id="rId8" w:history="1">
         <w:r>
           <w:rPr>
             <w:rStyle w:val="Hyperlink"/>
@@ -762,7 +1607,7 @@
         </w:rPr>
         <w:t xml:space="preserve">Volunteer Machine Learning Engineer, </w:t>
       </w:r>
-      <w:hyperlink r:id="rId8" w:history="1">
+      <w:hyperlink r:id="rId9" w:history="1">
         <w:r>
           <w:rPr>
             <w:rStyle w:val="Hyperlink"/>
@@ -775,7 +1620,31 @@
         <w:rPr>
           <w:rFonts w:ascii="Tw Cen MT" w:hAnsi="Tw Cen MT"/>
         </w:rPr>
-        <w:t xml:space="preserve"> (2023-Present) classifying shark and ray eggs by species to substitute for manual classification.</w:t>
+        <w:t xml:space="preserve"> (2023-Present) classifying shark and ray eggs</w:t>
+      </w:r>
+      <w:r>
+        <w:rPr>
+          <w:rFonts w:ascii="Tw Cen MT" w:hAnsi="Tw Cen MT"/>
+        </w:rPr>
+        <w:t xml:space="preserve"> </w:t>
+      </w:r>
+      <w:r>
+        <w:rPr>
+          <w:rFonts w:ascii="Tw Cen MT" w:hAnsi="Tw Cen MT"/>
+        </w:rPr>
+        <w:t>by species</w:t>
+      </w:r>
+      <w:r>
+        <w:rPr>
+          <w:rFonts w:ascii="Tw Cen MT" w:hAnsi="Tw Cen MT"/>
+        </w:rPr>
+        <w:t xml:space="preserve"> using TensorFlow</w:t>
+      </w:r>
+      <w:r>
+        <w:rPr>
+          <w:rFonts w:ascii="Tw Cen MT" w:hAnsi="Tw Cen MT"/>
+        </w:rPr>
+        <w:t>.</w:t>
       </w:r>
     </w:p>
     <w:p>
@@ -959,7 +1828,7 @@
           </mc:Choice>
           <mc:Fallback>
             <w:pict>
-              <v:line w14:anchorId="1493C408" id="Straight Connector 6" o:spid="_x0000_s1026" style="position:absolute;flip:y;z-index:251668480;visibility:visible;mso-wrap-style:square;mso-height-percent:0;mso-wrap-distance-left:9pt;mso-wrap-distance-top:0;mso-wrap-distance-right:9pt;mso-wrap-distance-bottom:0;mso-position-horizontal:absolute;mso-position-horizontal-relative:text;mso-position-vertical:absolute;mso-position-vertical-relative:text;mso-height-percent:0;mso-height-relative:margin" from=".1pt,14.1pt" to="473.1pt,14.1pt" o:gfxdata="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" strokecolor="black [3213]" strokeweight="1.25pt">
+              <v:line w14:anchorId="0E49B6CC" id="Straight Connector 6" o:spid="_x0000_s1026" style="position:absolute;flip:y;z-index:251668480;visibility:visible;mso-wrap-style:square;mso-height-percent:0;mso-wrap-distance-left:9pt;mso-wrap-distance-top:0;mso-wrap-distance-right:9pt;mso-wrap-distance-bottom:0;mso-position-horizontal:absolute;mso-position-horizontal-relative:text;mso-position-vertical:absolute;mso-position-vertical-relative:text;mso-height-percent:0;mso-height-relative:margin" from=".1pt,14.1pt" to="473.1pt,14.1pt" o:gfxdata="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" strokecolor="black [3213]" strokeweight="1.25pt">
                 <v:stroke joinstyle="miter"/>
               </v:line>
             </w:pict>
@@ -1099,25 +1968,6 @@
       <w:pPr>
         <w:pStyle w:val="ListParagraph"/>
         <w:numPr>
-          <w:ilvl w:val="1"/>
-          <w:numId w:val="7"/>
-        </w:numPr>
-        <w:spacing w:after="0"/>
-        <w:rPr>
-          <w:rFonts w:ascii="Tw Cen MT" w:hAnsi="Tw Cen MT"/>
-        </w:rPr>
-      </w:pPr>
-      <w:r>
-        <w:rPr>
-          <w:rFonts w:ascii="Tw Cen MT" w:hAnsi="Tw Cen MT"/>
-        </w:rPr>
-        <w:t>Modules: General Relativity, Black Holes, Quantum Field Theory, Cosmology, String Theory</w:t>
-      </w:r>
-    </w:p>
-    <w:p>
-      <w:pPr>
-        <w:pStyle w:val="ListParagraph"/>
-        <w:numPr>
           <w:ilvl w:val="0"/>
           <w:numId w:val="7"/>
         </w:numPr>
@@ -1296,62 +2146,6 @@
           <w:rFonts w:ascii="Tw Cen MT" w:hAnsi="Tw Cen MT"/>
         </w:rPr>
         <w:t>top performer</w:t>
-      </w:r>
-    </w:p>
-    <w:p>
-      <w:pPr>
-        <w:pStyle w:val="ListParagraph"/>
-        <w:numPr>
-          <w:ilvl w:val="1"/>
-          <w:numId w:val="7"/>
-        </w:numPr>
-        <w:spacing w:after="0"/>
-        <w:rPr>
-          <w:rFonts w:ascii="Tw Cen MT" w:hAnsi="Tw Cen MT"/>
-        </w:rPr>
-      </w:pPr>
-      <w:r>
-        <w:rPr>
-          <w:rFonts w:ascii="Tw Cen MT" w:hAnsi="Tw Cen MT"/>
-        </w:rPr>
-        <w:t>1</w:t>
-      </w:r>
-      <w:r>
-        <w:rPr>
-          <w:rFonts w:ascii="Tw Cen MT" w:hAnsi="Tw Cen MT"/>
-          <w:vertAlign w:val="superscript"/>
-        </w:rPr>
-        <w:t>st</w:t>
-      </w:r>
-      <w:r>
-        <w:rPr>
-          <w:rFonts w:ascii="Tw Cen MT" w:hAnsi="Tw Cen MT"/>
-        </w:rPr>
-        <w:t xml:space="preserve"> </w:t>
-      </w:r>
-      <w:r>
-        <w:rPr>
-          <w:rFonts w:ascii="Tw Cen MT" w:hAnsi="Tw Cen MT"/>
-        </w:rPr>
-        <w:t>C</w:t>
-      </w:r>
-      <w:r>
-        <w:rPr>
-          <w:rFonts w:ascii="Tw Cen MT" w:hAnsi="Tw Cen MT"/>
-        </w:rPr>
-        <w:t>lass in firs</w:t>
-      </w:r>
-      <w:r>
-        <w:rPr>
-          <w:rFonts w:ascii="Tw Cen MT" w:hAnsi="Tw Cen MT"/>
-        </w:rPr>
-        <w:t>t</w:t>
-      </w:r>
-      <w:r>
-        <w:rPr>
-          <w:rFonts w:ascii="Tw Cen MT" w:hAnsi="Tw Cen MT"/>
-        </w:rPr>
-        <w:t xml:space="preserve"> year (position: 61/232, percentage: 72%)</w:t>
       </w:r>
     </w:p>
     <w:p>
@@ -1471,7 +2265,7 @@
           </mc:Choice>
           <mc:Fallback>
             <w:pict>
-              <v:line w14:anchorId="20418848" id="Straight Connector 610557234" o:spid="_x0000_s1026" style="position:absolute;flip:y;z-index:251672576;visibility:visible;mso-wrap-style:square;mso-height-percent:0;mso-wrap-distance-left:9pt;mso-wrap-distance-top:0;mso-wrap-distance-right:9pt;mso-wrap-distance-bottom:0;mso-position-horizontal:left;mso-position-horizontal-relative:margin;mso-position-vertical:absolute;mso-position-vertical-relative:text;mso-height-percent:0;mso-height-relative:margin" from="0,14.7pt" to="473pt,14.7pt" o:gfxdata="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" strokecolor="black [3213]" strokeweight="1.25pt">
+              <v:line w14:anchorId="416DB84C" id="Straight Connector 610557234" o:spid="_x0000_s1026" style="position:absolute;flip:y;z-index:251672576;visibility:visible;mso-wrap-style:square;mso-height-percent:0;mso-wrap-distance-left:9pt;mso-wrap-distance-top:0;mso-wrap-distance-right:9pt;mso-wrap-distance-bottom:0;mso-position-horizontal:left;mso-position-horizontal-relative:margin;mso-position-vertical:absolute;mso-position-vertical-relative:text;mso-height-percent:0;mso-height-relative:margin" from="0,14.7pt" to="473pt,14.7pt" o:gfxdata="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" strokecolor="black [3213]" strokeweight="1.25pt">
                 <v:stroke joinstyle="miter"/>
                 <w10:wrap anchorx="margin"/>
               </v:line>
@@ -1689,7 +2483,7 @@
         </w:rPr>
         <w:t xml:space="preserve"> </w:t>
       </w:r>
-      <w:hyperlink r:id="rId9" w:history="1">
+      <w:hyperlink r:id="rId10" w:history="1">
         <w:r>
           <w:rPr>
             <w:rStyle w:val="Hyperlink"/>
@@ -1927,11 +2721,7 @@
           </mc:Choice>
           <mc:Fallback>
             <w:pict>
-              <v:shapetype w14:anchorId="04F79456" id="_x0000_t202" coordsize="21600,21600" o:spt="202" path="m,l,21600r21600,l21600,xe">
-                <v:stroke joinstyle="miter"/>
-                <v:path gradientshapeok="t" o:connecttype="rect"/>
-              </v:shapetype>
-              <v:shape id="Text Box 1" o:spid="_x0000_s1026" type="#_x0000_t202" style="position:absolute;margin-left:307.85pt;margin-top:25.95pt;width:240pt;height:50.3pt;z-index:251659264;visibility:visible;mso-wrap-style:square;mso-width-percent:0;mso-height-percent:0;mso-wrap-distance-left:9pt;mso-wrap-distance-top:0;mso-wrap-distance-right:9pt;mso-wrap-distance-bottom:0;mso-position-horizontal:absolute;mso-position-horizontal-relative:page;mso-position-vertical:absolute;mso-position-vertical-relative:text;mso-width-percent:0;mso-height-percent:0;mso-width-relative:margin;mso-height-relative:margin;v-text-anchor:top" o:gfxdata="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" fillcolor="white [3201]" stroked="f" strokeweight=".5pt">
+              <v:shape w14:anchorId="04F79456" id="Text Box 1" o:spid="_x0000_s1028" type="#_x0000_t202" style="position:absolute;margin-left:307.85pt;margin-top:25.95pt;width:240pt;height:50.3pt;z-index:251659264;visibility:visible;mso-wrap-style:square;mso-width-percent:0;mso-height-percent:0;mso-wrap-distance-left:9pt;mso-wrap-distance-top:0;mso-wrap-distance-right:9pt;mso-wrap-distance-bottom:0;mso-position-horizontal:absolute;mso-position-horizontal-relative:page;mso-position-vertical:absolute;mso-position-vertical-relative:text;mso-width-percent:0;mso-height-percent:0;mso-width-relative:margin;mso-height-relative:margin;v-text-anchor:top" o:gfxdata="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" fillcolor="white [3201]" stroked="f" strokeweight=".5pt">
                 <v:textbox>
                   <w:txbxContent>
                     <w:p>
@@ -2182,7 +2972,7 @@
           </mc:Choice>
           <mc:Fallback>
             <w:pict>
-              <v:shape w14:anchorId="1E88C6A5" id="Text Box 7" o:spid="_x0000_s1027" type="#_x0000_t202" style="position:absolute;margin-left:8.1pt;margin-top:23.65pt;width:246pt;height:48.8pt;z-index:251670528;visibility:visible;mso-wrap-style:square;mso-width-percent:0;mso-height-percent:0;mso-wrap-distance-left:9pt;mso-wrap-distance-top:0;mso-wrap-distance-right:9pt;mso-wrap-distance-bottom:0;mso-position-horizontal:absolute;mso-position-horizontal-relative:margin;mso-position-vertical:absolute;mso-position-vertical-relative:text;mso-width-percent:0;mso-height-percent:0;mso-width-relative:margin;mso-height-relative:margin;v-text-anchor:top" o:gfxdata="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" fillcolor="white [3201]" stroked="f" strokeweight=".5pt">
+              <v:shape w14:anchorId="1E88C6A5" id="Text Box 7" o:spid="_x0000_s1029" type="#_x0000_t202" style="position:absolute;margin-left:8.1pt;margin-top:23.65pt;width:246pt;height:48.8pt;z-index:251670528;visibility:visible;mso-wrap-style:square;mso-width-percent:0;mso-height-percent:0;mso-wrap-distance-left:9pt;mso-wrap-distance-top:0;mso-wrap-distance-right:9pt;mso-wrap-distance-bottom:0;mso-position-horizontal:absolute;mso-position-horizontal-relative:margin;mso-position-vertical:absolute;mso-position-vertical-relative:text;mso-width-percent:0;mso-height-percent:0;mso-width-relative:margin;mso-height-relative:margin;v-text-anchor:top" o:gfxdata="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" fillcolor="white [3201]" stroked="f" strokeweight=".5pt">
                 <v:textbox>
                   <w:txbxContent>
                     <w:p>
@@ -2357,7 +3147,7 @@
           </mc:Choice>
           <mc:Fallback>
             <w:pict>
-              <v:line w14:anchorId="25F76BE9" id="Straight Connector 5" o:spid="_x0000_s1026" style="position:absolute;flip:y;z-index:251666432;visibility:visible;mso-wrap-style:square;mso-height-percent:0;mso-wrap-distance-left:9pt;mso-wrap-distance-top:0;mso-wrap-distance-right:9pt;mso-wrap-distance-bottom:0;mso-position-horizontal:absolute;mso-position-horizontal-relative:text;mso-position-vertical:absolute;mso-position-vertical-relative:text;mso-height-percent:0;mso-height-relative:margin" from=".7pt,15pt" to="473.7pt,15pt" o:gfxdata="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" strokecolor="black [3213]" strokeweight="1.25pt">
+              <v:line w14:anchorId="3DB74114" id="Straight Connector 5" o:spid="_x0000_s1026" style="position:absolute;flip:y;z-index:251666432;visibility:visible;mso-wrap-style:square;mso-height-percent:0;mso-wrap-distance-left:9pt;mso-wrap-distance-top:0;mso-wrap-distance-right:9pt;mso-wrap-distance-bottom:0;mso-position-horizontal:absolute;mso-position-horizontal-relative:text;mso-position-vertical:absolute;mso-position-vertical-relative:text;mso-height-percent:0;mso-height-relative:margin" from=".7pt,15pt" to="473.7pt,15pt" o:gfxdata="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" strokecolor="black [3213]" strokeweight="1.25pt">
                 <v:stroke joinstyle="miter"/>
               </v:line>
             </w:pict>
@@ -2396,6 +3186,118 @@
 <file path=word/numbering.xml><?xml version="1.0" encoding="utf-8"?>
 <w:numbering xmlns:wpc="http://schemas.microsoft.com/office/word/2010/wordprocessingCanvas" xmlns:cx="http://schemas.microsoft.com/office/drawing/2014/chartex" xmlns:cx1="http://schemas.microsoft.com/office/drawing/2015/9/8/chartex" xmlns:cx2="http://schemas.microsoft.com/office/drawing/2015/10/21/chartex" xmlns:cx3="http://schemas.microsoft.com/office/drawing/2016/5/9/chartex" xmlns:cx4="http://schemas.microsoft.com/office/drawing/2016/5/10/chartex" xmlns:cx5="http://schemas.microsoft.com/office/drawing/2016/5/11/chartex" xmlns:cx6="http://schemas.microsoft.com/office/drawing/2016/5/12/chartex" xmlns:cx7="http://schemas.microsoft.com/office/drawing/2016/5/13/chartex" xmlns:cx8="http://schemas.microsoft.com/office/drawing/2016/5/14/chartex" xmlns:mc="http://schemas.openxmlformats.org/markup-compatibility/2006" xmlns:aink="http://schemas.microsoft.com/office/drawing/2016/ink" xmlns:am3d="http://schemas.microsoft.com/office/drawing/2017/model3d" xmlns:o="urn:schemas-microsoft-com:office:office" xmlns:oel="http://schemas.microsoft.com/office/2019/extlst" xmlns:r="http://schemas.openxmlformats.org/officeDocument/2006/relationships" xmlns:m="http://schemas.openxmlformats.org/officeDocument/2006/math" xmlns:v="urn:schemas-microsoft-com:vml" xmlns:wp14="http://schemas.microsoft.com/office/word/2010/wordprocessingDrawing" xmlns:wp="http://schemas.openxmlformats.org/drawingml/2006/wordprocessingDrawing" xmlns:w10="urn:schemas-microsoft-com:office:word" xmlns:w="http://schemas.openxmlformats.org/wordprocessingml/2006/main" xmlns:w14="http://schemas.microsoft.com/office/word/2010/wordml" xmlns:w15="http://schemas.microsoft.com/office/word/2012/wordml" xmlns:w16cex="http://schemas.microsoft.com/office/word/2018/wordml/cex" xmlns:w16cid="http://schemas.microsoft.com/office/word/2016/wordml/cid" xmlns:w16="http://schemas.microsoft.com/office/word/2018/wordml" xmlns:w16du="http://schemas.microsoft.com/office/word/2023/wordml/word16du" xmlns:w16sdtdh="http://schemas.microsoft.com/office/word/2020/wordml/sdtdatahash" xmlns:w16se="http://schemas.microsoft.com/office/word/2015/wordml/symex" xmlns:wpg="http://schemas.microsoft.com/office/word/2010/wordprocessingGroup" xmlns:wpi="http://schemas.microsoft.com/office/word/2010/wordprocessingInk" xmlns:wne="http://schemas.microsoft.com/office/word/2006/wordml" xmlns:wps="http://schemas.microsoft.com/office/word/2010/wordprocessingShape" mc:Ignorable="w14 w15 w16se w16cid w16 w16cex w16sdtdh w16du wp14">
   <w:abstractNum w:abstractNumId="0" w15:restartNumberingAfterBreak="0">
+    <w:nsid w:val="00457EAA"/>
+    <w:multiLevelType w:val="hybridMultilevel"/>
+    <w:tmpl w:val="E1680724"/>
+    <w:lvl w:ilvl="0" w:tplc="B0C27110">
+      <w:numFmt w:val="bullet"/>
+      <w:lvlText w:val="-"/>
+      <w:lvlJc w:val="left"/>
+      <w:pPr>
+        <w:ind w:left="363" w:hanging="360"/>
+      </w:pPr>
+      <w:rPr>
+        <w:rFonts w:ascii="Calibri" w:eastAsiaTheme="minorHAnsi" w:hAnsi="Calibri" w:cs="Calibri" w:hint="default"/>
+      </w:rPr>
+    </w:lvl>
+    <w:lvl w:ilvl="1" w:tplc="08090003" w:tentative="1">
+      <w:start w:val="1"/>
+      <w:numFmt w:val="bullet"/>
+      <w:lvlText w:val="o"/>
+      <w:lvlJc w:val="left"/>
+      <w:pPr>
+        <w:ind w:left="1083" w:hanging="360"/>
+      </w:pPr>
+      <w:rPr>
+        <w:rFonts w:ascii="Courier New" w:hAnsi="Courier New" w:cs="Courier New" w:hint="default"/>
+      </w:rPr>
+    </w:lvl>
+    <w:lvl w:ilvl="2" w:tplc="08090005" w:tentative="1">
+      <w:start w:val="1"/>
+      <w:numFmt w:val="bullet"/>
+      <w:lvlText w:val=""/>
+      <w:lvlJc w:val="left"/>
+      <w:pPr>
+        <w:ind w:left="1803" w:hanging="360"/>
+      </w:pPr>
+      <w:rPr>
+        <w:rFonts w:ascii="Wingdings" w:hAnsi="Wingdings" w:hint="default"/>
+      </w:rPr>
+    </w:lvl>
+    <w:lvl w:ilvl="3" w:tplc="08090001" w:tentative="1">
+      <w:start w:val="1"/>
+      <w:numFmt w:val="bullet"/>
+      <w:lvlText w:val=""/>
+      <w:lvlJc w:val="left"/>
+      <w:pPr>
+        <w:ind w:left="2523" w:hanging="360"/>
+      </w:pPr>
+      <w:rPr>
+        <w:rFonts w:ascii="Symbol" w:hAnsi="Symbol" w:hint="default"/>
+      </w:rPr>
+    </w:lvl>
+    <w:lvl w:ilvl="4" w:tplc="08090003" w:tentative="1">
+      <w:start w:val="1"/>
+      <w:numFmt w:val="bullet"/>
+      <w:lvlText w:val="o"/>
+      <w:lvlJc w:val="left"/>
+      <w:pPr>
+        <w:ind w:left="3243" w:hanging="360"/>
+      </w:pPr>
+      <w:rPr>
+        <w:rFonts w:ascii="Courier New" w:hAnsi="Courier New" w:cs="Courier New" w:hint="default"/>
+      </w:rPr>
+    </w:lvl>
+    <w:lvl w:ilvl="5" w:tplc="08090005" w:tentative="1">
+      <w:start w:val="1"/>
+      <w:numFmt w:val="bullet"/>
+      <w:lvlText w:val=""/>
+      <w:lvlJc w:val="left"/>
+      <w:pPr>
+        <w:ind w:left="3963" w:hanging="360"/>
+      </w:pPr>
+      <w:rPr>
+        <w:rFonts w:ascii="Wingdings" w:hAnsi="Wingdings" w:hint="default"/>
+      </w:rPr>
+    </w:lvl>
+    <w:lvl w:ilvl="6" w:tplc="08090001" w:tentative="1">
+      <w:start w:val="1"/>
+      <w:numFmt w:val="bullet"/>
+      <w:lvlText w:val=""/>
+      <w:lvlJc w:val="left"/>
+      <w:pPr>
+        <w:ind w:left="4683" w:hanging="360"/>
+      </w:pPr>
+      <w:rPr>
+        <w:rFonts w:ascii="Symbol" w:hAnsi="Symbol" w:hint="default"/>
+      </w:rPr>
+    </w:lvl>
+    <w:lvl w:ilvl="7" w:tplc="08090003" w:tentative="1">
+      <w:start w:val="1"/>
+      <w:numFmt w:val="bullet"/>
+      <w:lvlText w:val="o"/>
+      <w:lvlJc w:val="left"/>
+      <w:pPr>
+        <w:ind w:left="5403" w:hanging="360"/>
+      </w:pPr>
+      <w:rPr>
+        <w:rFonts w:ascii="Courier New" w:hAnsi="Courier New" w:cs="Courier New" w:hint="default"/>
+      </w:rPr>
+    </w:lvl>
+    <w:lvl w:ilvl="8" w:tplc="08090005" w:tentative="1">
+      <w:start w:val="1"/>
+      <w:numFmt w:val="bullet"/>
+      <w:lvlText w:val=""/>
+      <w:lvlJc w:val="left"/>
+      <w:pPr>
+        <w:ind w:left="6123" w:hanging="360"/>
+      </w:pPr>
+      <w:rPr>
+        <w:rFonts w:ascii="Wingdings" w:hAnsi="Wingdings" w:hint="default"/>
+      </w:rPr>
+    </w:lvl>
+  </w:abstractNum>
+  <w:abstractNum w:abstractNumId="1" w15:restartNumberingAfterBreak="0">
     <w:nsid w:val="03C545B9"/>
     <w:multiLevelType w:val="hybridMultilevel"/>
     <w:tmpl w:val="12861BA8"/>
@@ -2508,7 +3410,7 @@
       </w:rPr>
     </w:lvl>
   </w:abstractNum>
-  <w:abstractNum w:abstractNumId="1" w15:restartNumberingAfterBreak="0">
+  <w:abstractNum w:abstractNumId="2" w15:restartNumberingAfterBreak="0">
     <w:nsid w:val="05A07310"/>
     <w:multiLevelType w:val="hybridMultilevel"/>
     <w:tmpl w:val="03BCC1DC"/>
@@ -2621,7 +3523,7 @@
       </w:rPr>
     </w:lvl>
   </w:abstractNum>
-  <w:abstractNum w:abstractNumId="2" w15:restartNumberingAfterBreak="0">
+  <w:abstractNum w:abstractNumId="3" w15:restartNumberingAfterBreak="0">
     <w:nsid w:val="09617B04"/>
     <w:multiLevelType w:val="hybridMultilevel"/>
     <w:tmpl w:val="5C52508E"/>
@@ -2734,7 +3636,7 @@
       </w:rPr>
     </w:lvl>
   </w:abstractNum>
-  <w:abstractNum w:abstractNumId="3" w15:restartNumberingAfterBreak="0">
+  <w:abstractNum w:abstractNumId="4" w15:restartNumberingAfterBreak="0">
     <w:nsid w:val="1D131B3E"/>
     <w:multiLevelType w:val="hybridMultilevel"/>
     <w:tmpl w:val="30D6E74E"/>
@@ -2847,7 +3749,7 @@
       </w:rPr>
     </w:lvl>
   </w:abstractNum>
-  <w:abstractNum w:abstractNumId="4" w15:restartNumberingAfterBreak="0">
+  <w:abstractNum w:abstractNumId="5" w15:restartNumberingAfterBreak="0">
     <w:nsid w:val="29491B5A"/>
     <w:multiLevelType w:val="hybridMultilevel"/>
     <w:tmpl w:val="0BC2937A"/>
@@ -2960,7 +3862,233 @@
       </w:rPr>
     </w:lvl>
   </w:abstractNum>
-  <w:abstractNum w:abstractNumId="5" w15:restartNumberingAfterBreak="0">
+  <w:abstractNum w:abstractNumId="6" w15:restartNumberingAfterBreak="0">
+    <w:nsid w:val="417A2190"/>
+    <w:multiLevelType w:val="hybridMultilevel"/>
+    <w:tmpl w:val="AAD43886"/>
+    <w:lvl w:ilvl="0" w:tplc="08090001">
+      <w:start w:val="1"/>
+      <w:numFmt w:val="bullet"/>
+      <w:lvlText w:val=""/>
+      <w:lvlJc w:val="left"/>
+      <w:pPr>
+        <w:ind w:left="363" w:hanging="360"/>
+      </w:pPr>
+      <w:rPr>
+        <w:rFonts w:ascii="Symbol" w:hAnsi="Symbol" w:hint="default"/>
+      </w:rPr>
+    </w:lvl>
+    <w:lvl w:ilvl="1" w:tplc="08090003" w:tentative="1">
+      <w:start w:val="1"/>
+      <w:numFmt w:val="bullet"/>
+      <w:lvlText w:val="o"/>
+      <w:lvlJc w:val="left"/>
+      <w:pPr>
+        <w:ind w:left="1083" w:hanging="360"/>
+      </w:pPr>
+      <w:rPr>
+        <w:rFonts w:ascii="Courier New" w:hAnsi="Courier New" w:cs="Courier New" w:hint="default"/>
+      </w:rPr>
+    </w:lvl>
+    <w:lvl w:ilvl="2" w:tplc="08090005" w:tentative="1">
+      <w:start w:val="1"/>
+      <w:numFmt w:val="bullet"/>
+      <w:lvlText w:val=""/>
+      <w:lvlJc w:val="left"/>
+      <w:pPr>
+        <w:ind w:left="1803" w:hanging="360"/>
+      </w:pPr>
+      <w:rPr>
+        <w:rFonts w:ascii="Wingdings" w:hAnsi="Wingdings" w:hint="default"/>
+      </w:rPr>
+    </w:lvl>
+    <w:lvl w:ilvl="3" w:tplc="08090001" w:tentative="1">
+      <w:start w:val="1"/>
+      <w:numFmt w:val="bullet"/>
+      <w:lvlText w:val=""/>
+      <w:lvlJc w:val="left"/>
+      <w:pPr>
+        <w:ind w:left="2523" w:hanging="360"/>
+      </w:pPr>
+      <w:rPr>
+        <w:rFonts w:ascii="Symbol" w:hAnsi="Symbol" w:hint="default"/>
+      </w:rPr>
+    </w:lvl>
+    <w:lvl w:ilvl="4" w:tplc="08090003" w:tentative="1">
+      <w:start w:val="1"/>
+      <w:numFmt w:val="bullet"/>
+      <w:lvlText w:val="o"/>
+      <w:lvlJc w:val="left"/>
+      <w:pPr>
+        <w:ind w:left="3243" w:hanging="360"/>
+      </w:pPr>
+      <w:rPr>
+        <w:rFonts w:ascii="Courier New" w:hAnsi="Courier New" w:cs="Courier New" w:hint="default"/>
+      </w:rPr>
+    </w:lvl>
+    <w:lvl w:ilvl="5" w:tplc="08090005" w:tentative="1">
+      <w:start w:val="1"/>
+      <w:numFmt w:val="bullet"/>
+      <w:lvlText w:val=""/>
+      <w:lvlJc w:val="left"/>
+      <w:pPr>
+        <w:ind w:left="3963" w:hanging="360"/>
+      </w:pPr>
+      <w:rPr>
+        <w:rFonts w:ascii="Wingdings" w:hAnsi="Wingdings" w:hint="default"/>
+      </w:rPr>
+    </w:lvl>
+    <w:lvl w:ilvl="6" w:tplc="08090001" w:tentative="1">
+      <w:start w:val="1"/>
+      <w:numFmt w:val="bullet"/>
+      <w:lvlText w:val=""/>
+      <w:lvlJc w:val="left"/>
+      <w:pPr>
+        <w:ind w:left="4683" w:hanging="360"/>
+      </w:pPr>
+      <w:rPr>
+        <w:rFonts w:ascii="Symbol" w:hAnsi="Symbol" w:hint="default"/>
+      </w:rPr>
+    </w:lvl>
+    <w:lvl w:ilvl="7" w:tplc="08090003" w:tentative="1">
+      <w:start w:val="1"/>
+      <w:numFmt w:val="bullet"/>
+      <w:lvlText w:val="o"/>
+      <w:lvlJc w:val="left"/>
+      <w:pPr>
+        <w:ind w:left="5403" w:hanging="360"/>
+      </w:pPr>
+      <w:rPr>
+        <w:rFonts w:ascii="Courier New" w:hAnsi="Courier New" w:cs="Courier New" w:hint="default"/>
+      </w:rPr>
+    </w:lvl>
+    <w:lvl w:ilvl="8" w:tplc="08090005" w:tentative="1">
+      <w:start w:val="1"/>
+      <w:numFmt w:val="bullet"/>
+      <w:lvlText w:val=""/>
+      <w:lvlJc w:val="left"/>
+      <w:pPr>
+        <w:ind w:left="6123" w:hanging="360"/>
+      </w:pPr>
+      <w:rPr>
+        <w:rFonts w:ascii="Wingdings" w:hAnsi="Wingdings" w:hint="default"/>
+      </w:rPr>
+    </w:lvl>
+  </w:abstractNum>
+  <w:abstractNum w:abstractNumId="7" w15:restartNumberingAfterBreak="0">
+    <w:nsid w:val="431D72A6"/>
+    <w:multiLevelType w:val="hybridMultilevel"/>
+    <w:tmpl w:val="2B4EB5EA"/>
+    <w:lvl w:ilvl="0" w:tplc="08090001">
+      <w:start w:val="1"/>
+      <w:numFmt w:val="bullet"/>
+      <w:lvlText w:val=""/>
+      <w:lvlJc w:val="left"/>
+      <w:pPr>
+        <w:ind w:left="720" w:hanging="360"/>
+      </w:pPr>
+      <w:rPr>
+        <w:rFonts w:ascii="Symbol" w:hAnsi="Symbol" w:hint="default"/>
+      </w:rPr>
+    </w:lvl>
+    <w:lvl w:ilvl="1" w:tplc="08090003" w:tentative="1">
+      <w:start w:val="1"/>
+      <w:numFmt w:val="bullet"/>
+      <w:lvlText w:val="o"/>
+      <w:lvlJc w:val="left"/>
+      <w:pPr>
+        <w:ind w:left="1440" w:hanging="360"/>
+      </w:pPr>
+      <w:rPr>
+        <w:rFonts w:ascii="Courier New" w:hAnsi="Courier New" w:cs="Courier New" w:hint="default"/>
+      </w:rPr>
+    </w:lvl>
+    <w:lvl w:ilvl="2" w:tplc="08090005" w:tentative="1">
+      <w:start w:val="1"/>
+      <w:numFmt w:val="bullet"/>
+      <w:lvlText w:val=""/>
+      <w:lvlJc w:val="left"/>
+      <w:pPr>
+        <w:ind w:left="2160" w:hanging="360"/>
+      </w:pPr>
+      <w:rPr>
+        <w:rFonts w:ascii="Wingdings" w:hAnsi="Wingdings" w:hint="default"/>
+      </w:rPr>
+    </w:lvl>
+    <w:lvl w:ilvl="3" w:tplc="08090001" w:tentative="1">
+      <w:start w:val="1"/>
+      <w:numFmt w:val="bullet"/>
+      <w:lvlText w:val=""/>
+      <w:lvlJc w:val="left"/>
+      <w:pPr>
+        <w:ind w:left="2880" w:hanging="360"/>
+      </w:pPr>
+      <w:rPr>
+        <w:rFonts w:ascii="Symbol" w:hAnsi="Symbol" w:hint="default"/>
+      </w:rPr>
+    </w:lvl>
+    <w:lvl w:ilvl="4" w:tplc="08090003" w:tentative="1">
+      <w:start w:val="1"/>
+      <w:numFmt w:val="bullet"/>
+      <w:lvlText w:val="o"/>
+      <w:lvlJc w:val="left"/>
+      <w:pPr>
+        <w:ind w:left="3600" w:hanging="360"/>
+      </w:pPr>
+      <w:rPr>
+        <w:rFonts w:ascii="Courier New" w:hAnsi="Courier New" w:cs="Courier New" w:hint="default"/>
+      </w:rPr>
+    </w:lvl>
+    <w:lvl w:ilvl="5" w:tplc="08090005" w:tentative="1">
+      <w:start w:val="1"/>
+      <w:numFmt w:val="bullet"/>
+      <w:lvlText w:val=""/>
+      <w:lvlJc w:val="left"/>
+      <w:pPr>
+        <w:ind w:left="4320" w:hanging="360"/>
+      </w:pPr>
+      <w:rPr>
+        <w:rFonts w:ascii="Wingdings" w:hAnsi="Wingdings" w:hint="default"/>
+      </w:rPr>
+    </w:lvl>
+    <w:lvl w:ilvl="6" w:tplc="08090001" w:tentative="1">
+      <w:start w:val="1"/>
+      <w:numFmt w:val="bullet"/>
+      <w:lvlText w:val=""/>
+      <w:lvlJc w:val="left"/>
+      <w:pPr>
+        <w:ind w:left="5040" w:hanging="360"/>
+      </w:pPr>
+      <w:rPr>
+        <w:rFonts w:ascii="Symbol" w:hAnsi="Symbol" w:hint="default"/>
+      </w:rPr>
+    </w:lvl>
+    <w:lvl w:ilvl="7" w:tplc="08090003" w:tentative="1">
+      <w:start w:val="1"/>
+      <w:numFmt w:val="bullet"/>
+      <w:lvlText w:val="o"/>
+      <w:lvlJc w:val="left"/>
+      <w:pPr>
+        <w:ind w:left="5760" w:hanging="360"/>
+      </w:pPr>
+      <w:rPr>
+        <w:rFonts w:ascii="Courier New" w:hAnsi="Courier New" w:cs="Courier New" w:hint="default"/>
+      </w:rPr>
+    </w:lvl>
+    <w:lvl w:ilvl="8" w:tplc="08090005" w:tentative="1">
+      <w:start w:val="1"/>
+      <w:numFmt w:val="bullet"/>
+      <w:lvlText w:val=""/>
+      <w:lvlJc w:val="left"/>
+      <w:pPr>
+        <w:ind w:left="6480" w:hanging="360"/>
+      </w:pPr>
+      <w:rPr>
+        <w:rFonts w:ascii="Wingdings" w:hAnsi="Wingdings" w:hint="default"/>
+      </w:rPr>
+    </w:lvl>
+  </w:abstractNum>
+  <w:abstractNum w:abstractNumId="8" w15:restartNumberingAfterBreak="0">
     <w:nsid w:val="452862EC"/>
     <w:multiLevelType w:val="hybridMultilevel"/>
     <w:tmpl w:val="64BE57C4"/>
@@ -3073,7 +4201,7 @@
       </w:rPr>
     </w:lvl>
   </w:abstractNum>
-  <w:abstractNum w:abstractNumId="6" w15:restartNumberingAfterBreak="0">
+  <w:abstractNum w:abstractNumId="9" w15:restartNumberingAfterBreak="0">
     <w:nsid w:val="4BEC51D2"/>
     <w:multiLevelType w:val="hybridMultilevel"/>
     <w:tmpl w:val="3A9E4FB2"/>
@@ -3186,7 +4314,7 @@
       </w:rPr>
     </w:lvl>
   </w:abstractNum>
-  <w:abstractNum w:abstractNumId="7" w15:restartNumberingAfterBreak="0">
+  <w:abstractNum w:abstractNumId="10" w15:restartNumberingAfterBreak="0">
     <w:nsid w:val="4BF548E7"/>
     <w:multiLevelType w:val="hybridMultilevel"/>
     <w:tmpl w:val="91F022DC"/>
@@ -3275,7 +4403,7 @@
       </w:pPr>
     </w:lvl>
   </w:abstractNum>
-  <w:abstractNum w:abstractNumId="8" w15:restartNumberingAfterBreak="0">
+  <w:abstractNum w:abstractNumId="11" w15:restartNumberingAfterBreak="0">
     <w:nsid w:val="51946865"/>
     <w:multiLevelType w:val="hybridMultilevel"/>
     <w:tmpl w:val="5622CF48"/>
@@ -3388,7 +4516,119 @@
       </w:rPr>
     </w:lvl>
   </w:abstractNum>
-  <w:abstractNum w:abstractNumId="9" w15:restartNumberingAfterBreak="0">
+  <w:abstractNum w:abstractNumId="12" w15:restartNumberingAfterBreak="0">
+    <w:nsid w:val="59915BF2"/>
+    <w:multiLevelType w:val="hybridMultilevel"/>
+    <w:tmpl w:val="4CB064B2"/>
+    <w:lvl w:ilvl="0" w:tplc="B0C27110">
+      <w:numFmt w:val="bullet"/>
+      <w:lvlText w:val="-"/>
+      <w:lvlJc w:val="left"/>
+      <w:pPr>
+        <w:ind w:left="363" w:hanging="360"/>
+      </w:pPr>
+      <w:rPr>
+        <w:rFonts w:ascii="Calibri" w:eastAsiaTheme="minorHAnsi" w:hAnsi="Calibri" w:cs="Calibri" w:hint="default"/>
+      </w:rPr>
+    </w:lvl>
+    <w:lvl w:ilvl="1" w:tplc="08090003" w:tentative="1">
+      <w:start w:val="1"/>
+      <w:numFmt w:val="bullet"/>
+      <w:lvlText w:val="o"/>
+      <w:lvlJc w:val="left"/>
+      <w:pPr>
+        <w:ind w:left="1440" w:hanging="360"/>
+      </w:pPr>
+      <w:rPr>
+        <w:rFonts w:ascii="Courier New" w:hAnsi="Courier New" w:cs="Courier New" w:hint="default"/>
+      </w:rPr>
+    </w:lvl>
+    <w:lvl w:ilvl="2" w:tplc="08090005" w:tentative="1">
+      <w:start w:val="1"/>
+      <w:numFmt w:val="bullet"/>
+      <w:lvlText w:val=""/>
+      <w:lvlJc w:val="left"/>
+      <w:pPr>
+        <w:ind w:left="2160" w:hanging="360"/>
+      </w:pPr>
+      <w:rPr>
+        <w:rFonts w:ascii="Wingdings" w:hAnsi="Wingdings" w:hint="default"/>
+      </w:rPr>
+    </w:lvl>
+    <w:lvl w:ilvl="3" w:tplc="08090001" w:tentative="1">
+      <w:start w:val="1"/>
+      <w:numFmt w:val="bullet"/>
+      <w:lvlText w:val=""/>
+      <w:lvlJc w:val="left"/>
+      <w:pPr>
+        <w:ind w:left="2880" w:hanging="360"/>
+      </w:pPr>
+      <w:rPr>
+        <w:rFonts w:ascii="Symbol" w:hAnsi="Symbol" w:hint="default"/>
+      </w:rPr>
+    </w:lvl>
+    <w:lvl w:ilvl="4" w:tplc="08090003" w:tentative="1">
+      <w:start w:val="1"/>
+      <w:numFmt w:val="bullet"/>
+      <w:lvlText w:val="o"/>
+      <w:lvlJc w:val="left"/>
+      <w:pPr>
+        <w:ind w:left="3600" w:hanging="360"/>
+      </w:pPr>
+      <w:rPr>
+        <w:rFonts w:ascii="Courier New" w:hAnsi="Courier New" w:cs="Courier New" w:hint="default"/>
+      </w:rPr>
+    </w:lvl>
+    <w:lvl w:ilvl="5" w:tplc="08090005" w:tentative="1">
+      <w:start w:val="1"/>
+      <w:numFmt w:val="bullet"/>
+      <w:lvlText w:val=""/>
+      <w:lvlJc w:val="left"/>
+      <w:pPr>
+        <w:ind w:left="4320" w:hanging="360"/>
+      </w:pPr>
+      <w:rPr>
+        <w:rFonts w:ascii="Wingdings" w:hAnsi="Wingdings" w:hint="default"/>
+      </w:rPr>
+    </w:lvl>
+    <w:lvl w:ilvl="6" w:tplc="08090001" w:tentative="1">
+      <w:start w:val="1"/>
+      <w:numFmt w:val="bullet"/>
+      <w:lvlText w:val=""/>
+      <w:lvlJc w:val="left"/>
+      <w:pPr>
+        <w:ind w:left="5040" w:hanging="360"/>
+      </w:pPr>
+      <w:rPr>
+        <w:rFonts w:ascii="Symbol" w:hAnsi="Symbol" w:hint="default"/>
+      </w:rPr>
+    </w:lvl>
+    <w:lvl w:ilvl="7" w:tplc="08090003" w:tentative="1">
+      <w:start w:val="1"/>
+      <w:numFmt w:val="bullet"/>
+      <w:lvlText w:val="o"/>
+      <w:lvlJc w:val="left"/>
+      <w:pPr>
+        <w:ind w:left="5760" w:hanging="360"/>
+      </w:pPr>
+      <w:rPr>
+        <w:rFonts w:ascii="Courier New" w:hAnsi="Courier New" w:cs="Courier New" w:hint="default"/>
+      </w:rPr>
+    </w:lvl>
+    <w:lvl w:ilvl="8" w:tplc="08090005" w:tentative="1">
+      <w:start w:val="1"/>
+      <w:numFmt w:val="bullet"/>
+      <w:lvlText w:val=""/>
+      <w:lvlJc w:val="left"/>
+      <w:pPr>
+        <w:ind w:left="6480" w:hanging="360"/>
+      </w:pPr>
+      <w:rPr>
+        <w:rFonts w:ascii="Wingdings" w:hAnsi="Wingdings" w:hint="default"/>
+      </w:rPr>
+    </w:lvl>
+  </w:abstractNum>
+  <w:abstractNum w:abstractNumId="13" w15:restartNumberingAfterBreak="0">
     <w:nsid w:val="59CC428D"/>
     <w:multiLevelType w:val="hybridMultilevel"/>
     <w:tmpl w:val="0CF0CA44"/>
@@ -3500,7 +4740,7 @@
       </w:rPr>
     </w:lvl>
   </w:abstractNum>
-  <w:abstractNum w:abstractNumId="10" w15:restartNumberingAfterBreak="0">
+  <w:abstractNum w:abstractNumId="14" w15:restartNumberingAfterBreak="0">
     <w:nsid w:val="5B8678B7"/>
     <w:multiLevelType w:val="hybridMultilevel"/>
     <w:tmpl w:val="CCB0387A"/>
@@ -3613,7 +4853,7 @@
       </w:rPr>
     </w:lvl>
   </w:abstractNum>
-  <w:abstractNum w:abstractNumId="11" w15:restartNumberingAfterBreak="0">
+  <w:abstractNum w:abstractNumId="15" w15:restartNumberingAfterBreak="0">
     <w:nsid w:val="6A852F6E"/>
     <w:multiLevelType w:val="hybridMultilevel"/>
     <w:tmpl w:val="D3BA0334"/>
@@ -3726,7 +4966,7 @@
       </w:rPr>
     </w:lvl>
   </w:abstractNum>
-  <w:abstractNum w:abstractNumId="12" w15:restartNumberingAfterBreak="0">
+  <w:abstractNum w:abstractNumId="16" w15:restartNumberingAfterBreak="0">
     <w:nsid w:val="7EB66C2B"/>
     <w:multiLevelType w:val="hybridMultilevel"/>
     <w:tmpl w:val="DA8CC1B4"/>
@@ -3840,42 +5080,54 @@
     </w:lvl>
   </w:abstractNum>
   <w:num w:numId="1" w16cid:durableId="545871437">
+    <w:abstractNumId w:val="10"/>
+  </w:num>
+  <w:num w:numId="2" w16cid:durableId="496456160">
+    <w:abstractNumId w:val="2"/>
+  </w:num>
+  <w:num w:numId="3" w16cid:durableId="2142573988">
+    <w:abstractNumId w:val="5"/>
+  </w:num>
+  <w:num w:numId="4" w16cid:durableId="1447848611">
+    <w:abstractNumId w:val="11"/>
+  </w:num>
+  <w:num w:numId="5" w16cid:durableId="908687168">
+    <w:abstractNumId w:val="15"/>
+  </w:num>
+  <w:num w:numId="6" w16cid:durableId="1594586417">
+    <w:abstractNumId w:val="1"/>
+  </w:num>
+  <w:num w:numId="7" w16cid:durableId="94978508">
+    <w:abstractNumId w:val="8"/>
+  </w:num>
+  <w:num w:numId="8" w16cid:durableId="789591293">
+    <w:abstractNumId w:val="3"/>
+  </w:num>
+  <w:num w:numId="9" w16cid:durableId="969895271">
+    <w:abstractNumId w:val="14"/>
+  </w:num>
+  <w:num w:numId="10" w16cid:durableId="1121345181">
+    <w:abstractNumId w:val="13"/>
+  </w:num>
+  <w:num w:numId="11" w16cid:durableId="2077780512">
+    <w:abstractNumId w:val="4"/>
+  </w:num>
+  <w:num w:numId="12" w16cid:durableId="1280648159">
+    <w:abstractNumId w:val="9"/>
+  </w:num>
+  <w:num w:numId="13" w16cid:durableId="1384520101">
+    <w:abstractNumId w:val="16"/>
+  </w:num>
+  <w:num w:numId="14" w16cid:durableId="923954578">
     <w:abstractNumId w:val="7"/>
   </w:num>
-  <w:num w:numId="2" w16cid:durableId="496456160">
-    <w:abstractNumId w:val="1"/>
+  <w:num w:numId="15" w16cid:durableId="2017681932">
+    <w:abstractNumId w:val="6"/>
   </w:num>
-  <w:num w:numId="3" w16cid:durableId="2142573988">
-    <w:abstractNumId w:val="4"/>
-  </w:num>
-  <w:num w:numId="4" w16cid:durableId="1447848611">
-    <w:abstractNumId w:val="8"/>
-  </w:num>
-  <w:num w:numId="5" w16cid:durableId="908687168">
-    <w:abstractNumId w:val="11"/>
-  </w:num>
-  <w:num w:numId="6" w16cid:durableId="1594586417">
+  <w:num w:numId="16" w16cid:durableId="1397434976">
     <w:abstractNumId w:val="0"/>
   </w:num>
-  <w:num w:numId="7" w16cid:durableId="94978508">
-    <w:abstractNumId w:val="5"/>
-  </w:num>
-  <w:num w:numId="8" w16cid:durableId="789591293">
-    <w:abstractNumId w:val="2"/>
-  </w:num>
-  <w:num w:numId="9" w16cid:durableId="969895271">
-    <w:abstractNumId w:val="10"/>
-  </w:num>
-  <w:num w:numId="10" w16cid:durableId="1121345181">
-    <w:abstractNumId w:val="9"/>
-  </w:num>
-  <w:num w:numId="11" w16cid:durableId="2077780512">
-    <w:abstractNumId w:val="3"/>
-  </w:num>
-  <w:num w:numId="12" w16cid:durableId="1280648159">
-    <w:abstractNumId w:val="6"/>
-  </w:num>
-  <w:num w:numId="13" w16cid:durableId="1384520101">
+  <w:num w:numId="17" w16cid:durableId="1286737685">
     <w:abstractNumId w:val="12"/>
   </w:num>
 </w:numbering>
@@ -4661,8 +5913,20 @@
 </a:theme>
 </file>
 
+<file path=customXml/item1.xml><?xml version="1.0" encoding="utf-8"?>
+<b:Sources xmlns:b="http://schemas.openxmlformats.org/officeDocument/2006/bibliography" xmlns="http://schemas.openxmlformats.org/officeDocument/2006/bibliography" SelectedStyle="\APASixthEditionOfficeOnline.xsl" StyleName="APA" Version="6"/>
+</file>
+
+<file path=customXml/itemProps1.xml><?xml version="1.0" encoding="utf-8"?>
+<ds:datastoreItem xmlns:ds="http://schemas.openxmlformats.org/officeDocument/2006/customXml" ds:itemID="{2B2288F1-2742-4FF7-9EA1-E9F3A9202275}">
+  <ds:schemaRefs>
+    <ds:schemaRef ds:uri="http://schemas.openxmlformats.org/officeDocument/2006/bibliography"/>
+  </ds:schemaRefs>
+</ds:datastoreItem>
+</file>
+
 <file path=docMetadata/LabelInfo.xml><?xml version="1.0" encoding="utf-8"?>
 <clbl:labelList xmlns:clbl="http://schemas.microsoft.com/office/2020/mipLabelMetadata">
-  <clbl:label id="{f42aa342-8706-4288-bd11-ebb85995028c}" enabled="1" method="Standard" siteId="{72f988bf-86f1-41af-91ab-2d7cd011db47}" contentBits="0" removed="0"/>
+  <clbl:label id="{f42aa342-8706-4288-bd11-ebb85995028c}" enabled="1" method="Privileged" siteId="{72f988bf-86f1-41af-91ab-2d7cd011db47}" contentBits="0" removed="0"/>
 </clbl:labelList>
 </file>
</xml_diff>

<commit_message>
Remove mobile number from CV files (interim)
Phone number removed from CV.docx (paragraph deleted) and CV.pdf
(redacted in place). Interim only: the PDF should be regenerated from
the updated docx, and the CV content itself is outdated — full rewrite
to follow.

Co-Authored-By: Claude Fable 5 <noreply@anthropic.com>
</commit_message>
<xml_diff>
--- a/public/CV.docx
+++ b/public/CV.docx
@@ -86,27 +86,8 @@
                 <w:sz w:val="24"/>
               </w:rPr>
               <w:t>Location</w:t>
-            </w:r>
-            <w:r>
-              <w:rPr>
-                <w:rFonts w:ascii="Tw Cen MT" w:hAnsi="Tw Cen MT"/>
-                <w:sz w:val="24"/>
-              </w:rPr>
               <w:tab/>
-            </w:r>
-            <w:r>
-              <w:rPr>
-                <w:rFonts w:ascii="Tw Cen MT" w:hAnsi="Tw Cen MT"/>
-                <w:sz w:val="24"/>
-              </w:rPr>
-              <w:t>London, N5 1</w:t>
-            </w:r>
-            <w:r>
-              <w:rPr>
-                <w:rFonts w:ascii="Tw Cen MT" w:hAnsi="Tw Cen MT"/>
-                <w:sz w:val="24"/>
-              </w:rPr>
-              <w:t>EJ</w:t>
+              <w:t>London, N5 1EJ</w:t>
             </w:r>
           </w:p>
           <w:p>
@@ -123,19 +104,7 @@
                 <w:sz w:val="24"/>
               </w:rPr>
               <w:t xml:space="preserve">Email </w:t>
-            </w:r>
-            <w:r>
-              <w:rPr>
-                <w:rFonts w:ascii="Tw Cen MT" w:hAnsi="Tw Cen MT"/>
-                <w:sz w:val="24"/>
-              </w:rPr>
               <w:tab/>
-            </w:r>
-            <w:r>
-              <w:rPr>
-                <w:rFonts w:ascii="Tw Cen MT" w:hAnsi="Tw Cen MT"/>
-                <w:sz w:val="24"/>
-              </w:rPr>
               <w:tab/>
             </w:r>
             <w:hyperlink r:id="rId6" w:history="1">
@@ -148,50 +117,6 @@
                 <w:t>hirst.jj@googlemail.com</w:t>
               </w:r>
             </w:hyperlink>
-          </w:p>
-          <w:p>
-            <w:pPr>
-              <w:spacing w:after="0"/>
-              <w:rPr>
-                <w:rFonts w:ascii="Tw Cen MT" w:hAnsi="Tw Cen MT"/>
-                <w:sz w:val="24"/>
-              </w:rPr>
-            </w:pPr>
-            <w:r>
-              <w:rPr>
-                <w:rFonts w:ascii="Tw Cen MT" w:hAnsi="Tw Cen MT"/>
-                <w:sz w:val="24"/>
-              </w:rPr>
-              <w:t>Phone</w:t>
-            </w:r>
-            <w:r>
-              <w:rPr>
-                <w:rFonts w:ascii="Tw Cen MT" w:hAnsi="Tw Cen MT"/>
-                <w:sz w:val="24"/>
-              </w:rPr>
-              <w:tab/>
-            </w:r>
-            <w:r>
-              <w:rPr>
-                <w:rFonts w:ascii="Tw Cen MT" w:hAnsi="Tw Cen MT"/>
-                <w:sz w:val="24"/>
-              </w:rPr>
-              <w:tab/>
-            </w:r>
-            <w:r>
-              <w:rPr>
-                <w:rFonts w:ascii="Tw Cen MT" w:hAnsi="Tw Cen MT"/>
-                <w:sz w:val="24"/>
-              </w:rPr>
-              <w:t xml:space="preserve">+44 </w:t>
-            </w:r>
-            <w:r>
-              <w:rPr>
-                <w:rFonts w:ascii="Tw Cen MT" w:hAnsi="Tw Cen MT"/>
-                <w:sz w:val="24"/>
-              </w:rPr>
-              <w:t>7504 456577</w:t>
-            </w:r>
           </w:p>
           <w:p>
             <w:pPr>
@@ -303,18 +228,7 @@
                                 <w:szCs w:val="24"/>
                                 <w:lang w:val="en-US"/>
                               </w:rPr>
-                              <w:t>Skills</w:t>
-                            </w:r>
-                            <w:r>
-                              <w:rPr>
-                                <w:rFonts w:ascii="Tw Cen MT" w:hAnsi="Tw Cen MT"/>
-                                <w:b/>
-                                <w:bCs/>
-                                <w:sz w:val="24"/>
-                                <w:szCs w:val="24"/>
-                                <w:lang w:val="en-US"/>
-                              </w:rPr>
-                              <w:t>:</w:t>
+                              <w:t>Skills:</w:t>
                             </w:r>
                           </w:p>
                           <w:p>
@@ -450,7 +364,7 @@
                 <v:stroke joinstyle="miter"/>
                 <v:path gradientshapeok="t" o:connecttype="rect"/>
               </v:shapetype>
-              <v:shape id="Text Box 2" o:spid="_x0000_s1026" type="#_x0000_t202" style="position:absolute;margin-left:260.8pt;margin-top:71pt;width:121.2pt;height:111pt;z-index:251678720;visibility:visible;mso-wrap-style:square;mso-width-percent:0;mso-height-percent:0;mso-wrap-distance-left:9pt;mso-wrap-distance-top:3.6pt;mso-wrap-distance-right:9pt;mso-wrap-distance-bottom:3.6pt;mso-position-horizontal:absolute;mso-position-horizontal-relative:margin;mso-position-vertical:absolute;mso-position-vertical-relative:text;mso-width-percent:0;mso-height-percent:0;mso-width-relative:margin;mso-height-relative:margin;v-text-anchor:top" o:gfxdata="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" stroked="f">
+              <v:shape id="Text Box 2" o:spid="_x0000_s1026" type="#_x0000_t202" style="position:absolute;margin-left:260.8pt;margin-top:71pt;width:121.2pt;height:111pt;z-index:251678720;visibility:visible;mso-wrap-style:square;mso-width-percent:0;mso-height-percent:0;mso-wrap-distance-left:9pt;mso-wrap-distance-top:3.6pt;mso-wrap-distance-right:9pt;mso-wrap-distance-bottom:3.6pt;mso-position-horizontal:absolute;mso-position-horizontal-relative:margin;mso-position-vertical:absolute;mso-position-vertical-relative:text;mso-width-percent:0;mso-height-percent:0;mso-width-relative:margin;mso-height-relative:margin;v-text-anchor:top" o:gfxdata="UEsDBBQABgAIAAAAIQC2gziS/gAAAOEBAAATAAAAW0NvbnRlbnRfVHlwZXNdLnhtbJSRQU7DMBBF 90jcwfIWJU67QAgl6YK0S0CoHGBkTxKLZGx5TGhvj5O2G0SRWNoz/78nu9wcxkFMGNg6quQqL6RA 0s5Y6ir5vt9lD1JwBDIwOMJKHpHlpr69KfdHjyxSmriSfYz+USnWPY7AufNIadK6MEJMx9ApD/oD OlTrorhX2lFEilmcO2RdNtjC5xDF9pCuTyYBB5bi6bQ4syoJ3g9WQ0ymaiLzg5KdCXlKLjvcW893 SUOqXwnz5DrgnHtJTxOsQfEKIT7DmDSUCaxw7Rqn8787ZsmRM9e2VmPeBN4uqYvTtW7jvijg9N/y JsXecLq0q+WD6m8AAAD//wMAUEsDBBQABgAIAAAAIQA4/SH/1gAAAJQBAAALAAAAX3JlbHMvLnJl bHOkkMFqwzAMhu+DvYPRfXGawxijTi+j0GvpHsDYimMaW0Yy2fr2M4PBMnrbUb/Q94l/f/hMi1qR JVI2sOt6UJgd+ZiDgffL8ekFlFSbvV0oo4EbChzGx4f9GRdb25HMsYhqlCwG5lrLq9biZkxWOiqY 22YiTra2kYMu1l1tQD30/bPm3wwYN0x18gb45AdQl1tp5j/sFB2T0FQ7R0nTNEV3j6o9feQzro1i OWA14Fm+Q8a1a8+Bvu/d/dMb2JY5uiPbhG/ktn4cqGU/er3pcvwCAAD//wMAUEsDBBQABgAIAAAA IQC6rn4TDQIAAPcDAAAOAAAAZHJzL2Uyb0RvYy54bWysU9tu2zAMfR+wfxD0vtjJkrUx4hRdugwD ugvQ7gNkWY6FyaJGKbGzrx8lp2nQvRXzg0Ca1CF5eLS6GTrDDgq9Blvy6STnTFkJtba7kv983L67 5swHYWthwKqSH5XnN+u3b1a9K9QMWjC1QkYg1he9K3kbgiuyzMtWdcJPwClLwQawE4Fc3GU1ip7Q O5PN8vxD1gPWDkEq7+nv3Rjk64TfNEqG703jVWCm5NRbSCems4pntl6JYofCtVqe2hCv6KIT2lLR M9SdCILtUf8D1WmJ4KEJEwldBk2jpUoz0DTT/MU0D61wKs1C5Hh3psn/P1j57fDgfiALw0cYaIFp CO/uQf7yzMKmFXanbhGhb5WoqfA0Upb1zhenq5FqX/gIUvVfoaYli32ABDQ02EVWaE5G6LSA45l0 NQQmY8nF++VsTiFJsek8X17laS2ZKJ6uO/Ths4KORaPkSFtN8OJw70NsRxRPKbGaB6PrrTYmObir NgbZQZACtulLE7xIM5b1JV8uZouEbCHeT+LodCCFGt2V/DqP36iZSMcnW6eUILQZberE2BM/kZKR nDBUAyVGniqoj8QUwqhEejlktIB/OOtJhSX3v/cCFWfmiyW2l9N5pCYkZ764mpGDl5HqMiKsJKiS B85GcxOS1CMPFm5pK41OfD13cuqV1JVoPL2EKN9LP2U9v9f1XwAAAP//AwBQSwMEFAAGAAgAAAAh AGtYKhbeAAAACwEAAA8AAABkcnMvZG93bnJldi54bWxMj8FOwzAQRO9I/IO1SFwQdRrShKZxKkAC cW3pB2zibRIR21HsNunfsz3R26xmNPum2M6mF2cafeesguUiAkG2drqzjYLDz+fzKwgf0GrsnSUF F/KwLe/vCsy1m+yOzvvQCC6xPkcFbQhDLqWvWzLoF24gy97RjQYDn2Mj9YgTl5texlGUSoOd5Q8t DvTRUv27PxkFx+/pabWeqq9wyHZJ+o5dVrmLUo8P89sGRKA5/Ifhis/oUDJT5U5We9ErWMXLlKNs JDGP4kSWJiwqBS9XIctC3m4o/wAAAP//AwBQSwECLQAUAAYACAAAACEAtoM4kv4AAADhAQAAEwAA AAAAAAAAAAAAAAAAAAAAW0NvbnRlbnRfVHlwZXNdLnhtbFBLAQItABQABgAIAAAAIQA4/SH/1gAA AJQBAAALAAAAAAAAAAAAAAAAAC8BAABfcmVscy8ucmVsc1BLAQItABQABgAIAAAAIQC6rn4TDQIA APcDAAAOAAAAAAAAAAAAAAAAAC4CAABkcnMvZTJvRG9jLnhtbFBLAQItABQABgAIAAAAIQBrWCoW 3gAAAAsBAAAPAAAAAAAAAAAAAAAAAGcEAABkcnMvZG93bnJldi54bWxQSwUGAAAAAAQABADzAAAA cgUAAAAA " stroked="f">
                 <v:textbox>
                   <w:txbxContent>
                     <w:p>
@@ -473,18 +387,7 @@
                           <w:szCs w:val="24"/>
                           <w:lang w:val="en-US"/>
                         </w:rPr>
-                        <w:t>Skills</w:t>
-                      </w:r>
-                      <w:r>
-                        <w:rPr>
-                          <w:rFonts w:ascii="Tw Cen MT" w:hAnsi="Tw Cen MT"/>
-                          <w:b/>
-                          <w:bCs/>
-                          <w:sz w:val="24"/>
-                          <w:szCs w:val="24"/>
-                          <w:lang w:val="en-US"/>
-                        </w:rPr>
-                        <w:t>:</w:t>
+                        <w:t>Skills:</w:t>
                       </w:r>
                     </w:p>
                     <w:p>
@@ -792,7 +695,7 @@
           </mc:Choice>
           <mc:Fallback>
             <w:pict>
-              <v:shape w14:anchorId="58163154" id="_x0000_s1027" type="#_x0000_t202" style="position:absolute;margin-left:374.8pt;margin-top:19pt;width:98pt;height:85.3pt;z-index:251680768;visibility:visible;mso-wrap-style:square;mso-width-percent:0;mso-height-percent:0;mso-wrap-distance-left:9pt;mso-wrap-distance-top:3.6pt;mso-wrap-distance-right:9pt;mso-wrap-distance-bottom:3.6pt;mso-position-horizontal:absolute;mso-position-horizontal-relative:margin;mso-position-vertical:absolute;mso-position-vertical-relative:text;mso-width-percent:0;mso-height-percent:0;mso-width-relative:margin;mso-height-relative:margin;v-text-anchor:top" o:gfxdata="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" stroked="f">
+              <v:shape w14:anchorId="58163154" id="_x0000_s1027" type="#_x0000_t202" style="position:absolute;margin-left:374.8pt;margin-top:19pt;width:98pt;height:85.3pt;z-index:251680768;visibility:visible;mso-wrap-style:square;mso-width-percent:0;mso-height-percent:0;mso-wrap-distance-left:9pt;mso-wrap-distance-top:3.6pt;mso-wrap-distance-right:9pt;mso-wrap-distance-bottom:3.6pt;mso-position-horizontal:absolute;mso-position-horizontal-relative:margin;mso-position-vertical:absolute;mso-position-vertical-relative:text;mso-width-percent:0;mso-height-percent:0;mso-width-relative:margin;mso-height-relative:margin;v-text-anchor:top" o:gfxdata="UEsDBBQABgAIAAAAIQC2gziS/gAAAOEBAAATAAAAW0NvbnRlbnRfVHlwZXNdLnhtbJSRQU7DMBBF 90jcwfIWJU67QAgl6YK0S0CoHGBkTxKLZGx5TGhvj5O2G0SRWNoz/78nu9wcxkFMGNg6quQqL6RA 0s5Y6ir5vt9lD1JwBDIwOMJKHpHlpr69KfdHjyxSmriSfYz+USnWPY7AufNIadK6MEJMx9ApD/oD OlTrorhX2lFEilmcO2RdNtjC5xDF9pCuTyYBB5bi6bQ4syoJ3g9WQ0ymaiLzg5KdCXlKLjvcW893 SUOqXwnz5DrgnHtJTxOsQfEKIT7DmDSUCaxw7Rqn8787ZsmRM9e2VmPeBN4uqYvTtW7jvijg9N/y JsXecLq0q+WD6m8AAAD//wMAUEsDBBQABgAIAAAAIQA4/SH/1gAAAJQBAAALAAAAX3JlbHMvLnJl bHOkkMFqwzAMhu+DvYPRfXGawxijTi+j0GvpHsDYimMaW0Yy2fr2M4PBMnrbUb/Q94l/f/hMi1qR JVI2sOt6UJgd+ZiDgffL8ekFlFSbvV0oo4EbChzGx4f9GRdb25HMsYhqlCwG5lrLq9biZkxWOiqY 22YiTra2kYMu1l1tQD30/bPm3wwYN0x18gb45AdQl1tp5j/sFB2T0FQ7R0nTNEV3j6o9feQzro1i OWA14Fm+Q8a1a8+Bvu/d/dMb2JY5uiPbhG/ktn4cqGU/er3pcvwCAAD//wMAUEsDBBQABgAIAAAA IQDUXzPcEAIAAP4DAAAOAAAAZHJzL2Uyb0RvYy54bWysU9tu2zAMfR+wfxD0vthOky414hRdugwD ugvQ7QNkSY6FyaImKbGzry8lu2nQvQ3zg0Ca1CF5eLS+HTpNjtJ5BaaixSynRBoOQpl9RX/+2L1b UeIDM4JpMLKiJ+np7ebtm3VvSzmHFrSQjiCI8WVvK9qGYMss87yVHfMzsNJgsAHXsYCu22fCsR7R O53N8/w668EJ64BL7/Hv/Rikm4TfNJKHb03jZSC6othbSKdLZx3PbLNm5d4x2yo+tcH+oYuOKYNF z1D3LDBycOovqE5xBx6aMOPQZdA0iss0A05T5K+meWyZlWkWJMfbM03+/8Hyr8dH+92RMHyAAReY hvD2AfgvTwxsW2b28s456FvJBBYuImVZb305XY1U+9JHkLr/AgKXzA4BEtDQuC6ygnMSRMcFnM6k yyEQHkvOF4vrHEMcY0W+uroq0loyVj5ft86HTxI6Eo2KOtxqgmfHBx9iO6x8TonVPGgldkrr5Lh9 vdWOHBkqYJe+NMGrNG1IX9Gb5XyZkA3E+0kcnQqoUK26iq7y+I2aiXR8NCKlBKb0aGMn2kz8REpG csJQD0SJibxIVw3ihIQ5GAWJDwiNFtwfSnoUY0X97wNzkhL92SDpN8ViEdWbnMXy/RwddxmpLyPM cISqaKBkNLchKT7SYeAOl9OoRNtLJ1PLKLLE5vQgooov/ZT18mw3TwAAAP//AwBQSwMEFAAGAAgA AAAhAIqssejeAAAACgEAAA8AAABkcnMvZG93bnJldi54bWxMj8tOwzAQRfdI/IM1SGwQdShpXmRS ARKIbUs/wImnSURsR7HbpH/PsKLLmTm6c265XcwgzjT53lmEp1UEgmzjdG9bhMP3x2MGwgdltRqc JYQLedhWtzelKrSb7Y7O+9AKDrG+UAhdCGMhpW86Msqv3EiWb0c3GRV4nFqpJzVzuBnkOooSaVRv +UOnRnrvqPnZnwzC8Wt+2ORz/RkO6S5O3lSf1u6CeH+3vL6ACLSEfxj+9FkdKnaq3clqLwaENM4T RhGeM+7EQB5veFEjrKMsAVmV8rpC9QsAAP//AwBQSwECLQAUAAYACAAAACEAtoM4kv4AAADhAQAA EwAAAAAAAAAAAAAAAAAAAAAAW0NvbnRlbnRfVHlwZXNdLnhtbFBLAQItABQABgAIAAAAIQA4/SH/ 1gAAAJQBAAALAAAAAAAAAAAAAAAAAC8BAABfcmVscy8ucmVsc1BLAQItABQABgAIAAAAIQDUXzPc EAIAAP4DAAAOAAAAAAAAAAAAAAAAAC4CAABkcnMvZTJvRG9jLnhtbFBLAQItABQABgAIAAAAIQCK rLHo3gAAAAoBAAAPAAAAAAAAAAAAAAAAAGoEAABkcnMvZG93bnJldi54bWxQSwUGAAAAAAQABADz AAAAdQUAAAAA " stroked="f">
                 <v:textbox>
                   <w:txbxContent>
                     <w:p>
@@ -905,15 +808,6 @@
             </w:pict>
           </mc:Fallback>
         </mc:AlternateContent>
-      </w:r>
-      <w:r>
-        <w:rPr>
-          <w:rFonts w:ascii="Tw Cen MT" w:hAnsi="Tw Cen MT"/>
-          <w:b/>
-          <w:noProof/>
-          <w:sz w:val="24"/>
-          <w:szCs w:val="24"/>
-        </w:rPr>
         <mc:AlternateContent>
           <mc:Choice Requires="wps">
             <w:drawing>
@@ -977,21 +871,12 @@
           </mc:Choice>
           <mc:Fallback>
             <w:pict>
-              <v:line w14:anchorId="4F51CAE3" id="Straight Connector 1248915895" o:spid="_x0000_s1026" style="position:absolute;flip:y;z-index:251682816;visibility:visible;mso-wrap-style:square;mso-width-percent:0;mso-height-percent:0;mso-wrap-distance-left:9pt;mso-wrap-distance-top:0;mso-wrap-distance-right:9pt;mso-wrap-distance-bottom:0;mso-position-horizontal:absolute;mso-position-horizontal-relative:text;mso-position-vertical:absolute;mso-position-vertical-relative:text;mso-width-percent:0;mso-height-percent:0;mso-width-relative:margin;mso-height-relative:margin" from="271.45pt,13.85pt" to="469.9pt,13.85pt" o:gfxdata="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" strokecolor="black [3213]" strokeweight="1.25pt">
+              <v:line w14:anchorId="4F51CAE3" id="Straight Connector 1248915895" o:spid="_x0000_s1026" style="position:absolute;flip:y;z-index:251682816;visibility:visible;mso-wrap-style:square;mso-width-percent:0;mso-height-percent:0;mso-wrap-distance-left:9pt;mso-wrap-distance-top:0;mso-wrap-distance-right:9pt;mso-wrap-distance-bottom:0;mso-position-horizontal:absolute;mso-position-horizontal-relative:text;mso-position-vertical:absolute;mso-position-vertical-relative:text;mso-width-percent:0;mso-height-percent:0;mso-width-relative:margin;mso-height-relative:margin" from="271.45pt,13.85pt" to="469.9pt,13.85pt" o:gfxdata="UEsDBBQABgAIAAAAIQC2gziS/gAAAOEBAAATAAAAW0NvbnRlbnRfVHlwZXNdLnhtbJSRQU7DMBBF 90jcwfIWJU67QAgl6YK0S0CoHGBkTxKLZGx5TGhvj5O2G0SRWNoz/78nu9wcxkFMGNg6quQqL6RA 0s5Y6ir5vt9lD1JwBDIwOMJKHpHlpr69KfdHjyxSmriSfYz+USnWPY7AufNIadK6MEJMx9ApD/oD OlTrorhX2lFEilmcO2RdNtjC5xDF9pCuTyYBB5bi6bQ4syoJ3g9WQ0ymaiLzg5KdCXlKLjvcW893 SUOqXwnz5DrgnHtJTxOsQfEKIT7DmDSUCaxw7Rqn8787ZsmRM9e2VmPeBN4uqYvTtW7jvijg9N/y JsXecLq0q+WD6m8AAAD//wMAUEsDBBQABgAIAAAAIQA4/SH/1gAAAJQBAAALAAAAX3JlbHMvLnJl bHOkkMFqwzAMhu+DvYPRfXGawxijTi+j0GvpHsDYimMaW0Yy2fr2M4PBMnrbUb/Q94l/f/hMi1qR JVI2sOt6UJgd+ZiDgffL8ekFlFSbvV0oo4EbChzGx4f9GRdb25HMsYhqlCwG5lrLq9biZkxWOiqY 22YiTra2kYMu1l1tQD30/bPm3wwYN0x18gb45AdQl1tp5j/sFB2T0FQ7R0nTNEV3j6o9feQzro1i OWA14Fm+Q8a1a8+Bvu/d/dMb2JY5uiPbhG/ktn4cqGU/er3pcvwCAAD//wMAUEsDBBQABgAIAAAA IQBY3n6zwwEAAOgDAAAOAAAAZHJzL2Uyb0RvYy54bWysU8Fu2zAMvRfYPwi6L3YCpCuMOD206C5D V2xr76pMxQIkUZC02Pn7UXLidOkuG3YRLIp8fO+R3tyO1rA9hKjRtXy5qDkDJ7HTbtfy5x8PH284 i0m4Thh00PIDRH67/XC1GXwDK+zRdBAYgbjYDL7lfUq+qaooe7AiLtCDo0eFwYpE17CruiAGQrem WtX1dTVg6HxACTFS9H565NuCrxTI9FWpCImZlhO3VM5Qztd8VtuNaHZB+F7LIw3xDyys0I6azlD3 Ign2M+h3UFbLgBFVWki0FSqlJRQNpGZZX6j53gsPRQuZE/1sU/x/sPJxf+eeAtkw+NhE/xSyilEF y5TR/oVmWnQRUzYW2w6zbTAmJim4WtMkanJXnt6qCSJD+RDTZ0DL8kfLjXZZkWjE/ktM1JZSTyk5 bBwbqOf65tO6pEU0unvQxuTHshVwZwLbC5pnGpd5foTwJotuxlHwLKd8pYOBCf8bKKY7oj0Ju8AU UoJLJ1zjKDuXKWIwF9YTs7yiZzK/Fx7zcymULfyb4rmidEaX5mKrHYY/dT9boab8kwOT7mzBK3aH MuhiDa1Tce64+nlf395L+fkH3f4CAAD//wMAUEsDBBQABgAIAAAAIQCr7FYB4AAAAAkBAAAPAAAA ZHJzL2Rvd25yZXYueG1sTI9NT8MwDIbvSPyHyEhcEEspHyOl6UQnGBIc0Abcs9ZrC41TNdna/nuM OMDR9qPXz5suRtuKA/a+caThYhaBQCpc2VCl4f3t8fwWhA+GStM6Qg0Telhkx0epSUo30BoPm1AJ DiGfGA11CF0ipS9qtMbPXIfEt53rrQk89pUsezNwuG1lHEU30pqG+ENtOlzWWHxt9lbD8PKcP0xP Z6vPPFfrj2mpdq9GaX16Mt7fgQg4hj8YfvRZHTJ22ro9lV60Gq6vYsWohng+B8GAulTcZfu7kFkq /zfIvgEAAP//AwBQSwECLQAUAAYACAAAACEAtoM4kv4AAADhAQAAEwAAAAAAAAAAAAAAAAAAAAAA W0NvbnRlbnRfVHlwZXNdLnhtbFBLAQItABQABgAIAAAAIQA4/SH/1gAAAJQBAAALAAAAAAAAAAAA AAAAAC8BAABfcmVscy8ucmVsc1BLAQItABQABgAIAAAAIQBY3n6zwwEAAOgDAAAOAAAAAAAAAAAA AAAAAC4CAABkcnMvZTJvRG9jLnhtbFBLAQItABQABgAIAAAAIQCr7FYB4AAAAAkBAAAPAAAAAAAA AAAAAAAAAB0EAABkcnMvZG93bnJldi54bWxQSwUGAAAAAAQABADzAAAAKgUAAAAA " strokecolor="black [3213]" strokeweight="1.25pt">
                 <v:stroke joinstyle="miter"/>
               </v:line>
             </w:pict>
           </mc:Fallback>
         </mc:AlternateContent>
-      </w:r>
-      <w:r>
-        <w:rPr>
-          <w:rFonts w:ascii="Tw Cen MT" w:hAnsi="Tw Cen MT"/>
-          <w:b/>
-          <w:noProof/>
-          <w:sz w:val="24"/>
-          <w:szCs w:val="24"/>
-        </w:rPr>
         <mc:AlternateContent>
           <mc:Choice Requires="wps">
             <w:drawing>
@@ -1055,21 +940,12 @@
           </mc:Choice>
           <mc:Fallback>
             <w:pict>
-              <v:line w14:anchorId="3D41430F" id="Straight Connector 4" o:spid="_x0000_s1026" style="position:absolute;flip:y;z-index:251676672;visibility:visible;mso-wrap-style:square;mso-width-percent:0;mso-height-percent:0;mso-wrap-distance-left:9pt;mso-wrap-distance-top:0;mso-wrap-distance-right:9pt;mso-wrap-distance-bottom:0;mso-position-horizontal:absolute;mso-position-horizontal-relative:text;mso-position-vertical:absolute;mso-position-vertical-relative:text;mso-width-percent:0;mso-height-percent:0;mso-width-relative:margin;mso-height-relative:margin" from=".45pt,14.8pt" to="235.75pt,14.8pt" o:gfxdata="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" strokecolor="black [3213]" strokeweight="1.25pt">
+              <v:line w14:anchorId="3D41430F" id="Straight Connector 4" o:spid="_x0000_s1026" style="position:absolute;flip:y;z-index:251676672;visibility:visible;mso-wrap-style:square;mso-width-percent:0;mso-height-percent:0;mso-wrap-distance-left:9pt;mso-wrap-distance-top:0;mso-wrap-distance-right:9pt;mso-wrap-distance-bottom:0;mso-position-horizontal:absolute;mso-position-horizontal-relative:text;mso-position-vertical:absolute;mso-position-vertical-relative:text;mso-width-percent:0;mso-height-percent:0;mso-width-relative:margin;mso-height-relative:margin" from=".45pt,14.8pt" to="235.75pt,14.8pt" o:gfxdata="UEsDBBQABgAIAAAAIQC2gziS/gAAAOEBAAATAAAAW0NvbnRlbnRfVHlwZXNdLnhtbJSRQU7DMBBF 90jcwfIWJU67QAgl6YK0S0CoHGBkTxKLZGx5TGhvj5O2G0SRWNoz/78nu9wcxkFMGNg6quQqL6RA 0s5Y6ir5vt9lD1JwBDIwOMJKHpHlpr69KfdHjyxSmriSfYz+USnWPY7AufNIadK6MEJMx9ApD/oD OlTrorhX2lFEilmcO2RdNtjC5xDF9pCuTyYBB5bi6bQ4syoJ3g9WQ0ymaiLzg5KdCXlKLjvcW893 SUOqXwnz5DrgnHtJTxOsQfEKIT7DmDSUCaxw7Rqn8787ZsmRM9e2VmPeBN4uqYvTtW7jvijg9N/y JsXecLq0q+WD6m8AAAD//wMAUEsDBBQABgAIAAAAIQA4/SH/1gAAAJQBAAALAAAAX3JlbHMvLnJl bHOkkMFqwzAMhu+DvYPRfXGawxijTi+j0GvpHsDYimMaW0Yy2fr2M4PBMnrbUb/Q94l/f/hMi1qR JVI2sOt6UJgd+ZiDgffL8ekFlFSbvV0oo4EbChzGx4f9GRdb25HMsYhqlCwG5lrLq9biZkxWOiqY 22YiTra2kYMu1l1tQD30/bPm3wwYN0x18gb45AdQl1tp5j/sFB2T0FQ7R0nTNEV3j6o9feQzro1i OWA14Fm+Q8a1a8+Bvu/d/dMb2JY5uiPbhG/ktn4cqGU/er3pcvwCAAD//wMAUEsDBBQABgAIAAAA IQBf39lCxAEAAOgDAAAOAAAAZHJzL2Uyb0RvYy54bWysU8Fu2zAMvQ/YPwi6L3YCdMuMOD20aC/D Vmxr76pMxQIkUZDU2Pn7UXLitN0uK3oRLJLvke+J3lyO1rA9hKjRtXy5qDkDJ7HTbtfy+983n9ac xSRcJww6aPkBIr/cfvywGXwDK+zRdBAYkbjYDL7lfUq+qaooe7AiLtCDo6TCYEWia9hVXRADsVtT rer6czVg6HxACTFS9HpK8m3hVwpk+qFUhMRMy2m2VM5Qzsd8VtuNaHZB+F7L4xjiDVNYoR01namu RRLsKei/qKyWASOqtJBoK1RKSygaSM2yfqXmVy88FC1kTvSzTfH9aOX3/ZW7C2TD4GMT/V3IKkYV LFNG+wd606KLJmVjse0w2wZjYpKCq6/rdV2Tu/KUqyaKTOVDTLeAluWPlhvtsiLRiP23mKgtlZ5K ctg4NlDPi/WXi1IW0ejuRhuTk2Ur4MoEthf0nmlc5vcjhmdVdDOOgmc55SsdDEz8P0Ex3dHYk7BX nEJKcOnEaxxVZ5iiCWZgPU2WV/Q8zEvgsT5DoWzh/4BnROmMLs1gqx2Gf3U/W6Gm+pMDk+5swSN2 h/LQxRpap+LccfXzvj6/F/j5B93+AQAA//8DAFBLAwQUAAYACAAAACEAvMNhFd0AAAAGAQAADwAA AGRycy9kb3ducmV2LnhtbEyOzU7DMBCE70i8g7VIXFDrtIKWhDgVqYBKcEAtcN/G2yQQr6PYbZK3 x4gDHOdHM1+6GkwjTtS52rKC2TQCQVxYXXOp4P3tcXILwnlkjY1lUjCSg1V2fpZiom3PWzrtfCnC CLsEFVTet4mUrqjIoJvaljhkB9sZ9EF2pdQd9mHcNHIeRQtpsObwUGFL64qKr93RKOhfnvOHcXP1 9Jnn8fZjXMeHV4yVurwY7u9AeBr8Xxl+8AM6ZIFpb4+snWgUxKGnYB4vQIT0ejm7AbH/NWSWyv/4 2TcAAAD//wMAUEsBAi0AFAAGAAgAAAAhALaDOJL+AAAA4QEAABMAAAAAAAAAAAAAAAAAAAAAAFtD b250ZW50X1R5cGVzXS54bWxQSwECLQAUAAYACAAAACEAOP0h/9YAAACUAQAACwAAAAAAAAAAAAAA AAAvAQAAX3JlbHMvLnJlbHNQSwECLQAUAAYACAAAACEAX9/ZQsQBAADoAwAADgAAAAAAAAAAAAAA AAAuAgAAZHJzL2Uyb0RvYy54bWxQSwECLQAUAAYACAAAACEAvMNhFd0AAAAGAQAADwAAAAAAAAAA AAAAAAAeBAAAZHJzL2Rvd25yZXYueG1sUEsFBgAAAAAEAAQA8wAAACgFAAAAAA== " strokecolor="black [3213]" strokeweight="1.25pt">
                 <v:stroke joinstyle="miter"/>
               </v:line>
             </w:pict>
           </mc:Fallback>
         </mc:AlternateContent>
-      </w:r>
-      <w:r>
-        <w:rPr>
-          <w:rFonts w:ascii="Tw Cen MT" w:hAnsi="Tw Cen MT"/>
-          <w:b/>
-          <w:noProof/>
-          <w:sz w:val="24"/>
-          <w:szCs w:val="24"/>
-        </w:rPr>
         <w:t>Software</w:t>
       </w:r>
       <w:r>
@@ -1079,24 +955,7 @@
           <w:sz w:val="24"/>
           <w:szCs w:val="24"/>
         </w:rPr>
-        <w:t xml:space="preserve"> Engineer</w:t>
-      </w:r>
-      <w:r>
-        <w:rPr>
-          <w:rFonts w:ascii="Tw Cen MT" w:hAnsi="Tw Cen MT"/>
-          <w:b/>
-          <w:sz w:val="24"/>
-          <w:szCs w:val="24"/>
-        </w:rPr>
-        <w:t>:</w:t>
-      </w:r>
-      <w:r>
-        <w:rPr>
-          <w:rFonts w:ascii="Tw Cen MT" w:hAnsi="Tw Cen MT"/>
-          <w:b/>
-          <w:sz w:val="24"/>
-          <w:szCs w:val="24"/>
-        </w:rPr>
+        <w:t xml:space="preserve"> Engineer:</w:t>
         <w:tab/>
       </w:r>
     </w:p>
@@ -1110,85 +969,7 @@
         <w:rPr>
           <w:rFonts w:ascii="Tw Cen MT" w:hAnsi="Tw Cen MT"/>
         </w:rPr>
-        <w:t>Software Engineer with</w:t>
-      </w:r>
-      <w:r>
-        <w:rPr>
-          <w:rFonts w:ascii="Tw Cen MT" w:hAnsi="Tw Cen MT"/>
-        </w:rPr>
-        <w:t xml:space="preserve"> </w:t>
-      </w:r>
-      <w:r>
-        <w:rPr>
-          <w:rFonts w:ascii="Tw Cen MT" w:hAnsi="Tw Cen MT"/>
-        </w:rPr>
-        <w:t xml:space="preserve">Python and Rust expertise, </w:t>
-      </w:r>
-      <w:r>
-        <w:rPr>
-          <w:rFonts w:ascii="Tw Cen MT" w:hAnsi="Tw Cen MT"/>
-        </w:rPr>
-        <w:t xml:space="preserve">and </w:t>
-      </w:r>
-      <w:r>
-        <w:rPr>
-          <w:rFonts w:ascii="Tw Cen MT" w:hAnsi="Tw Cen MT"/>
-        </w:rPr>
-        <w:t>experience</w:t>
-      </w:r>
-      <w:r>
-        <w:rPr>
-          <w:rFonts w:ascii="Tw Cen MT" w:hAnsi="Tw Cen MT"/>
-        </w:rPr>
-        <w:t xml:space="preserve"> </w:t>
-      </w:r>
-      <w:r>
-        <w:rPr>
-          <w:rFonts w:ascii="Tw Cen MT" w:hAnsi="Tw Cen MT"/>
-        </w:rPr>
-        <w:t xml:space="preserve">in developing robust applications on </w:t>
-      </w:r>
-      <w:r>
-        <w:rPr>
-          <w:rFonts w:ascii="Tw Cen MT" w:hAnsi="Tw Cen MT"/>
-        </w:rPr>
-        <w:t>the cloud</w:t>
-      </w:r>
-      <w:r>
-        <w:rPr>
-          <w:rFonts w:ascii="Tw Cen MT" w:hAnsi="Tw Cen MT"/>
-        </w:rPr>
-        <w:t xml:space="preserve"> using Kubernetes. </w:t>
-      </w:r>
-      <w:r>
-        <w:rPr>
-          <w:rFonts w:ascii="Tw Cen MT" w:hAnsi="Tw Cen MT"/>
-        </w:rPr>
-        <w:t>Proficient in Machine Learning technology and capable of owning and creating systems</w:t>
-      </w:r>
-      <w:r>
-        <w:rPr>
-          <w:rFonts w:ascii="Tw Cen MT" w:hAnsi="Tw Cen MT"/>
-        </w:rPr>
-        <w:t xml:space="preserve">. </w:t>
-      </w:r>
-      <w:r>
-        <w:rPr>
-          <w:rFonts w:ascii="Tw Cen MT" w:hAnsi="Tw Cen MT"/>
-        </w:rPr>
-        <w:t xml:space="preserve">Skilled in communication and presentation, and passionate </w:t>
-      </w:r>
-      <w:r>
-        <w:rPr>
-          <w:rFonts w:ascii="Tw Cen MT" w:hAnsi="Tw Cen MT"/>
-        </w:rPr>
-        <w:t>about technical problems</w:t>
-      </w:r>
-      <w:r>
-        <w:rPr>
-          <w:rFonts w:ascii="Tw Cen MT" w:hAnsi="Tw Cen MT"/>
-        </w:rPr>
-        <w:t>.</w:t>
+        <w:t>Software Engineer with Python and Rust expertise, and experience in developing robust applications on the cloud using Kubernetes. Proficient in Machine Learning technology and capable of owning and creating systems. Skilled in communication and presentation, and passionate about technical problems.</w:t>
       </w:r>
     </w:p>
     <w:p>
@@ -1268,7 +1049,7 @@
           </mc:Choice>
           <mc:Fallback>
             <w:pict>
-              <v:line w14:anchorId="0F830D1C" id="Straight Connector 3" o:spid="_x0000_s1026" style="position:absolute;flip:y;z-index:251674624;visibility:visible;mso-wrap-style:square;mso-height-percent:0;mso-wrap-distance-left:9pt;mso-wrap-distance-top:0;mso-wrap-distance-right:9pt;mso-wrap-distance-bottom:0;mso-position-horizontal:absolute;mso-position-horizontal-relative:text;mso-position-vertical:absolute;mso-position-vertical-relative:text;mso-height-percent:0;mso-height-relative:margin" from=".1pt,14.95pt" to="473.1pt,14.95pt" o:gfxdata="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" strokecolor="black [3213]" strokeweight="1.25pt">
+              <v:line w14:anchorId="0F830D1C" id="Straight Connector 3" o:spid="_x0000_s1026" style="position:absolute;flip:y;z-index:251674624;visibility:visible;mso-wrap-style:square;mso-height-percent:0;mso-wrap-distance-left:9pt;mso-wrap-distance-top:0;mso-wrap-distance-right:9pt;mso-wrap-distance-bottom:0;mso-position-horizontal:absolute;mso-position-horizontal-relative:text;mso-position-vertical:absolute;mso-position-vertical-relative:text;mso-height-percent:0;mso-height-relative:margin" from=".1pt,14.95pt" to="473.1pt,14.95pt" o:gfxdata="UEsDBBQABgAIAAAAIQC2gziS/gAAAOEBAAATAAAAW0NvbnRlbnRfVHlwZXNdLnhtbJSRQU7DMBBF 90jcwfIWJU67QAgl6YK0S0CoHGBkTxKLZGx5TGhvj5O2G0SRWNoz/78nu9wcxkFMGNg6quQqL6RA 0s5Y6ir5vt9lD1JwBDIwOMJKHpHlpr69KfdHjyxSmriSfYz+USnWPY7AufNIadK6MEJMx9ApD/oD OlTrorhX2lFEilmcO2RdNtjC5xDF9pCuTyYBB5bi6bQ4syoJ3g9WQ0ymaiLzg5KdCXlKLjvcW893 SUOqXwnz5DrgnHtJTxOsQfEKIT7DmDSUCaxw7Rqn8787ZsmRM9e2VmPeBN4uqYvTtW7jvijg9N/y JsXecLq0q+WD6m8AAAD//wMAUEsDBBQABgAIAAAAIQA4/SH/1gAAAJQBAAALAAAAX3JlbHMvLnJl bHOkkMFqwzAMhu+DvYPRfXGawxijTi+j0GvpHsDYimMaW0Yy2fr2M4PBMnrbUb/Q94l/f/hMi1qR JVI2sOt6UJgd+ZiDgffL8ekFlFSbvV0oo4EbChzGx4f9GRdb25HMsYhqlCwG5lrLq9biZkxWOiqY 22YiTra2kYMu1l1tQD30/bPm3wwYN0x18gb45AdQl1tp5j/sFB2T0FQ7R0nTNEV3j6o9feQzro1i OWA14Fm+Q8a1a8+Bvu/d/dMb2JY5uiPbhG/ktn4cqGU/er3pcvwCAAD//wMAUEsDBBQABgAIAAAA IQCmibeLxAEAAOgDAAAOAAAAZHJzL2Uyb0RvYy54bWysU01v2zAMvRfofxB0b+wU6AeMOD20aC/D Vmzr7qpMxQIkUZC02Pn3o+TESbtdVvQiWCTfI98TvbobrWFbCFGja/lyUXMGTmKn3ablLz8fL245 i0m4Thh00PIdRH63Pj9bDb6BS+zRdBAYkbjYDL7lfUq+qaooe7AiLtCDo6TCYEWia9hUXRADsVtT Xdb1dTVg6HxACTFS9GFK8nXhVwpk+qZUhMRMy2m2VM5Qztd8VuuVaDZB+F7L/RjiA1NYoR01nake RBLsd9B/UVktA0ZUaSHRVqiUllA0kJpl/U7Nj154KFrInOhnm+Ln0cqv23v3HMiGwccm+ueQVYwq WKaM9r/oTYsumpSNxbbdbBuMiUkKXtf1zbImd+UhV00UmcqHmJ4ALcsfLTfaZUWiEdsvMVFbKj2U 5LBxbKCeV7c3V6UsotHdozYmJ8tWwL0JbCvoPdO4zO9HDCdVdDOOgkc55SvtDEz830Ex3dHYk7B3 nEJKcOnAaxxVZ5iiCWZgPU2WV/Q4zFvgvj5DoWzh/4BnROmMLs1gqx2Gf3U/WqGm+oMDk+5swSt2 u/LQxRpap+LcfvXzvp7eC/z4g67/AAAA//8DAFBLAwQUAAYACAAAACEAUuXnCNsAAAAGAQAADwAA AGRycy9kb3ducmV2LnhtbEyOTUvDQBCG74L/YRnBi9iNRYobsymm+AF6kNb2Ps1Ok2h2N2S3TfLv HfGgl4H3g3eebDnaVpyoD413Gm5mCQhypTeNqzRsP56u70CEiM5g6x1pmCjAMj8/yzA1fnBrOm1i JXjEhRQ11DF2qZShrMlimPmOHGcH31uMLPtKmh4HHretnCfJQlpsHH+osaNVTeXX5mg1DG+vxeP0 cvX8WRRqvZtW6vCOSuvLi/HhHkSkMf6V4Qef0SFnpr0/OhNEq2HOPb5KgeBU3S7Y2P8aMs/kf/z8 GwAA//8DAFBLAQItABQABgAIAAAAIQC2gziS/gAAAOEBAAATAAAAAAAAAAAAAAAAAAAAAABbQ29u dGVudF9UeXBlc10ueG1sUEsBAi0AFAAGAAgAAAAhADj9If/WAAAAlAEAAAsAAAAAAAAAAAAAAAAA LwEAAF9yZWxzLy5yZWxzUEsBAi0AFAAGAAgAAAAhAKaJt4vEAQAA6AMAAA4AAAAAAAAAAAAAAAAA LgIAAGRycy9lMm9Eb2MueG1sUEsBAi0AFAAGAAgAAAAhAFLl5wjbAAAABgEAAA8AAAAAAAAAAAAA AAAAHgQAAGRycy9kb3ducmV2LnhtbFBLBQYAAAAABAAEAPMAAAAmBQAAAAA= " strokecolor="black [3213]" strokeweight="1.25pt">
                 <v:stroke joinstyle="miter"/>
               </v:line>
             </w:pict>
@@ -1339,67 +1120,7 @@
         <w:rPr>
           <w:rFonts w:ascii="Tw Cen MT" w:hAnsi="Tw Cen MT"/>
         </w:rPr>
-        <w:t>D</w:t>
-      </w:r>
-      <w:r>
-        <w:rPr>
-          <w:rFonts w:ascii="Tw Cen MT" w:hAnsi="Tw Cen MT"/>
-        </w:rPr>
-        <w:t>eploy</w:t>
-      </w:r>
-      <w:r>
-        <w:rPr>
-          <w:rFonts w:ascii="Tw Cen MT" w:hAnsi="Tw Cen MT"/>
-        </w:rPr>
-        <w:t>ed</w:t>
-      </w:r>
-      <w:r>
-        <w:rPr>
-          <w:rFonts w:ascii="Tw Cen MT" w:hAnsi="Tw Cen MT"/>
-        </w:rPr>
-        <w:t xml:space="preserve"> a voicemail solution</w:t>
-      </w:r>
-      <w:r>
-        <w:rPr>
-          <w:rFonts w:ascii="Tw Cen MT" w:hAnsi="Tw Cen MT"/>
-        </w:rPr>
-        <w:t xml:space="preserve"> on Azure</w:t>
-      </w:r>
-      <w:r>
-        <w:rPr>
-          <w:rFonts w:ascii="Tw Cen MT" w:hAnsi="Tw Cen MT"/>
-        </w:rPr>
-        <w:t xml:space="preserve"> for a large telco</w:t>
-      </w:r>
-      <w:r>
-        <w:rPr>
-          <w:rFonts w:ascii="Tw Cen MT" w:hAnsi="Tw Cen MT"/>
-        </w:rPr>
-        <w:t xml:space="preserve"> u</w:t>
-      </w:r>
-      <w:r>
-        <w:rPr>
-          <w:rFonts w:ascii="Tw Cen MT" w:hAnsi="Tw Cen MT"/>
-        </w:rPr>
-        <w:t>s</w:t>
-      </w:r>
-      <w:r>
-        <w:rPr>
-          <w:rFonts w:ascii="Tw Cen MT" w:hAnsi="Tw Cen MT"/>
-        </w:rPr>
-        <w:t xml:space="preserve">ing </w:t>
-      </w:r>
-      <w:r>
-        <w:rPr>
-          <w:rFonts w:ascii="Tw Cen MT" w:hAnsi="Tw Cen MT"/>
-        </w:rPr>
-        <w:t xml:space="preserve">Kubernetes </w:t>
-      </w:r>
-      <w:r>
-        <w:rPr>
-          <w:rFonts w:ascii="Tw Cen MT" w:hAnsi="Tw Cen MT"/>
-        </w:rPr>
-        <w:t>clusters.</w:t>
+        <w:t>Deployed a voicemail solution on Azure for a large telco using Kubernetes clusters.</w:t>
       </w:r>
     </w:p>
     <w:p>
@@ -1417,31 +1138,7 @@
         <w:rPr>
           <w:rFonts w:ascii="Tw Cen MT" w:hAnsi="Tw Cen MT"/>
         </w:rPr>
-        <w:t xml:space="preserve">Wrote and owned an </w:t>
-      </w:r>
-      <w:r>
-        <w:rPr>
-          <w:rFonts w:ascii="Tw Cen MT" w:hAnsi="Tw Cen MT"/>
-        </w:rPr>
-        <w:t xml:space="preserve">automation </w:t>
-      </w:r>
-      <w:r>
-        <w:rPr>
-          <w:rFonts w:ascii="Tw Cen MT" w:hAnsi="Tw Cen MT"/>
-        </w:rPr>
-        <w:t xml:space="preserve">bot </w:t>
-      </w:r>
-      <w:r>
-        <w:rPr>
-          <w:rFonts w:ascii="Tw Cen MT" w:hAnsi="Tw Cen MT"/>
-        </w:rPr>
-        <w:t>to manage and fix CVEs</w:t>
-      </w:r>
-      <w:r>
-        <w:rPr>
-          <w:rFonts w:ascii="Tw Cen MT" w:hAnsi="Tw Cen MT"/>
-        </w:rPr>
-        <w:t xml:space="preserve"> using Python.</w:t>
+        <w:t>Wrote and owned an automation bot to manage and fix CVEs using Python.</w:t>
       </w:r>
     </w:p>
     <w:p>
@@ -1460,13 +1157,7 @@
         <w:rPr>
           <w:rFonts w:ascii="Tw Cen MT" w:hAnsi="Tw Cen MT"/>
         </w:rPr>
-        <w:t>Scrum master for a team of 10</w:t>
-      </w:r>
-      <w:r>
-        <w:rPr>
-          <w:rFonts w:ascii="Tw Cen MT" w:hAnsi="Tw Cen MT"/>
-        </w:rPr>
-        <w:t>, achieving more efficient impact driven meetings.</w:t>
+        <w:t>Scrum master for a team of 10, achieving more efficient impact driven meetings.</w:t>
       </w:r>
     </w:p>
     <w:p>
@@ -1485,19 +1176,7 @@
         <w:rPr>
           <w:rFonts w:ascii="Tw Cen MT" w:hAnsi="Tw Cen MT"/>
         </w:rPr>
-        <w:t xml:space="preserve">Worked with Java and </w:t>
-      </w:r>
-      <w:r>
-        <w:rPr>
-          <w:rFonts w:ascii="Tw Cen MT" w:hAnsi="Tw Cen MT"/>
-        </w:rPr>
-        <w:t>Type</w:t>
-      </w:r>
-      <w:r>
-        <w:rPr>
-          <w:rFonts w:ascii="Tw Cen MT" w:hAnsi="Tw Cen MT"/>
-        </w:rPr>
-        <w:t>Script to maintain a workplace messaging app.</w:t>
+        <w:t>Worked with Java and TypeScript to maintain a workplace messaging app.</w:t>
       </w:r>
     </w:p>
     <w:p>
@@ -1516,25 +1195,7 @@
         <w:rPr>
           <w:rFonts w:ascii="Tw Cen MT" w:hAnsi="Tw Cen MT"/>
         </w:rPr>
-        <w:t>Gave</w:t>
-      </w:r>
-      <w:r>
-        <w:rPr>
-          <w:rFonts w:ascii="Tw Cen MT" w:hAnsi="Tw Cen MT"/>
-        </w:rPr>
-        <w:t xml:space="preserve"> demos to 100+ people</w:t>
-      </w:r>
-      <w:r>
-        <w:rPr>
-          <w:rFonts w:ascii="Tw Cen MT" w:hAnsi="Tw Cen MT"/>
-        </w:rPr>
-        <w:t xml:space="preserve"> on the uses and capabilities of GitHub Copilot</w:t>
-      </w:r>
-      <w:r>
-        <w:rPr>
-          <w:rFonts w:ascii="Tw Cen MT" w:hAnsi="Tw Cen MT"/>
-        </w:rPr>
-        <w:t>.</w:t>
+        <w:t>Gave demos to 100+ people on the uses and capabilities of GitHub Copilot.</w:t>
       </w:r>
     </w:p>
     <w:p>
@@ -1620,31 +1281,7 @@
         <w:rPr>
           <w:rFonts w:ascii="Tw Cen MT" w:hAnsi="Tw Cen MT"/>
         </w:rPr>
-        <w:t xml:space="preserve"> (2023-Present) classifying shark and ray eggs</w:t>
-      </w:r>
-      <w:r>
-        <w:rPr>
-          <w:rFonts w:ascii="Tw Cen MT" w:hAnsi="Tw Cen MT"/>
-        </w:rPr>
-        <w:t xml:space="preserve"> </w:t>
-      </w:r>
-      <w:r>
-        <w:rPr>
-          <w:rFonts w:ascii="Tw Cen MT" w:hAnsi="Tw Cen MT"/>
-        </w:rPr>
-        <w:t>by species</w:t>
-      </w:r>
-      <w:r>
-        <w:rPr>
-          <w:rFonts w:ascii="Tw Cen MT" w:hAnsi="Tw Cen MT"/>
-        </w:rPr>
-        <w:t xml:space="preserve"> using TensorFlow</w:t>
-      </w:r>
-      <w:r>
-        <w:rPr>
-          <w:rFonts w:ascii="Tw Cen MT" w:hAnsi="Tw Cen MT"/>
-        </w:rPr>
-        <w:t>.</w:t>
+        <w:t xml:space="preserve"> (2023-Present) classifying shark and ray eggs by species using TensorFlow.</w:t>
       </w:r>
     </w:p>
     <w:p>
@@ -1663,49 +1300,7 @@
         <w:rPr>
           <w:rFonts w:ascii="Tw Cen MT" w:hAnsi="Tw Cen MT"/>
         </w:rPr>
-        <w:t>Machine Learning Engineer, Cambridge (2022), w</w:t>
-      </w:r>
-      <w:r>
-        <w:rPr>
-          <w:rFonts w:ascii="Tw Cen MT" w:hAnsi="Tw Cen MT"/>
-        </w:rPr>
-        <w:t xml:space="preserve">orked on a </w:t>
-      </w:r>
-      <w:r>
-        <w:rPr>
-          <w:rFonts w:ascii="Tw Cen MT" w:hAnsi="Tw Cen MT"/>
-        </w:rPr>
-        <w:t>m</w:t>
-      </w:r>
-      <w:r>
-        <w:rPr>
-          <w:rFonts w:ascii="Tw Cen MT" w:hAnsi="Tw Cen MT"/>
-        </w:rPr>
-        <w:t xml:space="preserve">achine </w:t>
-      </w:r>
-      <w:r>
-        <w:rPr>
-          <w:rFonts w:ascii="Tw Cen MT" w:hAnsi="Tw Cen MT"/>
-        </w:rPr>
-        <w:t>l</w:t>
-      </w:r>
-      <w:r>
-        <w:rPr>
-          <w:rFonts w:ascii="Tw Cen MT" w:hAnsi="Tw Cen MT"/>
-        </w:rPr>
-        <w:t xml:space="preserve">earning </w:t>
-      </w:r>
-      <w:r>
-        <w:rPr>
-          <w:rFonts w:ascii="Tw Cen MT" w:hAnsi="Tw Cen MT"/>
-        </w:rPr>
-        <w:t>e</w:t>
-      </w:r>
-      <w:r>
-        <w:rPr>
-          <w:rFonts w:ascii="Tw Cen MT" w:hAnsi="Tw Cen MT"/>
-        </w:rPr>
-        <w:t>cology project using Detectron2 to predict the location of tree crowns to improve estimates of carbon store in forests and other locations. Resulted in a scientific paper published in a variety of journals.</w:t>
+        <w:t>Machine Learning Engineer, Cambridge (2022), worked on a machine learning ecology project using Detectron2 to predict the location of tree crowns to improve estimates of carbon store in forests and other locations. Resulted in a scientific paper published in a variety of journals.</w:t>
       </w:r>
     </w:p>
     <w:p>
@@ -1724,31 +1319,7 @@
         <w:rPr>
           <w:rFonts w:ascii="Tw Cen MT" w:hAnsi="Tw Cen MT"/>
         </w:rPr>
-        <w:t>Software Engineer</w:t>
-      </w:r>
-      <w:r>
-        <w:rPr>
-          <w:rFonts w:ascii="Tw Cen MT" w:hAnsi="Tw Cen MT"/>
-        </w:rPr>
-        <w:t>,</w:t>
-      </w:r>
-      <w:r>
-        <w:rPr>
-          <w:rFonts w:ascii="Tw Cen MT" w:hAnsi="Tw Cen MT"/>
-        </w:rPr>
-        <w:t xml:space="preserve"> Microsoft, 8-week virtual internship (2021)</w:t>
-      </w:r>
-      <w:r>
-        <w:rPr>
-          <w:rFonts w:ascii="Tw Cen MT" w:hAnsi="Tw Cen MT"/>
-        </w:rPr>
-        <w:t>, wrote</w:t>
-      </w:r>
-      <w:r>
-        <w:rPr>
-          <w:rFonts w:ascii="Tw Cen MT" w:hAnsi="Tw Cen MT"/>
-        </w:rPr>
-        <w:t xml:space="preserve"> Python to improve the automation of VM deployment and management for products in the telecoms sector.</w:t>
+        <w:t>Software Engineer, Microsoft, 8-week virtual internship (2021), wrote Python to improve the automation of VM deployment and management for products in the telecoms sector.</w:t>
       </w:r>
     </w:p>
     <w:p>
@@ -1828,7 +1399,7 @@
           </mc:Choice>
           <mc:Fallback>
             <w:pict>
-              <v:line w14:anchorId="0E49B6CC" id="Straight Connector 6" o:spid="_x0000_s1026" style="position:absolute;flip:y;z-index:251668480;visibility:visible;mso-wrap-style:square;mso-height-percent:0;mso-wrap-distance-left:9pt;mso-wrap-distance-top:0;mso-wrap-distance-right:9pt;mso-wrap-distance-bottom:0;mso-position-horizontal:absolute;mso-position-horizontal-relative:text;mso-position-vertical:absolute;mso-position-vertical-relative:text;mso-height-percent:0;mso-height-relative:margin" from=".1pt,14.1pt" to="473.1pt,14.1pt" o:gfxdata="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" strokecolor="black [3213]" strokeweight="1.25pt">
+              <v:line w14:anchorId="0E49B6CC" id="Straight Connector 6" o:spid="_x0000_s1026" style="position:absolute;flip:y;z-index:251668480;visibility:visible;mso-wrap-style:square;mso-height-percent:0;mso-wrap-distance-left:9pt;mso-wrap-distance-top:0;mso-wrap-distance-right:9pt;mso-wrap-distance-bottom:0;mso-position-horizontal:absolute;mso-position-horizontal-relative:text;mso-position-vertical:absolute;mso-position-vertical-relative:text;mso-height-percent:0;mso-height-relative:margin" from=".1pt,14.1pt" to="473.1pt,14.1pt" o:gfxdata="UEsDBBQABgAIAAAAIQC2gziS/gAAAOEBAAATAAAAW0NvbnRlbnRfVHlwZXNdLnhtbJSRQU7DMBBF 90jcwfIWJU67QAgl6YK0S0CoHGBkTxKLZGx5TGhvj5O2G0SRWNoz/78nu9wcxkFMGNg6quQqL6RA 0s5Y6ir5vt9lD1JwBDIwOMJKHpHlpr69KfdHjyxSmriSfYz+USnWPY7AufNIadK6MEJMx9ApD/oD OlTrorhX2lFEilmcO2RdNtjC5xDF9pCuTyYBB5bi6bQ4syoJ3g9WQ0ymaiLzg5KdCXlKLjvcW893 SUOqXwnz5DrgnHtJTxOsQfEKIT7DmDSUCaxw7Rqn8787ZsmRM9e2VmPeBN4uqYvTtW7jvijg9N/y JsXecLq0q+WD6m8AAAD//wMAUEsDBBQABgAIAAAAIQA4/SH/1gAAAJQBAAALAAAAX3JlbHMvLnJl bHOkkMFqwzAMhu+DvYPRfXGawxijTi+j0GvpHsDYimMaW0Yy2fr2M4PBMnrbUb/Q94l/f/hMi1qR JVI2sOt6UJgd+ZiDgffL8ekFlFSbvV0oo4EbChzGx4f9GRdb25HMsYhqlCwG5lrLq9biZkxWOiqY 22YiTra2kYMu1l1tQD30/bPm3wwYN0x18gb45AdQl1tp5j/sFB2T0FQ7R0nTNEV3j6o9feQzro1i OWA14Fm+Q8a1a8+Bvu/d/dMb2JY5uiPbhG/ktn4cqGU/er3pcvwCAAD//wMAUEsDBBQABgAIAAAA IQCmibeLxAEAAOgDAAAOAAAAZHJzL2Uyb0RvYy54bWysU01v2zAMvRfofxB0b+wU6AeMOD20aC/D Vmzr7qpMxQIkUZC02Pn3o+TESbtdVvQiWCTfI98TvbobrWFbCFGja/lyUXMGTmKn3ablLz8fL245 i0m4Thh00PIdRH63Pj9bDb6BS+zRdBAYkbjYDL7lfUq+qaooe7AiLtCDo6TCYEWia9hUXRADsVtT Xdb1dTVg6HxACTFS9GFK8nXhVwpk+qZUhMRMy2m2VM5Qztd8VuuVaDZB+F7L/RjiA1NYoR01nake RBLsd9B/UVktA0ZUaSHRVqiUllA0kJpl/U7Nj154KFrInOhnm+Ln0cqv23v3HMiGwccm+ueQVYwq WKaM9r/oTYsumpSNxbbdbBuMiUkKXtf1zbImd+UhV00UmcqHmJ4ALcsfLTfaZUWiEdsvMVFbKj2U 5LBxbKCeV7c3V6UsotHdozYmJ8tWwL0JbCvoPdO4zO9HDCdVdDOOgkc55SvtDEz830Ex3dHYk7B3 nEJKcOnAaxxVZ5iiCWZgPU2WV/Q4zFvgvj5DoWzh/4BnROmMLs1gqx2Gf3U/WqGm+oMDk+5swSt2 u/LQxRpap+LcfvXzvp7eC/z4g67/AAAA//8DAFBLAwQUAAYACAAAACEA95jHU9sAAAAGAQAADwAA AGRycy9kb3ducmV2LnhtbEyOTU+DQBCG7yb+h82YeDF2sTFNQZZGGj8SezCtep/CFFB2lrDbAv/e MR70Ml/vm3eedDXaVp2o941jAzezCBRx4cqGKwPvb4/XS1A+IJfYOiYDE3lYZednKSalG3hLp12o lISwT9BAHUKXaO2Lmiz6meuIRTu43mKQta902eMg4bbV8yhaaIsNy4caO1rXVHztjtbAsHnJH6bn q6fPPI+3H9M6PrxibMzlxXh/ByrQGP7M8IMv6JAJ094dufSqNTAXn9SldFHj24UM+9+DzlL9Hz/7 BgAA//8DAFBLAQItABQABgAIAAAAIQC2gziS/gAAAOEBAAATAAAAAAAAAAAAAAAAAAAAAABbQ29u dGVudF9UeXBlc10ueG1sUEsBAi0AFAAGAAgAAAAhADj9If/WAAAAlAEAAAsAAAAAAAAAAAAAAAAA LwEAAF9yZWxzLy5yZWxzUEsBAi0AFAAGAAgAAAAhAKaJt4vEAQAA6AMAAA4AAAAAAAAAAAAAAAAA LgIAAGRycy9lMm9Eb2MueG1sUEsBAi0AFAAGAAgAAAAhAPeYx1PbAAAABgEAAA8AAAAAAAAAAAAA AAAAHgQAAGRycy9kb3ducmV2LnhtbFBLBQYAAAAABAAEAPMAAAAmBQAAAAA= " strokecolor="black [3213]" strokeweight="1.25pt">
                 <v:stroke joinstyle="miter"/>
               </v:line>
             </w:pict>
@@ -1842,16 +1413,7 @@
           <w:sz w:val="24"/>
           <w:szCs w:val="24"/>
         </w:rPr>
-        <w:t>Qualifications</w:t>
-      </w:r>
-      <w:r>
-        <w:rPr>
-          <w:rFonts w:ascii="Tw Cen MT" w:hAnsi="Tw Cen MT"/>
-          <w:b/>
-          <w:sz w:val="24"/>
-          <w:szCs w:val="24"/>
-        </w:rPr>
-        <w:t>:</w:t>
+        <w:t>Qualifications:</w:t>
       </w:r>
     </w:p>
     <w:p>
@@ -1870,79 +1432,7 @@
         <w:rPr>
           <w:rFonts w:ascii="Tw Cen MT" w:hAnsi="Tw Cen MT"/>
         </w:rPr>
-        <w:t>MMath</w:t>
-      </w:r>
-      <w:r>
-        <w:rPr>
-          <w:rFonts w:ascii="Tw Cen MT" w:hAnsi="Tw Cen MT"/>
-        </w:rPr>
-        <w:t>, Mathematics</w:t>
-      </w:r>
-      <w:r>
-        <w:rPr>
-          <w:rFonts w:ascii="Tw Cen MT" w:hAnsi="Tw Cen MT"/>
-        </w:rPr>
-        <w:t xml:space="preserve"> </w:t>
-      </w:r>
-      <w:r>
-        <w:rPr>
-          <w:rFonts w:ascii="Tw Cen MT" w:hAnsi="Tw Cen MT"/>
-        </w:rPr>
-        <w:t>Master’s</w:t>
-      </w:r>
-      <w:r>
-        <w:rPr>
-          <w:rFonts w:ascii="Tw Cen MT" w:hAnsi="Tw Cen MT"/>
-        </w:rPr>
-        <w:t xml:space="preserve"> Degree</w:t>
-      </w:r>
-      <w:r>
-        <w:rPr>
-          <w:rFonts w:ascii="Tw Cen MT" w:hAnsi="Tw Cen MT"/>
-        </w:rPr>
-        <w:t>,</w:t>
-      </w:r>
-      <w:r>
-        <w:rPr>
-          <w:rFonts w:ascii="Tw Cen MT" w:hAnsi="Tw Cen MT"/>
-        </w:rPr>
-        <w:t xml:space="preserve"> University of</w:t>
-      </w:r>
-      <w:r>
-        <w:rPr>
-          <w:rFonts w:ascii="Tw Cen MT" w:hAnsi="Tw Cen MT"/>
-        </w:rPr>
-        <w:t xml:space="preserve"> Cambridge</w:t>
-      </w:r>
-      <w:r>
-        <w:rPr>
-          <w:rFonts w:ascii="Tw Cen MT" w:hAnsi="Tw Cen MT"/>
-        </w:rPr>
-        <w:t>, Jesus College</w:t>
-      </w:r>
-      <w:r>
-        <w:rPr>
-          <w:rFonts w:ascii="Tw Cen MT" w:hAnsi="Tw Cen MT"/>
-        </w:rPr>
-        <w:t xml:space="preserve"> (20</w:t>
-      </w:r>
-      <w:r>
-        <w:rPr>
-          <w:rFonts w:ascii="Tw Cen MT" w:hAnsi="Tw Cen MT"/>
-        </w:rPr>
-        <w:t>21</w:t>
-      </w:r>
-      <w:r>
-        <w:rPr>
-          <w:rFonts w:ascii="Tw Cen MT" w:hAnsi="Tw Cen MT"/>
-        </w:rPr>
-        <w:t>-</w:t>
-      </w:r>
-      <w:r>
-        <w:rPr>
-          <w:rFonts w:ascii="Tw Cen MT" w:hAnsi="Tw Cen MT"/>
-        </w:rPr>
-        <w:t>22)</w:t>
+        <w:t>MMath, Mathematics Master’s Degree, University of Cambridge, Jesus College (2021-22)</w:t>
       </w:r>
     </w:p>
     <w:p>
@@ -1980,31 +1470,7 @@
         <w:rPr>
           <w:rFonts w:ascii="Tw Cen MT" w:hAnsi="Tw Cen MT"/>
         </w:rPr>
-        <w:t>BA</w:t>
-      </w:r>
-      <w:r>
-        <w:rPr>
-          <w:rFonts w:ascii="Tw Cen MT" w:hAnsi="Tw Cen MT"/>
-        </w:rPr>
-        <w:t>, Mathematics Degree, University of</w:t>
-      </w:r>
-      <w:r>
-        <w:rPr>
-          <w:rFonts w:ascii="Tw Cen MT" w:hAnsi="Tw Cen MT"/>
-        </w:rPr>
-        <w:t xml:space="preserve"> Cambridge</w:t>
-      </w:r>
-      <w:r>
-        <w:rPr>
-          <w:rFonts w:ascii="Tw Cen MT" w:hAnsi="Tw Cen MT"/>
-        </w:rPr>
-        <w:t>, Jesus College</w:t>
-      </w:r>
-      <w:r>
-        <w:rPr>
-          <w:rFonts w:ascii="Tw Cen MT" w:hAnsi="Tw Cen MT"/>
-        </w:rPr>
-        <w:t xml:space="preserve"> (2018-2021)</w:t>
+        <w:t>BA, Mathematics Degree, University of Cambridge, Jesus College (2018-2021)</w:t>
       </w:r>
     </w:p>
     <w:p>
@@ -2036,55 +1502,7 @@
         <w:rPr>
           <w:rFonts w:ascii="Tw Cen MT" w:hAnsi="Tw Cen MT"/>
         </w:rPr>
-        <w:t xml:space="preserve"> </w:t>
-      </w:r>
-      <w:r>
-        <w:rPr>
-          <w:rFonts w:ascii="Tw Cen MT" w:hAnsi="Tw Cen MT"/>
-        </w:rPr>
-        <w:t>C</w:t>
-      </w:r>
-      <w:r>
-        <w:rPr>
-          <w:rFonts w:ascii="Tw Cen MT" w:hAnsi="Tw Cen MT"/>
-        </w:rPr>
-        <w:t xml:space="preserve">lass in </w:t>
-      </w:r>
-      <w:r>
-        <w:rPr>
-          <w:rFonts w:ascii="Tw Cen MT" w:hAnsi="Tw Cen MT"/>
-        </w:rPr>
-        <w:t>third y</w:t>
-      </w:r>
-      <w:r>
-        <w:rPr>
-          <w:rFonts w:ascii="Tw Cen MT" w:hAnsi="Tw Cen MT"/>
-        </w:rPr>
-        <w:t xml:space="preserve">ear (position: </w:t>
-      </w:r>
-      <w:r>
-        <w:rPr>
-          <w:rFonts w:ascii="Tw Cen MT" w:hAnsi="Tw Cen MT"/>
-        </w:rPr>
-        <w:t>14/22</w:t>
-      </w:r>
-      <w:r>
-        <w:rPr>
-          <w:rFonts w:ascii="Tw Cen MT" w:hAnsi="Tw Cen MT"/>
-        </w:rPr>
-        <w:t>2</w:t>
-      </w:r>
-      <w:r>
-        <w:rPr>
-          <w:rFonts w:ascii="Tw Cen MT" w:hAnsi="Tw Cen MT"/>
-        </w:rPr>
-        <w:t>, percentage: 86%</w:t>
-      </w:r>
-      <w:r>
-        <w:rPr>
-          <w:rFonts w:ascii="Tw Cen MT" w:hAnsi="Tw Cen MT"/>
-        </w:rPr>
-        <w:t xml:space="preserve">) </w:t>
+        <w:t xml:space="preserve"> Class in third year (position: 14/222, percentage: 86%) </w:t>
       </w:r>
     </w:p>
     <w:p>
@@ -2103,49 +1521,7 @@
         <w:rPr>
           <w:rFonts w:ascii="Tw Cen MT" w:hAnsi="Tw Cen MT"/>
         </w:rPr>
-        <w:t xml:space="preserve">Jesus College Mathematics Award in </w:t>
-      </w:r>
-      <w:r>
-        <w:rPr>
-          <w:rFonts w:ascii="Tw Cen MT" w:hAnsi="Tw Cen MT"/>
-        </w:rPr>
-        <w:t>second y</w:t>
-      </w:r>
-      <w:r>
-        <w:rPr>
-          <w:rFonts w:ascii="Tw Cen MT" w:hAnsi="Tw Cen MT"/>
-        </w:rPr>
-        <w:t>ear</w:t>
-      </w:r>
-      <w:r>
-        <w:rPr>
-          <w:rFonts w:ascii="Tw Cen MT" w:hAnsi="Tw Cen MT"/>
-        </w:rPr>
-        <w:t xml:space="preserve"> (2019-20)</w:t>
-      </w:r>
-      <w:r>
-        <w:rPr>
-          <w:rFonts w:ascii="Tw Cen MT" w:hAnsi="Tw Cen MT"/>
-        </w:rPr>
-        <w:t xml:space="preserve"> </w:t>
-      </w:r>
-      <w:r>
-        <w:rPr>
-          <w:rFonts w:ascii="Tw Cen MT" w:hAnsi="Tw Cen MT"/>
-        </w:rPr>
-        <w:t>for</w:t>
-      </w:r>
-      <w:r>
-        <w:rPr>
-          <w:rFonts w:ascii="Tw Cen MT" w:hAnsi="Tw Cen MT"/>
-        </w:rPr>
-        <w:t xml:space="preserve"> </w:t>
-      </w:r>
-      <w:r>
-        <w:rPr>
-          <w:rFonts w:ascii="Tw Cen MT" w:hAnsi="Tw Cen MT"/>
-        </w:rPr>
-        <w:t>top performer</w:t>
+        <w:t>Jesus College Mathematics Award in second year (2019-20) for top performer</w:t>
       </w:r>
     </w:p>
     <w:p>
@@ -2265,7 +1641,7 @@
           </mc:Choice>
           <mc:Fallback>
             <w:pict>
-              <v:line w14:anchorId="416DB84C" id="Straight Connector 610557234" o:spid="_x0000_s1026" style="position:absolute;flip:y;z-index:251672576;visibility:visible;mso-wrap-style:square;mso-height-percent:0;mso-wrap-distance-left:9pt;mso-wrap-distance-top:0;mso-wrap-distance-right:9pt;mso-wrap-distance-bottom:0;mso-position-horizontal:left;mso-position-horizontal-relative:margin;mso-position-vertical:absolute;mso-position-vertical-relative:text;mso-height-percent:0;mso-height-relative:margin" from="0,14.7pt" to="473pt,14.7pt" o:gfxdata="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" strokecolor="black [3213]" strokeweight="1.25pt">
+              <v:line w14:anchorId="416DB84C" id="Straight Connector 610557234" o:spid="_x0000_s1026" style="position:absolute;flip:y;z-index:251672576;visibility:visible;mso-wrap-style:square;mso-height-percent:0;mso-wrap-distance-left:9pt;mso-wrap-distance-top:0;mso-wrap-distance-right:9pt;mso-wrap-distance-bottom:0;mso-position-horizontal:left;mso-position-horizontal-relative:margin;mso-position-vertical:absolute;mso-position-vertical-relative:text;mso-height-percent:0;mso-height-relative:margin" from="0,14.7pt" to="473pt,14.7pt" o:gfxdata="UEsDBBQABgAIAAAAIQC2gziS/gAAAOEBAAATAAAAW0NvbnRlbnRfVHlwZXNdLnhtbJSRQU7DMBBF 90jcwfIWJU67QAgl6YK0S0CoHGBkTxKLZGx5TGhvj5O2G0SRWNoz/78nu9wcxkFMGNg6quQqL6RA 0s5Y6ir5vt9lD1JwBDIwOMJKHpHlpr69KfdHjyxSmriSfYz+USnWPY7AufNIadK6MEJMx9ApD/oD OlTrorhX2lFEilmcO2RdNtjC5xDF9pCuTyYBB5bi6bQ4syoJ3g9WQ0ymaiLzg5KdCXlKLjvcW893 SUOqXwnz5DrgnHtJTxOsQfEKIT7DmDSUCaxw7Rqn8787ZsmRM9e2VmPeBN4uqYvTtW7jvijg9N/y JsXecLq0q+WD6m8AAAD//wMAUEsDBBQABgAIAAAAIQA4/SH/1gAAAJQBAAALAAAAX3JlbHMvLnJl bHOkkMFqwzAMhu+DvYPRfXGawxijTi+j0GvpHsDYimMaW0Yy2fr2M4PBMnrbUb/Q94l/f/hMi1qR JVI2sOt6UJgd+ZiDgffL8ekFlFSbvV0oo4EbChzGx4f9GRdb25HMsYhqlCwG5lrLq9biZkxWOiqY 22YiTra2kYMu1l1tQD30/bPm3wwYN0x18gb45AdQl1tp5j/sFB2T0FQ7R0nTNEV3j6o9feQzro1i OWA14Fm+Q8a1a8+Bvu/d/dMb2JY5uiPbhG/ktn4cqGU/er3pcvwCAAD//wMAUEsDBBQABgAIAAAA IQCmibeLxAEAAOgDAAAOAAAAZHJzL2Uyb0RvYy54bWysU01v2zAMvRfofxB0b+wU6AeMOD20aC/D Vmzr7qpMxQIkUZC02Pn3o+TESbtdVvQiWCTfI98TvbobrWFbCFGja/lyUXMGTmKn3ablLz8fL245 i0m4Thh00PIdRH63Pj9bDb6BS+zRdBAYkbjYDL7lfUq+qaooe7AiLtCDo6TCYEWia9hUXRADsVtT Xdb1dTVg6HxACTFS9GFK8nXhVwpk+qZUhMRMy2m2VM5Qztd8VuuVaDZB+F7L/RjiA1NYoR01nake RBLsd9B/UVktA0ZUaSHRVqiUllA0kJpl/U7Nj154KFrInOhnm+Ln0cqv23v3HMiGwccm+ueQVYwq WKaM9r/oTYsumpSNxbbdbBuMiUkKXtf1zbImd+UhV00UmcqHmJ4ALcsfLTfaZUWiEdsvMVFbKj2U 5LBxbKCeV7c3V6UsotHdozYmJ8tWwL0JbCvoPdO4zO9HDCdVdDOOgkc55SvtDEz830Ex3dHYk7B3 nEJKcOnAaxxVZ5iiCWZgPU2WV/Q4zFvgvj5DoWzh/4BnROmMLs1gqx2Gf3U/WqGm+oMDk+5swSt2 u/LQxRpap+LcfvXzvp7eC/z4g67/AAAA//8DAFBLAwQUAAYACAAAACEABw4Ea90AAAAGAQAADwAA AGRycy9kb3ducmV2LnhtbEyPzU7DMBCE70i8g7VIXBB1qKoKhzgVqfiR6AG1wN2Nt0kgXkex2yRv zyIOcJyZ1cy32Wp0rThhHxpPGm5mCQik0tuGKg3vb4/XtyBCNGRN6wk1TBhglZ+fZSa1fqAtnnax ElxCITUa6hi7VMpQ1uhMmPkOibOD752JLPtK2t4MXO5aOU+SpXSmIV6oTYfrGsuv3dFpGDYvxcP0 fPX0WRRq+zGt1eHVKK0vL8b7OxARx/h3DD/4jA45M+39kWwQrQZ+JGqYqwUITtViycb+15B5Jv/j 598AAAD//wMAUEsBAi0AFAAGAAgAAAAhALaDOJL+AAAA4QEAABMAAAAAAAAAAAAAAAAAAAAAAFtD b250ZW50X1R5cGVzXS54bWxQSwECLQAUAAYACAAAACEAOP0h/9YAAACUAQAACwAAAAAAAAAAAAAA AAAvAQAAX3JlbHMvLnJlbHNQSwECLQAUAAYACAAAACEApom3i8QBAADoAwAADgAAAAAAAAAAAAAA AAAuAgAAZHJzL2Uyb0RvYy54bWxQSwECLQAUAAYACAAAACEABw4Ea90AAAAGAQAADwAAAAAAAAAA AAAAAAAeBAAAZHJzL2Rvd25yZXYueG1sUEsFBgAAAAAEAAQA8wAAACgFAAAAAA== " strokecolor="black [3213]" strokeweight="1.25pt">
                 <v:stroke joinstyle="miter"/>
                 <w10:wrap anchorx="margin"/>
               </v:line>
@@ -2300,115 +1676,7 @@
         <w:rPr>
           <w:rFonts w:ascii="Tw Cen MT" w:hAnsi="Tw Cen MT"/>
         </w:rPr>
-        <w:t>Restaurant manager</w:t>
-      </w:r>
-      <w:r>
-        <w:rPr>
-          <w:rFonts w:ascii="Tw Cen MT" w:hAnsi="Tw Cen MT"/>
-        </w:rPr>
-        <w:t xml:space="preserve">, </w:t>
-      </w:r>
-      <w:r>
-        <w:rPr>
-          <w:rFonts w:ascii="Tw Cen MT" w:hAnsi="Tw Cen MT"/>
-        </w:rPr>
-        <w:t>Hotelplan</w:t>
-      </w:r>
-      <w:r>
-        <w:rPr>
-          <w:rFonts w:ascii="Tw Cen MT" w:hAnsi="Tw Cen MT"/>
-        </w:rPr>
-        <w:t xml:space="preserve">, </w:t>
-      </w:r>
-      <w:r>
-        <w:rPr>
-          <w:rFonts w:ascii="Tw Cen MT" w:hAnsi="Tw Cen MT"/>
-        </w:rPr>
-        <w:t>winter</w:t>
-      </w:r>
-      <w:r>
-        <w:rPr>
-          <w:rFonts w:ascii="Tw Cen MT" w:hAnsi="Tw Cen MT"/>
-        </w:rPr>
-        <w:t xml:space="preserve"> ski</w:t>
-      </w:r>
-      <w:r>
-        <w:rPr>
-          <w:rFonts w:ascii="Tw Cen MT" w:hAnsi="Tw Cen MT"/>
-        </w:rPr>
-        <w:t xml:space="preserve"> season</w:t>
-      </w:r>
-      <w:r>
-        <w:rPr>
-          <w:rFonts w:ascii="Tw Cen MT" w:hAnsi="Tw Cen MT"/>
-        </w:rPr>
-        <w:t xml:space="preserve"> </w:t>
-      </w:r>
-      <w:r>
-        <w:rPr>
-          <w:rFonts w:ascii="Tw Cen MT" w:hAnsi="Tw Cen MT"/>
-        </w:rPr>
-        <w:t>(2017-18)</w:t>
-      </w:r>
-      <w:r>
-        <w:rPr>
-          <w:rFonts w:ascii="Tw Cen MT" w:hAnsi="Tw Cen MT"/>
-        </w:rPr>
-        <w:t>,</w:t>
-      </w:r>
-      <w:r>
-        <w:rPr>
-          <w:rFonts w:ascii="Tw Cen MT" w:hAnsi="Tw Cen MT"/>
-        </w:rPr>
-        <w:t xml:space="preserve"> manag</w:t>
-      </w:r>
-      <w:r>
-        <w:rPr>
-          <w:rFonts w:ascii="Tw Cen MT" w:hAnsi="Tw Cen MT"/>
-        </w:rPr>
-        <w:t>ed</w:t>
-      </w:r>
-      <w:r>
-        <w:rPr>
-          <w:rFonts w:ascii="Tw Cen MT" w:hAnsi="Tw Cen MT"/>
-        </w:rPr>
-        <w:t xml:space="preserve"> 20 staff of varying ages.</w:t>
-      </w:r>
-      <w:r>
-        <w:rPr>
-          <w:rFonts w:ascii="Tw Cen MT" w:hAnsi="Tw Cen MT"/>
-        </w:rPr>
-        <w:t xml:space="preserve"> Achieved ‘Mountain Spirit Award’</w:t>
-      </w:r>
-      <w:r>
-        <w:rPr>
-          <w:rFonts w:ascii="Tw Cen MT" w:hAnsi="Tw Cen MT"/>
-        </w:rPr>
-        <w:t xml:space="preserve"> </w:t>
-      </w:r>
-      <w:r>
-        <w:rPr>
-          <w:rFonts w:ascii="Tw Cen MT" w:hAnsi="Tw Cen MT"/>
-        </w:rPr>
-        <w:t xml:space="preserve">out of </w:t>
-      </w:r>
-      <w:r>
-        <w:rPr>
-          <w:rFonts w:ascii="Tw Cen MT" w:hAnsi="Tw Cen MT"/>
-        </w:rPr>
-        <w:t>500 employees</w:t>
-      </w:r>
-      <w:r>
-        <w:rPr>
-          <w:rFonts w:ascii="Tw Cen MT" w:hAnsi="Tw Cen MT"/>
-        </w:rPr>
-        <w:t xml:space="preserve"> for performance</w:t>
-      </w:r>
-      <w:r>
-        <w:rPr>
-          <w:rFonts w:ascii="Tw Cen MT" w:hAnsi="Tw Cen MT"/>
-        </w:rPr>
-        <w:t xml:space="preserve">. </w:t>
+        <w:t xml:space="preserve">Restaurant manager, Hotelplan, winter ski season (2017-18), managed 20 staff of varying ages. Achieved ‘Mountain Spirit Award’ out of 500 employees for performance. </w:t>
       </w:r>
     </w:p>
     <w:p>
@@ -2426,37 +1694,7 @@
         <w:rPr>
           <w:rFonts w:ascii="Tw Cen MT" w:hAnsi="Tw Cen MT"/>
         </w:rPr>
-        <w:t xml:space="preserve">Private tutor </w:t>
-      </w:r>
-      <w:r>
-        <w:rPr>
-          <w:rFonts w:ascii="Tw Cen MT" w:hAnsi="Tw Cen MT"/>
-        </w:rPr>
-        <w:t xml:space="preserve">and </w:t>
-      </w:r>
-      <w:r>
-        <w:rPr>
-          <w:rFonts w:ascii="Tw Cen MT" w:hAnsi="Tw Cen MT"/>
-        </w:rPr>
-        <w:t>Explore Learning Colchester Tutor</w:t>
-      </w:r>
-      <w:r>
-        <w:rPr>
-          <w:rFonts w:ascii="Tw Cen MT" w:hAnsi="Tw Cen MT"/>
-        </w:rPr>
-        <w:t xml:space="preserve"> (2017)</w:t>
-      </w:r>
-      <w:r>
-        <w:rPr>
-          <w:rFonts w:ascii="Tw Cen MT" w:hAnsi="Tw Cen MT"/>
-        </w:rPr>
-        <w:t xml:space="preserve"> in Maths</w:t>
-      </w:r>
-      <w:r>
-        <w:rPr>
-          <w:rFonts w:ascii="Tw Cen MT" w:hAnsi="Tw Cen MT"/>
-        </w:rPr>
-        <w:t>.</w:t>
+        <w:t>Private tutor and Explore Learning Colchester Tutor (2017) in Maths.</w:t>
       </w:r>
     </w:p>
     <w:p>
@@ -2475,13 +1713,7 @@
         <w:rPr>
           <w:rFonts w:ascii="Tw Cen MT" w:hAnsi="Tw Cen MT"/>
         </w:rPr>
-        <w:t>Team Leader for</w:t>
-      </w:r>
-      <w:r>
-        <w:rPr>
-          <w:rFonts w:ascii="Tw Cen MT" w:hAnsi="Tw Cen MT"/>
-        </w:rPr>
-        <w:t xml:space="preserve"> </w:t>
+        <w:t xml:space="preserve">Team Leader for </w:t>
       </w:r>
       <w:hyperlink r:id="rId10" w:history="1">
         <w:r>
@@ -2505,67 +1737,7 @@
         <w:rPr>
           <w:rFonts w:ascii="Tw Cen MT" w:hAnsi="Tw Cen MT"/>
         </w:rPr>
-        <w:t xml:space="preserve">2016), </w:t>
-      </w:r>
-      <w:r>
-        <w:rPr>
-          <w:rFonts w:ascii="Tw Cen MT" w:hAnsi="Tw Cen MT"/>
-        </w:rPr>
-        <w:t xml:space="preserve">led the winning team for </w:t>
-      </w:r>
-      <w:r>
-        <w:rPr>
-          <w:rFonts w:ascii="Tw Cen MT" w:hAnsi="Tw Cen MT"/>
-        </w:rPr>
-        <w:t xml:space="preserve">an international competition held by CERN. </w:t>
-      </w:r>
-      <w:r>
-        <w:rPr>
-          <w:rFonts w:ascii="Tw Cen MT" w:hAnsi="Tw Cen MT"/>
-        </w:rPr>
-        <w:t xml:space="preserve">We </w:t>
-      </w:r>
-      <w:r>
-        <w:rPr>
-          <w:rFonts w:ascii="Tw Cen MT" w:hAnsi="Tw Cen MT"/>
-        </w:rPr>
-        <w:t>propos</w:t>
-      </w:r>
-      <w:r>
-        <w:rPr>
-          <w:rFonts w:ascii="Tw Cen MT" w:hAnsi="Tw Cen MT"/>
-        </w:rPr>
-        <w:t>ed</w:t>
-      </w:r>
-      <w:r>
-        <w:rPr>
-          <w:rFonts w:ascii="Tw Cen MT" w:hAnsi="Tw Cen MT"/>
-        </w:rPr>
-        <w:t xml:space="preserve"> an experiment to investigate Einstein’s Special Theory of Relativity</w:t>
-      </w:r>
-      <w:r>
-        <w:rPr>
-          <w:rFonts w:ascii="Tw Cen MT" w:hAnsi="Tw Cen MT"/>
-        </w:rPr>
-        <w:t xml:space="preserve"> and then </w:t>
-      </w:r>
-      <w:r>
-        <w:rPr>
-          <w:rFonts w:ascii="Tw Cen MT" w:hAnsi="Tw Cen MT"/>
-        </w:rPr>
-        <w:t xml:space="preserve">completed </w:t>
-      </w:r>
-      <w:r>
-        <w:rPr>
-          <w:rFonts w:ascii="Tw Cen MT" w:hAnsi="Tw Cen MT"/>
-        </w:rPr>
-        <w:t xml:space="preserve">the </w:t>
-      </w:r>
-      <w:r>
-        <w:rPr>
-          <w:rFonts w:ascii="Tw Cen MT" w:hAnsi="Tw Cen MT"/>
-        </w:rPr>
-        <w:t>data collection using a particle accelerator at CERN and published a scientific paper in IOP Journal.</w:t>
+        <w:t>2016), led the winning team for an international competition held by CERN. We proposed an experiment to investigate Einstein’s Special Theory of Relativity and then completed the data collection using a particle accelerator at CERN and published a scientific paper in IOP Journal.</w:t>
       </w:r>
     </w:p>
     <w:p>
@@ -2667,12 +1839,6 @@
                                 <w:szCs w:val="20"/>
                               </w:rPr>
                               <w:t>Wado-Ryu Karate- 2nd Dan Black belt</w:t>
-                            </w:r>
-                            <w:r>
-                              <w:rPr>
-                                <w:rFonts w:ascii="Tw Cen MT" w:hAnsi="Tw Cen MT"/>
-                                <w:szCs w:val="20"/>
-                              </w:rPr>
                               <w:tab/>
                             </w:r>
                           </w:p>
@@ -2690,12 +1856,6 @@
                                 <w:szCs w:val="20"/>
                               </w:rPr>
                               <w:t>National Citizenship Service Award</w:t>
-                            </w:r>
-                            <w:r>
-                              <w:rPr>
-                                <w:rFonts w:ascii="Tw Cen MT" w:hAnsi="Tw Cen MT"/>
-                                <w:szCs w:val="20"/>
-                              </w:rPr>
                               <w:tab/>
                             </w:r>
                           </w:p>
@@ -2721,7 +1881,7 @@
           </mc:Choice>
           <mc:Fallback>
             <w:pict>
-              <v:shape w14:anchorId="04F79456" id="Text Box 1" o:spid="_x0000_s1028" type="#_x0000_t202" style="position:absolute;margin-left:307.85pt;margin-top:25.95pt;width:240pt;height:50.3pt;z-index:251659264;visibility:visible;mso-wrap-style:square;mso-width-percent:0;mso-height-percent:0;mso-wrap-distance-left:9pt;mso-wrap-distance-top:0;mso-wrap-distance-right:9pt;mso-wrap-distance-bottom:0;mso-position-horizontal:absolute;mso-position-horizontal-relative:page;mso-position-vertical:absolute;mso-position-vertical-relative:text;mso-width-percent:0;mso-height-percent:0;mso-width-relative:margin;mso-height-relative:margin;v-text-anchor:top" o:gfxdata="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" fillcolor="white [3201]" stroked="f" strokeweight=".5pt">
+              <v:shape w14:anchorId="04F79456" id="Text Box 1" o:spid="_x0000_s1028" type="#_x0000_t202" style="position:absolute;margin-left:307.85pt;margin-top:25.95pt;width:240pt;height:50.3pt;z-index:251659264;visibility:visible;mso-wrap-style:square;mso-width-percent:0;mso-height-percent:0;mso-wrap-distance-left:9pt;mso-wrap-distance-top:0;mso-wrap-distance-right:9pt;mso-wrap-distance-bottom:0;mso-position-horizontal:absolute;mso-position-horizontal-relative:page;mso-position-vertical:absolute;mso-position-vertical-relative:text;mso-width-percent:0;mso-height-percent:0;mso-width-relative:margin;mso-height-relative:margin;v-text-anchor:top" o:gfxdata="UEsDBBQABgAIAAAAIQC2gziS/gAAAOEBAAATAAAAW0NvbnRlbnRfVHlwZXNdLnhtbJSRQU7DMBBF 90jcwfIWJU67QAgl6YK0S0CoHGBkTxKLZGx5TGhvj5O2G0SRWNoz/78nu9wcxkFMGNg6quQqL6RA 0s5Y6ir5vt9lD1JwBDIwOMJKHpHlpr69KfdHjyxSmriSfYz+USnWPY7AufNIadK6MEJMx9ApD/oD OlTrorhX2lFEilmcO2RdNtjC5xDF9pCuTyYBB5bi6bQ4syoJ3g9WQ0ymaiLzg5KdCXlKLjvcW893 SUOqXwnz5DrgnHtJTxOsQfEKIT7DmDSUCaxw7Rqn8787ZsmRM9e2VmPeBN4uqYvTtW7jvijg9N/y JsXecLq0q+WD6m8AAAD//wMAUEsDBBQABgAIAAAAIQA4/SH/1gAAAJQBAAALAAAAX3JlbHMvLnJl bHOkkMFqwzAMhu+DvYPRfXGawxijTi+j0GvpHsDYimMaW0Yy2fr2M4PBMnrbUb/Q94l/f/hMi1qR JVI2sOt6UJgd+ZiDgffL8ekFlFSbvV0oo4EbChzGx4f9GRdb25HMsYhqlCwG5lrLq9biZkxWOiqY 22YiTra2kYMu1l1tQD30/bPm3wwYN0x18gb45AdQl1tp5j/sFB2T0FQ7R0nTNEV3j6o9feQzro1i OWA14Fm+Q8a1a8+Bvu/d/dMb2JY5uiPbhG/ktn4cqGU/er3pcvwCAAD//wMAUEsDBBQABgAIAAAA IQAvo2e8eAIAAGwFAAAOAAAAZHJzL2Uyb0RvYy54bWysVEtv2zAMvg/YfxB0X+ykaZcGcYosRYYB RVssHXpWZCkRJouapMTOfn0p2Xms66XDLjYlfnx9Ijm5aSpNdsJ5Baag/V5OiTAcSmXWBf3xtPg0 osQHZkqmwYiC7oWnN9OPHya1HYsBbECXwhF0Yvy4tgXdhGDHWeb5RlTM98AKg0oJrmIBj26dlY7V 6L3S2SDPr7IaXGkdcOE93t62SjpN/qUUPDxI6UUguqCYW0hfl76r+M2mEzZeO2Y3indpsH/IomLK YNCjq1sWGNk69ZerSnEHHmTocagykFJxkWrAavr5q2qWG2ZFqgXJ8fZIk/9/bvn9bmkfHQnNF2jw ASMhtfVjj5exnka6Kv4xU4J6pHB/pE00gXC8vMiHozxHFUfd1cXoOh9FN9nJ2jofvgqoSBQK6vBZ Eltsd+dDCz1AYjAPWpULpXU6xFYQc+3IjuEj6pByROd/oLQhdQx+mSfHBqJ561mb6EakZujCnSpM UthrETHafBeSqDIV+kZsxrkwx/gJHVESQ73HsMOfsnqPcVsHWqTIYMLRuFIGXKo+Tc+JsvLngTLZ 4vFtzuqOYmhWDRZe0MGhAVZQ7rEvHLQj4y1fKHy8O+bDI3M4I/jeOPfhAT9SA5IPnUTJBtzvt+4j HlsXtZTUOHMF9b+2zAlK9DeDTX3dHw7jkKbD8PLzAA/uXLM615htNQfsiD5uGMuTGPFBH0TpoHrG 9TCLUVHFDMfYBQ0HcR7aTYDrhYvZLIFwLC0Ld2ZpeXQdWY6t+dQ8M2e7/g3Y+fdwmE42ftXGLTZa GphtA0iVejzy3LLa8Y8jnaakWz9xZ5yfE+q0JKcvAAAA//8DAFBLAwQUAAYACAAAACEAX3j7O+EA AAALAQAADwAAAGRycy9kb3ducmV2LnhtbEyPy07DMBBF90j9B2sqsUHUSSu3NMSpEOIhdUcDVN25 8ZBExOModpPw9zgr2M3j6M6ZdDeahvXYudqShHgRAUMqrK6plPCeP9/eAXNekVaNJZTwgw522ewq VYm2A71hf/AlCyHkEiWh8r5NOHdFhUa5hW2Rwu7Ldkb50HYl150aQrhp+DKK1tyomsKFSrX4WGHx fbgYCaeb8rh348vHsBKr9um1zzefOpfyej4+3APzOPo/GCb9oA5ZcDrbC2nHGgnrWGwCKkHEW2AT EG2nyTlUYimAZyn//0P2CwAA//8DAFBLAQItABQABgAIAAAAIQC2gziS/gAAAOEBAAATAAAAAAAA AAAAAAAAAAAAAABbQ29udGVudF9UeXBlc10ueG1sUEsBAi0AFAAGAAgAAAAhADj9If/WAAAAlAEA AAsAAAAAAAAAAAAAAAAALwEAAF9yZWxzLy5yZWxzUEsBAi0AFAAGAAgAAAAhAC+jZ7x4AgAAbAUA AA4AAAAAAAAAAAAAAAAALgIAAGRycy9lMm9Eb2MueG1sUEsBAi0AFAAGAAgAAAAhAF94+zvhAAAA CwEAAA8AAAAAAAAAAAAAAAAA0gQAAGRycy9kb3ducmV2LnhtbFBLBQYAAAAABAAEAPMAAADgBQAA AAA= " fillcolor="white [3201]" stroked="f" strokeweight=".5pt">
                 <v:textbox>
                   <w:txbxContent>
                     <w:p>
@@ -2754,12 +1914,6 @@
                           <w:szCs w:val="20"/>
                         </w:rPr>
                         <w:t>Wado-Ryu Karate- 2nd Dan Black belt</w:t>
-                      </w:r>
-                      <w:r>
-                        <w:rPr>
-                          <w:rFonts w:ascii="Tw Cen MT" w:hAnsi="Tw Cen MT"/>
-                          <w:szCs w:val="20"/>
-                        </w:rPr>
                         <w:tab/>
                       </w:r>
                     </w:p>
@@ -2777,12 +1931,6 @@
                           <w:szCs w:val="20"/>
                         </w:rPr>
                         <w:t>National Citizenship Service Award</w:t>
-                      </w:r>
-                      <w:r>
-                        <w:rPr>
-                          <w:rFonts w:ascii="Tw Cen MT" w:hAnsi="Tw Cen MT"/>
-                          <w:szCs w:val="20"/>
-                        </w:rPr>
                         <w:tab/>
                       </w:r>
                     </w:p>
@@ -2793,15 +1941,6 @@
             </w:pict>
           </mc:Fallback>
         </mc:AlternateContent>
-      </w:r>
-      <w:r>
-        <w:rPr>
-          <w:b/>
-          <w:noProof/>
-          <w:sz w:val="26"/>
-          <w:szCs w:val="26"/>
-          <w:lang w:eastAsia="en-GB"/>
-        </w:rPr>
         <mc:AlternateContent>
           <mc:Choice Requires="wps">
             <w:drawing>
@@ -2868,12 +2007,6 @@
                                 <w:szCs w:val="20"/>
                               </w:rPr>
                               <w:t>Vice School Captain</w:t>
-                            </w:r>
-                            <w:r>
-                              <w:rPr>
-                                <w:rFonts w:ascii="Tw Cen MT" w:hAnsi="Tw Cen MT"/>
-                                <w:szCs w:val="20"/>
-                              </w:rPr>
                               <w:tab/>
                             </w:r>
                           </w:p>
@@ -2932,12 +2065,6 @@
                                 <w:szCs w:val="20"/>
                               </w:rPr>
                               <w:tab/>
-                            </w:r>
-                            <w:r>
-                              <w:rPr>
-                                <w:rFonts w:ascii="Tw Cen MT" w:hAnsi="Tw Cen MT"/>
-                                <w:szCs w:val="20"/>
-                              </w:rPr>
                               <w:tab/>
                             </w:r>
                           </w:p>
@@ -2972,7 +2099,7 @@
           </mc:Choice>
           <mc:Fallback>
             <w:pict>
-              <v:shape w14:anchorId="1E88C6A5" id="Text Box 7" o:spid="_x0000_s1029" type="#_x0000_t202" style="position:absolute;margin-left:8.1pt;margin-top:23.65pt;width:246pt;height:48.8pt;z-index:251670528;visibility:visible;mso-wrap-style:square;mso-width-percent:0;mso-height-percent:0;mso-wrap-distance-left:9pt;mso-wrap-distance-top:0;mso-wrap-distance-right:9pt;mso-wrap-distance-bottom:0;mso-position-horizontal:absolute;mso-position-horizontal-relative:margin;mso-position-vertical:absolute;mso-position-vertical-relative:text;mso-width-percent:0;mso-height-percent:0;mso-width-relative:margin;mso-height-relative:margin;v-text-anchor:top" o:gfxdata="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" fillcolor="white [3201]" stroked="f" strokeweight=".5pt">
+              <v:shape w14:anchorId="1E88C6A5" id="Text Box 7" o:spid="_x0000_s1029" type="#_x0000_t202" style="position:absolute;margin-left:8.1pt;margin-top:23.65pt;width:246pt;height:48.8pt;z-index:251670528;visibility:visible;mso-wrap-style:square;mso-width-percent:0;mso-height-percent:0;mso-wrap-distance-left:9pt;mso-wrap-distance-top:0;mso-wrap-distance-right:9pt;mso-wrap-distance-bottom:0;mso-position-horizontal:absolute;mso-position-horizontal-relative:margin;mso-position-vertical:absolute;mso-position-vertical-relative:text;mso-width-percent:0;mso-height-percent:0;mso-width-relative:margin;mso-height-relative:margin;v-text-anchor:top" o:gfxdata="UEsDBBQABgAIAAAAIQC2gziS/gAAAOEBAAATAAAAW0NvbnRlbnRfVHlwZXNdLnhtbJSRQU7DMBBF 90jcwfIWJU67QAgl6YK0S0CoHGBkTxKLZGx5TGhvj5O2G0SRWNoz/78nu9wcxkFMGNg6quQqL6RA 0s5Y6ir5vt9lD1JwBDIwOMJKHpHlpr69KfdHjyxSmriSfYz+USnWPY7AufNIadK6MEJMx9ApD/oD OlTrorhX2lFEilmcO2RdNtjC5xDF9pCuTyYBB5bi6bQ4syoJ3g9WQ0ymaiLzg5KdCXlKLjvcW893 SUOqXwnz5DrgnHtJTxOsQfEKIT7DmDSUCaxw7Rqn8787ZsmRM9e2VmPeBN4uqYvTtW7jvijg9N/y JsXecLq0q+WD6m8AAAD//wMAUEsDBBQABgAIAAAAIQA4/SH/1gAAAJQBAAALAAAAX3JlbHMvLnJl bHOkkMFqwzAMhu+DvYPRfXGawxijTi+j0GvpHsDYimMaW0Yy2fr2M4PBMnrbUb/Q94l/f/hMi1qR JVI2sOt6UJgd+ZiDgffL8ekFlFSbvV0oo4EbChzGx4f9GRdb25HMsYhqlCwG5lrLq9biZkxWOiqY 22YiTra2kYMu1l1tQD30/bPm3wwYN0x18gb45AdQl1tp5j/sFB2T0FQ7R0nTNEV3j6o9feQzro1i OWA14Fm+Q8a1a8+Bvu/d/dMb2JY5uiPbhG/ktn4cqGU/er3pcvwCAAD//wMAUEsDBBQABgAIAAAA IQBEUYTYdwIAAGwFAAAOAAAAZHJzL2Uyb0RvYy54bWysVEtv2zAMvg/YfxB0X51Xuy2oU2QtOgwo 2mLt0LMiS4kwWdQkJnb260vJzmNdLx12sSnxIyl+fJxftLVlGxWiAVfy4cmAM+UkVMYtS/7j8frD J84iClcJC06VfKsiv5i9f3fe+KkawQpspQIjJy5OG1/yFaKfFkWUK1WLeAJeOVJqCLVAOoZlUQXR kPfaFqPB4KxoIFQ+gFQx0u1Vp+Sz7F9rJfFO66iQ2ZLT2zB/Q/4u0reYnYvpMgi/MrJ/hviHV9TC OAq6d3UlULB1MH+5qo0MEEHjiYS6AK2NVDkHymY4eJHNw0p4lXMhcqLf0xT/n1t5u3nw94Fh+wVa KmAipPFxGuky5dPqUKc/vZSRnijc7mlTLTJJl+PhaEK14EyS7oyk03FyUxysfYj4VUHNklDyQGXJ bInNTcQOuoOkYBGsqa6NtfmQWkFd2sA2gopoMb+RnP+Bso41FHx8OsiOHSTzzrN1yY3KzdCHO2SY JdxalTDWfVeamSon+kpsIaVy+/gZnVCaQr3FsMcfXvUW4y4PssiRweHeuDYOQs4+T8+BsurnjjLd 4ak2R3knEdtFS4lTLXcNsIBqS30RoBuZ6OW1oeLdiIj3ItCMUL1p7vGOPtoCkQ+9xNkKwu/X7hOe Wpe0nDU0cyWPv9YiKM7sN0dN/Xk4maQhzYfJ6ccRHcKxZnGscev6EqgjhrRhvMxiwqPdiTpA/UTr YZ6ikko4SbFLjjvxErtNQOtFqvk8g2gsvcAb9+Blcp1YTq352D6J4Pv+Rer8W9hNp5i+aOMOmywd zNcI2uQeTzx3rPb800jnKenXT9oZx+eMOizJ2TMAAAD//wMAUEsDBBQABgAIAAAAIQDzjpCS4AAA AAkBAAAPAAAAZHJzL2Rvd25yZXYueG1sTI/NTsMwEITvSLyDtUhcUOvQpD+EOBVCQCVuNAXEzY2X JCJeR7GbhLdnOcFx9hvNzmTbybZiwN43jhRczyMQSKUzDVUKDsXjbAPCB01Gt45QwTd62ObnZ5lO jRvpBYd9qASHkE+1gjqELpXSlzVa7eeuQ2L26XqrA8u+kqbXI4fbVi6iaCWtbog/1LrD+xrLr/3J Kvi4qt6f/fT0OsbLuHvYDcX6zRRKXV5Md7cgAk7hzwy/9bk65Nzp6E5kvGhZrxbsVJCsYxDMl9GG D0cGSXIDMs/k/wX5DwAAAP//AwBQSwECLQAUAAYACAAAACEAtoM4kv4AAADhAQAAEwAAAAAAAAAA AAAAAAAAAAAAW0NvbnRlbnRfVHlwZXNdLnhtbFBLAQItABQABgAIAAAAIQA4/SH/1gAAAJQBAAAL AAAAAAAAAAAAAAAAAC8BAABfcmVscy8ucmVsc1BLAQItABQABgAIAAAAIQBEUYTYdwIAAGwFAAAO AAAAAAAAAAAAAAAAAC4CAABkcnMvZTJvRG9jLnhtbFBLAQItABQABgAIAAAAIQDzjpCS4AAAAAkB AAAPAAAAAAAAAAAAAAAAANEEAABkcnMvZG93bnJldi54bWxQSwUGAAAAAAQABADzAAAA3gUAAAAA " fillcolor="white [3201]" stroked="f" strokeweight=".5pt">
                 <v:textbox>
                   <w:txbxContent>
                     <w:p>
@@ -2989,12 +2116,6 @@
                           <w:szCs w:val="20"/>
                         </w:rPr>
                         <w:t>Vice School Captain</w:t>
-                      </w:r>
-                      <w:r>
-                        <w:rPr>
-                          <w:rFonts w:ascii="Tw Cen MT" w:hAnsi="Tw Cen MT"/>
-                          <w:szCs w:val="20"/>
-                        </w:rPr>
                         <w:tab/>
                       </w:r>
                     </w:p>
@@ -3053,12 +2174,6 @@
                           <w:szCs w:val="20"/>
                         </w:rPr>
                         <w:tab/>
-                      </w:r>
-                      <w:r>
-                        <w:rPr>
-                          <w:rFonts w:ascii="Tw Cen MT" w:hAnsi="Tw Cen MT"/>
-                          <w:szCs w:val="20"/>
-                        </w:rPr>
                         <w:tab/>
                       </w:r>
                     </w:p>
@@ -3147,7 +2262,7 @@
           </mc:Choice>
           <mc:Fallback>
             <w:pict>
-              <v:line w14:anchorId="3DB74114" id="Straight Connector 5" o:spid="_x0000_s1026" style="position:absolute;flip:y;z-index:251666432;visibility:visible;mso-wrap-style:square;mso-height-percent:0;mso-wrap-distance-left:9pt;mso-wrap-distance-top:0;mso-wrap-distance-right:9pt;mso-wrap-distance-bottom:0;mso-position-horizontal:absolute;mso-position-horizontal-relative:text;mso-position-vertical:absolute;mso-position-vertical-relative:text;mso-height-percent:0;mso-height-relative:margin" from=".7pt,15pt" to="473.7pt,15pt" o:gfxdata="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" strokecolor="black [3213]" strokeweight="1.25pt">
+              <v:line w14:anchorId="3DB74114" id="Straight Connector 5" o:spid="_x0000_s1026" style="position:absolute;flip:y;z-index:251666432;visibility:visible;mso-wrap-style:square;mso-height-percent:0;mso-wrap-distance-left:9pt;mso-wrap-distance-top:0;mso-wrap-distance-right:9pt;mso-wrap-distance-bottom:0;mso-position-horizontal:absolute;mso-position-horizontal-relative:text;mso-position-vertical:absolute;mso-position-vertical-relative:text;mso-height-percent:0;mso-height-relative:margin" from=".7pt,15pt" to="473.7pt,15pt" o:gfxdata="UEsDBBQABgAIAAAAIQC2gziS/gAAAOEBAAATAAAAW0NvbnRlbnRfVHlwZXNdLnhtbJSRQU7DMBBF 90jcwfIWJU67QAgl6YK0S0CoHGBkTxKLZGx5TGhvj5O2G0SRWNoz/78nu9wcxkFMGNg6quQqL6RA 0s5Y6ir5vt9lD1JwBDIwOMJKHpHlpr69KfdHjyxSmriSfYz+USnWPY7AufNIadK6MEJMx9ApD/oD OlTrorhX2lFEilmcO2RdNtjC5xDF9pCuTyYBB5bi6bQ4syoJ3g9WQ0ymaiLzg5KdCXlKLjvcW893 SUOqXwnz5DrgnHtJTxOsQfEKIT7DmDSUCaxw7Rqn8787ZsmRM9e2VmPeBN4uqYvTtW7jvijg9N/y JsXecLq0q+WD6m8AAAD//wMAUEsDBBQABgAIAAAAIQA4/SH/1gAAAJQBAAALAAAAX3JlbHMvLnJl bHOkkMFqwzAMhu+DvYPRfXGawxijTi+j0GvpHsDYimMaW0Yy2fr2M4PBMnrbUb/Q94l/f/hMi1qR JVI2sOt6UJgd+ZiDgffL8ekFlFSbvV0oo4EbChzGx4f9GRdb25HMsYhqlCwG5lrLq9biZkxWOiqY 22YiTra2kYMu1l1tQD30/bPm3wwYN0x18gb45AdQl1tp5j/sFB2T0FQ7R0nTNEV3j6o9feQzro1i OWA14Fm+Q8a1a8+Bvu/d/dMb2JY5uiPbhG/ktn4cqGU/er3pcvwCAAD//wMAUEsDBBQABgAIAAAA IQCmibeLxAEAAOgDAAAOAAAAZHJzL2Uyb0RvYy54bWysU01v2zAMvRfofxB0b+wU6AeMOD20aC/D Vmzr7qpMxQIkUZC02Pn3o+TESbtdVvQiWCTfI98TvbobrWFbCFGja/lyUXMGTmKn3ablLz8fL245 i0m4Thh00PIdRH63Pj9bDb6BS+zRdBAYkbjYDL7lfUq+qaooe7AiLtCDo6TCYEWia9hUXRADsVtT Xdb1dTVg6HxACTFS9GFK8nXhVwpk+qZUhMRMy2m2VM5Qztd8VuuVaDZB+F7L/RjiA1NYoR01nake RBLsd9B/UVktA0ZUaSHRVqiUllA0kJpl/U7Nj154KFrInOhnm+Ln0cqv23v3HMiGwccm+ueQVYwq WKaM9r/oTYsumpSNxbbdbBuMiUkKXtf1zbImd+UhV00UmcqHmJ4ALcsfLTfaZUWiEdsvMVFbKj2U 5LBxbKCeV7c3V6UsotHdozYmJ8tWwL0JbCvoPdO4zO9HDCdVdDOOgkc55SvtDEz830Ex3dHYk7B3 nEJKcOnAaxxVZ5iiCWZgPU2WV/Q4zFvgvj5DoWzh/4BnROmMLs1gqx2Gf3U/WqGm+oMDk+5swSt2 u/LQxRpap+LcfvXzvp7eC/z4g67/AAAA//8DAFBLAwQUAAYACAAAACEAJrP+WtsAAAAHAQAADwAA AGRycy9kb3ducmV2LnhtbEyPTU+DQBCG7yb+h82YeDF2URsVZGmkUZvowbTqfQpTQNlZwm4L/HvH eNDj+5F3nkkXo23VgXrfODZwMYtAEReubLgy8P72eH4LygfkElvHZGAiD4vs+CjFpHQDr+mwCZWS EfYJGqhD6BKtfVGTRT9zHbFkO9dbDCL7Spc9DjJuW30ZRdfaYsNyocaOljUVX5u9NTC8POcP0+rs 6TPP4/XHtIx3rxgbc3oy3t+BCjSGvzL84As6ZMK0dXsuvWpFz6Vo4CqSjySO5zdibH8NnaX6P3/2 DQAA//8DAFBLAQItABQABgAIAAAAIQC2gziS/gAAAOEBAAATAAAAAAAAAAAAAAAAAAAAAABbQ29u dGVudF9UeXBlc10ueG1sUEsBAi0AFAAGAAgAAAAhADj9If/WAAAAlAEAAAsAAAAAAAAAAAAAAAAA LwEAAF9yZWxzLy5yZWxzUEsBAi0AFAAGAAgAAAAhAKaJt4vEAQAA6AMAAA4AAAAAAAAAAAAAAAAA LgIAAGRycy9lMm9Eb2MueG1sUEsBAi0AFAAGAAgAAAAhACaz/lrbAAAABwEAAA8AAAAAAAAAAAAA AAAAHgQAAGRycy9kb3ducmV2LnhtbFBLBQYAAAAABAAEAPMAAAAmBQAAAAA= " strokecolor="black [3213]" strokeweight="1.25pt">
                 <v:stroke joinstyle="miter"/>
               </v:line>
             </w:pict>

</xml_diff>

<commit_message>
360° creatures, clickable dive-in cue, gyroscope look on phones
- New creatures fill the look-around space: a sea turtle circling the
  sunlit shallows, a manta ray sweeping the twilight zone (both orbit
  through the camera's position so they pass close by), an octopus perched
  by a rock behind you on the seabed, extra fish schools and jellyfish
  behind the camera, and marine snow / bubbles now surround the viewer
- The "Dive in" hero cue is now a button that smooth-scrolls to the first
  section
- On phones the gyroscope drives the view: point the phone to look around
  (yaw unwraps for full 360° turns, pitch from tilt), while touch
  scrolling still controls the descent; iOS asks for sensor permission on
  the first tap

Co-Authored-By: Claude Fable 5 <noreply@anthropic.com>
</commit_message>
<xml_diff>
--- a/public/CV.docx
+++ b/public/CV.docx
@@ -338,7 +338,7 @@
                                 <w:rFonts w:ascii="Tw Cen MT" w:hAnsi="Tw Cen MT"/>
                                 <w:lang w:val="en-US"/>
                               </w:rPr>
-                              <w:t>GitHub Copilot</w:t>
+                              <w:t>Dart/Flutter</w:t>
                             </w:r>
                           </w:p>
                         </w:txbxContent>
@@ -497,7 +497,7 @@
                           <w:rFonts w:ascii="Tw Cen MT" w:hAnsi="Tw Cen MT"/>
                           <w:lang w:val="en-US"/>
                         </w:rPr>
-                        <w:t>GitHub Copilot</w:t>
+                        <w:t>Dart/Flutter</w:t>
                       </w:r>
                     </w:p>
                   </w:txbxContent>
@@ -673,7 +673,7 @@
                                 <w:rFonts w:ascii="Tw Cen MT" w:hAnsi="Tw Cen MT"/>
                                 <w:lang w:val="en-US"/>
                               </w:rPr>
-                              <w:t>HTML/CSS</w:t>
+                              <w:t>Supabase</w:t>
                             </w:r>
                           </w:p>
                         </w:txbxContent>
@@ -798,7 +798,7 @@
                           <w:rFonts w:ascii="Tw Cen MT" w:hAnsi="Tw Cen MT"/>
                           <w:lang w:val="en-US"/>
                         </w:rPr>
-                        <w:t>HTML/CSS</w:t>
+                        <w:t>Supabase</w:t>
                       </w:r>
                     </w:p>
                   </w:txbxContent>
@@ -946,7 +946,7 @@
             </w:pict>
           </mc:Fallback>
         </mc:AlternateContent>
-        <w:t>Software</w:t>
+        <w:t>Founding</w:t>
       </w:r>
       <w:r>
         <w:rPr>
@@ -969,7 +969,7 @@
         <w:rPr>
           <w:rFonts w:ascii="Tw Cen MT" w:hAnsi="Tw Cen MT"/>
         </w:rPr>
-        <w:t>Software Engineer with Python and Rust expertise, and experience in developing robust applications on the cloud using Kubernetes. Proficient in Machine Learning technology and capable of owning and creating systems. Skilled in communication and presentation, and passionate about technical problems.</w:t>
+        <w:t>Founding engineer at Mozaic Earth, building a platform that turns mobile-collected biodiversity data into ecologist-verified, AI-enhanced insight. A full-stack and machine learning engineer with Python, TypeScript and Rust expertise, comfortable owning systems end to end and passionate about applying technology to conservation.</w:t>
       </w:r>
     </w:p>
     <w:p>
@@ -1082,7 +1082,7 @@
         <w:rPr>
           <w:rFonts w:ascii="Tw Cen MT" w:hAnsi="Tw Cen MT"/>
         </w:rPr>
-        <w:t xml:space="preserve">Software Engineer, Microsoft (Sep 2022-Present) </w:t>
+        <w:t xml:space="preserve">Founding Engineer, Mozaic Earth (2024-Present) </w:t>
       </w:r>
     </w:p>
     <w:p>
@@ -1101,7 +1101,7 @@
         <w:rPr>
           <w:rFonts w:ascii="Tw Cen MT" w:hAnsi="Tw Cen MT"/>
         </w:rPr>
-        <w:t>Developed a Rust based solution to configuration translation with an extensive testing framework.</w:t>
+        <w:t>Architecting and managing the Supabase backend - database functions, triggers and edge functions.</w:t>
       </w:r>
     </w:p>
     <w:p>
@@ -1120,7 +1120,7 @@
         <w:rPr>
           <w:rFonts w:ascii="Tw Cen MT" w:hAnsi="Tw Cen MT"/>
         </w:rPr>
-        <w:t>Deployed a voicemail solution on Azure for a large telco using Kubernetes clusters.</w:t>
+        <w:t>Leading design and development of the web platform, scoping and reviewing a small team’s work.</w:t>
       </w:r>
     </w:p>
     <w:p>
@@ -1138,7 +1138,7 @@
         <w:rPr>
           <w:rFonts w:ascii="Tw Cen MT" w:hAnsi="Tw Cen MT"/>
         </w:rPr>
-        <w:t>Wrote and owned an automation bot to manage and fix CVEs using Python.</w:t>
+        <w:t>Owning all AI initiatives - building models, data pipelines and researching new technologies.</w:t>
       </w:r>
     </w:p>
     <w:p>
@@ -1157,7 +1157,7 @@
         <w:rPr>
           <w:rFonts w:ascii="Tw Cen MT" w:hAnsi="Tw Cen MT"/>
         </w:rPr>
-        <w:t>Scrum master for a team of 10, achieving more efficient impact driven meetings.</w:t>
+        <w:t>Shipping full-stack features across Supabase, React, Flutter, Figma and Retool.</w:t>
       </w:r>
     </w:p>
     <w:p>
@@ -1176,7 +1176,26 @@
         <w:rPr>
           <w:rFonts w:ascii="Tw Cen MT" w:hAnsi="Tw Cen MT"/>
         </w:rPr>
-        <w:t>Worked with Java and TypeScript to maintain a workplace messaging app.</w:t>
+        <w:t>Working with clients on delivery and insight-rich reports via custom SQL workflows.</w:t>
+      </w:r>
+    </w:p>
+    <w:p>
+      <w:pPr>
+        <w:pStyle w:val="ListParagraph"/>
+        <w:numPr>
+          <w:ilvl w:val="0"/>
+          <w:numId w:val="5"/>
+        </w:numPr>
+        <w:rPr>
+          <w:rFonts w:ascii="Tw Cen MT" w:hAnsi="Tw Cen MT"/>
+          <w:u w:val="single"/>
+        </w:rPr>
+      </w:pPr>
+      <w:r>
+        <w:rPr>
+          <w:rFonts w:ascii="Tw Cen MT" w:hAnsi="Tw Cen MT"/>
+        </w:rPr>
+        <w:t xml:space="preserve">Software Engineer, Microsoft (2022-2024) </w:t>
       </w:r>
     </w:p>
     <w:p>
@@ -1195,60 +1214,7 @@
         <w:rPr>
           <w:rFonts w:ascii="Tw Cen MT" w:hAnsi="Tw Cen MT"/>
         </w:rPr>
-        <w:t>Gave demos to 100+ people on the uses and capabilities of GitHub Copilot.</w:t>
-      </w:r>
-    </w:p>
-    <w:p>
-      <w:pPr>
-        <w:pStyle w:val="ListParagraph"/>
-        <w:numPr>
-          <w:ilvl w:val="1"/>
-          <w:numId w:val="5"/>
-        </w:numPr>
-        <w:rPr>
-          <w:rFonts w:ascii="Tw Cen MT" w:hAnsi="Tw Cen MT"/>
-          <w:u w:val="single"/>
-        </w:rPr>
-      </w:pPr>
-      <w:r>
-        <w:rPr>
-          <w:rFonts w:ascii="Tw Cen MT" w:hAnsi="Tw Cen MT"/>
-        </w:rPr>
-        <w:t>Running a sustainability series, personally giving talks on fishing and carbon removal companies.</w:t>
-      </w:r>
-    </w:p>
-    <w:p>
-      <w:pPr>
-        <w:pStyle w:val="ListParagraph"/>
-        <w:numPr>
-          <w:ilvl w:val="0"/>
-          <w:numId w:val="5"/>
-        </w:numPr>
-        <w:rPr>
-          <w:rFonts w:ascii="Tw Cen MT" w:hAnsi="Tw Cen MT"/>
-          <w:u w:val="single"/>
-        </w:rPr>
-      </w:pPr>
-      <w:r>
-        <w:rPr>
-          <w:rFonts w:ascii="Tw Cen MT" w:hAnsi="Tw Cen MT"/>
-        </w:rPr>
-        <w:t xml:space="preserve">Built a personal website using React - </w:t>
-      </w:r>
-      <w:hyperlink r:id="rId8" w:history="1">
-        <w:r>
-          <w:rPr>
-            <w:rStyle w:val="Hyperlink"/>
-            <w:rFonts w:ascii="Tw Cen MT" w:hAnsi="Tw Cen MT"/>
-          </w:rPr>
-          <w:t>https://www.jamesjhirst.com/</w:t>
-        </w:r>
-      </w:hyperlink>
-      <w:r>
-        <w:rPr>
-          <w:rFonts w:ascii="Tw Cen MT" w:hAnsi="Tw Cen MT"/>
-        </w:rPr>
-        <w:t>.</w:t>
+        <w:t>Built a Rust configuration-translation system with an automated testing framework, and a reliable Azure and Kubernetes voicemail solution for a large telco. GitHub Copilot Champion and scrum master for a team of ten.</w:t>
       </w:r>
     </w:p>
     <w:p>
@@ -1281,7 +1247,7 @@
         <w:rPr>
           <w:rFonts w:ascii="Tw Cen MT" w:hAnsi="Tw Cen MT"/>
         </w:rPr>
-        <w:t xml:space="preserve"> (2023-Present) classifying shark and ray eggs by species using TensorFlow.</w:t>
+        <w:t xml:space="preserve"> (2023-Present) classifying shark and ray eggcases by species with convolutional neural networks.</w:t>
       </w:r>
     </w:p>
     <w:p>
@@ -1300,26 +1266,7 @@
         <w:rPr>
           <w:rFonts w:ascii="Tw Cen MT" w:hAnsi="Tw Cen MT"/>
         </w:rPr>
-        <w:t>Machine Learning Engineer, Cambridge (2022), worked on a machine learning ecology project using Detectron2 to predict the location of tree crowns to improve estimates of carbon store in forests and other locations. Resulted in a scientific paper published in a variety of journals.</w:t>
-      </w:r>
-    </w:p>
-    <w:p>
-      <w:pPr>
-        <w:pStyle w:val="ListParagraph"/>
-        <w:numPr>
-          <w:ilvl w:val="0"/>
-          <w:numId w:val="5"/>
-        </w:numPr>
-        <w:rPr>
-          <w:rFonts w:ascii="Tw Cen MT" w:hAnsi="Tw Cen MT"/>
-          <w:u w:val="single"/>
-        </w:rPr>
-      </w:pPr>
-      <w:r>
-        <w:rPr>
-          <w:rFonts w:ascii="Tw Cen MT" w:hAnsi="Tw Cen MT"/>
-        </w:rPr>
-        <w:t>Software Engineer, Microsoft, 8-week virtual internship (2021), wrote Python to improve the automation of VM deployment and management for products in the telecoms sector.</w:t>
+        <w:t>Machine Learning Engineer, University of Cambridge (2022), applied Detectron2 to delineate tree crowns from drone imagery, improving estimates of carbon stored in forests. Results were published in a peer-reviewed paper.</w:t>
       </w:r>
     </w:p>
     <w:p>

</xml_diff>